<commit_message>
docs: regenerate Issues/Fixed/CONTINUATION PDF+HTML+DOCX siblings (stale after HRD-100..114 migrations + CONTINUATION r9)
Co-Authored-By: Claude Opus 4.7 <noreply@anthropic.com>
</commit_message>
<xml_diff>
--- a/docs/CONTINUATION.docx
+++ b/docs/CONTINUATION.docx
@@ -75,7 +75,7 @@
               <w:pStyle w:val="Compact"/>
             </w:pPr>
             <w:r>
-              <w:t xml:space="preserve">8</w:t>
+              <w:t xml:space="preserve">9</w:t>
             </w:r>
           </w:p>
         </w:tc>
@@ -123,7 +123,7 @@
               <w:pStyle w:val="Compact"/>
             </w:pPr>
             <w:r>
-              <w:t xml:space="preserve">2026-05-23</w:t>
+              <w:t xml:space="preserve">2026-05-27</w:t>
             </w:r>
           </w:p>
         </w:tc>
@@ -175,7 +175,7 @@
                 <w:b/>
                 <w:bCs/>
               </w:rPr>
-              <w:t xml:space="preserve">2026-05-23 session-end checkpoint — safe to shut down. Wave 6.5 lifecycle layer landed (12/12 implementation tasks + premature v0.5.0 tag from a parallel Haiku session). One root-cause bug discovered live + fixed: envelope ACTION FORMAT GUIDANCE (commit</w:t>
+              <w:t xml:space="preserve">2026-05-27 checkpoint (HEAD</w:t>
             </w:r>
             <w:r>
               <w:rPr>
@@ -190,14 +190,14 @@
                 <w:b/>
                 <w:bCs/>
               </w:rPr>
-              <w:t xml:space="preserve">53a7ad3</w:t>
+              <w:t xml:space="preserve">f833b0b</w:t>
             </w:r>
             <w:r>
               <w:rPr>
                 <w:b/>
                 <w:bCs/>
               </w:rPr>
-              <w:t xml:space="preserve">) — before the fix, every Bug:/Task: defaulted to</w:t>
+              <w:t xml:space="preserve">, all 4 mirrors synced). MAJOR FINDING: the 2nd-bot qaherald-auto automation is structurally impossible — Telegram never relays bot-to-bot messages in groups (proven; full forensic record</w:t>
             </w:r>
             <w:r>
               <w:rPr>
@@ -212,7 +212,14 @@
                 <w:b/>
                 <w:bCs/>
               </w:rPr>
-              <w:t xml:space="preserve">action:"reply"</w:t>
+              <w:t xml:space="preserve">docs/research/telegram-bot-to-bot-constraint.md</w:t>
+            </w:r>
+            <w:r>
+              <w:rPr>
+                <w:b/>
+                <w:bCs/>
+              </w:rPr>
+              <w:t xml:space="preserve">, commit</w:t>
             </w:r>
             <w:r>
               <w:rPr>
@@ -223,45 +230,24 @@
             </w:r>
             <w:r>
               <w:rPr>
+                <w:rStyle w:val="VerbatimChar"/>
                 <w:b/>
                 <w:bCs/>
               </w:rPr>
-              <w:t xml:space="preserve">and never wrote Issues.md (§107 PASS-bluff at the prompt layer). qaherald-auto Go framework T1+T2+T3+T4+T5 of 8 landed (full 15-scenario lifecycle test framework using a 2nd Telegram bot</w:t>
+              <w:t xml:space="preserve">5267f14</w:t>
             </w:r>
             <w:r>
               <w:rPr>
                 <w:b/>
                 <w:bCs/>
               </w:rPr>
+              <w:t xml:space="preserve">). Real-channel inbound automation requires MTProto (a real user account via gotd/td) — OPERATOR DECISION PENDING (needs my.telegram.org app_id+app_hash + 1-time phone login).</w:t>
+            </w:r>
+            <w:r>
               <w:t xml:space="preserve"> </w:t>
             </w:r>
             <w:r>
-              <w:rPr>
-                <w:rStyle w:val="VerbatimChar"/>
-                <w:b/>
-                <w:bCs/>
-              </w:rPr>
-              <w:t xml:space="preserve">@pherald_qa_bot</w:t>
-            </w:r>
-            <w:r>
-              <w:rPr>
-                <w:b/>
-                <w:bCs/>
-              </w:rPr>
-              <w:t xml:space="preserve"> </w:t>
-            </w:r>
-            <w:r>
-              <w:rPr>
-                <w:b/>
-                <w:bCs/>
-              </w:rPr>
-              <w:t xml:space="preserve">as automated subscriber). T6+T7+T8 remaining: pre-flight validator + httptest-driven unit tests + tests/test_wave6.5_lifecycle.sh adapter. After T8 + live run + v0.5.1 tag: ready to start Wave 7 (genericize messenger framework Slack/Email per operator mandate) / close 47 remaining HRDs.</w:t>
-            </w:r>
-            <w:r>
-              <w:t xml:space="preserve"> </w:t>
-            </w:r>
-            <w:r>
-              <w:t xml:space="preserve">v0.4.0 (Wave 6 closed-loop) + v0.5.0 (Wave 6.5 implementations) both tagged + pushed to all 4 mirrors. Live evidence so far under</w:t>
+              <w:t xml:space="preserve">This session: (1) pulled HelixConstitution to</w:t>
             </w:r>
             <w:r>
               <w:t xml:space="preserve"> </w:t>
@@ -270,13 +256,13 @@
               <w:rPr>
                 <w:rStyle w:val="VerbatimChar"/>
               </w:rPr>
-              <w:t xml:space="preserve">docs/qa/HRD-100-2026-05-22T18-27-30-w6live/</w:t>
+              <w:t xml:space="preserve">3a085b9</w:t>
             </w:r>
             <w:r>
               <w:t xml:space="preserve"> </w:t>
             </w:r>
             <w:r>
-              <w:t xml:space="preserve">(4-event closed loop) +</w:t>
+              <w:t xml:space="preserve">(gained §11.4.85 stress+chaos / §11.4.86 / §11.4.87 endless-loop-autonomous / §11.4.88 background-push); (2) propagated §11.4.85/87/88 into Herald CLAUDE/AGENTS/QWEN + new HERALD_CONSTITUTION §108 (merge</w:t>
             </w:r>
             <w:r>
               <w:t xml:space="preserve"> </w:t>
@@ -285,13 +271,10 @@
               <w:rPr>
                 <w:rStyle w:val="VerbatimChar"/>
               </w:rPr>
-              <w:t xml:space="preserve">docs/qa/HRD-101-lifecycle-2026-05-22T20-04-04-w6.5live/</w:t>
-            </w:r>
-            <w:r>
-              <w:t xml:space="preserve"> </w:t>
-            </w:r>
-            <w:r>
-              <w:t xml:space="preserve">(partial — only S1+S2 evidence; superseded by qaherald-auto). Workspace at 16 modules. Spec V3 at r12 + §32.7 + §32.9 + §33.6 + §33.7 captured. Constitutional propagation of §107.x docs/qa-evidence + §107.y working-tree-quiescence covenant complete across 13 submodules + parent constitution + Herald root (QA1 commit</w:t>
+              <w:t xml:space="preserve">4888081</w:t>
+            </w:r>
+            <w:r>
+              <w:t xml:space="preserve">); (3) built qaherald-auto framework COMPLETE —</w:t>
             </w:r>
             <w:r>
               <w:t xml:space="preserve"> </w:t>
@@ -300,13 +283,13 @@
               <w:rPr>
                 <w:rStyle w:val="VerbatimChar"/>
               </w:rPr>
-              <w:t xml:space="preserve">bff18db</w:t>
+              <w:t xml:space="preserve">qaherald lifecycle</w:t>
             </w:r>
             <w:r>
               <w:t xml:space="preserve"> </w:t>
             </w:r>
             <w:r>
-              <w:t xml:space="preserve">+ per-submodule</w:t>
+              <w:t xml:space="preserve">Cobra cmd + MessengerClient interface (Telegram impl) + 15 scenarios + orchestrator + report + preflight (10 gates) + shell adapter, all hermetic tests PASS (T1-T8); (4) fixed preflight G1 false-negative (real</w:t>
             </w:r>
             <w:r>
               <w:t xml:space="preserve"> </w:t>
@@ -315,10 +298,61 @@
               <w:rPr>
                 <w:rStyle w:val="VerbatimChar"/>
               </w:rPr>
-              <w:t xml:space="preserve">a8c1cb4..b464136</w:t>
-            </w:r>
-            <w:r>
-              <w:t xml:space="preserve">). Anti-bluff gates green: inheritance 15/15 PASS, audit_antibluff 18/0/1, Wave 6 mutation gate 4/4 PASS, Wave 6.5 mutation gate 6/6 PASS. Pre-existing carry-over: Postgres-SASL-dependent e2e invariants (E7-E12, E14-E16, E37-E42 — 15 FAILs against the running PG container, root cause is local-PG SASL handshake; unrelated to Wave 6/6.5).</w:t>
+              <w:t xml:space="preserve">getChatMember</w:t>
+            </w:r>
+            <w:r>
+              <w:t xml:space="preserve"> </w:t>
+            </w:r>
+            <w:r>
+              <w:t xml:space="preserve">membership proof,</w:t>
+            </w:r>
+            <w:r>
+              <w:t xml:space="preserve"> </w:t>
+            </w:r>
+            <w:r>
+              <w:rPr>
+                <w:rStyle w:val="VerbatimChar"/>
+              </w:rPr>
+              <w:t xml:space="preserve">b45e45d</w:t>
+            </w:r>
+            <w:r>
+              <w:t xml:space="preserve">); (5) Wave 7 STARTED — T1 channels.Channel interface (</w:t>
+            </w:r>
+            <w:r>
+              <w:rPr>
+                <w:rStyle w:val="VerbatimChar"/>
+              </w:rPr>
+              <w:t xml:space="preserve">688819a</w:t>
+            </w:r>
+            <w:r>
+              <w:t xml:space="preserve">) + T2 registry+init (</w:t>
+            </w:r>
+            <w:r>
+              <w:rPr>
+                <w:rStyle w:val="VerbatimChar"/>
+              </w:rPr>
+              <w:t xml:space="preserve">22ba96f</w:t>
+            </w:r>
+            <w:r>
+              <w:t xml:space="preserve">) + T3 per-channel inbox (</w:t>
+            </w:r>
+            <w:r>
+              <w:rPr>
+                <w:rStyle w:val="VerbatimChar"/>
+              </w:rPr>
+              <w:t xml:space="preserve">0080339</w:t>
+            </w:r>
+            <w:r>
+              <w:t xml:space="preserve">) + T4 generalized self-filter (</w:t>
+            </w:r>
+            <w:r>
+              <w:rPr>
+                <w:rStyle w:val="VerbatimChar"/>
+              </w:rPr>
+              <w:t xml:space="preserve">f833b0b</w:t>
+            </w:r>
+            <w:r>
+              <w:t xml:space="preserve">) → HRD-110/111/112/113 closed. Prior: v0.4.0 (Wave 6 closed-loop, HRD-100 real human round-trip msg 25→26) + v0.5.0 (Wave 6.5 lifecycle, premature S1+S2-only tag) both pushed. Anti-bluff gates green; pre-existing carry-over: Postgres-SASL e2e FAILs (E7-E12/E14-E16/E37-E42 — local PG SASL, unrelated).</w:t>
             </w:r>
           </w:p>
         </w:tc>
@@ -342,7 +376,7 @@
               <w:pStyle w:val="Compact"/>
             </w:pPr>
             <w:r>
-              <w:t xml:space="preserve">HRD-008, HRD-015, HRD-018 (in_progress), HRD-019..HRD-027, HRD-029..HRD-056, HRD-081, HRD-085..HRD-090, HRD-101 (in_progress — qaherald-auto + full lifecycle evidence)</w:t>
+              <w:t xml:space="preserve">HRD-008, HRD-015, HRD-018 (in_progress), HRD-019..HRD-027, HRD-029..HRD-056, HRD-081, HRD-085..HRD-090, HRD-114..HRD-121 (Wave 7 T5-T12 pending)</w:t>
             </w:r>
           </w:p>
         </w:tc>
@@ -378,10 +412,7 @@
               <w:t xml:space="preserve">Issues.md</w:t>
             </w:r>
             <w:r>
-              <w:t xml:space="preserve"> </w:t>
-            </w:r>
-            <w:r>
-              <w:t xml:space="preserve">— 48 open items (HRD-101 in flight)</w:t>
+              <w:t xml:space="preserve">. Wave 7 closed HRD-110/111/112/113 this session; HRD-114..121 are the remaining Wave 7 tasks T5-T12.</w:t>
             </w:r>
           </w:p>
         </w:tc>
@@ -405,7 +436,7 @@
               <w:pStyle w:val="Compact"/>
             </w:pPr>
             <w:r>
-              <w:t xml:space="preserve">HRD-001..HRD-007, HRD-009, HRD-009b, HRD-010, HRD-011, HRD-012, HRD-013, HRD-014, HRD-016, HRD-017, HRD-028, HRD-080, HRD-092..HRD-100 (HRD-018 partial — M1 + M2 components landed)</w:t>
+              <w:t xml:space="preserve">HRD-001..HRD-017 (less open), HRD-028, HRD-080, HRD-092..HRD-101, HRD-110, HRD-111, HRD-112, HRD-113</w:t>
             </w:r>
           </w:p>
         </w:tc>
@@ -466,7 +497,7 @@
                 <w:b/>
                 <w:bCs/>
               </w:rPr>
-              <w:t xml:space="preserve">Resume tomorrow at qaherald-auto T6+T7+T8</w:t>
+              <w:t xml:space="preserve">Resume at Wave 7 T6</w:t>
             </w:r>
             <w:r>
               <w:t xml:space="preserve"> </w:t>
@@ -478,13 +509,13 @@
               <w:rPr>
                 <w:rStyle w:val="VerbatimChar"/>
               </w:rPr>
-              <w:t xml:space="preserve">docs/superpowers/plans/2026-05-23-qaherald-auto.md</w:t>
+              <w:t xml:space="preserve">docs/superpowers/plans/2026-05-27-wave7-generic-messenger.md</w:t>
             </w:r>
             <w:r>
               <w:t xml:space="preserve"> </w:t>
             </w:r>
             <w:r>
-              <w:t xml:space="preserve">commit</w:t>
+              <w:t xml:space="preserve">line 980; HEAD</w:t>
             </w:r>
             <w:r>
               <w:t xml:space="preserve"> </w:t>
@@ -493,10 +524,10 @@
               <w:rPr>
                 <w:rStyle w:val="VerbatimChar"/>
               </w:rPr>
-              <w:t xml:space="preserve">52ce679</w:t>
-            </w:r>
-            <w:r>
-              <w:t xml:space="preserve">). T1-T5 landed:</w:t>
+              <w:t xml:space="preserve">42448a2</w:t>
+            </w:r>
+            <w:r>
+              <w:t xml:space="preserve">). Wave 7 done: T1</w:t>
             </w:r>
             <w:r>
               <w:t xml:space="preserve"> </w:t>
@@ -505,13 +536,13 @@
               <w:rPr>
                 <w:rStyle w:val="VerbatimChar"/>
               </w:rPr>
-              <w:t xml:space="preserve">qaherald lifecycle</w:t>
+              <w:t xml:space="preserve">channels.Channel</w:t>
             </w:r>
             <w:r>
               <w:t xml:space="preserve"> </w:t>
             </w:r>
             <w:r>
-              <w:t xml:space="preserve">Cobra subcommand + MessengerClient interface (Telegram impl) + 15 scenarios (S1..S15) + orchestrator + Markdown report — 12 hermetic unit tests PASS under</w:t>
+              <w:t xml:space="preserve">interface (reply method</w:t>
             </w:r>
             <w:r>
               <w:t xml:space="preserve"> </w:t>
@@ -520,10 +551,10 @@
               <w:rPr>
                 <w:rStyle w:val="VerbatimChar"/>
               </w:rPr>
-              <w:t xml:space="preserve">-race -count=1</w:t>
-            </w:r>
-            <w:r>
-              <w:t xml:space="preserve">. T6: 10-gate pre-flight validator (pherald-bot getMe, qa-bot privacy disabled, group membership, OPERATOR_IDS contains qa-bot, etc.). T7: full unit-test pass against</w:t>
+              <w:t xml:space="preserve">SendReplyGeneric</w:t>
+            </w:r>
+            <w:r>
+              <w:t xml:space="preserve">) + T2 registry/init + T3 per-channel inbox + T4</w:t>
             </w:r>
             <w:r>
               <w:t xml:space="preserve"> </w:t>
@@ -532,28 +563,22 @@
               <w:rPr>
                 <w:rStyle w:val="VerbatimChar"/>
               </w:rPr>
-              <w:t xml:space="preserve">httptest</w:t>
-            </w:r>
-            <w:r>
-              <w:t xml:space="preserve"> </w:t>
-            </w:r>
-            <w:r>
-              <w:t xml:space="preserve">impersonating Bot API + canned pherald transcripts. T8: rewrite</w:t>
-            </w:r>
-            <w:r>
-              <w:t xml:space="preserve"> </w:t>
+              <w:t xml:space="preserve">channels.IsSelfEcho</w:t>
+            </w:r>
+            <w:r>
+              <w:t xml:space="preserve">/</w:t>
             </w:r>
             <w:r>
               <w:rPr>
                 <w:rStyle w:val="VerbatimChar"/>
               </w:rPr>
-              <w:t xml:space="preserve">tests/test_wave6.5_lifecycle.sh</w:t>
+              <w:t xml:space="preserve">StampSender</w:t>
             </w:r>
             <w:r>
               <w:t xml:space="preserve"> </w:t>
             </w:r>
             <w:r>
-              <w:t xml:space="preserve">to delegate to</w:t>
+              <w:t xml:space="preserve">+ T5 multi-channel</w:t>
             </w:r>
             <w:r>
               <w:t xml:space="preserve"> </w:t>
@@ -562,13 +587,13 @@
               <w:rPr>
                 <w:rStyle w:val="VerbatimChar"/>
               </w:rPr>
-              <w:t xml:space="preserve">qaherald lifecycle</w:t>
+              <w:t xml:space="preserve">pherald listen</w:t>
             </w:r>
             <w:r>
               <w:t xml:space="preserve"> </w:t>
             </w:r>
             <w:r>
-              <w:t xml:space="preserve">(keep</w:t>
+              <w:t xml:space="preserve">(HRD-110..114 closed;</w:t>
             </w:r>
             <w:r>
               <w:t xml:space="preserve"> </w:t>
@@ -577,28 +602,22 @@
               <w:rPr>
                 <w:rStyle w:val="VerbatimChar"/>
               </w:rPr>
-              <w:t xml:space="preserve">--manual</w:t>
-            </w:r>
-            <w:r>
-              <w:t xml:space="preserve"> </w:t>
-            </w:r>
-            <w:r>
-              <w:t xml:space="preserve">for old interactive UX). After T8: live e2e run with operator-supplied creds (see §4a below), commit</w:t>
-            </w:r>
-            <w:r>
-              <w:t xml:space="preserve"> </w:t>
+              <w:t xml:space="preserve">inbound.TgramReplier</w:t>
+            </w:r>
+            <w:r>
+              <w:t xml:space="preserve">→</w:t>
             </w:r>
             <w:r>
               <w:rPr>
                 <w:rStyle w:val="VerbatimChar"/>
               </w:rPr>
-              <w:t xml:space="preserve">docs/qa/HRD-101-lifecycle-&lt;run-id&gt;/</w:t>
+              <w:t xml:space="preserve">Replier</w:t>
             </w:r>
             <w:r>
               <w:t xml:space="preserve"> </w:t>
             </w:r>
             <w:r>
-              <w:t xml:space="preserve">+ tag</w:t>
+              <w:t xml:space="preserve">generic-sig rename done via a</w:t>
             </w:r>
             <w:r>
               <w:t xml:space="preserve"> </w:t>
@@ -607,13 +626,338 @@
               <w:rPr>
                 <w:rStyle w:val="VerbatimChar"/>
               </w:rPr>
-              <w:t xml:space="preserve">v0.5.1</w:t>
+              <w:t xml:space="preserve">channelReplier</w:t>
             </w:r>
             <w:r>
               <w:t xml:space="preserve"> </w:t>
             </w:r>
             <w:r>
-              <w:t xml:space="preserve">+ 4-mirror push. Subsequent: Wave 7 (genericize messenger framework — Slack/Email next per operator 2026-05-22), then close-out of HRDs 018..027 + 029..056 + 081 + 085..090 for v1.0.0 production-ready, then the docs-audit task #147 (operator manuals + PDF/HTML/DOCX exports for every wave). Operator restated 2026-05-22/23: NO BLUFF, NO FALSE POSITIVES, fix root causes immediately. The 53a7ad3 envelope fix is the canonical example of that rule operating live. Push to all 4 mirrors + every submodule's own origin on every non-trivial commit per Universal §12.10.</w:t>
+              <w:t xml:space="preserve">shim — tgram's native int</w:t>
+            </w:r>
+            <w:r>
+              <w:t xml:space="preserve"> </w:t>
+            </w:r>
+            <w:r>
+              <w:rPr>
+                <w:rStyle w:val="VerbatimChar"/>
+              </w:rPr>
+              <w:t xml:space="preserve">SendReply</w:t>
+            </w:r>
+            <w:r>
+              <w:t xml:space="preserve"> </w:t>
+            </w:r>
+            <w:r>
+              <w:t xml:space="preserve">untouched,</w:t>
+            </w:r>
+            <w:r>
+              <w:t xml:space="preserve"> </w:t>
+            </w:r>
+            <w:r>
+              <w:rPr>
+                <w:rStyle w:val="VerbatimChar"/>
+              </w:rPr>
+              <w:t xml:space="preserve">channels.Channel.SendReplyGeneric</w:t>
+            </w:r>
+            <w:r>
+              <w:t xml:space="preserve"> </w:t>
+            </w:r>
+            <w:r>
+              <w:t xml:space="preserve">bridged; multi-channel fan-in via sync.WaitGroup, NOT errgroup, go.mod unchanged;</w:t>
+            </w:r>
+            <w:r>
+              <w:t xml:space="preserve"> </w:t>
+            </w:r>
+            <w:r>
+              <w:rPr>
+                <w:rStyle w:val="VerbatimChar"/>
+              </w:rPr>
+              <w:t xml:space="preserve">HERALD_CHANNELS=tgram,slack</w:t>
+            </w:r>
+            <w:r>
+              <w:t xml:space="preserve"> </w:t>
+            </w:r>
+            <w:r>
+              <w:t xml:space="preserve">parsed, default</w:t>
+            </w:r>
+            <w:r>
+              <w:t xml:space="preserve"> </w:t>
+            </w:r>
+            <w:r>
+              <w:rPr>
+                <w:rStyle w:val="VerbatimChar"/>
+              </w:rPr>
+              <w:t xml:space="preserve">tgram</w:t>
+            </w:r>
+            <w:r>
+              <w:t xml:space="preserve">). Remaining:</w:t>
+            </w:r>
+            <w:r>
+              <w:t xml:space="preserve"> </w:t>
+            </w:r>
+            <w:r>
+              <w:rPr>
+                <w:b/>
+                <w:bCs/>
+              </w:rPr>
+              <w:t xml:space="preserve">T6 Slack adapter (Socket Mode — VENDORS slack-go as a new submodule: verify</w:t>
+            </w:r>
+            <w:r>
+              <w:rPr>
+                <w:b/>
+                <w:bCs/>
+              </w:rPr>
+              <w:t xml:space="preserve"> </w:t>
+            </w:r>
+            <w:r>
+              <w:rPr>
+                <w:rStyle w:val="VerbatimChar"/>
+                <w:b/>
+                <w:bCs/>
+              </w:rPr>
+              <w:t xml:space="preserve">tests/test_constitution_inheritance.sh</w:t>
+            </w:r>
+            <w:r>
+              <w:rPr>
+                <w:b/>
+                <w:bCs/>
+              </w:rPr>
+              <w:t xml:space="preserve"> </w:t>
+            </w:r>
+            <w:r>
+              <w:rPr>
+                <w:b/>
+                <w:bCs/>
+              </w:rPr>
+              <w:t xml:space="preserve">I6 gate still passes after the .gitmodules entry; confirm slack-go v0.16.0 field names</w:t>
+            </w:r>
+            <w:r>
+              <w:rPr>
+                <w:b/>
+                <w:bCs/>
+              </w:rPr>
+              <w:t xml:space="preserve"> </w:t>
+            </w:r>
+            <w:r>
+              <w:rPr>
+                <w:rStyle w:val="VerbatimChar"/>
+                <w:b/>
+                <w:bCs/>
+              </w:rPr>
+              <w:t xml:space="preserve">inner.Files</w:t>
+            </w:r>
+            <w:r>
+              <w:rPr>
+                <w:b/>
+                <w:bCs/>
+              </w:rPr>
+              <w:t xml:space="preserve">/</w:t>
+            </w:r>
+            <w:r>
+              <w:rPr>
+                <w:rStyle w:val="VerbatimChar"/>
+                <w:b/>
+                <w:bCs/>
+              </w:rPr>
+              <w:t xml:space="preserve">socketmode.EventTypeEventsAPI</w:t>
+            </w:r>
+            <w:r>
+              <w:rPr>
+                <w:b/>
+                <w:bCs/>
+              </w:rPr>
+              <w:t xml:space="preserve">/</w:t>
+            </w:r>
+            <w:r>
+              <w:rPr>
+                <w:rStyle w:val="VerbatimChar"/>
+                <w:b/>
+                <w:bCs/>
+              </w:rPr>
+              <w:t xml:space="preserve">UploadFileV2Parameters</w:t>
+            </w:r>
+            <w:r>
+              <w:rPr>
+                <w:b/>
+                <w:bCs/>
+              </w:rPr>
+              <w:t xml:space="preserve"> </w:t>
+            </w:r>
+            <w:r>
+              <w:rPr>
+                <w:b/>
+                <w:bCs/>
+              </w:rPr>
+              <w:t xml:space="preserve">before coding; T5 pre-staged</w:t>
+            </w:r>
+            <w:r>
+              <w:rPr>
+                <w:b/>
+                <w:bCs/>
+              </w:rPr>
+              <w:t xml:space="preserve"> </w:t>
+            </w:r>
+            <w:r>
+              <w:rPr>
+                <w:rStyle w:val="VerbatimChar"/>
+                <w:b/>
+                <w:bCs/>
+              </w:rPr>
+              <w:t xml:space="preserve">perChannelConfig("slack")</w:t>
+            </w:r>
+            <w:r>
+              <w:rPr>
+                <w:b/>
+                <w:bCs/>
+              </w:rPr>
+              <w:t xml:space="preserve"> </w:t>
+            </w:r>
+            <w:r>
+              <w:rPr>
+                <w:b/>
+                <w:bCs/>
+              </w:rPr>
+              <w:t xml:space="preserve">+ blank-import comment in listen.go —</w:t>
+            </w:r>
+            <w:r>
+              <w:rPr>
+                <w:b/>
+                <w:bCs/>
+              </w:rPr>
+              <w:t xml:space="preserve"> </w:t>
+            </w:r>
+            <w:r>
+              <w:rPr>
+                <w:rStyle w:val="VerbatimChar"/>
+                <w:b/>
+                <w:bCs/>
+              </w:rPr>
+              <w:t xml:space="preserve">HERALD_CHANNELS=tgram,slack</w:t>
+            </w:r>
+            <w:r>
+              <w:rPr>
+                <w:b/>
+                <w:bCs/>
+              </w:rPr>
+              <w:t xml:space="preserve"> </w:t>
+            </w:r>
+            <w:r>
+              <w:rPr>
+                <w:b/>
+                <w:bCs/>
+              </w:rPr>
+              <w:t xml:space="preserve">currently errors ErrUnknownChannel until T6 registers slack, by design)</w:t>
+            </w:r>
+            <w:r>
+              <w:t xml:space="preserve"> </w:t>
+            </w:r>
+            <w:r>
+              <w:t xml:space="preserve">· T7 qaherald Slack MessengerClient · T8 spec §11.0/§32.2/§43 · T9 e2e E81-E88 · T10 paired mutation gate · T11 §11.4.85 stress+chaos · T12 docs/Issues→Fixed/v0.6.0/4-mirror push.</w:t>
+            </w:r>
+            <w:r>
+              <w:t xml:space="preserve"> </w:t>
+            </w:r>
+            <w:r>
+              <w:rPr>
+                <w:b/>
+                <w:bCs/>
+              </w:rPr>
+              <w:t xml:space="preserve">THREE GATED/DEBT ITEMS:</w:t>
+            </w:r>
+            <w:r>
+              <w:t xml:space="preserve"> </w:t>
+            </w:r>
+            <w:r>
+              <w:t xml:space="preserve">(a) MTProto real-channel automation — OPERATOR must provide my.telegram.org app_id+app_hash (folds into a qaherald MessengerClient MTProto impl reusing the entire scenario engine); operator should also</w:t>
+            </w:r>
+            <w:r>
+              <w:t xml:space="preserve"> </w:t>
+            </w:r>
+            <w:r>
+              <w:rPr>
+                <w:rStyle w:val="VerbatimChar"/>
+              </w:rPr>
+              <w:t xml:space="preserve">/revoke</w:t>
+            </w:r>
+            <w:r>
+              <w:t xml:space="preserve"> </w:t>
+            </w:r>
+            <w:r>
+              <w:t xml:space="preserve">the leaked</w:t>
+            </w:r>
+            <w:r>
+              <w:t xml:space="preserve"> </w:t>
+            </w:r>
+            <w:r>
+              <w:rPr>
+                <w:rStyle w:val="VerbatimChar"/>
+              </w:rPr>
+              <w:t xml:space="preserve">@pherald_qa_bot</w:t>
+            </w:r>
+            <w:r>
+              <w:t xml:space="preserve"> </w:t>
+            </w:r>
+            <w:r>
+              <w:t xml:space="preserve">token. (b) Wave 6.5 mutation-gate M3 STALE —</w:t>
+            </w:r>
+            <w:r>
+              <w:t xml:space="preserve"> </w:t>
+            </w:r>
+            <w:r>
+              <w:rPr>
+                <w:rStyle w:val="VerbatimChar"/>
+              </w:rPr>
+              <w:t xml:space="preserve">tests/test_wave6.5_mutation_meta.sh</w:t>
+            </w:r>
+            <w:r>
+              <w:t xml:space="preserve"> </w:t>
+            </w:r>
+            <w:r>
+              <w:t xml:space="preserve">M3 regex targets</w:t>
+            </w:r>
+            <w:r>
+              <w:t xml:space="preserve"> </w:t>
+            </w:r>
+            <w:r>
+              <w:rPr>
+                <w:rStyle w:val="VerbatimChar"/>
+              </w:rPr>
+              <w:t xml:space="preserve">opts.ReplyTo</w:t>
+            </w:r>
+            <w:r>
+              <w:t xml:space="preserve"> </w:t>
+            </w:r>
+            <w:r>
+              <w:t xml:space="preserve">but Wave 6.5 T6 renamed to</w:t>
+            </w:r>
+            <w:r>
+              <w:t xml:space="preserve"> </w:t>
+            </w:r>
+            <w:r>
+              <w:rPr>
+                <w:rStyle w:val="VerbatimChar"/>
+              </w:rPr>
+              <w:t xml:space="preserve">textOpts.ReplyTo</w:t>
+            </w:r>
+            <w:r>
+              <w:t xml:space="preserve"> </w:t>
+            </w:r>
+            <w:r>
+              <w:t xml:space="preserve">in send.go → M3 errors "anchor not found", non-functional gate (§107 bluff surface, FIX needed). (c) docs/Issues.md + docs/Fixed.md PDF/HTML/DOCX siblings stale after HRD-110..113 migrations — regen</w:t>
+            </w:r>
+            <w:r>
+              <w:t xml:space="preserve"> </w:t>
+            </w:r>
+            <w:r>
+              <w:rPr>
+                <w:rStyle w:val="VerbatimChar"/>
+              </w:rPr>
+              <w:t xml:space="preserve">bash scripts/export_docs.sh docs/Issues.md docs/Fixed.md</w:t>
+            </w:r>
+            <w:r>
+              <w:t xml:space="preserve"> </w:t>
+            </w:r>
+            <w:r>
+              <w:t xml:space="preserve">at Wave 7 close. Then: 39 remaining §42/§43 HRDs (018..027, 029..056, 081, 085..090, 008, 015) for v1.0.0; docs-audit #147. §11.4.87 endless-loop: continue until Issues.md zero-active + CONTINUATION §3 empty + no subagent in flight. NO BLUFF. Push 4 mirrors every 2-3 commits.</w:t>
             </w:r>
           </w:p>
         </w:tc>

</xml_diff>

<commit_message>
docs: CONTINUATION r10→r11 — GAP-3 complete (e2e 78/0), handoff refresh
Records GAP-3 §11.4.85 stress+chaos suite COMPLETE (HRD-122..130, commits 02d272d→d2a60d3;
full e2e_bluff_hunt 60→78 PASS/0 FAIL; HRD-130 gate 6/0). HRD-132 idempotency-window finding
open. The 2 conductor anti-bluff fixes (HRD-123 flaky oversized-body §11.4.50, E82 stale-anchor
§11.4.6) recorded. Continuation §3 = the 4 remaining 'do everything' workstreams in priority:
(1) HRD-132 idempotency fix, (2) §11.4.93 SQLite Phase 2+, (3) v1.0.0 (39 HRDs + Wave 7 T6-T12),
(4) GAP-4 docs/qa + docs #147. HEAD d2a60d3. Dated historical snapshots preserved.

§11.4.92: trivial — handoff doc refresh, zero source touched.

Co-Authored-By: Claude Opus 4.7 <noreply@anthropic.com>
</commit_message>
<xml_diff>
--- a/docs/CONTINUATION.docx
+++ b/docs/CONTINUATION.docx
@@ -75,7 +75,7 @@
               <w:pStyle w:val="Compact"/>
             </w:pPr>
             <w:r>
-              <w:t xml:space="preserve">10</w:t>
+              <w:t xml:space="preserve">11</w:t>
             </w:r>
           </w:p>
         </w:tc>
@@ -171,7 +171,7 @@
               <w:pStyle w:val="Compact"/>
             </w:pPr>
             <w:r>
-              <w:t xml:space="preserve">**2026-05-27 checkpoint (HEAD</w:t>
+              <w:t xml:space="preserve">**2026-05-27 GAP-3 checkpoint (HEAD</w:t>
             </w:r>
             <w:r>
               <w:t xml:space="preserve"> </w:t>
@@ -180,7 +180,7 @@
               <w:rPr>
                 <w:rStyle w:val="VerbatimChar"/>
               </w:rPr>
-              <w:t xml:space="preserve">a422c53</w:t>
+              <w:t xml:space="preserve">d2a60d3</w:t>
             </w:r>
             <w:r>
               <w:t xml:space="preserve">, all 4 mirrors synced; constitution at</w:t>
@@ -195,7 +195,331 @@
               <w:t xml:space="preserve">3c9c4e9</w:t>
             </w:r>
             <w:r>
-              <w:t xml:space="preserve">). This session was a constitution-compliance + SSoT-hygiene sweep: (1) pulled HelixConstitution</w:t>
+              <w:t xml:space="preserve">). GAP-3 §11.4.85 stress+chaos suite is COMPLETE (commits</w:t>
+            </w:r>
+            <w:r>
+              <w:t xml:space="preserve"> </w:t>
+            </w:r>
+            <w:r>
+              <w:rPr>
+                <w:rStyle w:val="VerbatimChar"/>
+              </w:rPr>
+              <w:t xml:space="preserve">02d272d</w:t>
+            </w:r>
+            <w:r>
+              <w:t xml:space="preserve">→</w:t>
+            </w:r>
+            <w:r>
+              <w:rPr>
+                <w:rStyle w:val="VerbatimChar"/>
+              </w:rPr>
+              <w:t xml:space="preserve">d2a60d3</w:t>
+            </w:r>
+            <w:r>
+              <w:t xml:space="preserve">, HRD-122..130): HRD-122 scaffold</w:t>
+            </w:r>
+            <w:r>
+              <w:t xml:space="preserve"> </w:t>
+            </w:r>
+            <w:r>
+              <w:rPr>
+                <w:rStyle w:val="VerbatimChar"/>
+              </w:rPr>
+              <w:t xml:space="preserve">commons/stresschaos/</w:t>
+            </w:r>
+            <w:r>
+              <w:t xml:space="preserve">, HRD-123 Gin</w:t>
+            </w:r>
+            <w:r>
+              <w:t xml:space="preserve"> </w:t>
+            </w:r>
+            <w:r>
+              <w:rPr>
+                <w:rStyle w:val="VerbatimChar"/>
+              </w:rPr>
+              <w:t xml:space="preserve">/v1/events</w:t>
+            </w:r>
+            <w:r>
+              <w:t xml:space="preserve">, HRD-124</w:t>
+            </w:r>
+            <w:r>
+              <w:t xml:space="preserve"> </w:t>
+            </w:r>
+            <w:r>
+              <w:rPr>
+                <w:rStyle w:val="VerbatimChar"/>
+              </w:rPr>
+              <w:t xml:space="preserve">/v1/compliance</w:t>
+            </w:r>
+            <w:r>
+              <w:t xml:space="preserve">+</w:t>
+            </w:r>
+            <w:r>
+              <w:rPr>
+                <w:rStyle w:val="VerbatimChar"/>
+              </w:rPr>
+              <w:t xml:space="preserve">/v1/safety_state</w:t>
+            </w:r>
+            <w:r>
+              <w:t xml:space="preserve">, HRD-125 Runner, HRD-126</w:t>
+            </w:r>
+            <w:r>
+              <w:t xml:space="preserve"> </w:t>
+            </w:r>
+            <w:r>
+              <w:rPr>
+                <w:rStyle w:val="VerbatimChar"/>
+              </w:rPr>
+              <w:t xml:space="preserve">pherald listen</w:t>
+            </w:r>
+            <w:r>
+              <w:t xml:space="preserve">, HRD-127 claude_code (testdata fake-claude shims), HRD-128 container/resource-exhaustion (§12.6-safe, live OOM SKIP-with-reason), HRD-129 e2e E81-E88, HRD-130 paired §1.1 mutation gate</w:t>
+            </w:r>
+            <w:r>
+              <w:t xml:space="preserve"> </w:t>
+            </w:r>
+            <w:r>
+              <w:rPr>
+                <w:rStyle w:val="VerbatimChar"/>
+              </w:rPr>
+              <w:t xml:space="preserve">tests/test_stress_chaos_mutation_meta.sh</w:t>
+            </w:r>
+            <w:r>
+              <w:t xml:space="preserve">. Full</w:t>
+            </w:r>
+            <w:r>
+              <w:t xml:space="preserve"> </w:t>
+            </w:r>
+            <w:r>
+              <w:rPr>
+                <w:rStyle w:val="VerbatimChar"/>
+              </w:rPr>
+              <w:t xml:space="preserve">scripts/e2e_bluff_hunt.sh</w:t>
+            </w:r>
+            <w:r>
+              <w:t xml:space="preserve"> </w:t>
+            </w:r>
+            <w:r>
+              <w:t xml:space="preserve">now reports</w:t>
+            </w:r>
+            <w:r>
+              <w:t xml:space="preserve"> </w:t>
+            </w:r>
+            <w:r>
+              <w:rPr>
+                <w:b/>
+                <w:bCs/>
+              </w:rPr>
+              <w:t xml:space="preserve">78 PASS / 0 FAIL</w:t>
+            </w:r>
+            <w:r>
+              <w:t xml:space="preserve"> </w:t>
+            </w:r>
+            <w:r>
+              <w:t xml:space="preserve">(was 60; +18 = E81-E88 + anchor sub-checks); HRD-130 gate</w:t>
+            </w:r>
+            <w:r>
+              <w:t xml:space="preserve"> </w:t>
+            </w:r>
+            <w:r>
+              <w:rPr>
+                <w:b/>
+                <w:bCs/>
+              </w:rPr>
+              <w:t xml:space="preserve">6 PASS / 0 FAIL</w:t>
+            </w:r>
+            <w:r>
+              <w:t xml:space="preserve"> </w:t>
+            </w:r>
+            <w:r>
+              <w:t xml:space="preserve">(5 mutations load-bearing). Evidence committed under</w:t>
+            </w:r>
+            <w:r>
+              <w:t xml:space="preserve"> </w:t>
+            </w:r>
+            <w:r>
+              <w:rPr>
+                <w:rStyle w:val="VerbatimChar"/>
+              </w:rPr>
+              <w:t xml:space="preserve">docs/qa/HRD-12{3,4,5,7,8}-*</w:t>
+            </w:r>
+            <w:r>
+              <w:t xml:space="preserve"> </w:t>
+            </w:r>
+            <w:r>
+              <w:t xml:space="preserve">+</w:t>
+            </w:r>
+            <w:r>
+              <w:t xml:space="preserve"> </w:t>
+            </w:r>
+            <w:r>
+              <w:rPr>
+                <w:rStyle w:val="VerbatimChar"/>
+              </w:rPr>
+              <w:t xml:space="preserve">docs/qa/2026-05-27T135301-gap3-listen-HRD-126/</w:t>
+            </w:r>
+            <w:r>
+              <w:t xml:space="preserve">.</w:t>
+            </w:r>
+            <w:r>
+              <w:t xml:space="preserve"> </w:t>
+            </w:r>
+            <w:r>
+              <w:rPr>
+                <w:b/>
+                <w:bCs/>
+              </w:rPr>
+              <w:t xml:space="preserve">NOTE — HRD-122..130 remain</w:t>
+            </w:r>
+            <w:r>
+              <w:rPr>
+                <w:b/>
+                <w:bCs/>
+              </w:rPr>
+              <w:t xml:space="preserve"> </w:t>
+            </w:r>
+            <w:r>
+              <w:rPr>
+                <w:rStyle w:val="VerbatimChar"/>
+                <w:b/>
+                <w:bCs/>
+              </w:rPr>
+              <w:t xml:space="preserve">in_progress</w:t>
+            </w:r>
+            <w:r>
+              <w:rPr>
+                <w:b/>
+                <w:bCs/>
+              </w:rPr>
+              <w:t xml:space="preserve"> </w:t>
+            </w:r>
+            <w:r>
+              <w:rPr>
+                <w:b/>
+                <w:bCs/>
+              </w:rPr>
+              <w:t xml:space="preserve">in Issues.md</w:t>
+            </w:r>
+            <w:r>
+              <w:t xml:space="preserve"> </w:t>
+            </w:r>
+            <w:r>
+              <w:t xml:space="preserve">(suite landed + e2e green, but not yet atomically migrated to Fixed.md). Two anti-bluff issues caught + fixed mid-session by the conductor: HRD-123 flaky oversized-body assertion (§11.4.50 — transport-rejection of an 8 MiB body is valid, not a failure) and E82 stale-anchor (re-captured committed evidence with</w:t>
+            </w:r>
+            <w:r>
+              <w:t xml:space="preserve"> </w:t>
+            </w:r>
+            <w:r>
+              <w:rPr>
+                <w:rStyle w:val="VerbatimChar"/>
+              </w:rPr>
+              <w:t xml:space="preserve">HERALD_STRESS_QA_DIR</w:t>
+            </w:r>
+            <w:r>
+              <w:t xml:space="preserve">; assertion</w:t>
+            </w:r>
+            <w:r>
+              <w:t xml:space="preserve"> </w:t>
+            </w:r>
+            <w:r>
+              <w:rPr>
+                <w:rStyle w:val="VerbatimChar"/>
+              </w:rPr>
+              <w:t xml:space="preserve">all_4xx_no_panic</w:t>
+            </w:r>
+            <w:r>
+              <w:t xml:space="preserve">→</w:t>
+            </w:r>
+            <w:r>
+              <w:rPr>
+                <w:rStyle w:val="VerbatimChar"/>
+              </w:rPr>
+              <w:t xml:space="preserve">all_malformed_rejected_no_5xx</w:t>
+            </w:r>
+            <w:r>
+              <w:t xml:space="preserve">).</w:t>
+            </w:r>
+            <w:r>
+              <w:t xml:space="preserve"> </w:t>
+            </w:r>
+            <w:r>
+              <w:rPr>
+                <w:b/>
+                <w:bCs/>
+              </w:rPr>
+              <w:t xml:space="preserve">NEW FINDING — HRD-132 (open, bug):</w:t>
+            </w:r>
+            <w:r>
+              <w:t xml:space="preserve"> </w:t>
+            </w:r>
+            <w:r>
+              <w:t xml:space="preserve">Runner idempotency window — concurrent same-key replay duplicate-dispatches (2-4 of a 1000× flood) because</w:t>
+            </w:r>
+            <w:r>
+              <w:t xml:space="preserve"> </w:t>
+            </w:r>
+            <w:r>
+              <w:rPr>
+                <w:rStyle w:val="VerbatimChar"/>
+              </w:rPr>
+              <w:t xml:space="preserve">events_processed</w:t>
+            </w:r>
+            <w:r>
+              <w:t xml:space="preserve"> </w:t>
+            </w:r>
+            <w:r>
+              <w:t xml:space="preserve">is archived at Stage 7 while</w:t>
+            </w:r>
+            <w:r>
+              <w:t xml:space="preserve"> </w:t>
+            </w:r>
+            <w:r>
+              <w:rPr>
+                <w:rStyle w:val="VerbatimChar"/>
+              </w:rPr>
+              <w:t xml:space="preserve">idempotency.go:64-72</w:t>
+            </w:r>
+            <w:r>
+              <w:t xml:space="preserve"> </w:t>
+            </w:r>
+            <w:r>
+              <w:t xml:space="preserve">treats SETNX-miss+no-PG-row as fresh (documented §32.1 "Redis-lies-PG-truths"); archival is exactly-once but dispatch is only bounded; fix direction = claim-before-dispatch (INSERT ON CONFLICT at Stage 2) + fix latent</w:t>
+            </w:r>
+            <w:r>
+              <w:t xml:space="preserve"> </w:t>
+            </w:r>
+            <w:r>
+              <w:rPr>
+                <w:rStyle w:val="VerbatimChar"/>
+              </w:rPr>
+              <w:t xml:space="preserve">runner.go:132</w:t>
+            </w:r>
+            <w:r>
+              <w:t xml:space="preserve"> </w:t>
+            </w:r>
+            <w:r>
+              <w:rPr>
+                <w:rStyle w:val="VerbatimChar"/>
+              </w:rPr>
+              <w:t xml:space="preserve">CachedRcpt.WasReplay</w:t>
+            </w:r>
+            <w:r>
+              <w:t xml:space="preserve"> </w:t>
+            </w:r>
+            <w:r>
+              <w:t xml:space="preserve">data race + upgrade HRD-125 assertion to</w:t>
+            </w:r>
+            <w:r>
+              <w:t xml:space="preserve"> </w:t>
+            </w:r>
+            <w:r>
+              <w:rPr>
+                <w:rStyle w:val="VerbatimChar"/>
+              </w:rPr>
+              <w:t xml:space="preserve">sends==1</w:t>
+            </w:r>
+            <w:r>
+              <w:t xml:space="preserve">. Prior r10 (still valid history) — a constitution-compliance + SSoT-hygiene sweep: (1) pulled HelixConstitution</w:t>
             </w:r>
             <w:r>
               <w:t xml:space="preserve"> </w:t>
@@ -429,7 +753,19 @@
               <w:pStyle w:val="Compact"/>
             </w:pPr>
             <w:r>
-              <w:t xml:space="preserve">HRD-008, HRD-015, HRD-018 (in_progress), HRD-019..HRD-027, HRD-029..HRD-056, HRD-081, HRD-085..HRD-090, HRD-115..HRD-121 (Wave 7 T6-T12 pending), HRD-122..HRD-130 (GAP-3 §11.4.85 stress+chaos plan), HRD-131 (SQLite SSoT Phase 1)</w:t>
+              <w:t xml:space="preserve">HRD-008, HRD-015, HRD-018 (in_progress), HRD-019..HRD-027, HRD-029..HRD-056, HRD-081, HRD-085..HRD-090, HRD-115..HRD-121 (Wave 7 T6-T12 pending), HRD-122..HRD-130 (GAP-3 §11.4.85 stress+chaos — all</w:t>
+            </w:r>
+            <w:r>
+              <w:t xml:space="preserve"> </w:t>
+            </w:r>
+            <w:r>
+              <w:rPr>
+                <w:rStyle w:val="VerbatimChar"/>
+              </w:rPr>
+              <w:t xml:space="preserve">in_progress</w:t>
+            </w:r>
+            <w:r>
+              <w:t xml:space="preserve">: suite landed + e2e green, atomic→Fixed migration pending), HRD-131 (SQLite SSoT Phase 1, open), HRD-132 (Runner idempotency-window bug, open)</w:t>
             </w:r>
           </w:p>
         </w:tc>
@@ -465,7 +801,22 @@
               <w:t xml:space="preserve">Issues.md</w:t>
             </w:r>
             <w:r>
-              <w:t xml:space="preserve">. Wave 7 closed HRD-110/111/112/113/114; HRD-115..121 are the remaining Wave 7 tasks T6-T12. HRD-122..130 are the planned §11.4.85 stress+chaos suite (GAP-3). HRD-131 is §11.4.93 SQLite workable-items SSoT migration Phase 1.</w:t>
+              <w:t xml:space="preserve">. Wave 7 closed HRD-110/111/112/113/114; HRD-115..121 are the remaining Wave 7 tasks T6-T12. HRD-122..130 are the §11.4.85 stress+chaos suite (GAP-3) — IMPLEMENTED + e2e-green this session but still</w:t>
+            </w:r>
+            <w:r>
+              <w:t xml:space="preserve"> </w:t>
+            </w:r>
+            <w:r>
+              <w:rPr>
+                <w:rStyle w:val="VerbatimChar"/>
+              </w:rPr>
+              <w:t xml:space="preserve">in_progress</w:t>
+            </w:r>
+            <w:r>
+              <w:t xml:space="preserve"> </w:t>
+            </w:r>
+            <w:r>
+              <w:t xml:space="preserve">in Issues.md (not yet migrated to Fixed.md). HRD-131 is §11.4.93 SQLite workable-items SSoT migration Phase 1 (open). HRD-132 is the newly-filed Runner idempotency-window bug (open) found while running HRD-125's stress flood.</w:t>
             </w:r>
           </w:p>
         </w:tc>
@@ -550,187 +901,7 @@
                 <w:b/>
                 <w:bCs/>
               </w:rPr>
-              <w:t xml:space="preserve">Resume at Wave 7 T6</w:t>
-            </w:r>
-            <w:r>
-              <w:t xml:space="preserve"> </w:t>
-            </w:r>
-            <w:r>
-              <w:t xml:space="preserve">(</w:t>
-            </w:r>
-            <w:r>
-              <w:rPr>
-                <w:rStyle w:val="VerbatimChar"/>
-              </w:rPr>
-              <w:t xml:space="preserve">docs/superpowers/plans/2026-05-27-wave7-generic-messenger.md</w:t>
-            </w:r>
-            <w:r>
-              <w:t xml:space="preserve"> </w:t>
-            </w:r>
-            <w:r>
-              <w:t xml:space="preserve">line 980). Wave 7 done: T1</w:t>
-            </w:r>
-            <w:r>
-              <w:t xml:space="preserve"> </w:t>
-            </w:r>
-            <w:r>
-              <w:rPr>
-                <w:rStyle w:val="VerbatimChar"/>
-              </w:rPr>
-              <w:t xml:space="preserve">channels.Channel</w:t>
-            </w:r>
-            <w:r>
-              <w:t xml:space="preserve"> </w:t>
-            </w:r>
-            <w:r>
-              <w:t xml:space="preserve">interface (reply method</w:t>
-            </w:r>
-            <w:r>
-              <w:t xml:space="preserve"> </w:t>
-            </w:r>
-            <w:r>
-              <w:rPr>
-                <w:rStyle w:val="VerbatimChar"/>
-              </w:rPr>
-              <w:t xml:space="preserve">SendReplyGeneric</w:t>
-            </w:r>
-            <w:r>
-              <w:t xml:space="preserve">) + T2 registry/init + T3 per-channel inbox + T4</w:t>
-            </w:r>
-            <w:r>
-              <w:t xml:space="preserve"> </w:t>
-            </w:r>
-            <w:r>
-              <w:rPr>
-                <w:rStyle w:val="VerbatimChar"/>
-              </w:rPr>
-              <w:t xml:space="preserve">channels.IsSelfEcho</w:t>
-            </w:r>
-            <w:r>
-              <w:t xml:space="preserve">/</w:t>
-            </w:r>
-            <w:r>
-              <w:rPr>
-                <w:rStyle w:val="VerbatimChar"/>
-              </w:rPr>
-              <w:t xml:space="preserve">StampSender</w:t>
-            </w:r>
-            <w:r>
-              <w:t xml:space="preserve"> </w:t>
-            </w:r>
-            <w:r>
-              <w:t xml:space="preserve">+ T5 multi-channel</w:t>
-            </w:r>
-            <w:r>
-              <w:t xml:space="preserve"> </w:t>
-            </w:r>
-            <w:r>
-              <w:rPr>
-                <w:rStyle w:val="VerbatimChar"/>
-              </w:rPr>
-              <w:t xml:space="preserve">pherald listen</w:t>
-            </w:r>
-            <w:r>
-              <w:t xml:space="preserve"> </w:t>
-            </w:r>
-            <w:r>
-              <w:t xml:space="preserve">(HRD-110..114 closed;</w:t>
-            </w:r>
-            <w:r>
-              <w:t xml:space="preserve"> </w:t>
-            </w:r>
-            <w:r>
-              <w:rPr>
-                <w:rStyle w:val="VerbatimChar"/>
-              </w:rPr>
-              <w:t xml:space="preserve">inbound.TgramReplier</w:t>
-            </w:r>
-            <w:r>
-              <w:t xml:space="preserve">→</w:t>
-            </w:r>
-            <w:r>
-              <w:rPr>
-                <w:rStyle w:val="VerbatimChar"/>
-              </w:rPr>
-              <w:t xml:space="preserve">Replier</w:t>
-            </w:r>
-            <w:r>
-              <w:t xml:space="preserve"> </w:t>
-            </w:r>
-            <w:r>
-              <w:t xml:space="preserve">generic-sig rename done via a</w:t>
-            </w:r>
-            <w:r>
-              <w:t xml:space="preserve"> </w:t>
-            </w:r>
-            <w:r>
-              <w:rPr>
-                <w:rStyle w:val="VerbatimChar"/>
-              </w:rPr>
-              <w:t xml:space="preserve">channelReplier</w:t>
-            </w:r>
-            <w:r>
-              <w:t xml:space="preserve"> </w:t>
-            </w:r>
-            <w:r>
-              <w:t xml:space="preserve">shim — tgram's native int</w:t>
-            </w:r>
-            <w:r>
-              <w:t xml:space="preserve"> </w:t>
-            </w:r>
-            <w:r>
-              <w:rPr>
-                <w:rStyle w:val="VerbatimChar"/>
-              </w:rPr>
-              <w:t xml:space="preserve">SendReply</w:t>
-            </w:r>
-            <w:r>
-              <w:t xml:space="preserve"> </w:t>
-            </w:r>
-            <w:r>
-              <w:t xml:space="preserve">untouched,</w:t>
-            </w:r>
-            <w:r>
-              <w:t xml:space="preserve"> </w:t>
-            </w:r>
-            <w:r>
-              <w:rPr>
-                <w:rStyle w:val="VerbatimChar"/>
-              </w:rPr>
-              <w:t xml:space="preserve">channels.Channel.SendReplyGeneric</w:t>
-            </w:r>
-            <w:r>
-              <w:t xml:space="preserve"> </w:t>
-            </w:r>
-            <w:r>
-              <w:t xml:space="preserve">bridged; multi-channel fan-in via sync.WaitGroup, NOT errgroup, go.mod unchanged;</w:t>
-            </w:r>
-            <w:r>
-              <w:t xml:space="preserve"> </w:t>
-            </w:r>
-            <w:r>
-              <w:rPr>
-                <w:rStyle w:val="VerbatimChar"/>
-              </w:rPr>
-              <w:t xml:space="preserve">HERALD_CHANNELS=tgram,slack</w:t>
-            </w:r>
-            <w:r>
-              <w:t xml:space="preserve"> </w:t>
-            </w:r>
-            <w:r>
-              <w:t xml:space="preserve">parsed, default</w:t>
-            </w:r>
-            <w:r>
-              <w:t xml:space="preserve"> </w:t>
-            </w:r>
-            <w:r>
-              <w:rPr>
-                <w:rStyle w:val="VerbatimChar"/>
-              </w:rPr>
-              <w:t xml:space="preserve">tgram</w:t>
-            </w:r>
-            <w:r>
-              <w:t xml:space="preserve">). Remaining:</w:t>
+              <w:t xml:space="preserve">Resume — remaining "do everything" workstreams in priority order:</w:t>
             </w:r>
             <w:r>
               <w:t xml:space="preserve"> </w:t>
@@ -740,28 +911,198 @@
                 <w:b/>
                 <w:bCs/>
               </w:rPr>
-              <w:t xml:space="preserve">T6 Slack adapter (Socket Mode — VENDORS slack-go as a new submodule: verify</w:t>
+              <w:t xml:space="preserve">(1) HRD-132 idempotency-window fix</w:t>
+            </w:r>
+            <w:r>
+              <w:t xml:space="preserve"> </w:t>
+            </w:r>
+            <w:r>
+              <w:t xml:space="preserve">(open bug, HIGH): claim-before-dispatch (INSERT ON CONFLICT at Runner Stage 2) + fix latent</w:t>
+            </w:r>
+            <w:r>
+              <w:t xml:space="preserve"> </w:t>
+            </w:r>
+            <w:r>
+              <w:rPr>
+                <w:rStyle w:val="VerbatimChar"/>
+              </w:rPr>
+              <w:t xml:space="preserve">runner.go:132</w:t>
+            </w:r>
+            <w:r>
+              <w:t xml:space="preserve"> </w:t>
+            </w:r>
+            <w:r>
+              <w:rPr>
+                <w:rStyle w:val="VerbatimChar"/>
+              </w:rPr>
+              <w:t xml:space="preserve">CachedRcpt.WasReplay</w:t>
+            </w:r>
+            <w:r>
+              <w:t xml:space="preserve"> </w:t>
+            </w:r>
+            <w:r>
+              <w:t xml:space="preserve">data race + upgrade HRD-125 assertion to</w:t>
+            </w:r>
+            <w:r>
+              <w:t xml:space="preserve"> </w:t>
+            </w:r>
+            <w:r>
+              <w:rPr>
+                <w:rStyle w:val="VerbatimChar"/>
+              </w:rPr>
+              <w:t xml:space="preserve">sends==1</w:t>
+            </w:r>
+            <w:r>
+              <w:t xml:space="preserve">; ship paired §1.1 mutation coverage + e2e evidence.</w:t>
+            </w:r>
+            <w:r>
+              <w:t xml:space="preserve"> </w:t>
             </w:r>
             <w:r>
               <w:rPr>
                 <w:b/>
                 <w:bCs/>
               </w:rPr>
-              <w:t xml:space="preserve"> </w:t>
+              <w:t xml:space="preserve">(2) §11.4.93 SQLite SSoT migration Phase 2+</w:t>
+            </w:r>
+            <w:r>
+              <w:t xml:space="preserve"> </w:t>
+            </w:r>
+            <w:r>
+              <w:t xml:space="preserve">(HRD-131, open): Phase 2 adopt the constitution's migration binary (</w:t>
             </w:r>
             <w:r>
               <w:rPr>
                 <w:rStyle w:val="VerbatimChar"/>
+              </w:rPr>
+              <w:t xml:space="preserve">constitution/scripts/workable-items/</w:t>
+            </w:r>
+            <w:r>
+              <w:t xml:space="preserve">, §11.4.74 reference — never reimplement), then Phases 3-6 (md→db sync, db→md byte-identical regen, generator shims, text-direct-edit prohibition) opened as follow-on HRDs so §106/§107.x invariants never break mid-migration.</w:t>
+            </w:r>
+            <w:r>
+              <w:t xml:space="preserve"> </w:t>
+            </w:r>
+            <w:r>
+              <w:rPr>
                 <w:b/>
                 <w:bCs/>
               </w:rPr>
-              <w:t xml:space="preserve">tests/test_constitution_inheritance.sh</w:t>
+              <w:t xml:space="preserve">(3) v1.0.0 readiness — 39 open §42/§43 HRDs</w:t>
+            </w:r>
+            <w:r>
+              <w:t xml:space="preserve"> </w:t>
+            </w:r>
+            <w:r>
+              <w:t xml:space="preserve">(HRD-018..027, 029..056, 081, 085..090, 008, 015)</w:t>
+            </w:r>
+            <w:r>
+              <w:t xml:space="preserve"> </w:t>
             </w:r>
             <w:r>
               <w:rPr>
                 <w:b/>
                 <w:bCs/>
               </w:rPr>
+              <w:t xml:space="preserve">+ Wave 7 T6-T12</w:t>
+            </w:r>
+            <w:r>
+              <w:t xml:space="preserve"> </w:t>
+            </w:r>
+            <w:r>
+              <w:t xml:space="preserve">(Slack adapter via vendored slack-go submodule — verify I6 gate after .gitmodules entry, confirm slack-go v0.16.0 field names</w:t>
+            </w:r>
+            <w:r>
+              <w:t xml:space="preserve"> </w:t>
+            </w:r>
+            <w:r>
+              <w:rPr>
+                <w:rStyle w:val="VerbatimChar"/>
+              </w:rPr>
+              <w:t xml:space="preserve">inner.Files</w:t>
+            </w:r>
+            <w:r>
+              <w:t xml:space="preserve">/</w:t>
+            </w:r>
+            <w:r>
+              <w:rPr>
+                <w:rStyle w:val="VerbatimChar"/>
+              </w:rPr>
+              <w:t xml:space="preserve">socketmode.EventTypeEventsAPI</w:t>
+            </w:r>
+            <w:r>
+              <w:t xml:space="preserve">/</w:t>
+            </w:r>
+            <w:r>
+              <w:rPr>
+                <w:rStyle w:val="VerbatimChar"/>
+              </w:rPr>
+              <w:t xml:space="preserve">UploadFileV2Parameters</w:t>
+            </w:r>
+            <w:r>
+              <w:t xml:space="preserve">; then qaherald Slack MessengerClient, spec §11.0/§32.2/§43, e2e, mutation gate, Issues→Fixed/v0.6.0/4-mirror push; T5 pre-staged</w:t>
+            </w:r>
+            <w:r>
+              <w:t xml:space="preserve"> </w:t>
+            </w:r>
+            <w:r>
+              <w:rPr>
+                <w:rStyle w:val="VerbatimChar"/>
+              </w:rPr>
+              <w:t xml:space="preserve">perChannelConfig("slack")</w:t>
+            </w:r>
+            <w:r>
+              <w:t xml:space="preserve"> </w:t>
+            </w:r>
+            <w:r>
+              <w:t xml:space="preserve">+ blank-import in listen.go —</w:t>
+            </w:r>
+            <w:r>
+              <w:t xml:space="preserve"> </w:t>
+            </w:r>
+            <w:r>
+              <w:rPr>
+                <w:rStyle w:val="VerbatimChar"/>
+              </w:rPr>
+              <w:t xml:space="preserve">HERALD_CHANNELS=tgram,slack</w:t>
+            </w:r>
+            <w:r>
+              <w:t xml:space="preserve"> </w:t>
+            </w:r>
+            <w:r>
+              <w:t xml:space="preserve">currently errors</w:t>
+            </w:r>
+            <w:r>
+              <w:t xml:space="preserve"> </w:t>
+            </w:r>
+            <w:r>
+              <w:rPr>
+                <w:rStyle w:val="VerbatimChar"/>
+              </w:rPr>
+              <w:t xml:space="preserve">ErrUnknownChannel</w:t>
+            </w:r>
+            <w:r>
+              <w:t xml:space="preserve"> </w:t>
+            </w:r>
+            <w:r>
+              <w:t xml:space="preserve">until T6 registers slack, by design; plan</w:t>
+            </w:r>
+            <w:r>
+              <w:t xml:space="preserve"> </w:t>
+            </w:r>
+            <w:r>
+              <w:rPr>
+                <w:rStyle w:val="VerbatimChar"/>
+              </w:rPr>
+              <w:t xml:space="preserve">docs/superpowers/plans/2026-05-27-wave7-generic-messenger.md</w:t>
+            </w:r>
+            <w:r>
+              <w:t xml:space="preserve"> </w:t>
+            </w:r>
+            <w:r>
+              <w:t xml:space="preserve">line 980).</w:t>
+            </w:r>
+            <w:r>
               <w:t xml:space="preserve"> </w:t>
             </w:r>
             <w:r>
@@ -769,230 +1110,86 @@
                 <w:b/>
                 <w:bCs/>
               </w:rPr>
-              <w:t xml:space="preserve">I6 gate still passes after the .gitmodules entry; confirm slack-go v0.16.0 field names</w:t>
+              <w:t xml:space="preserve">(4) GAP-4 docs/qa back-fill + docs-audit #147</w:t>
+            </w:r>
+            <w:r>
+              <w:t xml:space="preserve"> </w:t>
+            </w:r>
+            <w:r>
+              <w:t xml:space="preserve">— features lacking</w:t>
+            </w:r>
+            <w:r>
+              <w:t xml:space="preserve"> </w:t>
+            </w:r>
+            <w:r>
+              <w:rPr>
+                <w:rStyle w:val="VerbatimChar"/>
+              </w:rPr>
+              <w:t xml:space="preserve">docs/qa/&lt;run-id&gt;/</w:t>
+            </w:r>
+            <w:r>
+              <w:t xml:space="preserve"> </w:t>
+            </w:r>
+            <w:r>
+              <w:t xml:space="preserve">evidence per the</w:t>
+            </w:r>
+            <w:r>
+              <w:t xml:space="preserve"> </w:t>
+            </w:r>
+            <w:r>
+              <w:rPr>
+                <w:rStyle w:val="VerbatimChar"/>
+              </w:rPr>
+              <w:t xml:space="preserve">ee63ce6</w:t>
+            </w:r>
+            <w:r>
+              <w:t xml:space="preserve"> </w:t>
+            </w:r>
+            <w:r>
+              <w:t xml:space="preserve">qa-coverage audit + comprehensive documentation audit.</w:t>
+            </w:r>
+            <w:r>
+              <w:t xml:space="preserve"> </w:t>
             </w:r>
             <w:r>
               <w:rPr>
                 <w:b/>
                 <w:bCs/>
               </w:rPr>
+              <w:t xml:space="preserve">STILL-OPEN GATED ITEMS:</w:t>
+            </w:r>
+            <w:r>
+              <w:t xml:space="preserve"> </w:t>
+            </w:r>
+            <w:r>
+              <w:t xml:space="preserve">MTProto real-channel automation — OPERATOR-DECISION: provide my.telegram.org app_id+app_hash (folds into a qaherald MessengerClient MTProto impl reusing the entire scenario engine; Telegram never relays bot-to-bot in groups — see</w:t>
+            </w:r>
+            <w:r>
               <w:t xml:space="preserve"> </w:t>
             </w:r>
             <w:r>
               <w:rPr>
                 <w:rStyle w:val="VerbatimChar"/>
-                <w:b/>
-                <w:bCs/>
-              </w:rPr>
-              <w:t xml:space="preserve">inner.Files</w:t>
-            </w:r>
-            <w:r>
-              <w:rPr>
-                <w:b/>
-                <w:bCs/>
-              </w:rPr>
-              <w:t xml:space="preserve">/</w:t>
+              </w:rPr>
+              <w:t xml:space="preserve">docs/research/telegram-bot-to-bot-constraint.md</w:t>
+            </w:r>
+            <w:r>
+              <w:t xml:space="preserve">); operator should also</w:t>
+            </w:r>
+            <w:r>
+              <w:t xml:space="preserve"> </w:t>
             </w:r>
             <w:r>
               <w:rPr>
                 <w:rStyle w:val="VerbatimChar"/>
-                <w:b/>
-                <w:bCs/>
-              </w:rPr>
-              <w:t xml:space="preserve">socketmode.EventTypeEventsAPI</w:t>
-            </w:r>
-            <w:r>
-              <w:rPr>
-                <w:b/>
-                <w:bCs/>
-              </w:rPr>
-              <w:t xml:space="preserve">/</w:t>
-            </w:r>
-            <w:r>
-              <w:rPr>
-                <w:rStyle w:val="VerbatimChar"/>
-                <w:b/>
-                <w:bCs/>
-              </w:rPr>
-              <w:t xml:space="preserve">UploadFileV2Parameters</w:t>
-            </w:r>
-            <w:r>
-              <w:rPr>
-                <w:b/>
-                <w:bCs/>
-              </w:rPr>
-              <w:t xml:space="preserve"> </w:t>
-            </w:r>
-            <w:r>
-              <w:rPr>
-                <w:b/>
-                <w:bCs/>
-              </w:rPr>
-              <w:t xml:space="preserve">before coding; T5 pre-staged</w:t>
-            </w:r>
-            <w:r>
-              <w:rPr>
-                <w:b/>
-                <w:bCs/>
-              </w:rPr>
-              <w:t xml:space="preserve"> </w:t>
-            </w:r>
-            <w:r>
-              <w:rPr>
-                <w:rStyle w:val="VerbatimChar"/>
-                <w:b/>
-                <w:bCs/>
-              </w:rPr>
-              <w:t xml:space="preserve">perChannelConfig("slack")</w:t>
-            </w:r>
-            <w:r>
-              <w:rPr>
-                <w:b/>
-                <w:bCs/>
-              </w:rPr>
-              <w:t xml:space="preserve"> </w:t>
-            </w:r>
-            <w:r>
-              <w:rPr>
-                <w:b/>
-                <w:bCs/>
-              </w:rPr>
-              <w:t xml:space="preserve">+ blank-import comment in listen.go —</w:t>
-            </w:r>
-            <w:r>
-              <w:rPr>
-                <w:b/>
-                <w:bCs/>
-              </w:rPr>
-              <w:t xml:space="preserve"> </w:t>
-            </w:r>
-            <w:r>
-              <w:rPr>
-                <w:rStyle w:val="VerbatimChar"/>
-                <w:b/>
-                <w:bCs/>
-              </w:rPr>
-              <w:t xml:space="preserve">HERALD_CHANNELS=tgram,slack</w:t>
-            </w:r>
-            <w:r>
-              <w:rPr>
-                <w:b/>
-                <w:bCs/>
-              </w:rPr>
-              <w:t xml:space="preserve"> </w:t>
-            </w:r>
-            <w:r>
-              <w:rPr>
-                <w:b/>
-                <w:bCs/>
-              </w:rPr>
-              <w:t xml:space="preserve">currently errors ErrUnknownChannel until T6 registers slack, by design)</w:t>
-            </w:r>
-            <w:r>
-              <w:t xml:space="preserve"> </w:t>
-            </w:r>
-            <w:r>
-              <w:t xml:space="preserve">· T7 qaherald Slack MessengerClient · T8 spec §11.0/§32.2/§43 · T9 e2e E81-E88 · T10 paired mutation gate · T11 §11.4.85 stress+chaos · T12 docs/Issues→Fixed/v0.6.0/4-mirror push.</w:t>
-            </w:r>
-            <w:r>
-              <w:t xml:space="preserve"> </w:t>
-            </w:r>
-            <w:r>
-              <w:rPr>
-                <w:b/>
-                <w:bCs/>
-              </w:rPr>
-              <w:t xml:space="preserve">STILL-OPEN GATED/DEBT ITEMS:</w:t>
-            </w:r>
-            <w:r>
-              <w:t xml:space="preserve"> </w:t>
-            </w:r>
-            <w:r>
-              <w:t xml:space="preserve">(a) MTProto real-channel automation — OPERATOR must provide my.telegram.org app_id+app_hash (folds into a qaherald MessengerClient MTProto impl reusing the entire scenario engine); operator should also</w:t>
-            </w:r>
-            <w:r>
-              <w:t xml:space="preserve"> </w:t>
-            </w:r>
-            <w:r>
-              <w:rPr>
-                <w:rStyle w:val="VerbatimChar"/>
-              </w:rPr>
-              <w:t xml:space="preserve">/revoke</w:t>
-            </w:r>
-            <w:r>
-              <w:t xml:space="preserve"> </w:t>
-            </w:r>
-            <w:r>
-              <w:t xml:space="preserve">the leaked</w:t>
-            </w:r>
-            <w:r>
-              <w:t xml:space="preserve"> </w:t>
-            </w:r>
-            <w:r>
-              <w:rPr>
-                <w:rStyle w:val="VerbatimChar"/>
-              </w:rPr>
-              <w:t xml:space="preserve">@pherald_qa_bot</w:t>
-            </w:r>
-            <w:r>
-              <w:t xml:space="preserve"> </w:t>
-            </w:r>
-            <w:r>
-              <w:t xml:space="preserve">token. (b) GAP-3 execution — the §11.4.85 stress+chaos suite (HRD-122..130) is PLANNED (</w:t>
-            </w:r>
-            <w:r>
-              <w:rPr>
-                <w:rStyle w:val="VerbatimChar"/>
-              </w:rPr>
-              <w:t xml:space="preserve">docs/superpowers/plans/2026-05-27-stress-chaos-suite.md</w:t>
-            </w:r>
-            <w:r>
-              <w:t xml:space="preserve">) but NOT yet implemented. (c) §11.4.93 SQLite SSoT Phase 2+ — HRD-131 (Phase 1, scope-lock) filed; migration of the markdown trackers to the version-controlled</w:t>
-            </w:r>
-            <w:r>
-              <w:t xml:space="preserve"> </w:t>
-            </w:r>
-            <w:r>
-              <w:rPr>
-                <w:rStyle w:val="VerbatimChar"/>
-              </w:rPr>
-              <w:t xml:space="preserve">docs/.workable_items.db</w:t>
-            </w:r>
-            <w:r>
-              <w:t xml:space="preserve"> </w:t>
-            </w:r>
-            <w:r>
-              <w:t xml:space="preserve">SQLite SSoT is multi-phase. (d) GAP-4 docs/qa back-fill — features lacking</w:t>
-            </w:r>
-            <w:r>
-              <w:t xml:space="preserve"> </w:t>
-            </w:r>
-            <w:r>
-              <w:rPr>
-                <w:rStyle w:val="VerbatimChar"/>
-              </w:rPr>
-              <w:t xml:space="preserve">docs/qa/&lt;run-id&gt;/</w:t>
-            </w:r>
-            <w:r>
-              <w:t xml:space="preserve"> </w:t>
-            </w:r>
-            <w:r>
-              <w:t xml:space="preserve">evidence per the</w:t>
-            </w:r>
-            <w:r>
-              <w:t xml:space="preserve"> </w:t>
-            </w:r>
-            <w:r>
-              <w:rPr>
-                <w:rStyle w:val="VerbatimChar"/>
-              </w:rPr>
-              <w:t xml:space="preserve">ee63ce6</w:t>
-            </w:r>
-            <w:r>
-              <w:t xml:space="preserve"> </w:t>
-            </w:r>
-            <w:r>
-              <w:t xml:space="preserve">qa-coverage audit. (e) §11.4.90 obsolescence — zero current Obsolete rows; convention is in place, periodic re-audit of open/Fixed HRDs pending. (RESOLVED this session: Wave 6.5 mutation-gate M3 stale anchor; Postgres-SASL e2e FAILs → e2e now 60 PASS / 0 FAIL / 24 SKIP; HRD-101 filed as a real Fixed.md row; docs/Issues + Fixed sibling regen handled this session.) Then: 39 remaining §42/§43 HRDs (018..027, 029..056, 081, 085..090, 008, 015) for v1.0.0; docs-audit #147. §11.4.87 endless-loop: continue until Issues.md zero-active + CONTINUATION §3 empty + no subagent in flight. NO BLUFF. Push 4 mirrors every 2-3 commits.</w:t>
+              </w:rPr>
+              <w:t xml:space="preserve">/revoke @pherald_qa_bot</w:t>
+            </w:r>
+            <w:r>
+              <w:t xml:space="preserve"> </w:t>
+            </w:r>
+            <w:r>
+              <w:t xml:space="preserve">(leaked plaintext token). §11.4.90 obsolescence — zero current Obsolete rows; convention in place, periodic re-audit pending. (RESOLVED this session: GAP-3 §11.4.85 stress+chaos suite IMPLEMENTED — e2e 78 PASS / 0 FAIL; HRD-123 flaky oversized-body assertion + E82 stale-anchor anti-bluff issues fixed. Prior r10 RESOLVED: Wave 6.5 mutation-gate M3 stale anchor; Postgres-SASL e2e FAILs; HRD-101 filed as a real Fixed.md row.) §11.4.87 endless-loop: continue until Issues.md zero-active + CONTINUATION §3 empty + no subagent in flight. NO BLUFF. Push 4 mirrors every 2-3 commits.</w:t>
             </w:r>
           </w:p>
         </w:tc>
@@ -1659,7 +1856,38 @@
         <w:t xml:space="preserve"> </w:t>
       </w:r>
       <w:r>
-        <w:t xml:space="preserve">60 PASS / 0 FAIL / 24 SKIP (Postgres-SASL carry-over RESOLVED this session).</w:t>
+        <w:t xml:space="preserve">78 PASS / 0 FAIL (was 60; +18 = GAP-3 E81-E88 §11.4.85 stress+chaos + anchor sub-checks). Plus SKIP-with-reason for hardware/credential-absent invariants (live OOM, MTProto).</w:t>
+      </w:r>
+    </w:p>
+    <w:p>
+      <w:pPr>
+        <w:pStyle w:val="Compact"/>
+        <w:numPr>
+          <w:ilvl w:val="0"/>
+          <w:numId w:val="1002"/>
+        </w:numPr>
+      </w:pPr>
+      <w:r>
+        <w:rPr>
+          <w:b/>
+          <w:bCs/>
+        </w:rPr>
+        <w:t xml:space="preserve">Stress+chaos mutation gate:</w:t>
+      </w:r>
+      <w:r>
+        <w:t xml:space="preserve"> </w:t>
+      </w:r>
+      <w:r>
+        <w:rPr>
+          <w:rStyle w:val="VerbatimChar"/>
+        </w:rPr>
+        <w:t xml:space="preserve">tests/test_stress_chaos_mutation_meta.sh</w:t>
+      </w:r>
+      <w:r>
+        <w:t xml:space="preserve"> </w:t>
+      </w:r>
+      <w:r>
+        <w:t xml:space="preserve">(HRD-130) 6 PASS / 0 FAIL (5 load-bearing mutations).</w:t>
       </w:r>
     </w:p>
     <w:p>
@@ -2086,6 +2314,156 @@
           </w:p>
         </w:tc>
       </w:tr>
+      <w:tr>
+        <w:tc>
+          <w:tcPr/>
+          <w:p>
+            <w:pPr>
+              <w:pStyle w:val="Compact"/>
+            </w:pPr>
+            <w:r>
+              <w:t xml:space="preserve">HRD-122..130</w:t>
+            </w:r>
+          </w:p>
+        </w:tc>
+        <w:tc>
+          <w:tcPr/>
+          <w:p>
+            <w:pPr>
+              <w:pStyle w:val="Compact"/>
+            </w:pPr>
+            <w:r>
+              <w:t xml:space="preserve">in_progress</w:t>
+            </w:r>
+          </w:p>
+        </w:tc>
+        <w:tc>
+          <w:tcPr/>
+          <w:p>
+            <w:pPr>
+              <w:pStyle w:val="Compact"/>
+            </w:pPr>
+            <w:r>
+              <w:t xml:space="preserve">GAP-3 §11.4.85 stress+chaos suite — IMPLEMENTED + e2e-green (</w:t>
+            </w:r>
+            <w:r>
+              <w:rPr>
+                <w:rStyle w:val="VerbatimChar"/>
+              </w:rPr>
+              <w:t xml:space="preserve">d2a60d3</w:t>
+            </w:r>
+            <w:r>
+              <w:t xml:space="preserve">); awaiting atomic Issues→Fixed migration.</w:t>
+            </w:r>
+          </w:p>
+        </w:tc>
+      </w:tr>
+      <w:tr>
+        <w:tc>
+          <w:tcPr/>
+          <w:p>
+            <w:pPr>
+              <w:pStyle w:val="Compact"/>
+            </w:pPr>
+            <w:r>
+              <w:t xml:space="preserve">HRD-131</w:t>
+            </w:r>
+          </w:p>
+        </w:tc>
+        <w:tc>
+          <w:tcPr/>
+          <w:p>
+            <w:pPr>
+              <w:pStyle w:val="Compact"/>
+            </w:pPr>
+            <w:r>
+              <w:t xml:space="preserve">open</w:t>
+            </w:r>
+          </w:p>
+        </w:tc>
+        <w:tc>
+          <w:tcPr/>
+          <w:p>
+            <w:pPr>
+              <w:pStyle w:val="Compact"/>
+            </w:pPr>
+            <w:r>
+              <w:t xml:space="preserve">§11.4.93 SQLite workable-items SSoT migration Phase 1 (scope-lock filed); Phase 2+ pending.</w:t>
+            </w:r>
+          </w:p>
+        </w:tc>
+      </w:tr>
+      <w:tr>
+        <w:tc>
+          <w:tcPr/>
+          <w:p>
+            <w:pPr>
+              <w:pStyle w:val="Compact"/>
+            </w:pPr>
+            <w:r>
+              <w:t xml:space="preserve">HRD-132</w:t>
+            </w:r>
+          </w:p>
+        </w:tc>
+        <w:tc>
+          <w:tcPr/>
+          <w:p>
+            <w:pPr>
+              <w:pStyle w:val="Compact"/>
+            </w:pPr>
+            <w:r>
+              <w:t xml:space="preserve">open</w:t>
+            </w:r>
+          </w:p>
+        </w:tc>
+        <w:tc>
+          <w:tcPr/>
+          <w:p>
+            <w:pPr>
+              <w:pStyle w:val="Compact"/>
+            </w:pPr>
+            <w:r>
+              <w:t xml:space="preserve">Runner idempotency-window bug — concurrent same-key replay duplicate-dispatches (2-4 of 1000× flood); fix = claim-before-dispatch +</w:t>
+            </w:r>
+            <w:r>
+              <w:t xml:space="preserve"> </w:t>
+            </w:r>
+            <w:r>
+              <w:rPr>
+                <w:rStyle w:val="VerbatimChar"/>
+              </w:rPr>
+              <w:t xml:space="preserve">runner.go:132</w:t>
+            </w:r>
+            <w:r>
+              <w:t xml:space="preserve"> </w:t>
+            </w:r>
+            <w:r>
+              <w:rPr>
+                <w:rStyle w:val="VerbatimChar"/>
+              </w:rPr>
+              <w:t xml:space="preserve">CachedRcpt.WasReplay</w:t>
+            </w:r>
+            <w:r>
+              <w:t xml:space="preserve"> </w:t>
+            </w:r>
+            <w:r>
+              <w:t xml:space="preserve">race + HRD-125</w:t>
+            </w:r>
+            <w:r>
+              <w:t xml:space="preserve"> </w:t>
+            </w:r>
+            <w:r>
+              <w:rPr>
+                <w:rStyle w:val="VerbatimChar"/>
+              </w:rPr>
+              <w:t xml:space="preserve">sends==1</w:t>
+            </w:r>
+            <w:r>
+              <w:t xml:space="preserve">.</w:t>
+            </w:r>
+          </w:p>
+        </w:tc>
+      </w:tr>
     </w:tbl>
     <w:bookmarkEnd w:id="13"/>
     <w:bookmarkStart w:id="14" w:name="Xe0231d32a69d17d31f75951dcaa7beff2defc28"/>
@@ -5712,17 +6090,54 @@
         <w:t xml:space="preserve"> </w:t>
       </w:r>
       <w:r>
-        <w:t xml:space="preserve">(Runner nil-Redis graceful PG-only fallback). e2e_bluff_hunt now reports 60 PASS / 0 FAIL / 24 SKIP.</w:t>
+        <w:t xml:space="preserve">(Runner nil-Redis graceful PG-only fallback). At resolution e2e_bluff_hunt reported 60 PASS / 0 FAIL / 24 SKIP; the later GAP-3 session (</w:t>
+      </w:r>
+      <w:r>
+        <w:rPr>
+          <w:rStyle w:val="VerbatimChar"/>
+        </w:rPr>
+        <w:t xml:space="preserve">d2a60d3</w:t>
+      </w:r>
+      <w:r>
+        <w:t xml:space="preserve">) raised it to</w:t>
+      </w:r>
+      <w:r>
+        <w:t xml:space="preserve"> </w:t>
+      </w:r>
+      <w:r>
+        <w:rPr>
+          <w:b/>
+          <w:bCs/>
+        </w:rPr>
+        <w:t xml:space="preserve">78 PASS / 0 FAIL</w:t>
+      </w:r>
+      <w:r>
+        <w:t xml:space="preserve"> </w:t>
+      </w:r>
+      <w:r>
+        <w:t xml:space="preserve">with E81-E88 wired in.</w:t>
       </w:r>
     </w:p>
     <w:bookmarkEnd w:id="18"/>
-    <w:bookmarkStart w:id="19" w:name="X0d0df3fdf5880589887e9261cce7a8e992ef7fb"/>
+    <w:bookmarkStart w:id="19" w:name="Xf91d03998905adbda5963cf0d100d554292e7bd"/>
     <w:p>
       <w:pPr>
         <w:pStyle w:val="Heading3"/>
       </w:pPr>
       <w:r>
-        <w:t xml:space="preserve">Safe-shutdown checklist (NOW — end of 2026-05-23 session)</w:t>
+        <w:t xml:space="preserve">Safe-shutdown checklist (HISTORICAL — end of 2026-05-23 session; superseded — current HEAD is</w:t>
+      </w:r>
+      <w:r>
+        <w:t xml:space="preserve"> </w:t>
+      </w:r>
+      <w:r>
+        <w:rPr>
+          <w:rStyle w:val="VerbatimChar"/>
+        </w:rPr>
+        <w:t xml:space="preserve">d2a60d3</w:t>
+      </w:r>
+      <w:r>
+        <w:t xml:space="preserve">)</w:t>
       </w:r>
     </w:p>
     <w:tbl>

</xml_diff>

<commit_message>
docs: CONTINUATION r13→r14 — day-2 progress (Batch B complete, e2e 79/0, §11.4.95-97 + 3 fixes)
Records: constitution 3c9c4e9→15cd4bc + §11.4.95-97 propagated (d5b9895); 3 fixes (#194 audit-test
guard a8ad4f7, eventbus PublishedByType race→LoadOrStore f5d1367 [E3 -race regression], E17 PG SKIP-
guard 75e7a49); v1.0.0 Batch B COMPLETE — all 7 §42 flavor bindings HRD-019..025 (f33b5e4/5ebad4f/
46ca77e/f73195f/3fb753a), e2e E89-E96, full e2e CONFIRMED 79 PASS/0 FAIL. Resume-at = Batch C (§43
command catalogue HRD-029..056, the live op-interception commands feeding the Batch-B detectors).

§11.4.92: trivial — handoff doc refresh, zero source touched.

Co-Authored-By: Claude Opus 4.7 <noreply@anthropic.com>
</commit_message>
<xml_diff>
--- a/docs/CONTINUATION.docx
+++ b/docs/CONTINUATION.docx
@@ -75,7 +75,7 @@
               <w:pStyle w:val="Compact"/>
             </w:pPr>
             <w:r>
-              <w:t xml:space="preserve">13</w:t>
+              <w:t xml:space="preserve">14</w:t>
             </w:r>
           </w:p>
         </w:tc>
@@ -123,7 +123,7 @@
               <w:pStyle w:val="Compact"/>
             </w:pPr>
             <w:r>
-              <w:t xml:space="preserve">2026-05-27</w:t>
+              <w:t xml:space="preserve">2026-05-28</w:t>
             </w:r>
           </w:p>
         </w:tc>
@@ -175,6 +175,763 @@
                 <w:b/>
                 <w:bCs/>
               </w:rPr>
+              <w:t xml:space="preserve">2026-05-28 (day-2) — v1.0.0 Batch B COMPLETE + constitution sync + 3 fixes (HEAD</w:t>
+            </w:r>
+            <w:r>
+              <w:rPr>
+                <w:b/>
+                <w:bCs/>
+              </w:rPr>
+              <w:t xml:space="preserve"> </w:t>
+            </w:r>
+            <w:r>
+              <w:rPr>
+                <w:rStyle w:val="VerbatimChar"/>
+                <w:b/>
+                <w:bCs/>
+              </w:rPr>
+              <w:t xml:space="preserve">74649bb</w:t>
+            </w:r>
+            <w:r>
+              <w:rPr>
+                <w:b/>
+                <w:bCs/>
+              </w:rPr>
+              <w:t xml:space="preserve">; constitution pulled</w:t>
+            </w:r>
+            <w:r>
+              <w:rPr>
+                <w:b/>
+                <w:bCs/>
+              </w:rPr>
+              <w:t xml:space="preserve"> </w:t>
+            </w:r>
+            <w:r>
+              <w:rPr>
+                <w:rStyle w:val="VerbatimChar"/>
+                <w:b/>
+                <w:bCs/>
+              </w:rPr>
+              <w:t xml:space="preserve">3c9c4e9</w:t>
+            </w:r>
+            <w:r>
+              <w:rPr>
+                <w:b/>
+                <w:bCs/>
+              </w:rPr>
+              <w:t xml:space="preserve">→</w:t>
+            </w:r>
+            <w:r>
+              <w:rPr>
+                <w:rStyle w:val="VerbatimChar"/>
+                <w:b/>
+                <w:bCs/>
+              </w:rPr>
+              <w:t xml:space="preserve">15cd4bc</w:t>
+            </w:r>
+            <w:r>
+              <w:rPr>
+                <w:b/>
+                <w:bCs/>
+              </w:rPr>
+              <w:t xml:space="preserve">). (a) Constitution sync — pulled HelixConstitution</w:t>
+            </w:r>
+            <w:r>
+              <w:rPr>
+                <w:b/>
+                <w:bCs/>
+              </w:rPr>
+              <w:t xml:space="preserve"> </w:t>
+            </w:r>
+            <w:r>
+              <w:rPr>
+                <w:rStyle w:val="VerbatimChar"/>
+                <w:b/>
+                <w:bCs/>
+              </w:rPr>
+              <w:t xml:space="preserve">3c9c4e9</w:t>
+            </w:r>
+            <w:r>
+              <w:rPr>
+                <w:b/>
+                <w:bCs/>
+              </w:rPr>
+              <w:t xml:space="preserve">→</w:t>
+            </w:r>
+            <w:r>
+              <w:rPr>
+                <w:rStyle w:val="VerbatimChar"/>
+                <w:b/>
+                <w:bCs/>
+              </w:rPr>
+              <w:t xml:space="preserve">15cd4bc</w:t>
+            </w:r>
+            <w:r>
+              <w:rPr>
+                <w:b/>
+                <w:bCs/>
+              </w:rPr>
+              <w:t xml:space="preserve"> </w:t>
+            </w:r>
+            <w:r>
+              <w:rPr>
+                <w:b/>
+                <w:bCs/>
+              </w:rPr>
+              <w:t xml:space="preserve">(gained §11.4.95 workable-items-DB-tracked-not-gitignored / §11.4.96 safe-parallel-work-with-long-build catalogue / §11.4.97 max-idle + progress-update cadence) and propagated all three into CLAUDE.md r13 / AGENTS.md r9 / HERALD_CONSTITUTION.md r7 §108.j-l (commit</w:t>
+            </w:r>
+            <w:r>
+              <w:rPr>
+                <w:b/>
+                <w:bCs/>
+              </w:rPr>
+              <w:t xml:space="preserve"> </w:t>
+            </w:r>
+            <w:r>
+              <w:rPr>
+                <w:rStyle w:val="VerbatimChar"/>
+                <w:b/>
+                <w:bCs/>
+              </w:rPr>
+              <w:t xml:space="preserve">d5b9895</w:t>
+            </w:r>
+            <w:r>
+              <w:rPr>
+                <w:b/>
+                <w:bCs/>
+              </w:rPr>
+              <w:t xml:space="preserve">); Herald already complied with §11.4.95 (DB version-controlled per the 2026-05-27 operator divergence); inheritance gate 15 PASS / 0 FAIL. (b) Three real fixes — #194</w:t>
+            </w:r>
+            <w:r>
+              <w:rPr>
+                <w:b/>
+                <w:bCs/>
+              </w:rPr>
+              <w:t xml:space="preserve"> </w:t>
+            </w:r>
+            <w:r>
+              <w:rPr>
+                <w:rStyle w:val="VerbatimChar"/>
+                <w:b/>
+                <w:bCs/>
+              </w:rPr>
+              <w:t xml:space="preserve">audit_stress_chaos_test.go</w:t>
+            </w:r>
+            <w:r>
+              <w:rPr>
+                <w:b/>
+                <w:bCs/>
+              </w:rPr>
+              <w:t xml:space="preserve"> </w:t>
+            </w:r>
+            <w:r>
+              <w:rPr>
+                <w:b/>
+                <w:bCs/>
+              </w:rPr>
+              <w:t xml:space="preserve">now gates its qaRoot on</w:t>
+            </w:r>
+            <w:r>
+              <w:rPr>
+                <w:b/>
+                <w:bCs/>
+              </w:rPr>
+              <w:t xml:space="preserve"> </w:t>
+            </w:r>
+            <w:r>
+              <w:rPr>
+                <w:rStyle w:val="VerbatimChar"/>
+                <w:b/>
+                <w:bCs/>
+              </w:rPr>
+              <w:t xml:space="preserve">HERALD_STRESS_QA_DIR</w:t>
+            </w:r>
+            <w:r>
+              <w:rPr>
+                <w:b/>
+                <w:bCs/>
+              </w:rPr>
+              <w:t xml:space="preserve"> </w:t>
+            </w:r>
+            <w:r>
+              <w:rPr>
+                <w:b/>
+                <w:bCs/>
+              </w:rPr>
+              <w:t xml:space="preserve">via</w:t>
+            </w:r>
+            <w:r>
+              <w:rPr>
+                <w:b/>
+                <w:bCs/>
+              </w:rPr>
+              <w:t xml:space="preserve"> </w:t>
+            </w:r>
+            <w:r>
+              <w:rPr>
+                <w:rStyle w:val="VerbatimChar"/>
+                <w:b/>
+                <w:bCs/>
+              </w:rPr>
+              <w:t xml:space="preserve">t.TempDir()</w:t>
+            </w:r>
+            <w:r>
+              <w:rPr>
+                <w:b/>
+                <w:bCs/>
+              </w:rPr>
+              <w:t xml:space="preserve"> </w:t>
+            </w:r>
+            <w:r>
+              <w:rPr>
+                <w:b/>
+                <w:bCs/>
+              </w:rPr>
+              <w:t xml:space="preserve">(commit</w:t>
+            </w:r>
+            <w:r>
+              <w:rPr>
+                <w:b/>
+                <w:bCs/>
+              </w:rPr>
+              <w:t xml:space="preserve"> </w:t>
+            </w:r>
+            <w:r>
+              <w:rPr>
+                <w:rStyle w:val="VerbatimChar"/>
+                <w:b/>
+                <w:bCs/>
+              </w:rPr>
+              <w:t xml:space="preserve">a8ad4f7</w:t>
+            </w:r>
+            <w:r>
+              <w:rPr>
+                <w:b/>
+                <w:bCs/>
+              </w:rPr>
+              <w:t xml:space="preserve">, stops the suite littering</w:t>
+            </w:r>
+            <w:r>
+              <w:rPr>
+                <w:b/>
+                <w:bCs/>
+              </w:rPr>
+              <w:t xml:space="preserve"> </w:t>
+            </w:r>
+            <w:r>
+              <w:rPr>
+                <w:rStyle w:val="VerbatimChar"/>
+                <w:b/>
+                <w:bCs/>
+              </w:rPr>
+              <w:t xml:space="preserve">docs/qa/</w:t>
+            </w:r>
+            <w:r>
+              <w:rPr>
+                <w:b/>
+                <w:bCs/>
+              </w:rPr>
+              <w:t xml:space="preserve"> </w:t>
+            </w:r>
+            <w:r>
+              <w:rPr>
+                <w:b/>
+                <w:bCs/>
+              </w:rPr>
+              <w:t xml:space="preserve">on every run);</w:t>
+            </w:r>
+            <w:r>
+              <w:rPr>
+                <w:b/>
+                <w:bCs/>
+              </w:rPr>
+              <w:t xml:space="preserve"> </w:t>
+            </w:r>
+            <w:r>
+              <w:rPr>
+                <w:rStyle w:val="VerbatimChar"/>
+                <w:b/>
+                <w:bCs/>
+              </w:rPr>
+              <w:t xml:space="preserve">commons_constitution/eventbus.go</w:t>
+            </w:r>
+            <w:r>
+              <w:rPr>
+                <w:b/>
+                <w:bCs/>
+              </w:rPr>
+              <w:t xml:space="preserve"> </w:t>
+            </w:r>
+            <w:r>
+              <w:rPr>
+                <w:rStyle w:val="VerbatimChar"/>
+                <w:b/>
+                <w:bCs/>
+              </w:rPr>
+              <w:t xml:space="preserve">PublishedByType</w:t>
+            </w:r>
+            <w:r>
+              <w:rPr>
+                <w:b/>
+                <w:bCs/>
+              </w:rPr>
+              <w:t xml:space="preserve"> </w:t>
+            </w:r>
+            <w:r>
+              <w:rPr>
+                <w:b/>
+                <w:bCs/>
+              </w:rPr>
+              <w:t xml:space="preserve">data race →</w:t>
+            </w:r>
+            <w:r>
+              <w:rPr>
+                <w:b/>
+                <w:bCs/>
+              </w:rPr>
+              <w:t xml:space="preserve"> </w:t>
+            </w:r>
+            <w:r>
+              <w:rPr>
+                <w:rStyle w:val="VerbatimChar"/>
+                <w:b/>
+                <w:bCs/>
+              </w:rPr>
+              <w:t xml:space="preserve">sync.Map.LoadOrStore</w:t>
+            </w:r>
+            <w:r>
+              <w:rPr>
+                <w:b/>
+                <w:bCs/>
+              </w:rPr>
+              <w:t xml:space="preserve"> </w:t>
+            </w:r>
+            <w:r>
+              <w:rPr>
+                <w:b/>
+                <w:bCs/>
+              </w:rPr>
+              <w:t xml:space="preserve">(commit</w:t>
+            </w:r>
+            <w:r>
+              <w:rPr>
+                <w:b/>
+                <w:bCs/>
+              </w:rPr>
+              <w:t xml:space="preserve"> </w:t>
+            </w:r>
+            <w:r>
+              <w:rPr>
+                <w:rStyle w:val="VerbatimChar"/>
+                <w:b/>
+                <w:bCs/>
+              </w:rPr>
+              <w:t xml:space="preserve">f5d1367</w:t>
+            </w:r>
+            <w:r>
+              <w:rPr>
+                <w:b/>
+                <w:bCs/>
+              </w:rPr>
+              <w:t xml:space="preserve"> </w:t>
+            </w:r>
+            <w:r>
+              <w:rPr>
+                <w:b/>
+                <w:bCs/>
+              </w:rPr>
+              <w:t xml:space="preserve">— a REAL</w:t>
+            </w:r>
+            <w:r>
+              <w:rPr>
+                <w:b/>
+                <w:bCs/>
+              </w:rPr>
+              <w:t xml:space="preserve"> </w:t>
+            </w:r>
+            <w:r>
+              <w:rPr>
+                <w:rStyle w:val="VerbatimChar"/>
+                <w:b/>
+                <w:bCs/>
+              </w:rPr>
+              <w:t xml:space="preserve">-race</w:t>
+            </w:r>
+            <w:r>
+              <w:rPr>
+                <w:b/>
+                <w:bCs/>
+              </w:rPr>
+              <w:t xml:space="preserve"> </w:t>
+            </w:r>
+            <w:r>
+              <w:rPr>
+                <w:b/>
+                <w:bCs/>
+              </w:rPr>
+              <w:t xml:space="preserve">regression on E3 latent since Batch A, surfaced by the Batch-B bindings stress test); E17 e2e SKIP-guard now requires a live Postgres (commit</w:t>
+            </w:r>
+            <w:r>
+              <w:rPr>
+                <w:b/>
+                <w:bCs/>
+              </w:rPr>
+              <w:t xml:space="preserve"> </w:t>
+            </w:r>
+            <w:r>
+              <w:rPr>
+                <w:rStyle w:val="VerbatimChar"/>
+                <w:b/>
+                <w:bCs/>
+              </w:rPr>
+              <w:t xml:space="preserve">75e7a49</w:t>
+            </w:r>
+            <w:r>
+              <w:rPr>
+                <w:b/>
+                <w:bCs/>
+              </w:rPr>
+              <w:t xml:space="preserve"> </w:t>
+            </w:r>
+            <w:r>
+              <w:rPr>
+                <w:b/>
+                <w:bCs/>
+              </w:rPr>
+              <w:t xml:space="preserve">— E17 was FAILing instead of honestly SKIPping when PG is absent). (c) v1.0.0 Batch B COMPLETE — all 7 §42 flavor constitution bindings (HRD-019..025) landed, wiring each flavor to emit through the Batch-A</w:t>
+            </w:r>
+            <w:r>
+              <w:rPr>
+                <w:b/>
+                <w:bCs/>
+              </w:rPr>
+              <w:t xml:space="preserve"> </w:t>
+            </w:r>
+            <w:r>
+              <w:rPr>
+                <w:rStyle w:val="VerbatimChar"/>
+                <w:b/>
+                <w:bCs/>
+              </w:rPr>
+              <w:t xml:space="preserve">commons_constitution</w:t>
+            </w:r>
+            <w:r>
+              <w:rPr>
+                <w:b/>
+                <w:bCs/>
+              </w:rPr>
+              <w:t xml:space="preserve"> </w:t>
+            </w:r>
+            <w:r>
+              <w:rPr>
+                <w:b/>
+                <w:bCs/>
+              </w:rPr>
+              <w:t xml:space="preserve">Evaluator+audit foundation: HRD-019 cherald (</w:t>
+            </w:r>
+            <w:r>
+              <w:rPr>
+                <w:rStyle w:val="VerbatimChar"/>
+                <w:b/>
+                <w:bCs/>
+              </w:rPr>
+              <w:t xml:space="preserve">f33b5e4</w:t>
+            </w:r>
+            <w:r>
+              <w:rPr>
+                <w:b/>
+                <w:bCs/>
+              </w:rPr>
+              <w:t xml:space="preserve">, e2e E90</w:t>
+            </w:r>
+            <w:r>
+              <w:rPr>
+                <w:b/>
+                <w:bCs/>
+              </w:rPr>
+              <w:t xml:space="preserve"> </w:t>
+            </w:r>
+            <w:r>
+              <w:rPr>
+                <w:rStyle w:val="VerbatimChar"/>
+                <w:b/>
+                <w:bCs/>
+              </w:rPr>
+              <w:t xml:space="preserve">c3e3cff</w:t>
+            </w:r>
+            <w:r>
+              <w:rPr>
+                <w:b/>
+                <w:bCs/>
+              </w:rPr>
+              <w:t xml:space="preserve">), HRD-020 sherald (</w:t>
+            </w:r>
+            <w:r>
+              <w:rPr>
+                <w:rStyle w:val="VerbatimChar"/>
+                <w:b/>
+                <w:bCs/>
+              </w:rPr>
+              <w:t xml:space="preserve">5ebad4f</w:t>
+            </w:r>
+            <w:r>
+              <w:rPr>
+                <w:b/>
+                <w:bCs/>
+              </w:rPr>
+              <w:t xml:space="preserve">, E91</w:t>
+            </w:r>
+            <w:r>
+              <w:rPr>
+                <w:b/>
+                <w:bCs/>
+              </w:rPr>
+              <w:t xml:space="preserve"> </w:t>
+            </w:r>
+            <w:r>
+              <w:rPr>
+                <w:rStyle w:val="VerbatimChar"/>
+                <w:b/>
+                <w:bCs/>
+              </w:rPr>
+              <w:t xml:space="preserve">75e7a49</w:t>
+            </w:r>
+            <w:r>
+              <w:rPr>
+                <w:b/>
+                <w:bCs/>
+              </w:rPr>
+              <w:t xml:space="preserve">), HRD-021 bherald (</w:t>
+            </w:r>
+            <w:r>
+              <w:rPr>
+                <w:rStyle w:val="VerbatimChar"/>
+                <w:b/>
+                <w:bCs/>
+              </w:rPr>
+              <w:t xml:space="preserve">46ca77e</w:t>
+            </w:r>
+            <w:r>
+              <w:rPr>
+                <w:b/>
+                <w:bCs/>
+              </w:rPr>
+              <w:t xml:space="preserve">, E92</w:t>
+            </w:r>
+            <w:r>
+              <w:rPr>
+                <w:b/>
+                <w:bCs/>
+              </w:rPr>
+              <w:t xml:space="preserve"> </w:t>
+            </w:r>
+            <w:r>
+              <w:rPr>
+                <w:rStyle w:val="VerbatimChar"/>
+                <w:b/>
+                <w:bCs/>
+              </w:rPr>
+              <w:t xml:space="preserve">f31615f</w:t>
+            </w:r>
+            <w:r>
+              <w:rPr>
+                <w:b/>
+                <w:bCs/>
+              </w:rPr>
+              <w:t xml:space="preserve">), HRD-022 rherald (</w:t>
+            </w:r>
+            <w:r>
+              <w:rPr>
+                <w:rStyle w:val="VerbatimChar"/>
+                <w:b/>
+                <w:bCs/>
+              </w:rPr>
+              <w:t xml:space="preserve">f73195f</w:t>
+            </w:r>
+            <w:r>
+              <w:rPr>
+                <w:b/>
+                <w:bCs/>
+              </w:rPr>
+              <w:t xml:space="preserve">, E93</w:t>
+            </w:r>
+            <w:r>
+              <w:rPr>
+                <w:b/>
+                <w:bCs/>
+              </w:rPr>
+              <w:t xml:space="preserve"> </w:t>
+            </w:r>
+            <w:r>
+              <w:rPr>
+                <w:rStyle w:val="VerbatimChar"/>
+                <w:b/>
+                <w:bCs/>
+              </w:rPr>
+              <w:t xml:space="preserve">0206f8f</w:t>
+            </w:r>
+            <w:r>
+              <w:rPr>
+                <w:b/>
+                <w:bCs/>
+              </w:rPr>
+              <w:t xml:space="preserve">), HRD-023/024/025 pherald/iherald/scherald (</w:t>
+            </w:r>
+            <w:r>
+              <w:rPr>
+                <w:rStyle w:val="VerbatimChar"/>
+                <w:b/>
+                <w:bCs/>
+              </w:rPr>
+              <w:t xml:space="preserve">3fb753a</w:t>
+            </w:r>
+            <w:r>
+              <w:rPr>
+                <w:b/>
+                <w:bCs/>
+              </w:rPr>
+              <w:t xml:space="preserve">, landed in one parallel pass; E94/E95/E96</w:t>
+            </w:r>
+            <w:r>
+              <w:rPr>
+                <w:b/>
+                <w:bCs/>
+              </w:rPr>
+              <w:t xml:space="preserve"> </w:t>
+            </w:r>
+            <w:r>
+              <w:rPr>
+                <w:rStyle w:val="VerbatimChar"/>
+                <w:b/>
+                <w:bCs/>
+              </w:rPr>
+              <w:t xml:space="preserve">74649bb</w:t>
+            </w:r>
+            <w:r>
+              <w:rPr>
+                <w:b/>
+                <w:bCs/>
+              </w:rPr>
+              <w:t xml:space="preserve">). Each flavor:</w:t>
+            </w:r>
+            <w:r>
+              <w:rPr>
+                <w:b/>
+                <w:bCs/>
+              </w:rPr>
+              <w:t xml:space="preserve"> </w:t>
+            </w:r>
+            <w:r>
+              <w:rPr>
+                <w:rStyle w:val="VerbatimChar"/>
+                <w:b/>
+                <w:bCs/>
+              </w:rPr>
+              <w:t xml:space="preserve">&lt;flavor&gt;/internal/bindings/</w:t>
+            </w:r>
+            <w:r>
+              <w:rPr>
+                <w:b/>
+                <w:bCs/>
+              </w:rPr>
+              <w:t xml:space="preserve"> </w:t>
+            </w:r>
+            <w:r>
+              <w:rPr>
+                <w:b/>
+                <w:bCs/>
+              </w:rPr>
+              <w:t xml:space="preserve">Pipeline + rule catalogue + bespoke PURE detectors,</w:t>
+            </w:r>
+            <w:r>
+              <w:rPr>
+                <w:b/>
+                <w:bCs/>
+              </w:rPr>
+              <w:t xml:space="preserve"> </w:t>
+            </w:r>
+            <w:r>
+              <w:rPr>
+                <w:rStyle w:val="VerbatimChar"/>
+                <w:b/>
+                <w:bCs/>
+              </w:rPr>
+              <w:t xml:space="preserve">-race -count=3</w:t>
+            </w:r>
+            <w:r>
+              <w:rPr>
+                <w:b/>
+                <w:bCs/>
+              </w:rPr>
+              <w:t xml:space="preserve"> </w:t>
+            </w:r>
+            <w:r>
+              <w:rPr>
+                <w:b/>
+                <w:bCs/>
+              </w:rPr>
+              <w:t xml:space="preserve">green, §107.x evidence under</w:t>
+            </w:r>
+            <w:r>
+              <w:rPr>
+                <w:b/>
+                <w:bCs/>
+              </w:rPr>
+              <w:t xml:space="preserve"> </w:t>
+            </w:r>
+            <w:r>
+              <w:rPr>
+                <w:rStyle w:val="VerbatimChar"/>
+                <w:b/>
+                <w:bCs/>
+              </w:rPr>
+              <w:t xml:space="preserve">docs/qa/HRD-0XX-*/</w:t>
+            </w:r>
+            <w:r>
+              <w:rPr>
+                <w:b/>
+                <w:bCs/>
+              </w:rPr>
+              <w:t xml:space="preserve">, §11.4.85 stress (1200 concurrent → 1200 emits+audit rows). All HRD-019..025 remain</w:t>
+            </w:r>
+            <w:r>
+              <w:rPr>
+                <w:b/>
+                <w:bCs/>
+              </w:rPr>
+              <w:t xml:space="preserve"> </w:t>
+            </w:r>
+            <w:r>
+              <w:rPr>
+                <w:b/>
+                <w:b/>
+                <w:bCs/>
+                <w:bCs/>
+              </w:rPr>
+              <w:t xml:space="preserve">in_progress</w:t>
+            </w:r>
+            <w:r>
+              <w:rPr>
+                <w:b/>
+                <w:bCs/>
+              </w:rPr>
+              <w:t xml:space="preserve"> </w:t>
+            </w:r>
+            <w:r>
+              <w:rPr>
+                <w:b/>
+                <w:bCs/>
+              </w:rPr>
+              <w:t xml:space="preserve">— mechanism + rules + detectors are done, but live operation-interception (the Subjects fed to the detectors) is Batch C §43 command bodies. e2e invariants now run through E96 (E89 Batch-A foundation + E90-E96 Batch B). Prior r13 (still valid history):</w:t>
+            </w:r>
+            <w:r>
+              <w:t xml:space="preserve"> </w:t>
+            </w:r>
+            <w:r>
+              <w:rPr>
+                <w:b/>
+                <w:bCs/>
+              </w:rPr>
               <w:t xml:space="preserve">2026-05-27 v1.0.0 Batch A complete checkpoint (HEAD</w:t>
             </w:r>
             <w:r>
@@ -1549,7 +2306,20 @@
               <w:pStyle w:val="Compact"/>
             </w:pPr>
             <w:r>
-              <w:t xml:space="preserve">HRD-008, HRD-015, HRD-019..HRD-025, HRD-029..HRD-056, HRD-081, HRD-085..HRD-090, HRD-115..HRD-121 (Wave 7 T6-T12 pending), HRD-131 (SQLite SSoT Phase 1, OPEN-deferred — blocked on constitution binary) —</w:t>
+              <w:t xml:space="preserve">HRD-008, HRD-015, HRD-019..HRD-025 (Batch B bindings landed —</w:t>
+            </w:r>
+            <w:r>
+              <w:t xml:space="preserve"> </w:t>
+            </w:r>
+            <w:r>
+              <w:rPr>
+                <w:b/>
+                <w:bCs/>
+              </w:rPr>
+              <w:t xml:space="preserve">in_progress</w:t>
+            </w:r>
+            <w:r>
+              <w:t xml:space="preserve">, live-op deferred to Batch C), HRD-029..HRD-056, HRD-081, HRD-085..HRD-090, HRD-115..HRD-121 (Wave 7 T6-T12 pending), HRD-131 (SQLite SSoT Phase 1, OPEN-deferred — blocked on constitution binary) —</w:t>
             </w:r>
             <w:r>
               <w:t xml:space="preserve"> </w:t>
@@ -1595,10 +2365,83 @@
               <w:t xml:space="preserve">Issues.md</w:t>
             </w:r>
             <w:r>
-              <w:t xml:space="preserve"> </w:t>
-            </w:r>
-            <w:r>
-              <w:t xml:space="preserve">(r17). v1.0.0 Batch A migrated HRD-018 / HRD-026 / HRD-027 Issues→Fixed (40→37 open, §11.4.19 atomic). Wave 7 closed HRD-110/111/112/113/114; HRD-115..121 are the remaining Wave 7 tasks T6-T12. HRD-122..HRD-130 (§11.4.85 stress+chaos suite, GAP-3) + HRD-132 (Runner idempotency-window bug) MIGRATED to Fixed.md in r16/r15. HRD-131 is §11.4.93 SQLite workable-items SSoT migration Phase 1 — now</w:t>
+              <w:t xml:space="preserve">. v1.0.0 Batch A migrated HRD-018 / HRD-026 / HRD-027 Issues→Fixed (§11.4.19 atomic). v1.0.0 Batch B (HRD-019..025, §42 flavor constitution bindings) is</w:t>
+            </w:r>
+            <w:r>
+              <w:t xml:space="preserve"> </w:t>
+            </w:r>
+            <w:r>
+              <w:rPr>
+                <w:b/>
+                <w:bCs/>
+              </w:rPr>
+              <w:t xml:space="preserve">in_progress</w:t>
+            </w:r>
+            <w:r>
+              <w:t xml:space="preserve"> </w:t>
+            </w:r>
+            <w:r>
+              <w:t xml:space="preserve">— each flavor's</w:t>
+            </w:r>
+            <w:r>
+              <w:t xml:space="preserve"> </w:t>
+            </w:r>
+            <w:r>
+              <w:rPr>
+                <w:rStyle w:val="VerbatimChar"/>
+              </w:rPr>
+              <w:t xml:space="preserve">internal/bindings/</w:t>
+            </w:r>
+            <w:r>
+              <w:t xml:space="preserve"> </w:t>
+            </w:r>
+            <w:r>
+              <w:t xml:space="preserve">Pipeline + rule catalogue + PURE detectors + emit-through-audit foundation + §107.x evidence + §11.4.85 stress all landed (</w:t>
+            </w:r>
+            <w:r>
+              <w:rPr>
+                <w:rStyle w:val="VerbatimChar"/>
+              </w:rPr>
+              <w:t xml:space="preserve">f33b5e4</w:t>
+            </w:r>
+            <w:r>
+              <w:t xml:space="preserve">/</w:t>
+            </w:r>
+            <w:r>
+              <w:rPr>
+                <w:rStyle w:val="VerbatimChar"/>
+              </w:rPr>
+              <w:t xml:space="preserve">5ebad4f</w:t>
+            </w:r>
+            <w:r>
+              <w:t xml:space="preserve">/</w:t>
+            </w:r>
+            <w:r>
+              <w:rPr>
+                <w:rStyle w:val="VerbatimChar"/>
+              </w:rPr>
+              <w:t xml:space="preserve">46ca77e</w:t>
+            </w:r>
+            <w:r>
+              <w:t xml:space="preserve">/</w:t>
+            </w:r>
+            <w:r>
+              <w:rPr>
+                <w:rStyle w:val="VerbatimChar"/>
+              </w:rPr>
+              <w:t xml:space="preserve">f73195f</w:t>
+            </w:r>
+            <w:r>
+              <w:t xml:space="preserve">/</w:t>
+            </w:r>
+            <w:r>
+              <w:rPr>
+                <w:rStyle w:val="VerbatimChar"/>
+              </w:rPr>
+              <w:t xml:space="preserve">3fb753a</w:t>
+            </w:r>
+            <w:r>
+              <w:t xml:space="preserve">), but live operation-interception (the Subjects the detectors classify) is deferred to Batch C §43 command bodies, so these stay open not Fixed. Wave 7 closed HRD-110/111/112/113/114; HRD-115..121 are the remaining Wave 7 tasks T6-T12. HRD-122..HRD-130 (§11.4.85 stress+chaos suite, GAP-3) + HRD-132 (Runner idempotency-window bug) MIGRATED to Fixed.md. HRD-131 is §11.4.93 SQLite workable-items SSoT migration Phase 1 —</w:t>
             </w:r>
             <w:r>
               <w:t xml:space="preserve"> </w:t>
@@ -1733,23 +2576,506 @@
                 <w:b/>
                 <w:bCs/>
               </w:rPr>
-              <w:t xml:space="preserve">; Batch A DONE, next is Batch B:</w:t>
-            </w:r>
-            <w:r>
-              <w:t xml:space="preserve"> </w:t>
-            </w:r>
-            <w:r>
-              <w:rPr>
-                <w:b/>
-                <w:bCs/>
-              </w:rPr>
-              <w:t xml:space="preserve">(1) Batch B — HRD-019..025, §42 flavor constitution bindings (IMMEDIATE NEXT UNIT)</w:t>
-            </w:r>
-            <w:r>
-              <w:t xml:space="preserve"> </w:t>
-            </w:r>
-            <w:r>
-              <w:t xml:space="preserve">— these depend on the now-complete</w:t>
+              <w:t xml:space="preserve">; Batch A + Batch B DONE, next is Batch C:</w:t>
+            </w:r>
+            <w:r>
+              <w:t xml:space="preserve"> </w:t>
+            </w:r>
+            <w:r>
+              <w:rPr>
+                <w:b/>
+                <w:bCs/>
+              </w:rPr>
+              <w:t xml:space="preserve">(1) Batch C — §43 command catalogue HRD-029..056 (IMMEDIATE NEXT UNIT)</w:t>
+            </w:r>
+            <w:r>
+              <w:t xml:space="preserve"> </w:t>
+            </w:r>
+            <w:r>
+              <w:t xml:space="preserve">— the live CLI command bodies that PRODUCE the Subjects the Batch-B detectors classify (pherald commit-push, sherald destructive-guard, cherald creds-scan, rherald tag-mirror, bherald evidence-capture, etc.), grouped into 5 flavor clusters per the v1.0.0 plan. Closing Batch C is what flips HRD-019..025 from in_progress→Fixed (their bindings have no live Subjects until the command surface lands).</w:t>
+            </w:r>
+            <w:r>
+              <w:t xml:space="preserve"> </w:t>
+            </w:r>
+            <w:r>
+              <w:rPr>
+                <w:b/>
+                <w:bCs/>
+              </w:rPr>
+              <w:t xml:space="preserve">NOTE — the e2e invariant counter is at E96; next free is E97+.</w:t>
+            </w:r>
+            <w:r>
+              <w:t xml:space="preserve"> </w:t>
+            </w:r>
+            <w:r>
+              <w:rPr>
+                <w:b/>
+                <w:bCs/>
+              </w:rPr>
+              <w:t xml:space="preserve">(2) Batch D — commons_infra HRD-081 + HRD-085..090.</w:t>
+            </w:r>
+            <w:r>
+              <w:t xml:space="preserve"> </w:t>
+            </w:r>
+            <w:r>
+              <w:rPr>
+                <w:b/>
+                <w:bCs/>
+              </w:rPr>
+              <w:t xml:space="preserve">(3) Batch E — Wave 7 T6-T12 Slack adapter HRD-115..121</w:t>
+            </w:r>
+            <w:r>
+              <w:t xml:space="preserve"> </w:t>
+            </w:r>
+            <w:r>
+              <w:t xml:space="preserve">(vendored slack-go submodule —</w:t>
+            </w:r>
+            <w:r>
+              <w:t xml:space="preserve"> </w:t>
+            </w:r>
+            <w:r>
+              <w:rPr>
+                <w:b/>
+                <w:bCs/>
+              </w:rPr>
+              <w:t xml:space="preserve">verify the I6 inheritance-gate check after the</w:t>
+            </w:r>
+            <w:r>
+              <w:rPr>
+                <w:b/>
+                <w:bCs/>
+              </w:rPr>
+              <w:t xml:space="preserve"> </w:t>
+            </w:r>
+            <w:r>
+              <w:rPr>
+                <w:rStyle w:val="VerbatimChar"/>
+                <w:b/>
+                <w:bCs/>
+              </w:rPr>
+              <w:t xml:space="preserve">.gitmodules</w:t>
+            </w:r>
+            <w:r>
+              <w:rPr>
+                <w:b/>
+                <w:bCs/>
+              </w:rPr>
+              <w:t xml:space="preserve"> </w:t>
+            </w:r>
+            <w:r>
+              <w:rPr>
+                <w:b/>
+                <w:bCs/>
+              </w:rPr>
+              <w:t xml:space="preserve">entry</w:t>
+            </w:r>
+            <w:r>
+              <w:t xml:space="preserve">; confirm slack-go v0.16.0 field names</w:t>
+            </w:r>
+            <w:r>
+              <w:t xml:space="preserve"> </w:t>
+            </w:r>
+            <w:r>
+              <w:rPr>
+                <w:rStyle w:val="VerbatimChar"/>
+              </w:rPr>
+              <w:t xml:space="preserve">inner.Files</w:t>
+            </w:r>
+            <w:r>
+              <w:t xml:space="preserve">/</w:t>
+            </w:r>
+            <w:r>
+              <w:rPr>
+                <w:rStyle w:val="VerbatimChar"/>
+              </w:rPr>
+              <w:t xml:space="preserve">socketmode.EventTypeEventsAPI</w:t>
+            </w:r>
+            <w:r>
+              <w:t xml:space="preserve">/</w:t>
+            </w:r>
+            <w:r>
+              <w:rPr>
+                <w:rStyle w:val="VerbatimChar"/>
+              </w:rPr>
+              <w:t xml:space="preserve">UploadFileV2Parameters</w:t>
+            </w:r>
+            <w:r>
+              <w:t xml:space="preserve">; then qaherald Slack MessengerClient, spec §11.0/§32.2/§43, e2e, mutation gate, Issues→Fixed/v0.6.0/4-mirror push; T5 pre-staged</w:t>
+            </w:r>
+            <w:r>
+              <w:t xml:space="preserve"> </w:t>
+            </w:r>
+            <w:r>
+              <w:rPr>
+                <w:rStyle w:val="VerbatimChar"/>
+              </w:rPr>
+              <w:t xml:space="preserve">perChannelConfig("slack")</w:t>
+            </w:r>
+            <w:r>
+              <w:t xml:space="preserve"> </w:t>
+            </w:r>
+            <w:r>
+              <w:t xml:space="preserve">+ blank-import in listen.go —</w:t>
+            </w:r>
+            <w:r>
+              <w:t xml:space="preserve"> </w:t>
+            </w:r>
+            <w:r>
+              <w:rPr>
+                <w:rStyle w:val="VerbatimChar"/>
+              </w:rPr>
+              <w:t xml:space="preserve">HERALD_CHANNELS=tgram,slack</w:t>
+            </w:r>
+            <w:r>
+              <w:t xml:space="preserve"> </w:t>
+            </w:r>
+            <w:r>
+              <w:t xml:space="preserve">currently errors</w:t>
+            </w:r>
+            <w:r>
+              <w:t xml:space="preserve"> </w:t>
+            </w:r>
+            <w:r>
+              <w:rPr>
+                <w:rStyle w:val="VerbatimChar"/>
+              </w:rPr>
+              <w:t xml:space="preserve">ErrUnknownChannel</w:t>
+            </w:r>
+            <w:r>
+              <w:t xml:space="preserve"> </w:t>
+            </w:r>
+            <w:r>
+              <w:t xml:space="preserve">until T6 registers slack, by design; plan</w:t>
+            </w:r>
+            <w:r>
+              <w:t xml:space="preserve"> </w:t>
+            </w:r>
+            <w:r>
+              <w:rPr>
+                <w:rStyle w:val="VerbatimChar"/>
+              </w:rPr>
+              <w:t xml:space="preserve">docs/superpowers/plans/2026-05-27-wave7-generic-messenger.md</w:t>
+            </w:r>
+            <w:r>
+              <w:t xml:space="preserve"> </w:t>
+            </w:r>
+            <w:r>
+              <w:t xml:space="preserve">line 980).</w:t>
+            </w:r>
+            <w:r>
+              <w:t xml:space="preserve"> </w:t>
+            </w:r>
+            <w:r>
+              <w:rPr>
+                <w:b/>
+                <w:bCs/>
+              </w:rPr>
+              <w:t xml:space="preserve">PLAN GOTCHAS:</w:t>
+            </w:r>
+            <w:r>
+              <w:t xml:space="preserve"> </w:t>
+            </w:r>
+            <w:r>
+              <w:t xml:space="preserve">Wave 7 e2e invariants MUST renumber off E81-E89 — use</w:t>
+            </w:r>
+            <w:r>
+              <w:t xml:space="preserve"> </w:t>
+            </w:r>
+            <w:r>
+              <w:rPr>
+                <w:b/>
+                <w:bCs/>
+              </w:rPr>
+              <w:t xml:space="preserve">E90+</w:t>
+            </w:r>
+            <w:r>
+              <w:t xml:space="preserve"> </w:t>
+            </w:r>
+            <w:r>
+              <w:t xml:space="preserve">(E89 is now consumed by Batch A's audit write-through); the slack-go submodule addition requires re-running the I6 inheritance-gate check (</w:t>
+            </w:r>
+            <w:r>
+              <w:rPr>
+                <w:rStyle w:val="VerbatimChar"/>
+              </w:rPr>
+              <w:t xml:space="preserve">tests/test_constitution_inheritance.sh</w:t>
+            </w:r>
+            <w:r>
+              <w:t xml:space="preserve">). Tag cadence: v0.5→v1.0.0 across the batches.</w:t>
+            </w:r>
+            <w:r>
+              <w:t xml:space="preserve"> </w:t>
+            </w:r>
+            <w:r>
+              <w:rPr>
+                <w:b/>
+                <w:bCs/>
+              </w:rPr>
+              <w:t xml:space="preserve">(5) GAP-4 docs/qa back-fill + docs-audit #147</w:t>
+            </w:r>
+            <w:r>
+              <w:t xml:space="preserve"> </w:t>
+            </w:r>
+            <w:r>
+              <w:t xml:space="preserve">— features lacking</w:t>
+            </w:r>
+            <w:r>
+              <w:t xml:space="preserve"> </w:t>
+            </w:r>
+            <w:r>
+              <w:rPr>
+                <w:rStyle w:val="VerbatimChar"/>
+              </w:rPr>
+              <w:t xml:space="preserve">docs/qa/&lt;run-id&gt;/</w:t>
+            </w:r>
+            <w:r>
+              <w:t xml:space="preserve"> </w:t>
+            </w:r>
+            <w:r>
+              <w:t xml:space="preserve">evidence per the</w:t>
+            </w:r>
+            <w:r>
+              <w:t xml:space="preserve"> </w:t>
+            </w:r>
+            <w:r>
+              <w:rPr>
+                <w:rStyle w:val="VerbatimChar"/>
+              </w:rPr>
+              <w:t xml:space="preserve">ee63ce6</w:t>
+            </w:r>
+            <w:r>
+              <w:t xml:space="preserve"> </w:t>
+            </w:r>
+            <w:r>
+              <w:t xml:space="preserve">qa-coverage audit + comprehensive documentation audit.</w:t>
+            </w:r>
+            <w:r>
+              <w:t xml:space="preserve"> </w:t>
+            </w:r>
+            <w:r>
+              <w:rPr>
+                <w:b/>
+                <w:bCs/>
+              </w:rPr>
+              <w:t xml:space="preserve">DEFERRED / GATED ITEMS:</w:t>
+            </w:r>
+            <w:r>
+              <w:t xml:space="preserve"> </w:t>
+            </w:r>
+            <w:r>
+              <w:rPr>
+                <w:b/>
+                <w:bCs/>
+              </w:rPr>
+              <w:t xml:space="preserve">§11.4.93 SQLite SSoT migration (HRD-131) — OPERATOR-DEFERRED 2026-05-27:</w:t>
+            </w:r>
+            <w:r>
+              <w:t xml:space="preserve"> </w:t>
+            </w:r>
+            <w:r>
+              <w:t xml:space="preserve">Phase 2 adoption is blocked on the constitution's workable-items migration binary, which is an unimplemented scaffold (0/7 subcommands) + schema-incompatible with Herald's HRD-NNN pipe-table format; per §11.4.74 Herald may NOT reimplement it — the fix is a constitution-repo task affecting all consumers (assessment</w:t>
+            </w:r>
+            <w:r>
+              <w:t xml:space="preserve"> </w:t>
+            </w:r>
+            <w:r>
+              <w:rPr>
+                <w:rStyle w:val="VerbatimChar"/>
+              </w:rPr>
+              <w:t xml:space="preserve">docs/research/workable-items-phase2-assessment-2026-05-27.md</w:t>
+            </w:r>
+            <w:r>
+              <w:t xml:space="preserve">,</w:t>
+            </w:r>
+            <w:r>
+              <w:t xml:space="preserve"> </w:t>
+            </w:r>
+            <w:r>
+              <w:rPr>
+                <w:rStyle w:val="VerbatimChar"/>
+              </w:rPr>
+              <w:t xml:space="preserve">36fa90b</w:t>
+            </w:r>
+            <w:r>
+              <w:t xml:space="preserve">). HRD-131 stays OPEN, blocked-on-constitution-binary. MTProto real-channel automation — OPERATOR-DECISION: provide my.telegram.org app_id+app_hash (folds into a qaherald MessengerClient MTProto impl reusing the entire scenario engine; Telegram never relays bot-to-bot in groups — see</w:t>
+            </w:r>
+            <w:r>
+              <w:t xml:space="preserve"> </w:t>
+            </w:r>
+            <w:r>
+              <w:rPr>
+                <w:rStyle w:val="VerbatimChar"/>
+              </w:rPr>
+              <w:t xml:space="preserve">docs/research/telegram-bot-to-bot-constraint.md</w:t>
+            </w:r>
+            <w:r>
+              <w:t xml:space="preserve">); operator should also</w:t>
+            </w:r>
+            <w:r>
+              <w:t xml:space="preserve"> </w:t>
+            </w:r>
+            <w:r>
+              <w:rPr>
+                <w:rStyle w:val="VerbatimChar"/>
+              </w:rPr>
+              <w:t xml:space="preserve">/revoke @pherald_qa_bot</w:t>
+            </w:r>
+            <w:r>
+              <w:t xml:space="preserve"> </w:t>
+            </w:r>
+            <w:r>
+              <w:t xml:space="preserve">(leaked plaintext token). §11.4.90 obsolescence — zero current Obsolete rows; convention in place, periodic re-audit pending. (RESOLVED this session (2026-05-28 day-2): v1.0.0 Batch B COMPLETE — all 7 §42 flavor constitution bindings HRD-019..025 landed (</w:t>
+            </w:r>
+            <w:r>
+              <w:rPr>
+                <w:rStyle w:val="VerbatimChar"/>
+              </w:rPr>
+              <w:t xml:space="preserve">f33b5e4</w:t>
+            </w:r>
+            <w:r>
+              <w:t xml:space="preserve">/</w:t>
+            </w:r>
+            <w:r>
+              <w:rPr>
+                <w:rStyle w:val="VerbatimChar"/>
+              </w:rPr>
+              <w:t xml:space="preserve">5ebad4f</w:t>
+            </w:r>
+            <w:r>
+              <w:t xml:space="preserve">/</w:t>
+            </w:r>
+            <w:r>
+              <w:rPr>
+                <w:rStyle w:val="VerbatimChar"/>
+              </w:rPr>
+              <w:t xml:space="preserve">46ca77e</w:t>
+            </w:r>
+            <w:r>
+              <w:t xml:space="preserve">/</w:t>
+            </w:r>
+            <w:r>
+              <w:rPr>
+                <w:rStyle w:val="VerbatimChar"/>
+              </w:rPr>
+              <w:t xml:space="preserve">f73195f</w:t>
+            </w:r>
+            <w:r>
+              <w:t xml:space="preserve">/</w:t>
+            </w:r>
+            <w:r>
+              <w:rPr>
+                <w:rStyle w:val="VerbatimChar"/>
+              </w:rPr>
+              <w:t xml:space="preserve">3fb753a</w:t>
+            </w:r>
+            <w:r>
+              <w:t xml:space="preserve">), each</w:t>
+            </w:r>
+            <w:r>
+              <w:t xml:space="preserve"> </w:t>
+            </w:r>
+            <w:r>
+              <w:rPr>
+                <w:rStyle w:val="VerbatimChar"/>
+              </w:rPr>
+              <w:t xml:space="preserve">internal/bindings/</w:t>
+            </w:r>
+            <w:r>
+              <w:t xml:space="preserve"> </w:t>
+            </w:r>
+            <w:r>
+              <w:t xml:space="preserve">Pipeline + rule catalogue + PURE detectors + §107.x evidence + §11.4.85 stress 1200-concurrent, e2e E90-E96 wired (HRD-019..025 stay in_progress — live-op interception is Batch C); constitution pulled</w:t>
+            </w:r>
+            <w:r>
+              <w:t xml:space="preserve"> </w:t>
+            </w:r>
+            <w:r>
+              <w:rPr>
+                <w:rStyle w:val="VerbatimChar"/>
+              </w:rPr>
+              <w:t xml:space="preserve">3c9c4e9</w:t>
+            </w:r>
+            <w:r>
+              <w:t xml:space="preserve">→</w:t>
+            </w:r>
+            <w:r>
+              <w:rPr>
+                <w:rStyle w:val="VerbatimChar"/>
+              </w:rPr>
+              <w:t xml:space="preserve">15cd4bc</w:t>
+            </w:r>
+            <w:r>
+              <w:t xml:space="preserve"> </w:t>
+            </w:r>
+            <w:r>
+              <w:t xml:space="preserve">+ §11.4.95-97 propagated (</w:t>
+            </w:r>
+            <w:r>
+              <w:rPr>
+                <w:rStyle w:val="VerbatimChar"/>
+              </w:rPr>
+              <w:t xml:space="preserve">d5b9895</w:t>
+            </w:r>
+            <w:r>
+              <w:t xml:space="preserve">, gate 15/0); 3 fixes — #194 audit-test qaRoot t.TempDir guard (</w:t>
+            </w:r>
+            <w:r>
+              <w:rPr>
+                <w:rStyle w:val="VerbatimChar"/>
+              </w:rPr>
+              <w:t xml:space="preserve">a8ad4f7</w:t>
+            </w:r>
+            <w:r>
+              <w:t xml:space="preserve">), eventbus</w:t>
+            </w:r>
+            <w:r>
+              <w:t xml:space="preserve"> </w:t>
+            </w:r>
+            <w:r>
+              <w:rPr>
+                <w:rStyle w:val="VerbatimChar"/>
+              </w:rPr>
+              <w:t xml:space="preserve">PublishedByType</w:t>
+            </w:r>
+            <w:r>
+              <w:t xml:space="preserve"> </w:t>
+            </w:r>
+            <w:r>
+              <w:t xml:space="preserve">data race → LoadOrStore (</w:t>
+            </w:r>
+            <w:r>
+              <w:rPr>
+                <w:rStyle w:val="VerbatimChar"/>
+              </w:rPr>
+              <w:t xml:space="preserve">f5d1367</w:t>
+            </w:r>
+            <w:r>
+              <w:t xml:space="preserve">, a real E3 -race regression latent since Batch A), E17 e2e SKIP-guard now requires live PG (</w:t>
+            </w:r>
+            <w:r>
+              <w:rPr>
+                <w:rStyle w:val="VerbatimChar"/>
+              </w:rPr>
+              <w:t xml:space="preserve">75e7a49</w:t>
+            </w:r>
+            <w:r>
+              <w:t xml:space="preserve">). Prior r13: v1.0.0 Batch A — HRD-018/026/027 closed atomically Issues→Fixed, e2e</w:t>
+            </w:r>
+            <w:r>
+              <w:t xml:space="preserve"> </w:t>
+            </w:r>
+            <w:r>
+              <w:rPr>
+                <w:b/>
+                <w:bCs/>
+              </w:rPr>
+              <w:t xml:space="preserve">81 PASS / 0 FAIL</w:t>
+            </w:r>
+            <w:r>
+              <w:t xml:space="preserve"> </w:t>
+            </w:r>
+            <w:r>
+              <w:t xml:space="preserve">(E89 wired),</w:t>
             </w:r>
             <w:r>
               <w:t xml:space="preserve"> </w:t>
@@ -1764,375 +3090,6 @@
               <w:t xml:space="preserve"> </w:t>
             </w:r>
             <w:r>
-              <w:t xml:space="preserve">Evaluator + emit + audit write-through foundation Batch A just landed; wire each flavor's per-binding constitution evaluation + emit + audit + mode-ladder.</w:t>
-            </w:r>
-            <w:r>
-              <w:t xml:space="preserve"> </w:t>
-            </w:r>
-            <w:r>
-              <w:rPr>
-                <w:b/>
-                <w:bCs/>
-              </w:rPr>
-              <w:t xml:space="preserve">(2) Batch C — §43 command catalogue HRD-029..056</w:t>
-            </w:r>
-            <w:r>
-              <w:t xml:space="preserve"> </w:t>
-            </w:r>
-            <w:r>
-              <w:t xml:space="preserve">(the flavor CLI subcommand surface).</w:t>
-            </w:r>
-            <w:r>
-              <w:t xml:space="preserve"> </w:t>
-            </w:r>
-            <w:r>
-              <w:rPr>
-                <w:b/>
-                <w:bCs/>
-              </w:rPr>
-              <w:t xml:space="preserve">(3) Batch D — commons_infra HRD-081 + HRD-085..090.</w:t>
-            </w:r>
-            <w:r>
-              <w:t xml:space="preserve"> </w:t>
-            </w:r>
-            <w:r>
-              <w:rPr>
-                <w:b/>
-                <w:bCs/>
-              </w:rPr>
-              <w:t xml:space="preserve">(4) Batch E — Wave 7 T6-T12 Slack adapter HRD-115..121</w:t>
-            </w:r>
-            <w:r>
-              <w:t xml:space="preserve"> </w:t>
-            </w:r>
-            <w:r>
-              <w:t xml:space="preserve">(vendored slack-go submodule —</w:t>
-            </w:r>
-            <w:r>
-              <w:t xml:space="preserve"> </w:t>
-            </w:r>
-            <w:r>
-              <w:rPr>
-                <w:b/>
-                <w:bCs/>
-              </w:rPr>
-              <w:t xml:space="preserve">verify the I6 inheritance-gate check after the</w:t>
-            </w:r>
-            <w:r>
-              <w:rPr>
-                <w:b/>
-                <w:bCs/>
-              </w:rPr>
-              <w:t xml:space="preserve"> </w:t>
-            </w:r>
-            <w:r>
-              <w:rPr>
-                <w:rStyle w:val="VerbatimChar"/>
-                <w:b/>
-                <w:bCs/>
-              </w:rPr>
-              <w:t xml:space="preserve">.gitmodules</w:t>
-            </w:r>
-            <w:r>
-              <w:rPr>
-                <w:b/>
-                <w:bCs/>
-              </w:rPr>
-              <w:t xml:space="preserve"> </w:t>
-            </w:r>
-            <w:r>
-              <w:rPr>
-                <w:b/>
-                <w:bCs/>
-              </w:rPr>
-              <w:t xml:space="preserve">entry</w:t>
-            </w:r>
-            <w:r>
-              <w:t xml:space="preserve">; confirm slack-go v0.16.0 field names</w:t>
-            </w:r>
-            <w:r>
-              <w:t xml:space="preserve"> </w:t>
-            </w:r>
-            <w:r>
-              <w:rPr>
-                <w:rStyle w:val="VerbatimChar"/>
-              </w:rPr>
-              <w:t xml:space="preserve">inner.Files</w:t>
-            </w:r>
-            <w:r>
-              <w:t xml:space="preserve">/</w:t>
-            </w:r>
-            <w:r>
-              <w:rPr>
-                <w:rStyle w:val="VerbatimChar"/>
-              </w:rPr>
-              <w:t xml:space="preserve">socketmode.EventTypeEventsAPI</w:t>
-            </w:r>
-            <w:r>
-              <w:t xml:space="preserve">/</w:t>
-            </w:r>
-            <w:r>
-              <w:rPr>
-                <w:rStyle w:val="VerbatimChar"/>
-              </w:rPr>
-              <w:t xml:space="preserve">UploadFileV2Parameters</w:t>
-            </w:r>
-            <w:r>
-              <w:t xml:space="preserve">; then qaherald Slack MessengerClient, spec §11.0/§32.2/§43, e2e, mutation gate, Issues→Fixed/v0.6.0/4-mirror push; T5 pre-staged</w:t>
-            </w:r>
-            <w:r>
-              <w:t xml:space="preserve"> </w:t>
-            </w:r>
-            <w:r>
-              <w:rPr>
-                <w:rStyle w:val="VerbatimChar"/>
-              </w:rPr>
-              <w:t xml:space="preserve">perChannelConfig("slack")</w:t>
-            </w:r>
-            <w:r>
-              <w:t xml:space="preserve"> </w:t>
-            </w:r>
-            <w:r>
-              <w:t xml:space="preserve">+ blank-import in listen.go —</w:t>
-            </w:r>
-            <w:r>
-              <w:t xml:space="preserve"> </w:t>
-            </w:r>
-            <w:r>
-              <w:rPr>
-                <w:rStyle w:val="VerbatimChar"/>
-              </w:rPr>
-              <w:t xml:space="preserve">HERALD_CHANNELS=tgram,slack</w:t>
-            </w:r>
-            <w:r>
-              <w:t xml:space="preserve"> </w:t>
-            </w:r>
-            <w:r>
-              <w:t xml:space="preserve">currently errors</w:t>
-            </w:r>
-            <w:r>
-              <w:t xml:space="preserve"> </w:t>
-            </w:r>
-            <w:r>
-              <w:rPr>
-                <w:rStyle w:val="VerbatimChar"/>
-              </w:rPr>
-              <w:t xml:space="preserve">ErrUnknownChannel</w:t>
-            </w:r>
-            <w:r>
-              <w:t xml:space="preserve"> </w:t>
-            </w:r>
-            <w:r>
-              <w:t xml:space="preserve">until T6 registers slack, by design; plan</w:t>
-            </w:r>
-            <w:r>
-              <w:t xml:space="preserve"> </w:t>
-            </w:r>
-            <w:r>
-              <w:rPr>
-                <w:rStyle w:val="VerbatimChar"/>
-              </w:rPr>
-              <w:t xml:space="preserve">docs/superpowers/plans/2026-05-27-wave7-generic-messenger.md</w:t>
-            </w:r>
-            <w:r>
-              <w:t xml:space="preserve"> </w:t>
-            </w:r>
-            <w:r>
-              <w:t xml:space="preserve">line 980).</w:t>
-            </w:r>
-            <w:r>
-              <w:t xml:space="preserve"> </w:t>
-            </w:r>
-            <w:r>
-              <w:rPr>
-                <w:b/>
-                <w:bCs/>
-              </w:rPr>
-              <w:t xml:space="preserve">PLAN GOTCHAS:</w:t>
-            </w:r>
-            <w:r>
-              <w:t xml:space="preserve"> </w:t>
-            </w:r>
-            <w:r>
-              <w:t xml:space="preserve">Wave 7 e2e invariants MUST renumber off E81-E89 — use</w:t>
-            </w:r>
-            <w:r>
-              <w:t xml:space="preserve"> </w:t>
-            </w:r>
-            <w:r>
-              <w:rPr>
-                <w:b/>
-                <w:bCs/>
-              </w:rPr>
-              <w:t xml:space="preserve">E90+</w:t>
-            </w:r>
-            <w:r>
-              <w:t xml:space="preserve"> </w:t>
-            </w:r>
-            <w:r>
-              <w:t xml:space="preserve">(E89 is now consumed by Batch A's audit write-through); the slack-go submodule addition requires re-running the I6 inheritance-gate check (</w:t>
-            </w:r>
-            <w:r>
-              <w:rPr>
-                <w:rStyle w:val="VerbatimChar"/>
-              </w:rPr>
-              <w:t xml:space="preserve">tests/test_constitution_inheritance.sh</w:t>
-            </w:r>
-            <w:r>
-              <w:t xml:space="preserve">). Tag cadence: v0.5→v1.0.0 across the batches.</w:t>
-            </w:r>
-            <w:r>
-              <w:t xml:space="preserve"> </w:t>
-            </w:r>
-            <w:r>
-              <w:rPr>
-                <w:b/>
-                <w:bCs/>
-              </w:rPr>
-              <w:t xml:space="preserve">(5) GAP-4 docs/qa back-fill + docs-audit #147</w:t>
-            </w:r>
-            <w:r>
-              <w:t xml:space="preserve"> </w:t>
-            </w:r>
-            <w:r>
-              <w:t xml:space="preserve">— features lacking</w:t>
-            </w:r>
-            <w:r>
-              <w:t xml:space="preserve"> </w:t>
-            </w:r>
-            <w:r>
-              <w:rPr>
-                <w:rStyle w:val="VerbatimChar"/>
-              </w:rPr>
-              <w:t xml:space="preserve">docs/qa/&lt;run-id&gt;/</w:t>
-            </w:r>
-            <w:r>
-              <w:t xml:space="preserve"> </w:t>
-            </w:r>
-            <w:r>
-              <w:t xml:space="preserve">evidence per the</w:t>
-            </w:r>
-            <w:r>
-              <w:t xml:space="preserve"> </w:t>
-            </w:r>
-            <w:r>
-              <w:rPr>
-                <w:rStyle w:val="VerbatimChar"/>
-              </w:rPr>
-              <w:t xml:space="preserve">ee63ce6</w:t>
-            </w:r>
-            <w:r>
-              <w:t xml:space="preserve"> </w:t>
-            </w:r>
-            <w:r>
-              <w:t xml:space="preserve">qa-coverage audit + comprehensive documentation audit.</w:t>
-            </w:r>
-            <w:r>
-              <w:t xml:space="preserve"> </w:t>
-            </w:r>
-            <w:r>
-              <w:rPr>
-                <w:b/>
-                <w:bCs/>
-              </w:rPr>
-              <w:t xml:space="preserve">DEFERRED / GATED ITEMS:</w:t>
-            </w:r>
-            <w:r>
-              <w:t xml:space="preserve"> </w:t>
-            </w:r>
-            <w:r>
-              <w:rPr>
-                <w:b/>
-                <w:bCs/>
-              </w:rPr>
-              <w:t xml:space="preserve">§11.4.93 SQLite SSoT migration (HRD-131) — OPERATOR-DEFERRED 2026-05-27:</w:t>
-            </w:r>
-            <w:r>
-              <w:t xml:space="preserve"> </w:t>
-            </w:r>
-            <w:r>
-              <w:t xml:space="preserve">Phase 2 adoption is blocked on the constitution's workable-items migration binary, which is an unimplemented scaffold (0/7 subcommands) + schema-incompatible with Herald's HRD-NNN pipe-table format; per §11.4.74 Herald may NOT reimplement it — the fix is a constitution-repo task affecting all consumers (assessment</w:t>
-            </w:r>
-            <w:r>
-              <w:t xml:space="preserve"> </w:t>
-            </w:r>
-            <w:r>
-              <w:rPr>
-                <w:rStyle w:val="VerbatimChar"/>
-              </w:rPr>
-              <w:t xml:space="preserve">docs/research/workable-items-phase2-assessment-2026-05-27.md</w:t>
-            </w:r>
-            <w:r>
-              <w:t xml:space="preserve">,</w:t>
-            </w:r>
-            <w:r>
-              <w:t xml:space="preserve"> </w:t>
-            </w:r>
-            <w:r>
-              <w:rPr>
-                <w:rStyle w:val="VerbatimChar"/>
-              </w:rPr>
-              <w:t xml:space="preserve">36fa90b</w:t>
-            </w:r>
-            <w:r>
-              <w:t xml:space="preserve">). HRD-131 stays OPEN, blocked-on-constitution-binary. MTProto real-channel automation — OPERATOR-DECISION: provide my.telegram.org app_id+app_hash (folds into a qaherald MessengerClient MTProto impl reusing the entire scenario engine; Telegram never relays bot-to-bot in groups — see</w:t>
-            </w:r>
-            <w:r>
-              <w:t xml:space="preserve"> </w:t>
-            </w:r>
-            <w:r>
-              <w:rPr>
-                <w:rStyle w:val="VerbatimChar"/>
-              </w:rPr>
-              <w:t xml:space="preserve">docs/research/telegram-bot-to-bot-constraint.md</w:t>
-            </w:r>
-            <w:r>
-              <w:t xml:space="preserve">); operator should also</w:t>
-            </w:r>
-            <w:r>
-              <w:t xml:space="preserve"> </w:t>
-            </w:r>
-            <w:r>
-              <w:rPr>
-                <w:rStyle w:val="VerbatimChar"/>
-              </w:rPr>
-              <w:t xml:space="preserve">/revoke @pherald_qa_bot</w:t>
-            </w:r>
-            <w:r>
-              <w:t xml:space="preserve"> </w:t>
-            </w:r>
-            <w:r>
-              <w:t xml:space="preserve">(leaked plaintext token). §11.4.90 obsolescence — zero current Obsolete rows; convention in place, periodic re-audit pending. (RESOLVED this session: v1.0.0 Batch A — HRD-018/026/027 closed atomically Issues→Fixed, e2e</w:t>
-            </w:r>
-            <w:r>
-              <w:t xml:space="preserve"> </w:t>
-            </w:r>
-            <w:r>
-              <w:rPr>
-                <w:b/>
-                <w:bCs/>
-              </w:rPr>
-              <w:t xml:space="preserve">81 PASS / 0 FAIL</w:t>
-            </w:r>
-            <w:r>
-              <w:t xml:space="preserve"> </w:t>
-            </w:r>
-            <w:r>
-              <w:t xml:space="preserve">(E89 wired),</w:t>
-            </w:r>
-            <w:r>
-              <w:t xml:space="preserve"> </w:t>
-            </w:r>
-            <w:r>
-              <w:rPr>
-                <w:rStyle w:val="VerbatimChar"/>
-              </w:rPr>
-              <w:t xml:space="preserve">commons_constitution</w:t>
-            </w:r>
-            <w:r>
-              <w:t xml:space="preserve"> </w:t>
-            </w:r>
-            <w:r>
               <w:t xml:space="preserve">audit write-through §107 bluff FIXED + admin mode-flip REST; conductor-verified</w:t>
             </w:r>
             <w:r>
@@ -2148,7 +3105,7 @@
               <w:t xml:space="preserve"> </w:t>
             </w:r>
             <w:r>
-              <w:t xml:space="preserve">+ real-PG + §11.4.85 stress 512-row no-lost-writes. Earlier this session: GAP-3 §11.4.85 stress+chaos suite IMPLEMENTED — e2e 78 PASS / 0 FAIL — AND atomically migrated Issues→Fixed (HRD-122..130 Completed); HRD-132 Runner idempotency-window bug FIXED</w:t>
+              <w:t xml:space="preserve">+ real-PG + §11.4.85 stress 512-row no-lost-writes. Earlier: GAP-3 §11.4.85 stress+chaos suite IMPLEMENTED — e2e 78 PASS / 0 FAIL — AND atomically migrated Issues→Fixed (HRD-122..130 Completed); HRD-132 Runner idempotency-window bug FIXED</w:t>
             </w:r>
             <w:r>
               <w:t xml:space="preserve"> </w:t>
@@ -2842,7 +3799,76 @@
         <w:t xml:space="preserve"> </w:t>
       </w:r>
       <w:r>
-        <w:t xml:space="preserve">81 PASS / 0 FAIL (was 78; +3 = v1.0.0 Batch A E89 constitution audit write-through + mode-flip; prior +18 = GAP-3 E81-E88 §11.4.85 stress+chaos + anchor sub-checks). Plus SKIP-with-reason for hardware/credential-absent invariants (live OOM, MTProto).</w:t>
+        <w:t xml:space="preserve">invariants now run through</w:t>
+      </w:r>
+      <w:r>
+        <w:t xml:space="preserve"> </w:t>
+      </w:r>
+      <w:r>
+        <w:rPr>
+          <w:b/>
+          <w:bCs/>
+        </w:rPr>
+        <w:t xml:space="preserve">E96</w:t>
+      </w:r>
+      <w:r>
+        <w:t xml:space="preserve"> </w:t>
+      </w:r>
+      <w:r>
+        <w:t xml:space="preserve">(E89 Batch-A audit write-through + mode-flip; E90-E96 = Batch B flavor-bindings round-trips HRD-019..025; prior E81-E88 = GAP-3 §11.4.85 stress+chaos). Full e2e CONFIRMED this session =</w:t>
+      </w:r>
+      <w:r>
+        <w:t xml:space="preserve"> </w:t>
+      </w:r>
+      <w:r>
+        <w:rPr>
+          <w:b/>
+          <w:bCs/>
+        </w:rPr>
+        <w:t xml:space="preserve">79 PASS / 0 FAIL</w:t>
+      </w:r>
+      <w:r>
+        <w:t xml:space="preserve"> </w:t>
+      </w:r>
+      <w:r>
+        <w:t xml:space="preserve">(E1-E96 all green; E94/E95/E96 PASS verified post-commit</w:t>
+      </w:r>
+      <w:r>
+        <w:t xml:space="preserve"> </w:t>
+      </w:r>
+      <w:r>
+        <w:rPr>
+          <w:rStyle w:val="VerbatimChar"/>
+        </w:rPr>
+        <w:t xml:space="preserve">74649bb</w:t>
+      </w:r>
+      <w:r>
+        <w:t xml:space="preserve">; E3 -race green after the eventbus race fix</w:t>
+      </w:r>
+      <w:r>
+        <w:t xml:space="preserve"> </w:t>
+      </w:r>
+      <w:r>
+        <w:rPr>
+          <w:rStyle w:val="VerbatimChar"/>
+        </w:rPr>
+        <w:t xml:space="preserve">f5d1367</w:t>
+      </w:r>
+      <w:r>
+        <w:t xml:space="preserve">; E17 SKIP-with-reason on absent live-PG). Plus SKIP-with-reason for hardware/credential-absent invariants (live OOM, MTProto). Next free invariant id is</w:t>
+      </w:r>
+      <w:r>
+        <w:t xml:space="preserve"> </w:t>
+      </w:r>
+      <w:r>
+        <w:rPr>
+          <w:b/>
+          <w:bCs/>
+        </w:rPr>
+        <w:t xml:space="preserve">E97+</w:t>
+      </w:r>
+      <w:r>
+        <w:t xml:space="preserve">.</w:t>
       </w:r>
     </w:p>
     <w:p>
@@ -3640,7 +4666,7 @@
               <w:pStyle w:val="Compact"/>
             </w:pPr>
             <w:r>
-              <w:t xml:space="preserve">Batch B (HRD-019..025)</w:t>
+              <w:t xml:space="preserve">HRD-019..025</w:t>
             </w:r>
           </w:p>
         </w:tc>
@@ -3651,7 +4677,7 @@
               <w:pStyle w:val="Compact"/>
             </w:pPr>
             <w:r>
-              <w:t xml:space="preserve">next</w:t>
+              <w:t xml:space="preserve">in_progress</w:t>
             </w:r>
           </w:p>
         </w:tc>
@@ -3662,20 +4688,384 @@
               <w:pStyle w:val="Compact"/>
             </w:pPr>
             <w:r>
-              <w:t xml:space="preserve">§42 flavor constitution bindings —</w:t>
-            </w:r>
-            <w:r>
-              <w:t xml:space="preserve"> </w:t>
-            </w:r>
-            <w:r>
-              <w:rPr>
-                <w:b/>
-                <w:bCs/>
-              </w:rPr>
-              <w:t xml:space="preserve">IMMEDIATE NEXT UNIT</w:t>
-            </w:r>
-            <w:r>
-              <w:t xml:space="preserve">; depends on the now-complete commons_constitution Evaluator+emit+audit foundation Batch A landed. Then Batch C (§43 HRD-029..056), Batch D (commons_infra HRD-081/085..090), Batch E (Wave 7 T6-T12 Slack HRD-115..121). Plan</w:t>
+              <w:rPr>
+                <w:b/>
+                <w:bCs/>
+              </w:rPr>
+              <w:t xml:space="preserve">v1.0.0 Batch B COMPLETE (bindings)</w:t>
+            </w:r>
+            <w:r>
+              <w:t xml:space="preserve"> </w:t>
+            </w:r>
+            <w:r>
+              <w:t xml:space="preserve">— all 7 §42 flavor constitution bindings landed: HRD-019 cherald (</w:t>
+            </w:r>
+            <w:r>
+              <w:rPr>
+                <w:rStyle w:val="VerbatimChar"/>
+              </w:rPr>
+              <w:t xml:space="preserve">f33b5e4</w:t>
+            </w:r>
+            <w:r>
+              <w:t xml:space="preserve">, E90</w:t>
+            </w:r>
+            <w:r>
+              <w:t xml:space="preserve"> </w:t>
+            </w:r>
+            <w:r>
+              <w:rPr>
+                <w:rStyle w:val="VerbatimChar"/>
+              </w:rPr>
+              <w:t xml:space="preserve">c3e3cff</w:t>
+            </w:r>
+            <w:r>
+              <w:t xml:space="preserve">), HRD-020 sherald (</w:t>
+            </w:r>
+            <w:r>
+              <w:rPr>
+                <w:rStyle w:val="VerbatimChar"/>
+              </w:rPr>
+              <w:t xml:space="preserve">5ebad4f</w:t>
+            </w:r>
+            <w:r>
+              <w:t xml:space="preserve">, E91</w:t>
+            </w:r>
+            <w:r>
+              <w:t xml:space="preserve"> </w:t>
+            </w:r>
+            <w:r>
+              <w:rPr>
+                <w:rStyle w:val="VerbatimChar"/>
+              </w:rPr>
+              <w:t xml:space="preserve">75e7a49</w:t>
+            </w:r>
+            <w:r>
+              <w:t xml:space="preserve">), HRD-021 bherald (</w:t>
+            </w:r>
+            <w:r>
+              <w:rPr>
+                <w:rStyle w:val="VerbatimChar"/>
+              </w:rPr>
+              <w:t xml:space="preserve">46ca77e</w:t>
+            </w:r>
+            <w:r>
+              <w:t xml:space="preserve">, E92</w:t>
+            </w:r>
+            <w:r>
+              <w:t xml:space="preserve"> </w:t>
+            </w:r>
+            <w:r>
+              <w:rPr>
+                <w:rStyle w:val="VerbatimChar"/>
+              </w:rPr>
+              <w:t xml:space="preserve">f31615f</w:t>
+            </w:r>
+            <w:r>
+              <w:t xml:space="preserve">), HRD-022 rherald (</w:t>
+            </w:r>
+            <w:r>
+              <w:rPr>
+                <w:rStyle w:val="VerbatimChar"/>
+              </w:rPr>
+              <w:t xml:space="preserve">f73195f</w:t>
+            </w:r>
+            <w:r>
+              <w:t xml:space="preserve">, E93</w:t>
+            </w:r>
+            <w:r>
+              <w:t xml:space="preserve"> </w:t>
+            </w:r>
+            <w:r>
+              <w:rPr>
+                <w:rStyle w:val="VerbatimChar"/>
+              </w:rPr>
+              <w:t xml:space="preserve">0206f8f</w:t>
+            </w:r>
+            <w:r>
+              <w:t xml:space="preserve">), HRD-023/024/025 pherald/iherald/scherald (</w:t>
+            </w:r>
+            <w:r>
+              <w:rPr>
+                <w:rStyle w:val="VerbatimChar"/>
+              </w:rPr>
+              <w:t xml:space="preserve">3fb753a</w:t>
+            </w:r>
+            <w:r>
+              <w:t xml:space="preserve">, E94/E95/E96</w:t>
+            </w:r>
+            <w:r>
+              <w:t xml:space="preserve"> </w:t>
+            </w:r>
+            <w:r>
+              <w:rPr>
+                <w:rStyle w:val="VerbatimChar"/>
+              </w:rPr>
+              <w:t xml:space="preserve">74649bb</w:t>
+            </w:r>
+            <w:r>
+              <w:t xml:space="preserve">). Each:</w:t>
+            </w:r>
+            <w:r>
+              <w:t xml:space="preserve"> </w:t>
+            </w:r>
+            <w:r>
+              <w:rPr>
+                <w:rStyle w:val="VerbatimChar"/>
+              </w:rPr>
+              <w:t xml:space="preserve">&lt;flavor&gt;/internal/bindings/</w:t>
+            </w:r>
+            <w:r>
+              <w:t xml:space="preserve"> </w:t>
+            </w:r>
+            <w:r>
+              <w:t xml:space="preserve">Pipeline + rule catalogue + PURE detectors, emit-through Batch-A audit foundation,</w:t>
+            </w:r>
+            <w:r>
+              <w:t xml:space="preserve"> </w:t>
+            </w:r>
+            <w:r>
+              <w:rPr>
+                <w:rStyle w:val="VerbatimChar"/>
+              </w:rPr>
+              <w:t xml:space="preserve">-race -count=3</w:t>
+            </w:r>
+            <w:r>
+              <w:t xml:space="preserve"> </w:t>
+            </w:r>
+            <w:r>
+              <w:t xml:space="preserve">green, §107.x evidence</w:t>
+            </w:r>
+            <w:r>
+              <w:t xml:space="preserve"> </w:t>
+            </w:r>
+            <w:r>
+              <w:rPr>
+                <w:rStyle w:val="VerbatimChar"/>
+              </w:rPr>
+              <w:t xml:space="preserve">docs/qa/HRD-0XX-*/</w:t>
+            </w:r>
+            <w:r>
+              <w:t xml:space="preserve">, §11.4.85 stress 1200-concurrent → 1200 emits+audit rows.</w:t>
+            </w:r>
+            <w:r>
+              <w:t xml:space="preserve"> </w:t>
+            </w:r>
+            <w:r>
+              <w:rPr>
+                <w:b/>
+                <w:bCs/>
+              </w:rPr>
+              <w:t xml:space="preserve">Stay in_progress</w:t>
+            </w:r>
+            <w:r>
+              <w:t xml:space="preserve"> </w:t>
+            </w:r>
+            <w:r>
+              <w:t xml:space="preserve">— live operation-interception (the Subjects the detectors classify) is Batch C §43 command bodies; these flip →Fixed once Batch C lands.</w:t>
+            </w:r>
+          </w:p>
+        </w:tc>
+      </w:tr>
+      <w:tr>
+        <w:tc>
+          <w:tcPr/>
+          <w:p>
+            <w:pPr>
+              <w:pStyle w:val="Compact"/>
+            </w:pPr>
+            <w:r>
+              <w:t xml:space="preserve">#194 / eventbus race / E17</w:t>
+            </w:r>
+          </w:p>
+        </w:tc>
+        <w:tc>
+          <w:tcPr/>
+          <w:p>
+            <w:pPr>
+              <w:pStyle w:val="Compact"/>
+            </w:pPr>
+            <w:r>
+              <w:t xml:space="preserve">Fixed</w:t>
+            </w:r>
+          </w:p>
+        </w:tc>
+        <w:tc>
+          <w:tcPr/>
+          <w:p>
+            <w:pPr>
+              <w:pStyle w:val="Compact"/>
+            </w:pPr>
+            <w:r>
+              <w:t xml:space="preserve">3 day-2 fixes: #194</w:t>
+            </w:r>
+            <w:r>
+              <w:t xml:space="preserve"> </w:t>
+            </w:r>
+            <w:r>
+              <w:rPr>
+                <w:rStyle w:val="VerbatimChar"/>
+              </w:rPr>
+              <w:t xml:space="preserve">audit_stress_chaos_test.go</w:t>
+            </w:r>
+            <w:r>
+              <w:t xml:space="preserve"> </w:t>
+            </w:r>
+            <w:r>
+              <w:t xml:space="preserve">qaRoot gated on</w:t>
+            </w:r>
+            <w:r>
+              <w:t xml:space="preserve"> </w:t>
+            </w:r>
+            <w:r>
+              <w:rPr>
+                <w:rStyle w:val="VerbatimChar"/>
+              </w:rPr>
+              <w:t xml:space="preserve">HERALD_STRESS_QA_DIR</w:t>
+            </w:r>
+            <w:r>
+              <w:t xml:space="preserve"> </w:t>
+            </w:r>
+            <w:r>
+              <w:t xml:space="preserve">via</w:t>
+            </w:r>
+            <w:r>
+              <w:t xml:space="preserve"> </w:t>
+            </w:r>
+            <w:r>
+              <w:rPr>
+                <w:rStyle w:val="VerbatimChar"/>
+              </w:rPr>
+              <w:t xml:space="preserve">t.TempDir()</w:t>
+            </w:r>
+            <w:r>
+              <w:t xml:space="preserve"> </w:t>
+            </w:r>
+            <w:r>
+              <w:t xml:space="preserve">(</w:t>
+            </w:r>
+            <w:r>
+              <w:rPr>
+                <w:rStyle w:val="VerbatimChar"/>
+              </w:rPr>
+              <w:t xml:space="preserve">a8ad4f7</w:t>
+            </w:r>
+            <w:r>
+              <w:t xml:space="preserve">, stops docs/qa noise);</w:t>
+            </w:r>
+            <w:r>
+              <w:t xml:space="preserve"> </w:t>
+            </w:r>
+            <w:r>
+              <w:rPr>
+                <w:rStyle w:val="VerbatimChar"/>
+              </w:rPr>
+              <w:t xml:space="preserve">commons_constitution/eventbus.go</w:t>
+            </w:r>
+            <w:r>
+              <w:t xml:space="preserve"> </w:t>
+            </w:r>
+            <w:r>
+              <w:rPr>
+                <w:rStyle w:val="VerbatimChar"/>
+              </w:rPr>
+              <w:t xml:space="preserve">PublishedByType</w:t>
+            </w:r>
+            <w:r>
+              <w:t xml:space="preserve"> </w:t>
+            </w:r>
+            <w:r>
+              <w:t xml:space="preserve">data race →</w:t>
+            </w:r>
+            <w:r>
+              <w:t xml:space="preserve"> </w:t>
+            </w:r>
+            <w:r>
+              <w:rPr>
+                <w:rStyle w:val="VerbatimChar"/>
+              </w:rPr>
+              <w:t xml:space="preserve">sync.Map.LoadOrStore</w:t>
+            </w:r>
+            <w:r>
+              <w:t xml:space="preserve"> </w:t>
+            </w:r>
+            <w:r>
+              <w:t xml:space="preserve">(</w:t>
+            </w:r>
+            <w:r>
+              <w:rPr>
+                <w:rStyle w:val="VerbatimChar"/>
+              </w:rPr>
+              <w:t xml:space="preserve">f5d1367</w:t>
+            </w:r>
+            <w:r>
+              <w:t xml:space="preserve">, real E3 -race regression latent since Batch A); E17 e2e SKIP-guard now requires live PG (</w:t>
+            </w:r>
+            <w:r>
+              <w:rPr>
+                <w:rStyle w:val="VerbatimChar"/>
+              </w:rPr>
+              <w:t xml:space="preserve">75e7a49</w:t>
+            </w:r>
+            <w:r>
+              <w:t xml:space="preserve">, was FAILing instead of SKIPping when PG absent).</w:t>
+            </w:r>
+          </w:p>
+        </w:tc>
+      </w:tr>
+      <w:tr>
+        <w:tc>
+          <w:tcPr/>
+          <w:p>
+            <w:pPr>
+              <w:pStyle w:val="Compact"/>
+            </w:pPr>
+            <w:r>
+              <w:t xml:space="preserve">Batch C (HRD-029..056)</w:t>
+            </w:r>
+          </w:p>
+        </w:tc>
+        <w:tc>
+          <w:tcPr/>
+          <w:p>
+            <w:pPr>
+              <w:pStyle w:val="Compact"/>
+            </w:pPr>
+            <w:r>
+              <w:t xml:space="preserve">next</w:t>
+            </w:r>
+          </w:p>
+        </w:tc>
+        <w:tc>
+          <w:tcPr/>
+          <w:p>
+            <w:pPr>
+              <w:pStyle w:val="Compact"/>
+            </w:pPr>
+            <w:r>
+              <w:rPr>
+                <w:b/>
+                <w:bCs/>
+              </w:rPr>
+              <w:t xml:space="preserve">§43 command catalogue — IMMEDIATE NEXT UNIT.</w:t>
+            </w:r>
+            <w:r>
+              <w:t xml:space="preserve"> </w:t>
+            </w:r>
+            <w:r>
+              <w:t xml:space="preserve">Live CLI command bodies that PRODUCE the Subjects the Batch-B detectors classify (pherald commit-push, sherald destructive-guard, cherald creds-scan, rherald tag-mirror, bherald evidence-capture, …), grouped into 5 flavor clusters. Closing Batch C flips HRD-019..025 →Fixed. Next free e2e invariant id is</w:t>
+            </w:r>
+            <w:r>
+              <w:t xml:space="preserve"> </w:t>
+            </w:r>
+            <w:r>
+              <w:rPr>
+                <w:b/>
+                <w:bCs/>
+              </w:rPr>
+              <w:t xml:space="preserve">E97+</w:t>
+            </w:r>
+            <w:r>
+              <w:t xml:space="preserve">. Then Batch D (commons_infra HRD-081/085..090), Batch E (Wave 7 T6-T12 Slack HRD-115..121), then §11.4.93 SQLite (deferred). Plan</w:t>
             </w:r>
             <w:r>
               <w:t xml:space="preserve"> </w:t>

</xml_diff>

<commit_message>
docs: CONTINUATION r14→r15 — Batch C C1-C5 §43 catalogue complete checkpoint
Records this session's landed work as the resume contract: §43 command
catalogue across all 5 flavor clusters (C1 pherald 502ebf6/65c8362, C2 sherald
ed6c675, C4+C5 rherald+bherald 130ec19, C3 cherald aef0207), the
commons/gitops promotion (4a6b0ec), the §107 lazy-verifier fix for sherald +
cherald, and the E53 Brotli flake fix (dfca0be). e2e now E1-E120 = 128 PASS /
0 FAIL. RESUME-AT: finish §43 (HRD-034 backup-snapshot, HRD-047 status-digest)
→ Batch D commons_infra → Batch E Wave 7 Slack. HEAD=aef0207.

Co-Authored-By: Claude Opus 4.7 <noreply@anthropic.com>
</commit_message>
<xml_diff>
--- a/docs/CONTINUATION.docx
+++ b/docs/CONTINUATION.docx
@@ -75,7 +75,7 @@
               <w:pStyle w:val="Compact"/>
             </w:pPr>
             <w:r>
-              <w:t xml:space="preserve">14</w:t>
+              <w:t xml:space="preserve">15</w:t>
             </w:r>
           </w:p>
         </w:tc>
@@ -3809,13 +3809,13 @@
           <w:b/>
           <w:bCs/>
         </w:rPr>
-        <w:t xml:space="preserve">E96</w:t>
-      </w:r>
-      <w:r>
-        <w:t xml:space="preserve"> </w:t>
-      </w:r>
-      <w:r>
-        <w:t xml:space="preserve">(E89 Batch-A audit write-through + mode-flip; E90-E96 = Batch B flavor-bindings round-trips HRD-019..025; prior E81-E88 = GAP-3 §11.4.85 stress+chaos). Full e2e CONFIRMED this session =</w:t>
+        <w:t xml:space="preserve">E120</w:t>
+      </w:r>
+      <w:r>
+        <w:t xml:space="preserve"> </w:t>
+      </w:r>
+      <w:r>
+        <w:t xml:space="preserve">(E89 Batch-A; E90-E96 Batch-B bindings;</w:t>
       </w:r>
       <w:r>
         <w:t xml:space="preserve"> </w:t>
@@ -3825,37 +3825,13 @@
           <w:b/>
           <w:bCs/>
         </w:rPr>
-        <w:t xml:space="preserve">79 PASS / 0 FAIL</w:t>
-      </w:r>
-      <w:r>
-        <w:t xml:space="preserve"> </w:t>
-      </w:r>
-      <w:r>
-        <w:t xml:space="preserve">(E1-E96 all green; E94/E95/E96 PASS verified post-commit</w:t>
-      </w:r>
-      <w:r>
-        <w:t xml:space="preserve"> </w:t>
-      </w:r>
-      <w:r>
-        <w:rPr>
-          <w:rStyle w:val="VerbatimChar"/>
-        </w:rPr>
-        <w:t xml:space="preserve">74649bb</w:t>
-      </w:r>
-      <w:r>
-        <w:t xml:space="preserve">; E3 -race green after the eventbus race fix</w:t>
-      </w:r>
-      <w:r>
-        <w:t xml:space="preserve"> </w:t>
-      </w:r>
-      <w:r>
-        <w:rPr>
-          <w:rStyle w:val="VerbatimChar"/>
-        </w:rPr>
-        <w:t xml:space="preserve">f5d1367</w:t>
-      </w:r>
-      <w:r>
-        <w:t xml:space="preserve">; E17 SKIP-with-reason on absent live-PG). Plus SKIP-with-reason for hardware/credential-absent invariants (live OOM, MTProto). Next free invariant id is</w:t>
+        <w:t xml:space="preserve">E97-E120 = Batch C §43 command catalogue</w:t>
+      </w:r>
+      <w:r>
+        <w:t xml:space="preserve"> </w:t>
+      </w:r>
+      <w:r>
+        <w:t xml:space="preserve">— E97-E100 pherald, E101-E104 sherald, E105-E107 rherald, E108-E109 bherald, E110-E120 cherald; prior E81-E88 GAP-3 stress+chaos). Full e2e CONFIRMED 2026-05-28 =</w:t>
       </w:r>
       <w:r>
         <w:t xml:space="preserve"> </w:t>
@@ -3865,7 +3841,50 @@
           <w:b/>
           <w:bCs/>
         </w:rPr>
-        <w:t xml:space="preserve">E97+</w:t>
+        <w:t xml:space="preserve">128 PASS / 0 FAIL</w:t>
+      </w:r>
+      <w:r>
+        <w:t xml:space="preserve"> </w:t>
+      </w:r>
+      <w:r>
+        <w:t xml:space="preserve">(E3 -race spans 12 packages incl</w:t>
+      </w:r>
+      <w:r>
+        <w:t xml:space="preserve"> </w:t>
+      </w:r>
+      <w:r>
+        <w:rPr>
+          <w:rStyle w:val="VerbatimChar"/>
+        </w:rPr>
+        <w:t xml:space="preserve">commons/gitops</w:t>
+      </w:r>
+      <w:r>
+        <w:t xml:space="preserve">; E17 SKIP-with-reason on absent live-PG; E53 flake root-caused + fixed — was a cross-call byte-diff on the dynamic</w:t>
+      </w:r>
+      <w:r>
+        <w:t xml:space="preserve"> </w:t>
+      </w:r>
+      <w:r>
+        <w:rPr>
+          <w:rStyle w:val="VerbatimChar"/>
+        </w:rPr>
+        <w:t xml:space="preserve">/v1/safety_state</w:t>
+      </w:r>
+      <w:r>
+        <w:t xml:space="preserve"> </w:t>
+      </w:r>
+      <w:r>
+        <w:t xml:space="preserve">body). Plus SKIP-with-reason for hardware/credential-absent invariants (live OOM, MTProto, Wave-6 live-loop). Next free invariant id is</w:t>
+      </w:r>
+      <w:r>
+        <w:t xml:space="preserve"> </w:t>
+      </w:r>
+      <w:r>
+        <w:rPr>
+          <w:b/>
+          <w:bCs/>
+        </w:rPr>
+        <w:t xml:space="preserve">E121+</w:t>
       </w:r>
       <w:r>
         <w:t xml:space="preserve">.</w:t>
@@ -5031,7 +5050,7 @@
               <w:pStyle w:val="Compact"/>
             </w:pPr>
             <w:r>
-              <w:t xml:space="preserve">next</w:t>
+              <w:t xml:space="preserve">in_progress (C1-C5 IMPLEMENTED 2026-05-28)</w:t>
             </w:r>
           </w:p>
         </w:tc>
@@ -5046,26 +5065,690 @@
                 <w:b/>
                 <w:bCs/>
               </w:rPr>
-              <w:t xml:space="preserve">§43 command catalogue — IMMEDIATE NEXT UNIT.</w:t>
-            </w:r>
-            <w:r>
-              <w:t xml:space="preserve"> </w:t>
-            </w:r>
-            <w:r>
-              <w:t xml:space="preserve">Live CLI command bodies that PRODUCE the Subjects the Batch-B detectors classify (pherald commit-push, sherald destructive-guard, cherald creds-scan, rherald tag-mirror, bherald evidence-capture, …), grouped into 5 flavor clusters. Closing Batch C flips HRD-019..025 →Fixed. Next free e2e invariant id is</w:t>
-            </w:r>
-            <w:r>
-              <w:t xml:space="preserve"> </w:t>
-            </w:r>
-            <w:r>
-              <w:rPr>
-                <w:b/>
-                <w:bCs/>
-              </w:rPr>
-              <w:t xml:space="preserve">E97+</w:t>
-            </w:r>
-            <w:r>
-              <w:t xml:space="preserve">. Then Batch D (commons_infra HRD-081/085..090), Batch E (Wave 7 T6-T12 Slack HRD-115..121), then §11.4.93 SQLite (deferred). Plan</w:t>
+              <w:t xml:space="preserve">§43 command catalogue — all 5 flavor clusters landed</w:t>
+            </w:r>
+            <w:r>
+              <w:t xml:space="preserve">, each a live CLI command feeding its Batch-B binding (DETECT+classify+exit-non-zero): C1 pherald</w:t>
+            </w:r>
+            <w:r>
+              <w:t xml:space="preserve"> </w:t>
+            </w:r>
+            <w:r>
+              <w:rPr>
+                <w:rStyle w:val="VerbatimChar"/>
+              </w:rPr>
+              <w:t xml:space="preserve">commit-push</w:t>
+            </w:r>
+            <w:r>
+              <w:t xml:space="preserve">/</w:t>
+            </w:r>
+            <w:r>
+              <w:rPr>
+                <w:rStyle w:val="VerbatimChar"/>
+              </w:rPr>
+              <w:t xml:space="preserve">submodule-propagate</w:t>
+            </w:r>
+            <w:r>
+              <w:t xml:space="preserve">/</w:t>
+            </w:r>
+            <w:r>
+              <w:rPr>
+                <w:rStyle w:val="VerbatimChar"/>
+              </w:rPr>
+              <w:t xml:space="preserve">install-upstreams</w:t>
+            </w:r>
+            <w:r>
+              <w:t xml:space="preserve">/</w:t>
+            </w:r>
+            <w:r>
+              <w:rPr>
+                <w:rStyle w:val="VerbatimChar"/>
+              </w:rPr>
+              <w:t xml:space="preserve">fetch-guard</w:t>
+            </w:r>
+            <w:r>
+              <w:t xml:space="preserve">/</w:t>
+            </w:r>
+            <w:r>
+              <w:rPr>
+                <w:rStyle w:val="VerbatimChar"/>
+              </w:rPr>
+              <w:t xml:space="preserve">reopen</w:t>
+            </w:r>
+            <w:r>
+              <w:t xml:space="preserve">/</w:t>
+            </w:r>
+            <w:r>
+              <w:rPr>
+                <w:rStyle w:val="VerbatimChar"/>
+              </w:rPr>
+              <w:t xml:space="preserve">pre-push</w:t>
+            </w:r>
+            <w:r>
+              <w:t xml:space="preserve"> </w:t>
+            </w:r>
+            <w:r>
+              <w:t xml:space="preserve">(</w:t>
+            </w:r>
+            <w:r>
+              <w:rPr>
+                <w:rStyle w:val="VerbatimChar"/>
+              </w:rPr>
+              <w:t xml:space="preserve">502ebf6</w:t>
+            </w:r>
+            <w:r>
+              <w:t xml:space="preserve">,</w:t>
+            </w:r>
+            <w:r>
+              <w:rPr>
+                <w:rStyle w:val="VerbatimChar"/>
+              </w:rPr>
+              <w:t xml:space="preserve">65c8362</w:t>
+            </w:r>
+            <w:r>
+              <w:t xml:space="preserve">, E97-E100); C2 sherald</w:t>
+            </w:r>
+            <w:r>
+              <w:t xml:space="preserve"> </w:t>
+            </w:r>
+            <w:r>
+              <w:rPr>
+                <w:rStyle w:val="VerbatimChar"/>
+              </w:rPr>
+              <w:t xml:space="preserve">destructive-guard</w:t>
+            </w:r>
+            <w:r>
+              <w:t xml:space="preserve">/</w:t>
+            </w:r>
+            <w:r>
+              <w:rPr>
+                <w:rStyle w:val="VerbatimChar"/>
+              </w:rPr>
+              <w:t xml:space="preserve">constitution-pull</w:t>
+            </w:r>
+            <w:r>
+              <w:t xml:space="preserve">/</w:t>
+            </w:r>
+            <w:r>
+              <w:rPr>
+                <w:rStyle w:val="VerbatimChar"/>
+              </w:rPr>
+              <w:t xml:space="preserve">force-push-gate</w:t>
+            </w:r>
+            <w:r>
+              <w:t xml:space="preserve">/</w:t>
+            </w:r>
+            <w:r>
+              <w:rPr>
+                <w:rStyle w:val="VerbatimChar"/>
+              </w:rPr>
+              <w:t xml:space="preserve">mem-budget-watch</w:t>
+            </w:r>
+            <w:r>
+              <w:t xml:space="preserve"> </w:t>
+            </w:r>
+            <w:r>
+              <w:t xml:space="preserve">(</w:t>
+            </w:r>
+            <w:r>
+              <w:rPr>
+                <w:rStyle w:val="VerbatimChar"/>
+              </w:rPr>
+              <w:t xml:space="preserve">ed6c675</w:t>
+            </w:r>
+            <w:r>
+              <w:t xml:space="preserve">, E31+E101-E104); C4 rherald</w:t>
+            </w:r>
+            <w:r>
+              <w:t xml:space="preserve"> </w:t>
+            </w:r>
+            <w:r>
+              <w:rPr>
+                <w:rStyle w:val="VerbatimChar"/>
+              </w:rPr>
+              <w:t xml:space="preserve">tag-mirror</w:t>
+            </w:r>
+            <w:r>
+              <w:t xml:space="preserve">/</w:t>
+            </w:r>
+            <w:r>
+              <w:rPr>
+                <w:rStyle w:val="VerbatimChar"/>
+              </w:rPr>
+              <w:t xml:space="preserve">changelog-generate</w:t>
+            </w:r>
+            <w:r>
+              <w:t xml:space="preserve">/</w:t>
+            </w:r>
+            <w:r>
+              <w:rPr>
+                <w:rStyle w:val="VerbatimChar"/>
+              </w:rPr>
+              <w:t xml:space="preserve">gate-retest</w:t>
+            </w:r>
+            <w:r>
+              <w:t xml:space="preserve"> </w:t>
+            </w:r>
+            <w:r>
+              <w:t xml:space="preserve">+ C5 bherald</w:t>
+            </w:r>
+            <w:r>
+              <w:t xml:space="preserve"> </w:t>
+            </w:r>
+            <w:r>
+              <w:rPr>
+                <w:rStyle w:val="VerbatimChar"/>
+              </w:rPr>
+              <w:t xml:space="preserve">test-tier-verify</w:t>
+            </w:r>
+            <w:r>
+              <w:t xml:space="preserve">/</w:t>
+            </w:r>
+            <w:r>
+              <w:rPr>
+                <w:rStyle w:val="VerbatimChar"/>
+              </w:rPr>
+              <w:t xml:space="preserve">evidence-capture</w:t>
+            </w:r>
+            <w:r>
+              <w:t xml:space="preserve"> </w:t>
+            </w:r>
+            <w:r>
+              <w:t xml:space="preserve">(</w:t>
+            </w:r>
+            <w:r>
+              <w:rPr>
+                <w:rStyle w:val="VerbatimChar"/>
+              </w:rPr>
+              <w:t xml:space="preserve">130ec19</w:t>
+            </w:r>
+            <w:r>
+              <w:t xml:space="preserve">, E105-E109); C3 cherald 11 docs/compliance cmds (</w:t>
+            </w:r>
+            <w:r>
+              <w:rPr>
+                <w:rStyle w:val="VerbatimChar"/>
+              </w:rPr>
+              <w:t xml:space="preserve">aef0207</w:t>
+            </w:r>
+            <w:r>
+              <w:t xml:space="preserve">, E110-E120). Remaining §43:</w:t>
+            </w:r>
+            <w:r>
+              <w:t xml:space="preserve"> </w:t>
+            </w:r>
+            <w:r>
+              <w:rPr>
+                <w:b/>
+                <w:bCs/>
+              </w:rPr>
+              <w:t xml:space="preserve">HRD-034</w:t>
+            </w:r>
+            <w:r>
+              <w:t xml:space="preserve"> </w:t>
+            </w:r>
+            <w:r>
+              <w:t xml:space="preserve">(sherald backup-snapshot §9.3) +</w:t>
+            </w:r>
+            <w:r>
+              <w:t xml:space="preserve"> </w:t>
+            </w:r>
+            <w:r>
+              <w:rPr>
+                <w:b/>
+                <w:bCs/>
+              </w:rPr>
+              <w:t xml:space="preserve">HRD-047</w:t>
+            </w:r>
+            <w:r>
+              <w:t xml:space="preserve"> </w:t>
+            </w:r>
+            <w:r>
+              <w:t xml:space="preserve">(scherald status-digest §11.4.45/.56) — not yet implemented. Rows are in_progress (hermetic+e2e proven; flip →Fixed at an operator-live close-out pass, together with HRD-019..025).</w:t>
+            </w:r>
+          </w:p>
+        </w:tc>
+      </w:tr>
+      <w:tr>
+        <w:tc>
+          <w:tcPr/>
+          <w:p>
+            <w:pPr>
+              <w:pStyle w:val="Compact"/>
+            </w:pPr>
+            <w:r>
+              <w:t xml:space="preserve">commons/gitops promotion</w:t>
+            </w:r>
+          </w:p>
+        </w:tc>
+        <w:tc>
+          <w:tcPr/>
+          <w:p>
+            <w:pPr>
+              <w:pStyle w:val="Compact"/>
+            </w:pPr>
+            <w:r>
+              <w:t xml:space="preserve">Fixed (</w:t>
+            </w:r>
+            <w:r>
+              <w:rPr>
+                <w:rStyle w:val="VerbatimChar"/>
+              </w:rPr>
+              <w:t xml:space="preserve">4a6b0ec</w:t>
+            </w:r>
+            <w:r>
+              <w:t xml:space="preserve">)</w:t>
+            </w:r>
+          </w:p>
+        </w:tc>
+        <w:tc>
+          <w:tcPr/>
+          <w:p>
+            <w:pPr>
+              <w:pStyle w:val="Compact"/>
+            </w:pPr>
+            <w:r>
+              <w:t xml:space="preserve">Promoted</w:t>
+            </w:r>
+            <w:r>
+              <w:t xml:space="preserve"> </w:t>
+            </w:r>
+            <w:r>
+              <w:rPr>
+                <w:rStyle w:val="VerbatimChar"/>
+              </w:rPr>
+              <w:t xml:space="preserve">pherald/internal/gitops</w:t>
+            </w:r>
+            <w:r>
+              <w:t xml:space="preserve"> </w:t>
+            </w:r>
+            <w:r>
+              <w:t xml:space="preserve">→ shared</w:t>
+            </w:r>
+            <w:r>
+              <w:t xml:space="preserve"> </w:t>
+            </w:r>
+            <w:r>
+              <w:rPr>
+                <w:rStyle w:val="VerbatimChar"/>
+              </w:rPr>
+              <w:t xml:space="preserve">commons/gitops</w:t>
+            </w:r>
+            <w:r>
+              <w:t xml:space="preserve"> </w:t>
+            </w:r>
+            <w:r>
+              <w:t xml:space="preserve">(L0, pure-stdlib: Runner/RepoRoot/FindScript/ParseUpstreams + TagExists/RemoteHasTag/LogSubjects) so all flavor modules reuse the git primitives (§11.4.74). No go.work/go.mod change (every flavor already requires commons).</w:t>
+            </w:r>
+          </w:p>
+        </w:tc>
+      </w:tr>
+      <w:tr>
+        <w:tc>
+          <w:tcPr/>
+          <w:p>
+            <w:pPr>
+              <w:pStyle w:val="Compact"/>
+            </w:pPr>
+            <w:r>
+              <w:t xml:space="preserve">§107 lazy-verifier fix (sherald+cherald)</w:t>
+            </w:r>
+          </w:p>
+        </w:tc>
+        <w:tc>
+          <w:tcPr/>
+          <w:p>
+            <w:pPr>
+              <w:pStyle w:val="Compact"/>
+            </w:pPr>
+            <w:r>
+              <w:t xml:space="preserve">Fixed (</w:t>
+            </w:r>
+            <w:r>
+              <w:rPr>
+                <w:rStyle w:val="VerbatimChar"/>
+              </w:rPr>
+              <w:t xml:space="preserve">ed6c675</w:t>
+            </w:r>
+            <w:r>
+              <w:t xml:space="preserve">,</w:t>
+            </w:r>
+            <w:r>
+              <w:rPr>
+                <w:rStyle w:val="VerbatimChar"/>
+              </w:rPr>
+              <w:t xml:space="preserve">aef0207</w:t>
+            </w:r>
+            <w:r>
+              <w:t xml:space="preserve">)</w:t>
+            </w:r>
+          </w:p>
+        </w:tc>
+        <w:tc>
+          <w:tcPr/>
+          <w:p>
+            <w:pPr>
+              <w:pStyle w:val="Compact"/>
+            </w:pPr>
+            <w:r>
+              <w:t xml:space="preserve">sherald + cherald</w:t>
+            </w:r>
+            <w:r>
+              <w:t xml:space="preserve"> </w:t>
+            </w:r>
+            <w:r>
+              <w:rPr>
+                <w:rStyle w:val="VerbatimChar"/>
+              </w:rPr>
+              <w:t xml:space="preserve">main.go</w:t>
+            </w:r>
+            <w:r>
+              <w:t xml:space="preserve"> </w:t>
+            </w:r>
+            <w:r>
+              <w:t xml:space="preserve">built the JWT verifier eagerly +</w:t>
+            </w:r>
+            <w:r>
+              <w:t xml:space="preserve"> </w:t>
+            </w:r>
+            <w:r>
+              <w:rPr>
+                <w:rStyle w:val="VerbatimChar"/>
+              </w:rPr>
+              <w:t xml:space="preserve">os.Exit(1)</w:t>
+            </w:r>
+            <w:r>
+              <w:t xml:space="preserve"> </w:t>
+            </w:r>
+            <w:r>
+              <w:t xml:space="preserve">before</w:t>
+            </w:r>
+            <w:r>
+              <w:t xml:space="preserve"> </w:t>
+            </w:r>
+            <w:r>
+              <w:rPr>
+                <w:rStyle w:val="VerbatimChar"/>
+              </w:rPr>
+              <w:t xml:space="preserve">root.Execute()</w:t>
+            </w:r>
+            <w:r>
+              <w:t xml:space="preserve"> </w:t>
+            </w:r>
+            <w:r>
+              <w:t xml:space="preserve">→ EVERY subcommand (even</w:t>
+            </w:r>
+            <w:r>
+              <w:t xml:space="preserve"> </w:t>
+            </w:r>
+            <w:r>
+              <w:rPr>
+                <w:rStyle w:val="VerbatimChar"/>
+              </w:rPr>
+              <w:t xml:space="preserve">version</w:t>
+            </w:r>
+            <w:r>
+              <w:t xml:space="preserve">) died without</w:t>
+            </w:r>
+            <w:r>
+              <w:t xml:space="preserve"> </w:t>
+            </w:r>
+            <w:r>
+              <w:rPr>
+                <w:rStyle w:val="VerbatimChar"/>
+              </w:rPr>
+              <w:t xml:space="preserve">HERALD_AUTH_MODE</w:t>
+            </w:r>
+            <w:r>
+              <w:t xml:space="preserve">. The §43 CLI commands are for bare CI/cron invocation. Fixed by building the verifier LAZILY inside a flavor-local</w:t>
+            </w:r>
+            <w:r>
+              <w:t xml:space="preserve"> </w:t>
+            </w:r>
+            <w:r>
+              <w:rPr>
+                <w:rStyle w:val="VerbatimChar"/>
+              </w:rPr>
+              <w:t xml:space="preserve">newServeCmd</w:t>
+            </w:r>
+            <w:r>
+              <w:t xml:space="preserve"> </w:t>
+            </w:r>
+            <w:r>
+              <w:t xml:space="preserve">(cli.BindServeFlags+RunServe), mirroring pherald. serve still refuses anonymous. Binary-verified. See memory</w:t>
+            </w:r>
+            <w:r>
+              <w:t xml:space="preserve"> </w:t>
+            </w:r>
+            <w:r>
+              <w:rPr>
+                <w:rStyle w:val="VerbatimChar"/>
+              </w:rPr>
+              <w:t xml:space="preserve">feedback_verify_subagent_cli_on_binary</w:t>
+            </w:r>
+            <w:r>
+              <w:t xml:space="preserve">.</w:t>
+            </w:r>
+          </w:p>
+        </w:tc>
+      </w:tr>
+      <w:tr>
+        <w:tc>
+          <w:tcPr/>
+          <w:p>
+            <w:pPr>
+              <w:pStyle w:val="Compact"/>
+            </w:pPr>
+            <w:r>
+              <w:t xml:space="preserve">E53 Brotli flake</w:t>
+            </w:r>
+          </w:p>
+        </w:tc>
+        <w:tc>
+          <w:tcPr/>
+          <w:p>
+            <w:pPr>
+              <w:pStyle w:val="Compact"/>
+            </w:pPr>
+            <w:r>
+              <w:t xml:space="preserve">Fixed (</w:t>
+            </w:r>
+            <w:r>
+              <w:rPr>
+                <w:rStyle w:val="VerbatimChar"/>
+              </w:rPr>
+              <w:t xml:space="preserve">dfca0be</w:t>
+            </w:r>
+            <w:r>
+              <w:t xml:space="preserve">)</w:t>
+            </w:r>
+          </w:p>
+        </w:tc>
+        <w:tc>
+          <w:tcPr/>
+          <w:p>
+            <w:pPr>
+              <w:pStyle w:val="Compact"/>
+            </w:pPr>
+            <w:r>
+              <w:t xml:space="preserve">e2e E53 byte-compared two SEPARATE</w:t>
+            </w:r>
+            <w:r>
+              <w:t xml:space="preserve"> </w:t>
+            </w:r>
+            <w:r>
+              <w:rPr>
+                <w:rStyle w:val="VerbatimChar"/>
+              </w:rPr>
+              <w:t xml:space="preserve">/v1/safety_state</w:t>
+            </w:r>
+            <w:r>
+              <w:t xml:space="preserve"> </w:t>
+            </w:r>
+            <w:r>
+              <w:t xml:space="preserve">responses, but the body carries live</w:t>
+            </w:r>
+            <w:r>
+              <w:t xml:space="preserve"> </w:t>
+            </w:r>
+            <w:r>
+              <w:rPr>
+                <w:rStyle w:val="VerbatimChar"/>
+              </w:rPr>
+              <w:t xml:space="preserve">current_mem_percent</w:t>
+            </w:r>
+            <w:r>
+              <w:t xml:space="preserve">/</w:t>
+            </w:r>
+            <w:r>
+              <w:rPr>
+                <w:rStyle w:val="VerbatimChar"/>
+              </w:rPr>
+              <w:t xml:space="preserve">last_mem_sample_at</w:t>
+            </w:r>
+            <w:r>
+              <w:t xml:space="preserve">/</w:t>
+            </w:r>
+            <w:r>
+              <w:rPr>
+                <w:rStyle w:val="VerbatimChar"/>
+              </w:rPr>
+              <w:t xml:space="preserve">uptime_seconds</w:t>
+            </w:r>
+            <w:r>
+              <w:t xml:space="preserve"> </w:t>
+            </w:r>
+            <w:r>
+              <w:t xml:space="preserve">→ false FAIL. Replaced cross-call diff with a codec-agnostic</w:t>
+            </w:r>
+            <w:r>
+              <w:t xml:space="preserve"> </w:t>
+            </w:r>
+            <w:r>
+              <w:rPr>
+                <w:rStyle w:val="VerbatimChar"/>
+              </w:rPr>
+              <w:t xml:space="preserve">grep uptime_seconds</w:t>
+            </w:r>
+            <w:r>
+              <w:t xml:space="preserve"> </w:t>
+            </w:r>
+            <w:r>
+              <w:t xml:space="preserve">on the (decoded) body; kept the</w:t>
+            </w:r>
+            <w:r>
+              <w:t xml:space="preserve"> </w:t>
+            </w:r>
+            <w:r>
+              <w:rPr>
+                <w:rStyle w:val="VerbatimChar"/>
+              </w:rPr>
+              <w:t xml:space="preserve">Content-Encoding:br</w:t>
+            </w:r>
+            <w:r>
+              <w:t xml:space="preserve"> </w:t>
+            </w:r>
+            <w:r>
+              <w:t xml:space="preserve">policy check.</w:t>
+            </w:r>
+          </w:p>
+        </w:tc>
+      </w:tr>
+      <w:tr>
+        <w:tc>
+          <w:tcPr/>
+          <w:p>
+            <w:pPr>
+              <w:pStyle w:val="Compact"/>
+            </w:pPr>
+            <w:r>
+              <w:t xml:space="preserve">RESUME-AT (next units)</w:t>
+            </w:r>
+          </w:p>
+        </w:tc>
+        <w:tc>
+          <w:tcPr/>
+          <w:p>
+            <w:pPr>
+              <w:pStyle w:val="Compact"/>
+            </w:pPr>
+            <w:r>
+              <w:t xml:space="preserve">next</w:t>
+            </w:r>
+          </w:p>
+        </w:tc>
+        <w:tc>
+          <w:tcPr/>
+          <w:p>
+            <w:pPr>
+              <w:pStyle w:val="Compact"/>
+            </w:pPr>
+            <w:r>
+              <w:t xml:space="preserve">(1) finish §43:</w:t>
+            </w:r>
+            <w:r>
+              <w:t xml:space="preserve"> </w:t>
+            </w:r>
+            <w:r>
+              <w:rPr>
+                <w:b/>
+                <w:bCs/>
+              </w:rPr>
+              <w:t xml:space="preserve">HRD-034</w:t>
+            </w:r>
+            <w:r>
+              <w:t xml:space="preserve"> </w:t>
+            </w:r>
+            <w:r>
+              <w:t xml:space="preserve">sherald backup-snapshot +</w:t>
+            </w:r>
+            <w:r>
+              <w:t xml:space="preserve"> </w:t>
+            </w:r>
+            <w:r>
+              <w:rPr>
+                <w:b/>
+                <w:bCs/>
+              </w:rPr>
+              <w:t xml:space="preserve">HRD-047</w:t>
+            </w:r>
+            <w:r>
+              <w:t xml:space="preserve"> </w:t>
+            </w:r>
+            <w:r>
+              <w:t xml:space="preserve">scherald status-digest. (2)</w:t>
+            </w:r>
+            <w:r>
+              <w:t xml:space="preserve"> </w:t>
+            </w:r>
+            <w:r>
+              <w:rPr>
+                <w:b/>
+                <w:bCs/>
+              </w:rPr>
+              <w:t xml:space="preserve">Batch D</w:t>
+            </w:r>
+            <w:r>
+              <w:t xml:space="preserve"> </w:t>
+            </w:r>
+            <w:r>
+              <w:t xml:space="preserve">commons_infra HRD-081 + HRD-085..090 (TaskRepository surfaces). (3)</w:t>
+            </w:r>
+            <w:r>
+              <w:t xml:space="preserve"> </w:t>
+            </w:r>
+            <w:r>
+              <w:rPr>
+                <w:b/>
+                <w:bCs/>
+              </w:rPr>
+              <w:t xml:space="preserve">Batch E</w:t>
+            </w:r>
+            <w:r>
+              <w:t xml:space="preserve"> </w:t>
+            </w:r>
+            <w:r>
+              <w:t xml:space="preserve">Wave 7 T6-T12 Slack HRD-115..121 (slack-go submodule + I6 gate; renumber e2e off E121+). (4) operator-live close-out flips HRD-019..025 + §43 rows →Fixed. (5) §11.4.93 SQLite (HRD-131, deferred). Plan</w:t>
             </w:r>
             <w:r>
               <w:t xml:space="preserve"> </w:t>
@@ -5075,6 +5758,15 @@
                 <w:rStyle w:val="VerbatimChar"/>
               </w:rPr>
               <w:t xml:space="preserve">docs/superpowers/plans/2026-05-27-v1.0.0-execution.md</w:t>
+            </w:r>
+            <w:r>
+              <w:t xml:space="preserve">. HEAD=</w:t>
+            </w:r>
+            <w:r>
+              <w:rPr>
+                <w:rStyle w:val="VerbatimChar"/>
+              </w:rPr>
+              <w:t xml:space="preserve">aef0207</w:t>
             </w:r>
             <w:r>
               <w:t xml:space="preserve">.</w:t>

</xml_diff>

<commit_message>
docs: CONTINUATION r15→r16 — §43 catalogue COMPLETE; Batch D is next (needs live PG)
§43 stragglers HRD-034 (sherald backup-snapshot) + HRD-047 (scherald
status-digest) landed (ba27a0e, E121-E122) — the full §43 catalogue
(HRD-029..056, 30 commands) is now implemented + e2e-proven (E97-E122,
132 PASS / 0 FAIL). RESUME-AT updated: Batch D = the 17 ErrUnsupported
pgxTaskRepository methods (HRD-085..089) + new task_resource_snapshots
migration — needs live PG :24100 for §107 anti-bluff integration evidence.
HEAD=ba27a0e.

Co-Authored-By: Claude Opus 4.7 <noreply@anthropic.com>
</commit_message>
<xml_diff>
--- a/docs/CONTINUATION.docx
+++ b/docs/CONTINUATION.docx
@@ -75,7 +75,7 @@
               <w:pStyle w:val="Compact"/>
             </w:pPr>
             <w:r>
-              <w:t xml:space="preserve">15</w:t>
+              <w:t xml:space="preserve">16</w:t>
             </w:r>
           </w:p>
         </w:tc>
@@ -5662,7 +5662,7 @@
               <w:pStyle w:val="Compact"/>
             </w:pPr>
             <w:r>
-              <w:t xml:space="preserve">RESUME-AT (next units)</w:t>
+              <w:t xml:space="preserve">§43 stragglers (HRD-034/047)</w:t>
             </w:r>
           </w:p>
         </w:tc>
@@ -5673,7 +5673,19 @@
               <w:pStyle w:val="Compact"/>
             </w:pPr>
             <w:r>
-              <w:t xml:space="preserve">next</w:t>
+              <w:t xml:space="preserve">in_progress (IMPLEMENTED 2026-05-28,</w:t>
+            </w:r>
+            <w:r>
+              <w:t xml:space="preserve"> </w:t>
+            </w:r>
+            <w:r>
+              <w:rPr>
+                <w:rStyle w:val="VerbatimChar"/>
+              </w:rPr>
+              <w:t xml:space="preserve">ba27a0e</w:t>
+            </w:r>
+            <w:r>
+              <w:t xml:space="preserve">)</w:t>
             </w:r>
           </w:p>
         </w:tc>
@@ -5684,39 +5696,109 @@
               <w:pStyle w:val="Compact"/>
             </w:pPr>
             <w:r>
-              <w:t xml:space="preserve">(1) finish §43:</w:t>
-            </w:r>
-            <w:r>
-              <w:t xml:space="preserve"> </w:t>
-            </w:r>
-            <w:r>
-              <w:rPr>
-                <w:b/>
-                <w:bCs/>
-              </w:rPr>
-              <w:t xml:space="preserve">HRD-034</w:t>
-            </w:r>
-            <w:r>
-              <w:t xml:space="preserve"> </w:t>
-            </w:r>
-            <w:r>
-              <w:t xml:space="preserve">sherald backup-snapshot +</w:t>
-            </w:r>
-            <w:r>
-              <w:t xml:space="preserve"> </w:t>
-            </w:r>
-            <w:r>
-              <w:rPr>
-                <w:b/>
-                <w:bCs/>
-              </w:rPr>
-              <w:t xml:space="preserve">HRD-047</w:t>
-            </w:r>
-            <w:r>
-              <w:t xml:space="preserve"> </w:t>
-            </w:r>
-            <w:r>
-              <w:t xml:space="preserve">scherald status-digest. (2)</w:t>
+              <w:rPr>
+                <w:b/>
+                <w:bCs/>
+              </w:rPr>
+              <w:t xml:space="preserve">§43 catalogue NOW COMPLETE</w:t>
+            </w:r>
+            <w:r>
+              <w:t xml:space="preserve"> </w:t>
+            </w:r>
+            <w:r>
+              <w:t xml:space="preserve">—</w:t>
+            </w:r>
+            <w:r>
+              <w:t xml:space="preserve"> </w:t>
+            </w:r>
+            <w:r>
+              <w:rPr>
+                <w:rStyle w:val="VerbatimChar"/>
+              </w:rPr>
+              <w:t xml:space="preserve">sherald backup-snapshot</w:t>
+            </w:r>
+            <w:r>
+              <w:t xml:space="preserve"> </w:t>
+            </w:r>
+            <w:r>
+              <w:t xml:space="preserve">(§9.3 os.Link hardlinks →</w:t>
+            </w:r>
+            <w:r>
+              <w:t xml:space="preserve"> </w:t>
+            </w:r>
+            <w:r>
+              <w:rPr>
+                <w:rStyle w:val="VerbatimChar"/>
+              </w:rPr>
+              <w:t xml:space="preserve">.gate.recovered</w:t>
+            </w:r>
+            <w:r>
+              <w:t xml:space="preserve">, E121) +</w:t>
+            </w:r>
+            <w:r>
+              <w:t xml:space="preserve"> </w:t>
+            </w:r>
+            <w:r>
+              <w:rPr>
+                <w:rStyle w:val="VerbatimChar"/>
+              </w:rPr>
+              <w:t xml:space="preserve">scherald status-digest</w:t>
+            </w:r>
+            <w:r>
+              <w:t xml:space="preserve"> </w:t>
+            </w:r>
+            <w:r>
+              <w:t xml:space="preserve">(§11.4.45 Status.md sweep +</w:t>
+            </w:r>
+            <w:r>
+              <w:t xml:space="preserve"> </w:t>
+            </w:r>
+            <w:r>
+              <w:rPr>
+                <w:rStyle w:val="VerbatimChar"/>
+              </w:rPr>
+              <w:t xml:space="preserve">--apply</w:t>
+            </w:r>
+            <w:r>
+              <w:t xml:space="preserve"> </w:t>
+            </w:r>
+            <w:r>
+              <w:t xml:space="preserve">Status_Summary regen, E122). All 30 §43 commands (HRD-029..056) across pherald/sherald/cherald/rherald/bherald/scherald implemented + e2e-proven (E97-E122).</w:t>
+            </w:r>
+          </w:p>
+        </w:tc>
+      </w:tr>
+      <w:tr>
+        <w:tc>
+          <w:tcPr/>
+          <w:p>
+            <w:pPr>
+              <w:pStyle w:val="Compact"/>
+            </w:pPr>
+            <w:r>
+              <w:t xml:space="preserve">RESUME-AT (next units)</w:t>
+            </w:r>
+          </w:p>
+        </w:tc>
+        <w:tc>
+          <w:tcPr/>
+          <w:p>
+            <w:pPr>
+              <w:pStyle w:val="Compact"/>
+            </w:pPr>
+            <w:r>
+              <w:t xml:space="preserve">next</w:t>
+            </w:r>
+          </w:p>
+        </w:tc>
+        <w:tc>
+          <w:tcPr/>
+          <w:p>
+            <w:pPr>
+              <w:pStyle w:val="Compact"/>
+            </w:pPr>
+            <w:r>
+              <w:t xml:space="preserve">(1)</w:t>
             </w:r>
             <w:r>
               <w:t xml:space="preserve"> </w:t>
@@ -5732,7 +5814,74 @@
               <w:t xml:space="preserve"> </w:t>
             </w:r>
             <w:r>
-              <w:t xml:space="preserve">commons_infra HRD-081 + HRD-085..090 (TaskRepository surfaces). (3)</w:t>
+              <w:t xml:space="preserve">commons_infra</w:t>
+            </w:r>
+            <w:r>
+              <w:t xml:space="preserve"> </w:t>
+            </w:r>
+            <w:r>
+              <w:rPr>
+                <w:rStyle w:val="VerbatimChar"/>
+              </w:rPr>
+              <w:t xml:space="preserve">pgxTaskRepository</w:t>
+            </w:r>
+            <w:r>
+              <w:t xml:space="preserve"> </w:t>
+            </w:r>
+            <w:r>
+              <w:t xml:space="preserve">(</w:t>
+            </w:r>
+            <w:r>
+              <w:rPr>
+                <w:rStyle w:val="VerbatimChar"/>
+              </w:rPr>
+              <w:t xml:space="preserve">commons_infra/task_repository.go</w:t>
+            </w:r>
+            <w:r>
+              <w:t xml:space="preserve">) — 17 methods currently</w:t>
+            </w:r>
+            <w:r>
+              <w:t xml:space="preserve"> </w:t>
+            </w:r>
+            <w:r>
+              <w:rPr>
+                <w:rStyle w:val="VerbatimChar"/>
+              </w:rPr>
+              <w:t xml:space="preserve">ErrUnsupported</w:t>
+            </w:r>
+            <w:r>
+              <w:t xml:space="preserve">: HRD-085 GetByID/Update/Delete, HRD-086 UpdateStatus/UpdateProgress/UpdateHeartbeat/SaveCheckpoint, HRD-087 GetByStatus/GetPendingTasks/CountByStatus/GetTaskHistory, HRD-088 GetStaleTasks/GetByWorkerID, HRD-089 SaveResourceSnapshot/GetResourceSnapshots (+new</w:t>
+            </w:r>
+            <w:r>
+              <w:t xml:space="preserve"> </w:t>
+            </w:r>
+            <w:r>
+              <w:rPr>
+                <w:rStyle w:val="VerbatimChar"/>
+              </w:rPr>
+              <w:t xml:space="preserve">task_resource_snapshots</w:t>
+            </w:r>
+            <w:r>
+              <w:t xml:space="preserve"> </w:t>
+            </w:r>
+            <w:r>
+              <w:t xml:space="preserve">migration).</w:t>
+            </w:r>
+            <w:r>
+              <w:t xml:space="preserve"> </w:t>
+            </w:r>
+            <w:r>
+              <w:rPr>
+                <w:b/>
+                <w:bCs/>
+              </w:rPr>
+              <w:t xml:space="preserve">Needs live PG :24100</w:t>
+            </w:r>
+            <w:r>
+              <w:t xml:space="preserve"> </w:t>
+            </w:r>
+            <w:r>
+              <w:t xml:space="preserve">(boot via containers submodule + podman socket) for §107 anti-bluff integration evidence — NOT hermetic. HRD-081 is a containers-submodule podman/docker detect (already worked around in boot.go). (2)</w:t>
             </w:r>
             <w:r>
               <w:t xml:space="preserve"> </w:t>
@@ -5748,7 +5897,7 @@
               <w:t xml:space="preserve"> </w:t>
             </w:r>
             <w:r>
-              <w:t xml:space="preserve">Wave 7 T6-T12 Slack HRD-115..121 (slack-go submodule + I6 gate; renumber e2e off E121+). (4) operator-live close-out flips HRD-019..025 + §43 rows →Fixed. (5) §11.4.93 SQLite (HRD-131, deferred). Plan</w:t>
+              <w:t xml:space="preserve">Wave 7 T6-T12 Slack HRD-115..121 (slack-go submodule + I6 gate; e2e off E123+). (3) operator-live close-out flips HRD-019..025 + §43 rows →Fixed. (4) §11.4.93 SQLite (HRD-131, deferred). Plan</w:t>
             </w:r>
             <w:r>
               <w:t xml:space="preserve"> </w:t>
@@ -5766,7 +5915,7 @@
               <w:rPr>
                 <w:rStyle w:val="VerbatimChar"/>
               </w:rPr>
-              <w:t xml:space="preserve">aef0207</w:t>
+              <w:t xml:space="preserve">ba27a0e</w:t>
             </w:r>
             <w:r>
               <w:t xml:space="preserve">.</w:t>

</xml_diff>

<commit_message>
docs: CONTINUATION r16→r17 — Batch D done (real-PG 14/14); Batch E next
pgxTaskRepository HRD-085..089 implemented + real-PG verified (5899623,
14/14 integration round-trips, migration 000013). RESUME-AT: Batch E (Wave 7
Slack HRD-115..121) → HRD-090 MoveToDeadLetter → operator-live close-out
(flip HRD-019..025 + §43 + Batch D →Fixed). HEAD=5899623; full e2e 148/0;
podman VM up + herald-postgres :24100 healthy.

Co-Authored-By: Claude Opus 4.7 <noreply@anthropic.com>
</commit_message>
<xml_diff>
--- a/docs/CONTINUATION.docx
+++ b/docs/CONTINUATION.docx
@@ -75,7 +75,7 @@
               <w:pStyle w:val="Compact"/>
             </w:pPr>
             <w:r>
-              <w:t xml:space="preserve">16</w:t>
+              <w:t xml:space="preserve">17</w:t>
             </w:r>
           </w:p>
         </w:tc>
@@ -5776,7 +5776,7 @@
               <w:pStyle w:val="Compact"/>
             </w:pPr>
             <w:r>
-              <w:t xml:space="preserve">RESUME-AT (next units)</w:t>
+              <w:t xml:space="preserve">Batch D (HRD-085..089)</w:t>
             </w:r>
           </w:p>
         </w:tc>
@@ -5787,7 +5787,19 @@
               <w:pStyle w:val="Compact"/>
             </w:pPr>
             <w:r>
-              <w:t xml:space="preserve">next</w:t>
+              <w:t xml:space="preserve">in_progress (IMPLEMENTED 2026-05-28,</w:t>
+            </w:r>
+            <w:r>
+              <w:t xml:space="preserve"> </w:t>
+            </w:r>
+            <w:r>
+              <w:rPr>
+                <w:rStyle w:val="VerbatimChar"/>
+              </w:rPr>
+              <w:t xml:space="preserve">5899623</w:t>
+            </w:r>
+            <w:r>
+              <w:t xml:space="preserve">)</w:t>
             </w:r>
           </w:p>
         </w:tc>
@@ -5798,6 +5810,264 @@
               <w:pStyle w:val="Compact"/>
             </w:pPr>
             <w:r>
+              <w:rPr>
+                <w:b/>
+                <w:bCs/>
+              </w:rPr>
+              <w:t xml:space="preserve">commons_infra</w:t>
+            </w:r>
+            <w:r>
+              <w:rPr>
+                <w:b/>
+                <w:bCs/>
+              </w:rPr>
+              <w:t xml:space="preserve"> </w:t>
+            </w:r>
+            <w:r>
+              <w:rPr>
+                <w:rStyle w:val="VerbatimChar"/>
+                <w:b/>
+                <w:bCs/>
+              </w:rPr>
+              <w:t xml:space="preserve">pgxTaskRepository</w:t>
+            </w:r>
+            <w:r>
+              <w:rPr>
+                <w:b/>
+                <w:bCs/>
+              </w:rPr>
+              <w:t xml:space="preserve"> </w:t>
+            </w:r>
+            <w:r>
+              <w:rPr>
+                <w:b/>
+                <w:bCs/>
+              </w:rPr>
+              <w:t xml:space="preserve">— 16 of 17 methods implemented + REAL-PG verified.</w:t>
+            </w:r>
+            <w:r>
+              <w:t xml:space="preserve"> </w:t>
+            </w:r>
+            <w:r>
+              <w:t xml:space="preserve">GetByID/Update/Delete(soft) + UpdateStatus/Progress/Heartbeat/SaveCheckpoint + GetByStatus/GetPendingTasks/CountByStatus/GetTaskHistory + GetStaleTasks/GetByWorkerID + SaveResourceSnapshot/GetResourceSnapshots; migration</w:t>
+            </w:r>
+            <w:r>
+              <w:t xml:space="preserve"> </w:t>
+            </w:r>
+            <w:r>
+              <w:rPr>
+                <w:rStyle w:val="VerbatimChar"/>
+              </w:rPr>
+              <w:t xml:space="preserve">000013_task_resource_snapshots</w:t>
+            </w:r>
+            <w:r>
+              <w:t xml:space="preserve"> </w:t>
+            </w:r>
+            <w:r>
+              <w:t xml:space="preserve">(ledger 12→13).</w:t>
+            </w:r>
+            <w:r>
+              <w:t xml:space="preserve"> </w:t>
+            </w:r>
+            <w:r>
+              <w:rPr>
+                <w:b/>
+                <w:bCs/>
+              </w:rPr>
+              <w:t xml:space="preserve">14/14 integration round-trips PASS against live PG</w:t>
+            </w:r>
+            <w:r>
+              <w:t xml:space="preserve"> </w:t>
+            </w:r>
+            <w:r>
+              <w:t xml:space="preserve">(</w:t>
+            </w:r>
+            <w:r>
+              <w:rPr>
+                <w:rStyle w:val="VerbatimChar"/>
+              </w:rPr>
+              <w:t xml:space="preserve">docs/qa/HRD-085-089-20260528T070000Z/integration_realpg.log</w:t>
+            </w:r>
+            <w:r>
+              <w:t xml:space="preserve">); e2e E123 (gated</w:t>
+            </w:r>
+            <w:r>
+              <w:t xml:space="preserve"> </w:t>
+            </w:r>
+            <w:r>
+              <w:rPr>
+                <w:rStyle w:val="VerbatimChar"/>
+              </w:rPr>
+              <w:t xml:space="preserve">HERALD_BATCHD_LIVE=1</w:t>
+            </w:r>
+            <w:r>
+              <w:t xml:space="preserve"> </w:t>
+            </w:r>
+            <w:r>
+              <w:t xml:space="preserve">— self-boot collides with the e2e's shared PG). The real-PG run caught + fixed a latent</w:t>
+            </w:r>
+            <w:r>
+              <w:t xml:space="preserve"> </w:t>
+            </w:r>
+            <w:r>
+              <w:rPr>
+                <w:rStyle w:val="VerbatimChar"/>
+              </w:rPr>
+              <w:t xml:space="preserve">LogEvent</w:t>
+            </w:r>
+            <w:r>
+              <w:t xml:space="preserve"> </w:t>
+            </w:r>
+            <w:r>
+              <w:t xml:space="preserve">JSONB-as-[]byte→bytea 22P02 bug (now</w:t>
+            </w:r>
+            <w:r>
+              <w:t xml:space="preserve"> </w:t>
+            </w:r>
+            <w:r>
+              <w:rPr>
+                <w:rStyle w:val="VerbatimChar"/>
+              </w:rPr>
+              <w:t xml:space="preserve">string()</w:t>
+            </w:r>
+            <w:r>
+              <w:t xml:space="preserve">).</w:t>
+            </w:r>
+            <w:r>
+              <w:t xml:space="preserve"> </w:t>
+            </w:r>
+            <w:r>
+              <w:rPr>
+                <w:rStyle w:val="VerbatimChar"/>
+                <w:b/>
+                <w:bCs/>
+              </w:rPr>
+              <w:t xml:space="preserve">MoveToDeadLetter</w:t>
+            </w:r>
+            <w:r>
+              <w:rPr>
+                <w:b/>
+                <w:bCs/>
+              </w:rPr>
+              <w:t xml:space="preserve"> </w:t>
+            </w:r>
+            <w:r>
+              <w:rPr>
+                <w:b/>
+                <w:bCs/>
+              </w:rPr>
+              <w:t xml:space="preserve">still</w:t>
+            </w:r>
+            <w:r>
+              <w:rPr>
+                <w:b/>
+                <w:bCs/>
+              </w:rPr>
+              <w:t xml:space="preserve"> </w:t>
+            </w:r>
+            <w:r>
+              <w:rPr>
+                <w:rStyle w:val="VerbatimChar"/>
+                <w:b/>
+                <w:bCs/>
+              </w:rPr>
+              <w:t xml:space="preserve">ErrUnsupported</w:t>
+            </w:r>
+            <w:r>
+              <w:rPr>
+                <w:b/>
+                <w:bCs/>
+              </w:rPr>
+              <w:t xml:space="preserve"> </w:t>
+            </w:r>
+            <w:r>
+              <w:rPr>
+                <w:b/>
+                <w:bCs/>
+              </w:rPr>
+              <w:t xml:space="preserve">→ HRD-090</w:t>
+            </w:r>
+            <w:r>
+              <w:t xml:space="preserve"> </w:t>
+            </w:r>
+            <w:r>
+              <w:t xml:space="preserve">(dead-letter table + retention, separate effort). PG boot:</w:t>
+            </w:r>
+            <w:r>
+              <w:t xml:space="preserve"> </w:t>
+            </w:r>
+            <w:r>
+              <w:rPr>
+                <w:rStyle w:val="VerbatimChar"/>
+              </w:rPr>
+              <w:t xml:space="preserve">podman machine start</w:t>
+            </w:r>
+            <w:r>
+              <w:t xml:space="preserve"> </w:t>
+            </w:r>
+            <w:r>
+              <w:t xml:space="preserve">(VM was never-started) + the integration suite self-boots herald-postgres via QuickstartBoot; a stale</w:t>
+            </w:r>
+            <w:r>
+              <w:t xml:space="preserve"> </w:t>
+            </w:r>
+            <w:r>
+              <w:rPr>
+                <w:rStyle w:val="VerbatimChar"/>
+              </w:rPr>
+              <w:t xml:space="preserve">herald-e2e_/herald-quickstart_herald-pg</w:t>
+            </w:r>
+            <w:r>
+              <w:t xml:space="preserve"> </w:t>
+            </w:r>
+            <w:r>
+              <w:t xml:space="preserve">volume caused a one-time 28P01 auth fail — removed both, recreated fresh with</w:t>
+            </w:r>
+            <w:r>
+              <w:t xml:space="preserve"> </w:t>
+            </w:r>
+            <w:r>
+              <w:rPr>
+                <w:rStyle w:val="VerbatimChar"/>
+              </w:rPr>
+              <w:t xml:space="preserve">herald_dev</w:t>
+            </w:r>
+            <w:r>
+              <w:t xml:space="preserve">.</w:t>
+            </w:r>
+          </w:p>
+        </w:tc>
+      </w:tr>
+      <w:tr>
+        <w:tc>
+          <w:tcPr/>
+          <w:p>
+            <w:pPr>
+              <w:pStyle w:val="Compact"/>
+            </w:pPr>
+            <w:r>
+              <w:t xml:space="preserve">RESUME-AT (next units)</w:t>
+            </w:r>
+          </w:p>
+        </w:tc>
+        <w:tc>
+          <w:tcPr/>
+          <w:p>
+            <w:pPr>
+              <w:pStyle w:val="Compact"/>
+            </w:pPr>
+            <w:r>
+              <w:t xml:space="preserve">next</w:t>
+            </w:r>
+          </w:p>
+        </w:tc>
+        <w:tc>
+          <w:tcPr/>
+          <w:p>
+            <w:pPr>
+              <w:pStyle w:val="Compact"/>
+            </w:pPr>
+            <w:r>
               <w:t xml:space="preserve">(1)</w:t>
             </w:r>
             <w:r>
@@ -5808,37 +6078,102 @@
                 <w:b/>
                 <w:bCs/>
               </w:rPr>
-              <w:t xml:space="preserve">Batch D</w:t>
-            </w:r>
-            <w:r>
-              <w:t xml:space="preserve"> </w:t>
-            </w:r>
-            <w:r>
-              <w:t xml:space="preserve">commons_infra</w:t>
-            </w:r>
-            <w:r>
-              <w:t xml:space="preserve"> </w:t>
-            </w:r>
-            <w:r>
-              <w:rPr>
-                <w:rStyle w:val="VerbatimChar"/>
-              </w:rPr>
-              <w:t xml:space="preserve">pgxTaskRepository</w:t>
-            </w:r>
-            <w:r>
-              <w:t xml:space="preserve"> </w:t>
-            </w:r>
-            <w:r>
-              <w:t xml:space="preserve">(</w:t>
-            </w:r>
-            <w:r>
-              <w:rPr>
-                <w:rStyle w:val="VerbatimChar"/>
-              </w:rPr>
-              <w:t xml:space="preserve">commons_infra/task_repository.go</w:t>
-            </w:r>
-            <w:r>
-              <w:t xml:space="preserve">) — 17 methods currently</w:t>
+              <w:t xml:space="preserve">Batch E</w:t>
+            </w:r>
+            <w:r>
+              <w:t xml:space="preserve"> </w:t>
+            </w:r>
+            <w:r>
+              <w:t xml:space="preserve">Wave 7 T6-T12 Slack HRD-115..121 (vendor a slack-go submodule + the I6 no-</w:t>
+            </w:r>
+            <w:r>
+              <w:rPr>
+                <w:rStyle w:val="VerbatimChar"/>
+              </w:rPr>
+              <w:t xml:space="preserve">&lt;repo&gt;/constitution/</w:t>
+            </w:r>
+            <w:r>
+              <w:t xml:space="preserve">/</w:t>
+            </w:r>
+            <w:r>
+              <w:rPr>
+                <w:rStyle w:val="VerbatimChar"/>
+              </w:rPr>
+              <w:t xml:space="preserve">.gitmodules</w:t>
+            </w:r>
+            <w:r>
+              <w:t xml:space="preserve"> </w:t>
+            </w:r>
+            <w:r>
+              <w:t xml:space="preserve">gate check; new</w:t>
+            </w:r>
+            <w:r>
+              <w:t xml:space="preserve"> </w:t>
+            </w:r>
+            <w:r>
+              <w:rPr>
+                <w:rStyle w:val="VerbatimChar"/>
+              </w:rPr>
+              <w:t xml:space="preserve">slack://</w:t>
+            </w:r>
+            <w:r>
+              <w:t xml:space="preserve"> </w:t>
+            </w:r>
+            <w:r>
+              <w:t xml:space="preserve">channel adapter per the Wave-7</w:t>
+            </w:r>
+            <w:r>
+              <w:t xml:space="preserve"> </w:t>
+            </w:r>
+            <w:r>
+              <w:rPr>
+                <w:rStyle w:val="VerbatimChar"/>
+              </w:rPr>
+              <w:t xml:space="preserve">Channel</w:t>
+            </w:r>
+            <w:r>
+              <w:t xml:space="preserve"> </w:t>
+            </w:r>
+            <w:r>
+              <w:t xml:space="preserve">framework; e2e off</w:t>
+            </w:r>
+            <w:r>
+              <w:t xml:space="preserve"> </w:t>
+            </w:r>
+            <w:r>
+              <w:rPr>
+                <w:b/>
+                <w:bCs/>
+              </w:rPr>
+              <w:t xml:space="preserve">E124+</w:t>
+            </w:r>
+            <w:r>
+              <w:t xml:space="preserve">). (2)</w:t>
+            </w:r>
+            <w:r>
+              <w:t xml:space="preserve"> </w:t>
+            </w:r>
+            <w:r>
+              <w:rPr>
+                <w:b/>
+                <w:bCs/>
+              </w:rPr>
+              <w:t xml:space="preserve">HRD-090</w:t>
+            </w:r>
+            <w:r>
+              <w:t xml:space="preserve"> </w:t>
+            </w:r>
+            <w:r>
+              <w:rPr>
+                <w:rStyle w:val="VerbatimChar"/>
+              </w:rPr>
+              <w:t xml:space="preserve">MoveToDeadLetter</w:t>
+            </w:r>
+            <w:r>
+              <w:t xml:space="preserve"> </w:t>
+            </w:r>
+            <w:r>
+              <w:t xml:space="preserve">(dead-letter table + retention design) — the last</w:t>
             </w:r>
             <w:r>
               <w:t xml:space="preserve"> </w:t>
@@ -5850,54 +6185,10 @@
               <w:t xml:space="preserve">ErrUnsupported</w:t>
             </w:r>
             <w:r>
-              <w:t xml:space="preserve">: HRD-085 GetByID/Update/Delete, HRD-086 UpdateStatus/UpdateProgress/UpdateHeartbeat/SaveCheckpoint, HRD-087 GetByStatus/GetPendingTasks/CountByStatus/GetTaskHistory, HRD-088 GetStaleTasks/GetByWorkerID, HRD-089 SaveResourceSnapshot/GetResourceSnapshots (+new</w:t>
-            </w:r>
-            <w:r>
-              <w:t xml:space="preserve"> </w:t>
-            </w:r>
-            <w:r>
-              <w:rPr>
-                <w:rStyle w:val="VerbatimChar"/>
-              </w:rPr>
-              <w:t xml:space="preserve">task_resource_snapshots</w:t>
-            </w:r>
-            <w:r>
-              <w:t xml:space="preserve"> </w:t>
-            </w:r>
-            <w:r>
-              <w:t xml:space="preserve">migration).</w:t>
-            </w:r>
-            <w:r>
-              <w:t xml:space="preserve"> </w:t>
-            </w:r>
-            <w:r>
-              <w:rPr>
-                <w:b/>
-                <w:bCs/>
-              </w:rPr>
-              <w:t xml:space="preserve">Needs live PG :24100</w:t>
-            </w:r>
-            <w:r>
-              <w:t xml:space="preserve"> </w:t>
-            </w:r>
-            <w:r>
-              <w:t xml:space="preserve">(boot via containers submodule + podman socket) for §107 anti-bluff integration evidence — NOT hermetic. HRD-081 is a containers-submodule podman/docker detect (already worked around in boot.go). (2)</w:t>
-            </w:r>
-            <w:r>
-              <w:t xml:space="preserve"> </w:t>
-            </w:r>
-            <w:r>
-              <w:rPr>
-                <w:b/>
-                <w:bCs/>
-              </w:rPr>
-              <w:t xml:space="preserve">Batch E</w:t>
-            </w:r>
-            <w:r>
-              <w:t xml:space="preserve"> </w:t>
-            </w:r>
-            <w:r>
-              <w:t xml:space="preserve">Wave 7 T6-T12 Slack HRD-115..121 (slack-go submodule + I6 gate; e2e off E123+). (3) operator-live close-out flips HRD-019..025 + §43 rows →Fixed. (4) §11.4.93 SQLite (HRD-131, deferred). Plan</w:t>
+              <w:t xml:space="preserve"> </w:t>
+            </w:r>
+            <w:r>
+              <w:t xml:space="preserve">TaskRepository method. (3) operator-live close-out: flip HRD-019..025 (Batch B bindings) + the §43 rows (HRD-029..056) + Batch D rows (HRD-085..089) →Fixed once operator-live-validated. (4) HRD-008 quickstart validation, HRD-015 gate-I8, HRD-081 (upstream containers podman/docker detect). (5) §11.4.93 SQLite (HRD-131, operator-deferred). Plan</w:t>
             </w:r>
             <w:r>
               <w:t xml:space="preserve"> </w:t>
@@ -5909,16 +6200,28 @@
               <w:t xml:space="preserve">docs/superpowers/plans/2026-05-27-v1.0.0-execution.md</w:t>
             </w:r>
             <w:r>
-              <w:t xml:space="preserve">. HEAD=</w:t>
-            </w:r>
-            <w:r>
-              <w:rPr>
-                <w:rStyle w:val="VerbatimChar"/>
-              </w:rPr>
-              <w:t xml:space="preserve">ba27a0e</w:t>
-            </w:r>
-            <w:r>
               <w:t xml:space="preserve">.</w:t>
+            </w:r>
+            <w:r>
+              <w:t xml:space="preserve"> </w:t>
+            </w:r>
+            <w:r>
+              <w:rPr>
+                <w:b/>
+                <w:bCs/>
+              </w:rPr>
+              <w:t xml:space="preserve">HEAD=</w:t>
+            </w:r>
+            <w:r>
+              <w:rPr>
+                <w:rStyle w:val="VerbatimChar"/>
+                <w:b/>
+                <w:bCs/>
+              </w:rPr>
+              <w:t xml:space="preserve">5899623</w:t>
+            </w:r>
+            <w:r>
+              <w:t xml:space="preserve">; full e2e 148 PASS / 0 FAIL; podman VM now running + herald-postgres :24100 healthy (fresh herald_dev volume).</w:t>
             </w:r>
           </w:p>
         </w:tc>

</xml_diff>

<commit_message>
docs: CONTINUATION r17→r18 — Wave 7 CODE-COMPLETE; v0.6.0 tag operator-gated
Wave 7 (HRD-110..121) landed end-to-end this session — slack adapter (T6),
qaherald slack client (T7), spec V3 r12→r13 (T8), e2e E124-E131 (T9), paired
§1.1 mutation gate 4/0 (T10), multi-channel §11.4.85 stress+chaos 12/12 (T11),
MESSENGER_CHANNELS.md operator guide (T12). HEAD=1037019. HRDs stay in_progress
pending operator-live Slack workspace evidence (mirrors Wave 6's v0.4.0
deferred-to-T13b convention). v0.6.0 tag command + env requirements documented
in this row. RESUME-AT: operator-live close-out wave → HRD-090 →
Wave 8 channels → HRD-008/015/081 → §11.4.93. Plans
docs/superpowers/plans/2026-05-27-v1.0.0-execution.md +
docs/superpowers/plans/2026-05-27-wave7-generic-messenger.md.

Co-Authored-By: Claude Opus 4.7 <noreply@anthropic.com>
</commit_message>
<xml_diff>
--- a/docs/CONTINUATION.docx
+++ b/docs/CONTINUATION.docx
@@ -10,7 +10,7 @@
         <w:t xml:space="preserve">Herald</w:t>
       </w:r>
     </w:p>
-    <w:bookmarkStart w:id="22" w:name="herald--continuation"/>
+    <w:bookmarkStart w:id="23" w:name="herald--continuation"/>
     <w:p>
       <w:pPr>
         <w:pStyle w:val="Heading1"/>
@@ -75,7 +75,7 @@
               <w:pStyle w:val="Compact"/>
             </w:pPr>
             <w:r>
-              <w:t xml:space="preserve">17</w:t>
+              <w:t xml:space="preserve">18</w:t>
             </w:r>
           </w:p>
         </w:tc>
@@ -4018,7 +4018,7 @@
       </w:r>
     </w:p>
     <w:bookmarkEnd w:id="12"/>
-    <w:bookmarkStart w:id="13" w:name="X806ebe5881757e2bd20067ef43e32482870d939"/>
+    <w:bookmarkStart w:id="14" w:name="X806ebe5881757e2bd20067ef43e32482870d939"/>
     <w:p>
       <w:pPr>
         <w:pStyle w:val="Heading2"/>
@@ -6046,7 +6046,7 @@
               <w:pStyle w:val="Compact"/>
             </w:pPr>
             <w:r>
-              <w:t xml:space="preserve">RESUME-AT (next units)</w:t>
+              <w:t xml:space="preserve">Wave 7 (HRD-110..121)</w:t>
             </w:r>
           </w:p>
         </w:tc>
@@ -6057,7 +6057,7 @@
               <w:pStyle w:val="Compact"/>
             </w:pPr>
             <w:r>
-              <w:t xml:space="preserve">next</w:t>
+              <w:t xml:space="preserve">in_progress — CODE-COMPLETE 2026-05-28</w:t>
             </w:r>
           </w:p>
         </w:tc>
@@ -6068,6 +6068,380 @@
               <w:pStyle w:val="Compact"/>
             </w:pPr>
             <w:r>
+              <w:rPr>
+                <w:b/>
+                <w:bCs/>
+              </w:rPr>
+              <w:t xml:space="preserve">Generic messenger framework + Slack — entire Wave 7 (T1-T12) landed.</w:t>
+            </w:r>
+            <w:r>
+              <w:t xml:space="preserve"> </w:t>
+            </w:r>
+            <w:r>
+              <w:t xml:space="preserve">Framework (HRD-110..114) Fixed pre-session: channels.Channel interface, init()-registered registry, per-channel inbox/</w:t>
+            </w:r>
+            <w:r>
+              <w:t xml:space="preserve">/</w:t>
+            </w:r>
+            <w:r>
+              <w:t xml:space="preserve">.</w:t>
+            </w:r>
+            <w:r>
+              <w:t xml:space="preserve">, generalized IsSelfEcho via SelfIdentity{Kind,Value}, multi-channel</w:t>
+            </w:r>
+            <w:r>
+              <w:t xml:space="preserve"> </w:t>
+            </w:r>
+            <w:r>
+              <w:rPr>
+                <w:rStyle w:val="VerbatimChar"/>
+              </w:rPr>
+              <w:t xml:space="preserve">pherald listen</w:t>
+            </w:r>
+            <w:r>
+              <w:t xml:space="preserve">. This session:</w:t>
+            </w:r>
+            <w:r>
+              <w:t xml:space="preserve"> </w:t>
+            </w:r>
+            <w:r>
+              <w:rPr>
+                <w:b/>
+                <w:bCs/>
+              </w:rPr>
+              <w:t xml:space="preserve">HRD-115</w:t>
+            </w:r>
+            <w:r>
+              <w:t xml:space="preserve"> </w:t>
+            </w:r>
+            <w:r>
+              <w:t xml:space="preserve">slack adapter Socket Mode (</w:t>
+            </w:r>
+            <w:r>
+              <w:rPr>
+                <w:rStyle w:val="VerbatimChar"/>
+              </w:rPr>
+              <w:t xml:space="preserve">54d4316</w:t>
+            </w:r>
+            <w:r>
+              <w:t xml:space="preserve">, vendored submodules/</w:t>
+            </w:r>
+            <w:hyperlink r:id="rId13">
+              <w:r>
+                <w:rPr>
+                  <w:rStyle w:val="Hyperlink"/>
+                </w:rPr>
+                <w:t xml:space="preserve">slack-go@v0.16.0</w:t>
+              </w:r>
+            </w:hyperlink>
+            <w:r>
+              <w:t xml:space="preserve">/209ec09, 22 hermetic httptest tests),</w:t>
+            </w:r>
+            <w:r>
+              <w:t xml:space="preserve"> </w:t>
+            </w:r>
+            <w:r>
+              <w:rPr>
+                <w:b/>
+                <w:bCs/>
+              </w:rPr>
+              <w:t xml:space="preserve">HRD-116</w:t>
+            </w:r>
+            <w:r>
+              <w:t xml:space="preserve"> </w:t>
+            </w:r>
+            <w:r>
+              <w:t xml:space="preserve">qaherald raw-HTTP slack MessengerClient + channel-keyed Build (</w:t>
+            </w:r>
+            <w:r>
+              <w:rPr>
+                <w:rStyle w:val="VerbatimChar"/>
+              </w:rPr>
+              <w:t xml:space="preserve">6811114</w:t>
+            </w:r>
+            <w:r>
+              <w:t xml:space="preserve">, 30 tests, xoxb token NEVER in errors via sanitizeError + TestSlack_Send_ErrorDoesNotLeakToken),</w:t>
+            </w:r>
+            <w:r>
+              <w:t xml:space="preserve"> </w:t>
+            </w:r>
+            <w:r>
+              <w:rPr>
+                <w:b/>
+                <w:bCs/>
+              </w:rPr>
+              <w:t xml:space="preserve">HRD-117</w:t>
+            </w:r>
+            <w:r>
+              <w:t xml:space="preserve"> </w:t>
+            </w:r>
+            <w:r>
+              <w:t xml:space="preserve">spec V3 r12→r13 (</w:t>
+            </w:r>
+            <w:r>
+              <w:rPr>
+                <w:rStyle w:val="VerbatimChar"/>
+              </w:rPr>
+              <w:t xml:space="preserve">7f1b043</w:t>
+            </w:r>
+            <w:r>
+              <w:t xml:space="preserve">, §11.0 + §32.2 LIVE + §43),</w:t>
+            </w:r>
+            <w:r>
+              <w:t xml:space="preserve"> </w:t>
+            </w:r>
+            <w:r>
+              <w:rPr>
+                <w:b/>
+                <w:bCs/>
+              </w:rPr>
+              <w:t xml:space="preserve">HRD-118</w:t>
+            </w:r>
+            <w:r>
+              <w:t xml:space="preserve"> </w:t>
+            </w:r>
+            <w:r>
+              <w:t xml:space="preserve">e2e E124-E131 multi-channel invariants (</w:t>
+            </w:r>
+            <w:r>
+              <w:rPr>
+                <w:rStyle w:val="VerbatimChar"/>
+              </w:rPr>
+              <w:t xml:space="preserve">17ecd0b</w:t>
+            </w:r>
+            <w:r>
+              <w:t xml:space="preserve">, E127 LIVE-Slack triple-guarded against "no tests to run" PASS-bluff),</w:t>
+            </w:r>
+            <w:r>
+              <w:t xml:space="preserve"> </w:t>
+            </w:r>
+            <w:r>
+              <w:rPr>
+                <w:b/>
+                <w:bCs/>
+              </w:rPr>
+              <w:t xml:space="preserve">HRD-119</w:t>
+            </w:r>
+            <w:r>
+              <w:t xml:space="preserve"> </w:t>
+            </w:r>
+            <w:r>
+              <w:t xml:space="preserve">paired §1.1 mutation gate 4 PASS / 0 FAIL (</w:t>
+            </w:r>
+            <w:r>
+              <w:rPr>
+                <w:rStyle w:val="VerbatimChar"/>
+              </w:rPr>
+              <w:t xml:space="preserve">6737040</w:t>
+            </w:r>
+            <w:r>
+              <w:t xml:space="preserve">, 3 mutations: blank-IsSelfEcho + drop-Register + drop-thread_ts),</w:t>
+            </w:r>
+            <w:r>
+              <w:t xml:space="preserve"> </w:t>
+            </w:r>
+            <w:r>
+              <w:rPr>
+                <w:b/>
+                <w:bCs/>
+              </w:rPr>
+              <w:t xml:space="preserve">HRD-120</w:t>
+            </w:r>
+            <w:r>
+              <w:t xml:space="preserve"> </w:t>
+            </w:r>
+            <w:r>
+              <w:t xml:space="preserve">multi-channel §11.4.85 stress+chaos 12/12 PASS (</w:t>
+            </w:r>
+            <w:r>
+              <w:rPr>
+                <w:rStyle w:val="VerbatimChar"/>
+              </w:rPr>
+              <w:t xml:space="preserve">86dfa1e</w:t>
+            </w:r>
+            <w:r>
+              <w:t xml:space="preserve">, per-channel attribution + concurrency-under-fault),</w:t>
+            </w:r>
+            <w:r>
+              <w:t xml:space="preserve"> </w:t>
+            </w:r>
+            <w:r>
+              <w:rPr>
+                <w:b/>
+                <w:bCs/>
+              </w:rPr>
+              <w:t xml:space="preserve">HRD-121</w:t>
+            </w:r>
+            <w:r>
+              <w:t xml:space="preserve"> </w:t>
+            </w:r>
+            <w:r>
+              <w:t xml:space="preserve">docs/guides/MESSENGER_CHANNELS.md operator guide (</w:t>
+            </w:r>
+            <w:r>
+              <w:rPr>
+                <w:rStyle w:val="VerbatimChar"/>
+              </w:rPr>
+              <w:t xml:space="preserve">1037019</w:t>
+            </w:r>
+            <w:r>
+              <w:t xml:space="preserve">, 610 lines + 3 siblings). HRDs stay in_progress pending operator-live Slack evidence (mirrors Wave 6's v0.4.0 deferred-to-T13b convention).</w:t>
+            </w:r>
+          </w:p>
+        </w:tc>
+      </w:tr>
+      <w:tr>
+        <w:tc>
+          <w:tcPr/>
+          <w:p>
+            <w:pPr>
+              <w:pStyle w:val="Compact"/>
+            </w:pPr>
+            <w:r>
+              <w:t xml:space="preserve">v0.6.0 tag</w:t>
+            </w:r>
+          </w:p>
+        </w:tc>
+        <w:tc>
+          <w:tcPr/>
+          <w:p>
+            <w:pPr>
+              <w:pStyle w:val="Compact"/>
+            </w:pPr>
+            <w:r>
+              <w:t xml:space="preserve">operator-gated</w:t>
+            </w:r>
+          </w:p>
+        </w:tc>
+        <w:tc>
+          <w:tcPr/>
+          <w:p>
+            <w:pPr>
+              <w:pStyle w:val="Compact"/>
+            </w:pPr>
+            <w:r>
+              <w:t xml:space="preserve">Operator runs the live closed-loop against a real Slack workspace + commits</w:t>
+            </w:r>
+            <w:r>
+              <w:t xml:space="preserve"> </w:t>
+            </w:r>
+            <w:r>
+              <w:rPr>
+                <w:rStyle w:val="VerbatimChar"/>
+              </w:rPr>
+              <w:t xml:space="preserve">docs/qa/HRD-115-LIVE-&lt;run-id&gt;/</w:t>
+            </w:r>
+            <w:r>
+              <w:t xml:space="preserve"> </w:t>
+            </w:r>
+            <w:r>
+              <w:t xml:space="preserve">evidence per §107.x; then E127 converts SKIP→PASS automatically (its sc_anchor already cites the future live transcript path). Tag command:</w:t>
+            </w:r>
+            <w:r>
+              <w:t xml:space="preserve"> </w:t>
+            </w:r>
+            <w:r>
+              <w:rPr>
+                <w:rStyle w:val="VerbatimChar"/>
+              </w:rPr>
+              <w:t xml:space="preserve">git tag -a v0.6.0 -m "Wave 7 — multi-channel messenger framework"</w:t>
+            </w:r>
+            <w:r>
+              <w:t xml:space="preserve">. Required env for the live run:</w:t>
+            </w:r>
+            <w:r>
+              <w:t xml:space="preserve"> </w:t>
+            </w:r>
+            <w:r>
+              <w:rPr>
+                <w:rStyle w:val="VerbatimChar"/>
+              </w:rPr>
+              <w:t xml:space="preserve">HERALD_SLACK_BOT_TOKEN</w:t>
+            </w:r>
+            <w:r>
+              <w:t xml:space="preserve"> </w:t>
+            </w:r>
+            <w:r>
+              <w:t xml:space="preserve">(xoxb-) +</w:t>
+            </w:r>
+            <w:r>
+              <w:t xml:space="preserve"> </w:t>
+            </w:r>
+            <w:r>
+              <w:rPr>
+                <w:rStyle w:val="VerbatimChar"/>
+              </w:rPr>
+              <w:t xml:space="preserve">HERALD_SLACK_CHANNEL_ID</w:t>
+            </w:r>
+            <w:r>
+              <w:t xml:space="preserve"> </w:t>
+            </w:r>
+            <w:r>
+              <w:t xml:space="preserve">(Cxxx) +</w:t>
+            </w:r>
+            <w:r>
+              <w:t xml:space="preserve"> </w:t>
+            </w:r>
+            <w:r>
+              <w:rPr>
+                <w:rStyle w:val="VerbatimChar"/>
+              </w:rPr>
+              <w:t xml:space="preserve">HERALD_SLACK_APP_TOKEN</w:t>
+            </w:r>
+            <w:r>
+              <w:t xml:space="preserve"> </w:t>
+            </w:r>
+            <w:r>
+              <w:t xml:space="preserve">(xapp- for Socket Mode); operator-setup walkthrough at</w:t>
+            </w:r>
+            <w:r>
+              <w:t xml:space="preserve"> </w:t>
+            </w:r>
+            <w:r>
+              <w:rPr>
+                <w:rStyle w:val="VerbatimChar"/>
+              </w:rPr>
+              <w:t xml:space="preserve">docs/guides/MESSENGER_CHANNELS.md</w:t>
+            </w:r>
+            <w:r>
+              <w:t xml:space="preserve"> </w:t>
+            </w:r>
+            <w:r>
+              <w:t xml:space="preserve">§4 + §10 pre-deploy checklist.</w:t>
+            </w:r>
+          </w:p>
+        </w:tc>
+      </w:tr>
+      <w:tr>
+        <w:tc>
+          <w:tcPr/>
+          <w:p>
+            <w:pPr>
+              <w:pStyle w:val="Compact"/>
+            </w:pPr>
+            <w:r>
+              <w:t xml:space="preserve">RESUME-AT (next units)</w:t>
+            </w:r>
+          </w:p>
+        </w:tc>
+        <w:tc>
+          <w:tcPr/>
+          <w:p>
+            <w:pPr>
+              <w:pStyle w:val="Compact"/>
+            </w:pPr>
+            <w:r>
+              <w:t xml:space="preserve">next</w:t>
+            </w:r>
+          </w:p>
+        </w:tc>
+        <w:tc>
+          <w:tcPr/>
+          <w:p>
+            <w:pPr>
+              <w:pStyle w:val="Compact"/>
+            </w:pPr>
+            <w:r>
               <w:t xml:space="preserve">(1)</w:t>
             </w:r>
             <w:r>
@@ -6078,22 +6452,117 @@
                 <w:b/>
                 <w:bCs/>
               </w:rPr>
-              <w:t xml:space="preserve">Batch E</w:t>
-            </w:r>
-            <w:r>
-              <w:t xml:space="preserve"> </w:t>
-            </w:r>
-            <w:r>
-              <w:t xml:space="preserve">Wave 7 T6-T12 Slack HRD-115..121 (vendor a slack-go submodule + the I6 no-</w:t>
-            </w:r>
-            <w:r>
-              <w:rPr>
-                <w:rStyle w:val="VerbatimChar"/>
-              </w:rPr>
-              <w:t xml:space="preserve">&lt;repo&gt;/constitution/</w:t>
-            </w:r>
-            <w:r>
-              <w:t xml:space="preserve">/</w:t>
+              <w:t xml:space="preserve">Operator-live close-out wave</w:t>
+            </w:r>
+            <w:r>
+              <w:t xml:space="preserve"> </w:t>
+            </w:r>
+            <w:r>
+              <w:t xml:space="preserve">— flip HRD-019..025 (Batch B bindings) + HRD-029..056 §43 (Batch C) + HRD-085..089 (Batch D) + HRD-115..121 (Wave 7) →Fixed once their respective live workspaces / PG instances / messenger workspaces are exercised. Bundles with v0.4.0 (Wave 6 deferred) + v0.6.0 (Wave 7) tags. (2)</w:t>
+            </w:r>
+            <w:r>
+              <w:t xml:space="preserve"> </w:t>
+            </w:r>
+            <w:r>
+              <w:rPr>
+                <w:b/>
+                <w:bCs/>
+              </w:rPr>
+              <w:t xml:space="preserve">HRD-090</w:t>
+            </w:r>
+            <w:r>
+              <w:t xml:space="preserve"> </w:t>
+            </w:r>
+            <w:r>
+              <w:rPr>
+                <w:rStyle w:val="VerbatimChar"/>
+              </w:rPr>
+              <w:t xml:space="preserve">MoveToDeadLetter</w:t>
+            </w:r>
+            <w:r>
+              <w:t xml:space="preserve"> </w:t>
+            </w:r>
+            <w:r>
+              <w:t xml:space="preserve">(dead-letter table + retention design) — the last</w:t>
+            </w:r>
+            <w:r>
+              <w:t xml:space="preserve"> </w:t>
+            </w:r>
+            <w:r>
+              <w:rPr>
+                <w:rStyle w:val="VerbatimChar"/>
+              </w:rPr>
+              <w:t xml:space="preserve">ErrUnsupported</w:t>
+            </w:r>
+            <w:r>
+              <w:t xml:space="preserve"> </w:t>
+            </w:r>
+            <w:r>
+              <w:t xml:space="preserve">TaskRepository method. (3)</w:t>
+            </w:r>
+            <w:r>
+              <w:t xml:space="preserve"> </w:t>
+            </w:r>
+            <w:r>
+              <w:rPr>
+                <w:b/>
+                <w:bCs/>
+              </w:rPr>
+              <w:t xml:space="preserve">Wave 8</w:t>
+            </w:r>
+            <w:r>
+              <w:t xml:space="preserve"> </w:t>
+            </w:r>
+            <w:r>
+              <w:t xml:space="preserve">— design new channels (Max / Email / Discord / WhatsApp / Viber) on the now-stable Wave 7 framework + the supervised-restart redesign noted in HRD-120's T11 chaos doc-comment. (4) HRD-008 quickstart validation, HRD-015 gate-I8, HRD-081 (upstream containers podman/docker detect). (5) §11.4.93 SQLite (HRD-131, operator-deferred). Plan</w:t>
+            </w:r>
+            <w:r>
+              <w:t xml:space="preserve"> </w:t>
+            </w:r>
+            <w:r>
+              <w:rPr>
+                <w:rStyle w:val="VerbatimChar"/>
+              </w:rPr>
+              <w:t xml:space="preserve">docs/superpowers/plans/2026-05-27-v1.0.0-execution.md</w:t>
+            </w:r>
+            <w:r>
+              <w:t xml:space="preserve"> </w:t>
+            </w:r>
+            <w:r>
+              <w:t xml:space="preserve">+</w:t>
+            </w:r>
+            <w:r>
+              <w:t xml:space="preserve"> </w:t>
+            </w:r>
+            <w:r>
+              <w:rPr>
+                <w:rStyle w:val="VerbatimChar"/>
+              </w:rPr>
+              <w:t xml:space="preserve">docs/superpowers/plans/2026-05-27-wave7-generic-messenger.md</w:t>
+            </w:r>
+            <w:r>
+              <w:t xml:space="preserve">.</w:t>
+            </w:r>
+            <w:r>
+              <w:t xml:space="preserve"> </w:t>
+            </w:r>
+            <w:r>
+              <w:rPr>
+                <w:b/>
+                <w:bCs/>
+              </w:rPr>
+              <w:t xml:space="preserve">HEAD=</w:t>
+            </w:r>
+            <w:r>
+              <w:rPr>
+                <w:rStyle w:val="VerbatimChar"/>
+                <w:b/>
+                <w:bCs/>
+              </w:rPr>
+              <w:t xml:space="preserve">1037019</w:t>
+            </w:r>
+            <w:r>
+              <w:t xml:space="preserve">; Wave 7 e2e = 142 PASS / 0 FAIL (T9 invariants green, T10 mutation gate 4/0, T11 stress+chaos 12/12); inheritance gate 15/0 post-</w:t>
             </w:r>
             <w:r>
               <w:rPr>
@@ -6105,130 +6574,14 @@
               <w:t xml:space="preserve"> </w:t>
             </w:r>
             <w:r>
-              <w:t xml:space="preserve">gate check; new</w:t>
-            </w:r>
-            <w:r>
-              <w:t xml:space="preserve"> </w:t>
-            </w:r>
-            <w:r>
-              <w:rPr>
-                <w:rStyle w:val="VerbatimChar"/>
-              </w:rPr>
-              <w:t xml:space="preserve">slack://</w:t>
-            </w:r>
-            <w:r>
-              <w:t xml:space="preserve"> </w:t>
-            </w:r>
-            <w:r>
-              <w:t xml:space="preserve">channel adapter per the Wave-7</w:t>
-            </w:r>
-            <w:r>
-              <w:t xml:space="preserve"> </w:t>
-            </w:r>
-            <w:r>
-              <w:rPr>
-                <w:rStyle w:val="VerbatimChar"/>
-              </w:rPr>
-              <w:t xml:space="preserve">Channel</w:t>
-            </w:r>
-            <w:r>
-              <w:t xml:space="preserve"> </w:t>
-            </w:r>
-            <w:r>
-              <w:t xml:space="preserve">framework; e2e off</w:t>
-            </w:r>
-            <w:r>
-              <w:t xml:space="preserve"> </w:t>
-            </w:r>
-            <w:r>
-              <w:rPr>
-                <w:b/>
-                <w:bCs/>
-              </w:rPr>
-              <w:t xml:space="preserve">E124+</w:t>
-            </w:r>
-            <w:r>
-              <w:t xml:space="preserve">). (2)</w:t>
-            </w:r>
-            <w:r>
-              <w:t xml:space="preserve"> </w:t>
-            </w:r>
-            <w:r>
-              <w:rPr>
-                <w:b/>
-                <w:bCs/>
-              </w:rPr>
-              <w:t xml:space="preserve">HRD-090</w:t>
-            </w:r>
-            <w:r>
-              <w:t xml:space="preserve"> </w:t>
-            </w:r>
-            <w:r>
-              <w:rPr>
-                <w:rStyle w:val="VerbatimChar"/>
-              </w:rPr>
-              <w:t xml:space="preserve">MoveToDeadLetter</w:t>
-            </w:r>
-            <w:r>
-              <w:t xml:space="preserve"> </w:t>
-            </w:r>
-            <w:r>
-              <w:t xml:space="preserve">(dead-letter table + retention design) — the last</w:t>
-            </w:r>
-            <w:r>
-              <w:t xml:space="preserve"> </w:t>
-            </w:r>
-            <w:r>
-              <w:rPr>
-                <w:rStyle w:val="VerbatimChar"/>
-              </w:rPr>
-              <w:t xml:space="preserve">ErrUnsupported</w:t>
-            </w:r>
-            <w:r>
-              <w:t xml:space="preserve"> </w:t>
-            </w:r>
-            <w:r>
-              <w:t xml:space="preserve">TaskRepository method. (3) operator-live close-out: flip HRD-019..025 (Batch B bindings) + the §43 rows (HRD-029..056) + Batch D rows (HRD-085..089) →Fixed once operator-live-validated. (4) HRD-008 quickstart validation, HRD-015 gate-I8, HRD-081 (upstream containers podman/docker detect). (5) §11.4.93 SQLite (HRD-131, operator-deferred). Plan</w:t>
-            </w:r>
-            <w:r>
-              <w:t xml:space="preserve"> </w:t>
-            </w:r>
-            <w:r>
-              <w:rPr>
-                <w:rStyle w:val="VerbatimChar"/>
-              </w:rPr>
-              <w:t xml:space="preserve">docs/superpowers/plans/2026-05-27-v1.0.0-execution.md</w:t>
-            </w:r>
-            <w:r>
-              <w:t xml:space="preserve">.</w:t>
-            </w:r>
-            <w:r>
-              <w:t xml:space="preserve"> </w:t>
-            </w:r>
-            <w:r>
-              <w:rPr>
-                <w:b/>
-                <w:bCs/>
-              </w:rPr>
-              <w:t xml:space="preserve">HEAD=</w:t>
-            </w:r>
-            <w:r>
-              <w:rPr>
-                <w:rStyle w:val="VerbatimChar"/>
-                <w:b/>
-                <w:bCs/>
-              </w:rPr>
-              <w:t xml:space="preserve">5899623</w:t>
-            </w:r>
-            <w:r>
-              <w:t xml:space="preserve">; full e2e 148 PASS / 0 FAIL; podman VM now running + herald-postgres :24100 healthy (fresh herald_dev volume).</w:t>
+              <w:t xml:space="preserve">slack-go-submodule add.</w:t>
             </w:r>
           </w:p>
         </w:tc>
       </w:tr>
     </w:tbl>
-    <w:bookmarkEnd w:id="13"/>
-    <w:bookmarkStart w:id="14" w:name="Xe0231d32a69d17d31f75951dcaa7beff2defc28"/>
+    <w:bookmarkEnd w:id="14"/>
+    <w:bookmarkStart w:id="15" w:name="Xe0231d32a69d17d31f75951dcaa7beff2defc28"/>
     <w:p>
       <w:pPr>
         <w:pStyle w:val="Heading2"/>
@@ -6811,8 +7164,8 @@
         <w:t xml:space="preserve">— propagate Universal §11.4.6X new mandates (spec-versioning + submodule-catalogue-first) into the constitution submodule.</w:t>
       </w:r>
     </w:p>
-    <w:bookmarkEnd w:id="14"/>
-    <w:bookmarkStart w:id="15" w:name="Xaef6f4bf8948401e7913347ad62a96c9e4cace3"/>
+    <w:bookmarkEnd w:id="15"/>
+    <w:bookmarkStart w:id="16" w:name="Xaef6f4bf8948401e7913347ad62a96c9e4cace3"/>
     <w:p>
       <w:pPr>
         <w:pStyle w:val="Heading2"/>
@@ -7613,8 +7966,8 @@
         <w:t xml:space="preserve">.</w:t>
       </w:r>
     </w:p>
-    <w:bookmarkEnd w:id="15"/>
-    <w:bookmarkStart w:id="20" w:name="Xbc160a9833928e45f1f952d03b94bf613f1bd17"/>
+    <w:bookmarkEnd w:id="16"/>
+    <w:bookmarkStart w:id="21" w:name="Xbc160a9833928e45f1f952d03b94bf613f1bd17"/>
     <w:p>
       <w:pPr>
         <w:pStyle w:val="Heading2"/>
@@ -7882,7 +8235,7 @@
         <w:t xml:space="preserve">then live run + tag.</w:t>
       </w:r>
     </w:p>
-    <w:bookmarkStart w:id="16" w:name="resume-prerequisites"/>
+    <w:bookmarkStart w:id="17" w:name="resume-prerequisites"/>
     <w:p>
       <w:pPr>
         <w:pStyle w:val="Heading3"/>
@@ -8117,8 +8470,8 @@
         <w:t xml:space="preserve">(port 24200) are LIVE — both have been Up since the start of this session; data persists across podman restarts. Schema is at migration v12 (all 12 applied).</w:t>
       </w:r>
     </w:p>
-    <w:bookmarkEnd w:id="16"/>
-    <w:bookmarkStart w:id="17" w:name="Xa79c282df449617bfa7750e205a846d7330c1df"/>
+    <w:bookmarkEnd w:id="17"/>
+    <w:bookmarkStart w:id="18" w:name="Xa79c282df449617bfa7750e205a846d7330c1df"/>
     <w:p>
       <w:pPr>
         <w:pStyle w:val="Heading3"/>
@@ -9702,8 +10055,8 @@
         <w:t xml:space="preserve">done</w:t>
       </w:r>
     </w:p>
-    <w:bookmarkEnd w:id="17"/>
-    <w:bookmarkStart w:id="18" w:name="open--known-constraints-for-tomorrow"/>
+    <w:bookmarkEnd w:id="18"/>
+    <w:bookmarkStart w:id="19" w:name="open--known-constraints-for-tomorrow"/>
     <w:p>
       <w:pPr>
         <w:pStyle w:val="Heading3"/>
@@ -9873,8 +10226,8 @@
         <w:t xml:space="preserve">with E81-E88 wired in.</w:t>
       </w:r>
     </w:p>
-    <w:bookmarkEnd w:id="18"/>
-    <w:bookmarkStart w:id="19" w:name="Xf91d03998905adbda5963cf0d100d554292e7bd"/>
+    <w:bookmarkEnd w:id="19"/>
+    <w:bookmarkStart w:id="20" w:name="Xf91d03998905adbda5963cf0d100d554292e7bd"/>
     <w:p>
       <w:pPr>
         <w:pStyle w:val="Heading3"/>
@@ -10311,9 +10664,9 @@
         <w:t xml:space="preserve">and start with qaherald-auto T6.</w:t>
       </w:r>
     </w:p>
-    <w:bookmarkEnd w:id="19"/>
     <w:bookmarkEnd w:id="20"/>
-    <w:bookmarkStart w:id="21" w:name="Xa530267dd21e876357827c8ba05f8d368676441"/>
+    <w:bookmarkEnd w:id="21"/>
+    <w:bookmarkStart w:id="22" w:name="Xa530267dd21e876357827c8ba05f8d368676441"/>
     <w:p>
       <w:pPr>
         <w:pStyle w:val="Heading2"/>
@@ -10469,8 +10822,8 @@
         <w:t xml:space="preserve">— the §11.0 type contract reference.</w:t>
       </w:r>
     </w:p>
-    <w:bookmarkEnd w:id="21"/>
     <w:bookmarkEnd w:id="22"/>
+    <w:bookmarkEnd w:id="23"/>
     <w:sectPr>
       <w:footnotePr>
         <w:numRestart w:val="eachSect"/>

</xml_diff>

<commit_message>
docs: CONTINUATION r20→r21 — session-resume sweep complete (§11.4.100 + bluff-fix + HRD-139..142 migration + Obsolete graduation)
Session-resume work captured: constitution sync c640947→3244bf4 + §11.4.100
propagation (commit 5aece5d) + bin/qaherald §107.y fix (c0903bc) +
§11.4.19 HRD-139..142 atomic migration to Fixed.md r17 + §11.4.90 Obsolete
graduation of 3 legacy NON-COMPLIANT tests as HRD-143/144/145 in Issues.md
r36 (commit 873aab4). All 4 mirrors at HEAD 873aab4. Inheritance gate
15/0 PASS. Docs sibling-export discipline holds (117 fresh / 0 stale).

§2 HEAD `873aab4` + commit chain documented (873aab4 → 5aece5d → c0903bc
→ 9796506 → d843ddf).

§3 background e2e_bluff_hunt running for state validation; push #2 to 4
mirrors complete; no other active work in flight.

Co-Authored-By: Claude Opus 4.7 <noreply@anthropic.com>
</commit_message>
<xml_diff>
--- a/docs/CONTINUATION.docx
+++ b/docs/CONTINUATION.docx
@@ -75,7 +75,7 @@
               <w:pStyle w:val="Compact"/>
             </w:pPr>
             <w:r>
-              <w:t xml:space="preserve">20</w:t>
+              <w:t xml:space="preserve">21</w:t>
             </w:r>
           </w:p>
         </w:tc>
@@ -123,7 +123,7 @@
               <w:pStyle w:val="Compact"/>
             </w:pPr>
             <w:r>
-              <w:t xml:space="preserve">2026-05-28</w:t>
+              <w:t xml:space="preserve">2026-05-29</w:t>
             </w:r>
           </w:p>
         </w:tc>
@@ -175,6 +175,386 @@
                 <w:b/>
                 <w:bCs/>
               </w:rPr>
+              <w:t xml:space="preserve">2026-05-29 — Session-resume sweep: constitution sync c640947→3244bf4 + §11.4.100 propagation + 3 cleanup commits (HEAD</w:t>
+            </w:r>
+            <w:r>
+              <w:rPr>
+                <w:b/>
+                <w:bCs/>
+              </w:rPr>
+              <w:t xml:space="preserve"> </w:t>
+            </w:r>
+            <w:r>
+              <w:rPr>
+                <w:rStyle w:val="VerbatimChar"/>
+                <w:b/>
+                <w:bCs/>
+              </w:rPr>
+              <w:t xml:space="preserve">873aab4</w:t>
+            </w:r>
+            <w:r>
+              <w:rPr>
+                <w:b/>
+                <w:bCs/>
+              </w:rPr>
+              <w:t xml:space="preserve">; constitution at</w:t>
+            </w:r>
+            <w:r>
+              <w:rPr>
+                <w:b/>
+                <w:bCs/>
+              </w:rPr>
+              <w:t xml:space="preserve"> </w:t>
+            </w:r>
+            <w:r>
+              <w:rPr>
+                <w:rStyle w:val="VerbatimChar"/>
+                <w:b/>
+                <w:bCs/>
+              </w:rPr>
+              <w:t xml:space="preserve">3244bf4</w:t>
+            </w:r>
+            <w:r>
+              <w:rPr>
+                <w:b/>
+                <w:bCs/>
+              </w:rPr>
+              <w:t xml:space="preserve">; all 4 mirrors synced).</w:t>
+            </w:r>
+            <w:r>
+              <w:t xml:space="preserve"> </w:t>
+            </w:r>
+            <w:r>
+              <w:t xml:space="preserve">Resumed work after operator power-off. (a)</w:t>
+            </w:r>
+            <w:r>
+              <w:t xml:space="preserve"> </w:t>
+            </w:r>
+            <w:r>
+              <w:rPr>
+                <w:b/>
+                <w:bCs/>
+              </w:rPr>
+              <w:t xml:space="preserve">Constitution sync</w:t>
+            </w:r>
+            <w:r>
+              <w:t xml:space="preserve"> </w:t>
+            </w:r>
+            <w:r>
+              <w:t xml:space="preserve">— pulled HelixConstitution c640947→3244bf4 (gained §11.4.100 Video color + visual-quality fidelity mandate). (b)</w:t>
+            </w:r>
+            <w:r>
+              <w:t xml:space="preserve"> </w:t>
+            </w:r>
+            <w:r>
+              <w:rPr>
+                <w:b/>
+                <w:bCs/>
+              </w:rPr>
+              <w:t xml:space="preserve">§11.4.100 propagation</w:t>
+            </w:r>
+            <w:r>
+              <w:t xml:space="preserve"> </w:t>
+            </w:r>
+            <w:r>
+              <w:t xml:space="preserve">to Herald root (commit</w:t>
+            </w:r>
+            <w:r>
+              <w:t xml:space="preserve"> </w:t>
+            </w:r>
+            <w:r>
+              <w:rPr>
+                <w:rStyle w:val="VerbatimChar"/>
+              </w:rPr>
+              <w:t xml:space="preserve">5aece5d</w:t>
+            </w:r>
+            <w:r>
+              <w:t xml:space="preserve">) — CLAUDE.md r15→r16, AGENTS.md r11→r12, QWEN.md, docs/guides/HERALD_CONSTITUTION.md r9→r10 with new §108.o; Herald-applicability classification:</w:t>
+            </w:r>
+            <w:r>
+              <w:t xml:space="preserve"> </w:t>
+            </w:r>
+            <w:r>
+              <w:rPr>
+                <w:b/>
+                <w:bCs/>
+              </w:rPr>
+              <w:t xml:space="preserve">non-applicable-but-cite</w:t>
+            </w:r>
+            <w:r>
+              <w:t xml:space="preserve"> </w:t>
+            </w:r>
+            <w:r>
+              <w:t xml:space="preserve">(Herald has NO video-playback surface — pherald downloads video attachments as opaque sha256-blobs via HRD-005 attachment pipeline, never decodes/renders; mandate binds latently if Herald ever ships a video-rendering surface); cascade-parallel to §108.k AOSP-pattern; literal anchor</w:t>
+            </w:r>
+            <w:r>
+              <w:t xml:space="preserve"> </w:t>
+            </w:r>
+            <w:r>
+              <w:rPr>
+                <w:rStyle w:val="VerbatimChar"/>
+              </w:rPr>
+              <w:t xml:space="preserve">11.4.100</w:t>
+            </w:r>
+            <w:r>
+              <w:t xml:space="preserve"> </w:t>
+            </w:r>
+            <w:r>
+              <w:t xml:space="preserve">present in all 4 docs per upcoming</w:t>
+            </w:r>
+            <w:r>
+              <w:t xml:space="preserve"> </w:t>
+            </w:r>
+            <w:r>
+              <w:rPr>
+                <w:rStyle w:val="VerbatimChar"/>
+              </w:rPr>
+              <w:t xml:space="preserve">CM-COVENANT-114-100-PROPAGATION</w:t>
+            </w:r>
+            <w:r>
+              <w:t xml:space="preserve"> </w:t>
+            </w:r>
+            <w:r>
+              <w:t xml:space="preserve">pre-build gate. (c)</w:t>
+            </w:r>
+            <w:r>
+              <w:t xml:space="preserve"> </w:t>
+            </w:r>
+            <w:r>
+              <w:rPr>
+                <w:b/>
+                <w:bCs/>
+              </w:rPr>
+              <w:t xml:space="preserve">§107.y anti-bluff fix</w:t>
+            </w:r>
+            <w:r>
+              <w:t xml:space="preserve"> </w:t>
+            </w:r>
+            <w:r>
+              <w:t xml:space="preserve">(commit</w:t>
+            </w:r>
+            <w:r>
+              <w:t xml:space="preserve"> </w:t>
+            </w:r>
+            <w:r>
+              <w:rPr>
+                <w:rStyle w:val="VerbatimChar"/>
+              </w:rPr>
+              <w:t xml:space="preserve">c0903bc</w:t>
+            </w:r>
+            <w:r>
+              <w:t xml:space="preserve">) — purged bin/qaherald (32MB compiled binary auto-committed by JetBrains IDE in commit</w:t>
+            </w:r>
+            <w:r>
+              <w:t xml:space="preserve"> </w:t>
+            </w:r>
+            <w:r>
+              <w:rPr>
+                <w:rStyle w:val="VerbatimChar"/>
+              </w:rPr>
+              <w:t xml:space="preserve">9796506</w:t>
+            </w:r>
+            <w:r>
+              <w:t xml:space="preserve">) + closed .gitignore gap (bin/ +</w:t>
+            </w:r>
+            <w:r>
+              <w:t xml:space="preserve"> </w:t>
+            </w:r>
+            <w:r>
+              <w:rPr>
+                <w:i/>
+                <w:iCs/>
+              </w:rPr>
+              <w:t xml:space="preserve">.test + herald-</w:t>
+            </w:r>
+            <w:r>
+              <w:t xml:space="preserve">.exe/bin); root cause documented: IDE Auto-commit mechanism (also caused historical</w:t>
+            </w:r>
+            <w:r>
+              <w:t xml:space="preserve"> </w:t>
+            </w:r>
+            <w:r>
+              <w:rPr>
+                <w:rStyle w:val="VerbatimChar"/>
+              </w:rPr>
+              <w:t xml:space="preserve">1ce7cda</w:t>
+            </w:r>
+            <w:r>
+              <w:t xml:space="preserve"> </w:t>
+            </w:r>
+            <w:r>
+              <w:t xml:space="preserve">PDF sweep +</w:t>
+            </w:r>
+            <w:r>
+              <w:t xml:space="preserve"> </w:t>
+            </w:r>
+            <w:r>
+              <w:rPr>
+                <w:rStyle w:val="VerbatimChar"/>
+              </w:rPr>
+              <w:t xml:space="preserve">b2d4b18</w:t>
+            </w:r>
+            <w:r>
+              <w:t xml:space="preserve"> </w:t>
+            </w:r>
+            <w:r>
+              <w:t xml:space="preserve">rename sweep); 32MB blob remains in git history at 9796506 — purging requires git-filter-repo + force-push which §11.4.41 gates on operator authorization (filed as accepted tech-debt). (d)</w:t>
+            </w:r>
+            <w:r>
+              <w:t xml:space="preserve"> </w:t>
+            </w:r>
+            <w:r>
+              <w:rPr>
+                <w:b/>
+                <w:bCs/>
+              </w:rPr>
+              <w:t xml:space="preserve">§11.4.19 atomic Issues→Fixed migration of HRD-139..142</w:t>
+            </w:r>
+            <w:r>
+              <w:t xml:space="preserve"> </w:t>
+            </w:r>
+            <w:r>
+              <w:t xml:space="preserve">(commit</w:t>
+            </w:r>
+            <w:r>
+              <w:t xml:space="preserve"> </w:t>
+            </w:r>
+            <w:r>
+              <w:rPr>
+                <w:rStyle w:val="VerbatimChar"/>
+              </w:rPr>
+              <w:t xml:space="preserve">873aab4</w:t>
+            </w:r>
+            <w:r>
+              <w:t xml:space="preserve">) — Wave 8 Track B closure recorded in Fixed.md r16→r17: HRD-139 (MTProto Client live wiring), HRD-140 (Subscribe roundtrip), HRD-141 (Wave 6 closed loop), HRD-142 (Wave 6.5 lifecycle) all graduate directly from TaskList → Fixed.md. (e)</w:t>
+            </w:r>
+            <w:r>
+              <w:t xml:space="preserve"> </w:t>
+            </w:r>
+            <w:r>
+              <w:rPr>
+                <w:b/>
+                <w:bCs/>
+              </w:rPr>
+              <w:t xml:space="preserve">§11.4.90 Obsolete graduation of 3 legacy NON-COMPLIANT tests</w:t>
+            </w:r>
+            <w:r>
+              <w:t xml:space="preserve"> </w:t>
+            </w:r>
+            <w:r>
+              <w:t xml:space="preserve">(same commit</w:t>
+            </w:r>
+            <w:r>
+              <w:t xml:space="preserve"> </w:t>
+            </w:r>
+            <w:r>
+              <w:rPr>
+                <w:rStyle w:val="VerbatimChar"/>
+              </w:rPr>
+              <w:t xml:space="preserve">873aab4</w:t>
+            </w:r>
+            <w:r>
+              <w:t xml:space="preserve">) — HRD-143 marks</w:t>
+            </w:r>
+            <w:r>
+              <w:t xml:space="preserve"> </w:t>
+            </w:r>
+            <w:r>
+              <w:rPr>
+                <w:rStyle w:val="VerbatimChar"/>
+              </w:rPr>
+              <w:t xml:space="preserve">TestSubscribe_LiveBotAPI</w:t>
+            </w:r>
+            <w:r>
+              <w:t xml:space="preserve"> </w:t>
+            </w:r>
+            <w:r>
+              <w:t xml:space="preserve">Obsolete (superseded by §11.4.98+HRD-140; literal source-comment "requires the operator to hand-send a message" cited per §11.4.6 no-guessing); HRD-144 marks</w:t>
+            </w:r>
+            <w:r>
+              <w:t xml:space="preserve"> </w:t>
+            </w:r>
+            <w:r>
+              <w:rPr>
+                <w:rStyle w:val="VerbatimChar"/>
+              </w:rPr>
+              <w:t xml:space="preserve">tests/test_wave6_live_loop.sh</w:t>
+            </w:r>
+            <w:r>
+              <w:t xml:space="preserve"> </w:t>
+            </w:r>
+            <w:r>
+              <w:t xml:space="preserve">Obsolete (superseded by §11.4.98+HRD-141); HRD-145 marks</w:t>
+            </w:r>
+            <w:r>
+              <w:t xml:space="preserve"> </w:t>
+            </w:r>
+            <w:r>
+              <w:rPr>
+                <w:rStyle w:val="VerbatimChar"/>
+              </w:rPr>
+              <w:t xml:space="preserve">qaherald lifecycle --manual</w:t>
+            </w:r>
+            <w:r>
+              <w:t xml:space="preserve"> </w:t>
+            </w:r>
+            <w:r>
+              <w:t xml:space="preserve">mode Obsolete (superseded by §11.4.98+HRD-142). Each Obsolete-Details cites Since/Reason/Superseding-item + triple-check evidence per §11.4.6. (f)</w:t>
+            </w:r>
+            <w:r>
+              <w:t xml:space="preserve"> </w:t>
+            </w:r>
+            <w:r>
+              <w:rPr>
+                <w:b/>
+                <w:bCs/>
+              </w:rPr>
+              <w:t xml:space="preserve">Docs sibling-export audit</w:t>
+            </w:r>
+            <w:r>
+              <w:t xml:space="preserve"> </w:t>
+            </w:r>
+            <w:r>
+              <w:t xml:space="preserve">— 117 fresh / 0 stale</w:t>
+            </w:r>
+            <w:r>
+              <w:t xml:space="preserve"> </w:t>
+            </w:r>
+            <w:r>
+              <w:rPr>
+                <w:rStyle w:val="VerbatimChar"/>
+              </w:rPr>
+              <w:t xml:space="preserve">.md ↔ .html/.pdf/.docx</w:t>
+            </w:r>
+            <w:r>
+              <w:t xml:space="preserve"> </w:t>
+            </w:r>
+            <w:r>
+              <w:t xml:space="preserve">pairs across the tracked tree (Python-based mtime-comparison) — Herald's</w:t>
+            </w:r>
+            <w:r>
+              <w:t xml:space="preserve"> </w:t>
+            </w:r>
+            <w:r>
+              <w:rPr>
+                <w:rStyle w:val="VerbatimChar"/>
+              </w:rPr>
+              <w:t xml:space="preserve">scripts/export_docs.sh</w:t>
+            </w:r>
+            <w:r>
+              <w:t xml:space="preserve"> </w:t>
+            </w:r>
+            <w:r>
+              <w:t xml:space="preserve">discipline holds. Inheritance gate 15 PASS / 0 FAIL post-§11.4.100 propagation. 3 commits c0903bc + 5aece5d + 873aab4 all pushed to 4 mirrors via §11.4.88 background-push (per-mirror flock, push detached after commit-lock release). Prior r20 (still valid history):**</w:t>
+            </w:r>
+            <w:r>
+              <w:t xml:space="preserve"> </w:t>
+            </w:r>
+            <w:r>
+              <w:rPr>
+                <w:b/>
+                <w:bCs/>
+              </w:rPr>
               <w:t xml:space="preserve">2026-05-28 (day-3) — Wave 8 Track B COMPLETE + v0.6.0 tagged (HEAD</w:t>
             </w:r>
             <w:r>
@@ -2339,7 +2719,7 @@
           <w:b/>
           <w:bCs/>
         </w:rPr>
-        <w:t xml:space="preserve">b313a5e</w:t>
+        <w:t xml:space="preserve">873aab4</w:t>
       </w:r>
       <w:r>
         <w:t xml:space="preserve"> </w:t>
@@ -2354,193 +2734,10 @@
         <w:rPr>
           <w:rStyle w:val="VerbatimChar"/>
         </w:rPr>
-        <w:t xml:space="preserve">docs(qa): Wave 8 Track B live evidence — E135/E136/E137 all PASS LIVE under §11.4.98</w:t>
-      </w:r>
-      <w:r>
-        <w:t xml:space="preserve">. Wave 8 Track B (MTProto user-account harness for §11.4.98 full-automation) CLOSED end-to-end: HRD-139 MTProto Client +</w:t>
-      </w:r>
-      <w:r>
-        <w:t xml:space="preserve"> </w:t>
-      </w:r>
-      <w:r>
-        <w:rPr>
-          <w:rStyle w:val="VerbatimChar"/>
-        </w:rPr>
-        <w:t xml:space="preserve">qaherald mtproto login/whoami/logout</w:t>
-      </w:r>
-      <w:r>
-        <w:t xml:space="preserve"> </w:t>
-      </w:r>
-      <w:r>
-        <w:t xml:space="preserve">(</w:t>
-      </w:r>
-      <w:r>
-        <w:rPr>
-          <w:rStyle w:val="VerbatimChar"/>
-        </w:rPr>
-        <w:t xml:space="preserve">238448e</w:t>
-      </w:r>
-      <w:r>
-        <w:t xml:space="preserve"> </w:t>
-      </w:r>
-      <w:r>
-        <w:t xml:space="preserve">+</w:t>
-      </w:r>
-      <w:r>
-        <w:t xml:space="preserve"> </w:t>
-      </w:r>
-      <w:r>
-        <w:rPr>
-          <w:rStyle w:val="VerbatimChar"/>
-        </w:rPr>
-        <w:t xml:space="preserve">ec4c3c0</w:t>
-      </w:r>
-      <w:r>
-        <w:t xml:space="preserve">); HRD-140 Subscribe roundtrip PASSED LIVE in 1.30s (</w:t>
-      </w:r>
-      <w:r>
-        <w:rPr>
-          <w:rStyle w:val="VerbatimChar"/>
-        </w:rPr>
-        <w:t xml:space="preserve">367d58b</w:t>
-      </w:r>
-      <w:r>
-        <w:t xml:space="preserve">); HRD-141 Wave 6 closed loop PASSED LIVE in 48.58s with journal-based §11.4.98 autonomy assertion (</w:t>
-      </w:r>
-      <w:r>
-        <w:rPr>
-          <w:rStyle w:val="VerbatimChar"/>
-        </w:rPr>
-        <w:t xml:space="preserve">7e50ed0</w:t>
-      </w:r>
-      <w:r>
-        <w:t xml:space="preserve"> </w:t>
-      </w:r>
-      <w:r>
-        <w:t xml:space="preserve">+</w:t>
-      </w:r>
-      <w:r>
-        <w:t xml:space="preserve"> </w:t>
-      </w:r>
-      <w:r>
-        <w:rPr>
-          <w:rStyle w:val="VerbatimChar"/>
-        </w:rPr>
-        <w:t xml:space="preserve">d7d6524</w:t>
-      </w:r>
-      <w:r>
-        <w:t xml:space="preserve"> </w:t>
-      </w:r>
-      <w:r>
-        <w:t xml:space="preserve">+</w:t>
-      </w:r>
-      <w:r>
-        <w:t xml:space="preserve"> </w:t>
-      </w:r>
-      <w:r>
-        <w:rPr>
-          <w:rStyle w:val="VerbatimChar"/>
-        </w:rPr>
-        <w:t xml:space="preserve">0797e85</w:t>
-      </w:r>
-      <w:r>
-        <w:t xml:space="preserve">); HRD-142 Wave 6.5 lifecycle PASSED LIVE in 26.04s, 3/3 subtests (</w:t>
-      </w:r>
-      <w:r>
-        <w:rPr>
-          <w:rStyle w:val="VerbatimChar"/>
-        </w:rPr>
-        <w:t xml:space="preserve">1f2e75d</w:t>
-      </w:r>
-      <w:r>
-        <w:t xml:space="preserve">); E135-E137 wired into bluff hunt (</w:t>
-      </w:r>
-      <w:r>
-        <w:rPr>
-          <w:rStyle w:val="VerbatimChar"/>
-        </w:rPr>
-        <w:t xml:space="preserve">a80d206</w:t>
-      </w:r>
-      <w:r>
-        <w:t xml:space="preserve">); HelixConstitution §11.4.99 anchored upstream + Herald root + 9 Helix-stack submodules (</w:t>
-      </w:r>
-      <w:r>
-        <w:rPr>
-          <w:rStyle w:val="VerbatimChar"/>
-        </w:rPr>
-        <w:t xml:space="preserve">fb9d81e</w:t>
-      </w:r>
-      <w:r>
-        <w:t xml:space="preserve"> </w:t>
-      </w:r>
-      <w:r>
-        <w:t xml:space="preserve">+</w:t>
-      </w:r>
-      <w:r>
-        <w:t xml:space="preserve"> </w:t>
-      </w:r>
-      <w:r>
-        <w:rPr>
-          <w:rStyle w:val="VerbatimChar"/>
-        </w:rPr>
-        <w:t xml:space="preserve">d1100b2</w:t>
-      </w:r>
-      <w:r>
-        <w:t xml:space="preserve"> </w:t>
-      </w:r>
-      <w:r>
-        <w:t xml:space="preserve">+</w:t>
-      </w:r>
-      <w:r>
-        <w:t xml:space="preserve"> </w:t>
-      </w:r>
-      <w:r>
-        <w:rPr>
-          <w:rStyle w:val="VerbatimChar"/>
-        </w:rPr>
-        <w:t xml:space="preserve">dc007ab</w:t>
-      </w:r>
-      <w:r>
-        <w:t xml:space="preserve"> </w:t>
-      </w:r>
-      <w:r>
-        <w:t xml:space="preserve">+</w:t>
-      </w:r>
-      <w:r>
-        <w:t xml:space="preserve"> </w:t>
-      </w:r>
-      <w:r>
-        <w:rPr>
-          <w:rStyle w:val="VerbatimChar"/>
-        </w:rPr>
-        <w:t xml:space="preserve">d1b6f25</w:t>
-      </w:r>
-      <w:r>
-        <w:t xml:space="preserve">); evidence committed under</w:t>
-      </w:r>
-      <w:r>
-        <w:t xml:space="preserve"> </w:t>
-      </w:r>
-      <w:r>
-        <w:rPr>
-          <w:rStyle w:val="VerbatimChar"/>
-        </w:rPr>
-        <w:t xml:space="preserve">docs/qa/HRD-LIVE-MTPROTO-20260528T125321Z/</w:t>
-      </w:r>
-      <w:r>
-        <w:t xml:space="preserve"> </w:t>
-      </w:r>
-      <w:r>
-        <w:t xml:space="preserve">(</w:t>
-      </w:r>
-      <w:r>
-        <w:rPr>
-          <w:rStyle w:val="VerbatimChar"/>
-        </w:rPr>
-        <w:t xml:space="preserve">b313a5e</w:t>
-      </w:r>
-      <w:r>
-        <w:t xml:space="preserve">). v0.6.0 ANNOTATED TAG cut.</w:t>
+        <w:t xml:space="preserve">docs(§11.4.19 + §11.4.90): atomic HRD-139..142 Issues→Fixed + Obsolete graduation of 3 legacy NON-COMPLIANT tests</w:t>
+      </w:r>
+      <w:r>
+        <w:t xml:space="preserve">. Fixed.md r17 records HRD-139/140/141/142 (Wave 8 Track B) as Fixed; Issues.md r36 marks 3 legacy tests Obsolete per §11.4.90 with full Obsolete-Details + triple-check evidence per §11.4.6.</w:t>
       </w:r>
       <w:r>
         <w:t xml:space="preserve"> </w:t>
@@ -2553,239 +2750,551 @@
         <w:t xml:space="preserve">Prior</w:t>
       </w:r>
       <w:r>
-        <w:t xml:space="preserve"> </w:t>
-      </w:r>
-      <w:r>
-        <w:rPr>
-          <w:rStyle w:val="VerbatimChar"/>
-        </w:rPr>
-        <w:t xml:space="preserve">77da6eb</w:t>
-      </w:r>
-      <w:r>
-        <w:t xml:space="preserve"> </w:t>
-      </w:r>
-      <w:r>
-        <w:t xml:space="preserve">—</w:t>
-      </w:r>
-      <w:r>
-        <w:t xml:space="preserve"> </w:t>
-      </w:r>
-      <w:r>
-        <w:rPr>
-          <w:rStyle w:val="VerbatimChar"/>
-        </w:rPr>
-        <w:t xml:space="preserve">feat(tgram HRD-137 + Wave C): §11.4.85 stress+chaos SKIP→PASS + 6 HRDs Issues→Fixed</w:t>
-      </w:r>
-      <w:r>
-        <w:t xml:space="preserve">.</w:t>
-      </w:r>
-      <w:r>
-        <w:t xml:space="preserve"> </w:t>
-      </w:r>
-      <w:r>
         <w:rPr>
           <w:b/>
           <w:bCs/>
         </w:rPr>
-        <w:t xml:space="preserve">Tgram-completeness wave COMPLETE — HRD-133..138 atomic Issues→Fixed per §11.4.19.</w:t>
-      </w:r>
-      <w:r>
-        <w:t xml:space="preserve"> </w:t>
-      </w:r>
-      <w:r>
-        <w:t xml:space="preserve">9 files changed (3 modified + 6 created): a one-line</w:t>
-      </w:r>
-      <w:r>
-        <w:t xml:space="preserve"> </w:t>
-      </w:r>
-      <w:r>
-        <w:rPr>
-          <w:rStyle w:val="VerbatimChar"/>
-        </w:rPr>
-        <w:t xml:space="preserve">commons_messaging/channels/tgram/subscribe.go</w:t>
-      </w:r>
-      <w:r>
-        <w:t xml:space="preserve"> </w:t>
-      </w:r>
-      <w:r>
-        <w:t xml:space="preserve">seam fix (threads</w:t>
-      </w:r>
-      <w:r>
-        <w:t xml:space="preserve"> </w:t>
-      </w:r>
-      <w:r>
-        <w:rPr>
-          <w:rStyle w:val="VerbatimChar"/>
-        </w:rPr>
-        <w:t xml:space="preserve">a.baseURL</w:t>
-      </w:r>
-      <w:r>
-        <w:t xml:space="preserve"> </w:t>
-      </w:r>
-      <w:r>
-        <w:t xml:space="preserve">into</w:t>
-      </w:r>
-      <w:r>
-        <w:t xml:space="preserve"> </w:t>
-      </w:r>
-      <w:r>
-        <w:rPr>
-          <w:rStyle w:val="VerbatimChar"/>
-        </w:rPr>
-        <w:t xml:space="preserve">telebot.Settings.URL</w:t>
-      </w:r>
-      <w:r>
-        <w:t xml:space="preserve"> </w:t>
-      </w:r>
-      <w:r>
-        <w:t xml:space="preserve">before</w:t>
-      </w:r>
-      <w:r>
-        <w:t xml:space="preserve"> </w:t>
-      </w:r>
-      <w:r>
-        <w:rPr>
-          <w:rStyle w:val="VerbatimChar"/>
-        </w:rPr>
-        <w:t xml:space="preserve">NewBot</w:t>
-      </w:r>
-      <w:r>
-        <w:t xml:space="preserve">, parallel to</w:t>
-      </w:r>
-      <w:r>
-        <w:t xml:space="preserve"> </w:t>
-      </w:r>
-      <w:r>
-        <w:rPr>
-          <w:rStyle w:val="VerbatimChar"/>
-        </w:rPr>
-        <w:t xml:space="preserve">ensureBot</w:t>
-      </w:r>
-      <w:r>
-        <w:t xml:space="preserve"> </w:t>
-      </w:r>
-      <w:r>
-        <w:t xml:space="preserve">at</w:t>
-      </w:r>
-      <w:r>
-        <w:t xml:space="preserve"> </w:t>
-      </w:r>
-      <w:r>
-        <w:rPr>
-          <w:rStyle w:val="VerbatimChar"/>
-        </w:rPr>
-        <w:t xml:space="preserve">tgram.go:60-67</w:t>
-      </w:r>
-      <w:r>
-        <w:t xml:space="preserve">; production path unchanged when</w:t>
-      </w:r>
-      <w:r>
-        <w:t xml:space="preserve"> </w:t>
-      </w:r>
-      <w:r>
-        <w:rPr>
-          <w:rStyle w:val="VerbatimChar"/>
-        </w:rPr>
-        <w:t xml:space="preserve">a.baseURL == ""</w:t>
-      </w:r>
-      <w:r>
-        <w:t xml:space="preserve">); new</w:t>
-      </w:r>
-      <w:r>
-        <w:t xml:space="preserve"> </w:t>
-      </w:r>
-      <w:r>
-        <w:rPr>
-          <w:rStyle w:val="VerbatimChar"/>
-        </w:rPr>
-        <w:t xml:space="preserve">commons_messaging/channels/tgram/stress_chaos_test.go</w:t>
-      </w:r>
-      <w:r>
-        <w:t xml:space="preserve"> </w:t>
-      </w:r>
-      <w:r>
-        <w:t xml:space="preserve">carrying</w:t>
-      </w:r>
-      <w:r>
-        <w:t xml:space="preserve"> </w:t>
-      </w:r>
-      <w:r>
-        <w:rPr>
-          <w:rStyle w:val="VerbatimChar"/>
-        </w:rPr>
-        <w:t xml:space="preserve">TestTgram_Stress_MultiRecipientFanOut</w:t>
-      </w:r>
-      <w:r>
-        <w:t xml:space="preserve"> </w:t>
-      </w:r>
-      <w:r>
-        <w:t xml:space="preserve">(already PASS pre-fix, Wave-B-era) +</w:t>
-      </w:r>
-      <w:r>
-        <w:t xml:space="preserve"> </w:t>
-      </w:r>
-      <w:r>
-        <w:rPr>
-          <w:rStyle w:val="VerbatimChar"/>
-        </w:rPr>
-        <w:t xml:space="preserve">TestTgram_Chaos_GetUpdatesPollerResilience</w:t>
-      </w:r>
-      <w:r>
-        <w:t xml:space="preserve"> </w:t>
-      </w:r>
-      <w:r>
-        <w:t xml:space="preserve">(httptest fault-injector — 3× 500 + 2× 1.5s hangs honoring ctx-cancel + 1× mid-body Hijacker connection-close + 2× success);</w:t>
-      </w:r>
-      <w:r>
-        <w:t xml:space="preserve"> </w:t>
-      </w:r>
-      <w:r>
-        <w:rPr>
-          <w:rStyle w:val="VerbatimChar"/>
-        </w:rPr>
-        <w:t xml:space="preserve">docs/qa/HRD-137-20260528T150000Z/stress_chaos/</w:t>
-      </w:r>
-      <w:r>
-        <w:t xml:space="preserve"> </w:t>
-      </w:r>
-      <w:r>
-        <w:t xml:space="preserve">artefacts (anchor preserved verbatim, transcript §2 documents SKIP→PASS, chaos_assertion.txt rewritten with measured PASS-state values); atomic Issues.md r34→r35 + Fixed.md r15→r16 migrating all 6 tgram-completeness HRDs (HRD-133/134/135/136/137/138) Issues→Fixed. Deterministic across</w:t>
-      </w:r>
-      <w:r>
-        <w:t xml:space="preserve"> </w:t>
-      </w:r>
-      <w:r>
-        <w:rPr>
-          <w:rStyle w:val="VerbatimChar"/>
-        </w:rPr>
-        <w:t xml:space="preserve">-race -count=3</w:t>
-      </w:r>
-      <w:r>
-        <w:t xml:space="preserve"> </w:t>
-      </w:r>
-      <w:r>
-        <w:t xml:space="preserve">— every iteration identical:</w:t>
-      </w:r>
-      <w:r>
-        <w:t xml:space="preserve"> </w:t>
-      </w:r>
-      <w:r>
-        <w:rPr>
-          <w:rStyle w:val="VerbatimChar"/>
-        </w:rPr>
-        <w:t xml:space="preserve">recovery=6 fault(500=12 hang=8 close=3 ok=6) goroutines 3→4 (leaked=1) duration=12.07s</w:t>
-      </w:r>
-      <w:r>
-        <w:t xml:space="preserve">. Full tgram suite</w:t>
-      </w:r>
-      <w:r>
-        <w:t xml:space="preserve"> </w:t>
-      </w:r>
-      <w:r>
-        <w:rPr>
+        <w:t xml:space="preserve"> </w:t>
+      </w:r>
+      <w:r>
+        <w:rPr>
+          <w:rStyle w:val="VerbatimChar"/>
           <w:b/>
           <w:bCs/>
         </w:rPr>
+        <w:t xml:space="preserve">5aece5d</w:t>
+      </w:r>
+      <w:r>
+        <w:t xml:space="preserve"> </w:t>
+      </w:r>
+      <w:r>
+        <w:t xml:space="preserve">—</w:t>
+      </w:r>
+      <w:r>
+        <w:t xml:space="preserve"> </w:t>
+      </w:r>
+      <w:r>
+        <w:rPr>
+          <w:rStyle w:val="VerbatimChar"/>
+        </w:rPr>
+        <w:t xml:space="preserve">feat(§11.4.100): propagate Video color + visual-quality fidelity mandate (non-applicable-but-cite for Herald)</w:t>
+      </w:r>
+      <w:r>
+        <w:t xml:space="preserve">. Constitution sync c640947→3244bf4; §11.4.100 propagated to all 4 root docs; inheritance gate 15/0.</w:t>
+      </w:r>
+      <w:r>
+        <w:t xml:space="preserve"> </w:t>
+      </w:r>
+      <w:r>
+        <w:rPr>
+          <w:b/>
+          <w:bCs/>
+        </w:rPr>
+        <w:t xml:space="preserve">Prior</w:t>
+      </w:r>
+      <w:r>
+        <w:rPr>
+          <w:b/>
+          <w:bCs/>
+        </w:rPr>
+        <w:t xml:space="preserve"> </w:t>
+      </w:r>
+      <w:r>
+        <w:rPr>
+          <w:rStyle w:val="VerbatimChar"/>
+          <w:b/>
+          <w:bCs/>
+        </w:rPr>
+        <w:t xml:space="preserve">c0903bc</w:t>
+      </w:r>
+      <w:r>
+        <w:t xml:space="preserve"> </w:t>
+      </w:r>
+      <w:r>
+        <w:t xml:space="preserve">—</w:t>
+      </w:r>
+      <w:r>
+        <w:t xml:space="preserve"> </w:t>
+      </w:r>
+      <w:r>
+        <w:rPr>
+          <w:rStyle w:val="VerbatimChar"/>
+        </w:rPr>
+        <w:t xml:space="preserve">fix(anti-bluff): purge bin/qaherald 32MB binary + close .gitignore gap</w:t>
+      </w:r>
+      <w:r>
+        <w:t xml:space="preserve">. §107.y working-tree quiescence fix — purged JetBrains-IDE-Auto-committed 32MB compiled binary from index + sealed the gitignore gap.</w:t>
+      </w:r>
+      <w:r>
+        <w:t xml:space="preserve"> </w:t>
+      </w:r>
+      <w:r>
+        <w:rPr>
+          <w:b/>
+          <w:bCs/>
+        </w:rPr>
+        <w:t xml:space="preserve">Prior</w:t>
+      </w:r>
+      <w:r>
+        <w:rPr>
+          <w:b/>
+          <w:bCs/>
+        </w:rPr>
+        <w:t xml:space="preserve"> </w:t>
+      </w:r>
+      <w:r>
+        <w:rPr>
+          <w:rStyle w:val="VerbatimChar"/>
+          <w:b/>
+          <w:bCs/>
+        </w:rPr>
+        <w:t xml:space="preserve">b313a5e</w:t>
+      </w:r>
+      <w:r>
+        <w:t xml:space="preserve"> </w:t>
+      </w:r>
+      <w:r>
+        <w:t xml:space="preserve">—</w:t>
+      </w:r>
+      <w:r>
+        <w:t xml:space="preserve"> </w:t>
+      </w:r>
+      <w:r>
+        <w:rPr>
+          <w:rStyle w:val="VerbatimChar"/>
+        </w:rPr>
+        <w:t xml:space="preserve">docs(qa): Wave 8 Track B live evidence — E135/E136/E137 all PASS LIVE under §11.4.98</w:t>
+      </w:r>
+      <w:r>
+        <w:t xml:space="preserve">. Wave 8 Track B (MTProto user-account harness for §11.4.98 full-automation) CLOSED end-to-end: HRD-139 MTProto Client +</w:t>
+      </w:r>
+      <w:r>
+        <w:t xml:space="preserve"> </w:t>
+      </w:r>
+      <w:r>
+        <w:rPr>
+          <w:rStyle w:val="VerbatimChar"/>
+        </w:rPr>
+        <w:t xml:space="preserve">qaherald mtproto login/whoami/logout</w:t>
+      </w:r>
+      <w:r>
+        <w:t xml:space="preserve"> </w:t>
+      </w:r>
+      <w:r>
+        <w:t xml:space="preserve">(</w:t>
+      </w:r>
+      <w:r>
+        <w:rPr>
+          <w:rStyle w:val="VerbatimChar"/>
+        </w:rPr>
+        <w:t xml:space="preserve">238448e</w:t>
+      </w:r>
+      <w:r>
+        <w:t xml:space="preserve"> </w:t>
+      </w:r>
+      <w:r>
+        <w:t xml:space="preserve">+</w:t>
+      </w:r>
+      <w:r>
+        <w:t xml:space="preserve"> </w:t>
+      </w:r>
+      <w:r>
+        <w:rPr>
+          <w:rStyle w:val="VerbatimChar"/>
+        </w:rPr>
+        <w:t xml:space="preserve">ec4c3c0</w:t>
+      </w:r>
+      <w:r>
+        <w:t xml:space="preserve">); HRD-140 Subscribe roundtrip PASSED LIVE in 1.30s (</w:t>
+      </w:r>
+      <w:r>
+        <w:rPr>
+          <w:rStyle w:val="VerbatimChar"/>
+        </w:rPr>
+        <w:t xml:space="preserve">367d58b</w:t>
+      </w:r>
+      <w:r>
+        <w:t xml:space="preserve">); HRD-141 Wave 6 closed loop PASSED LIVE in 48.58s with journal-based §11.4.98 autonomy assertion (</w:t>
+      </w:r>
+      <w:r>
+        <w:rPr>
+          <w:rStyle w:val="VerbatimChar"/>
+        </w:rPr>
+        <w:t xml:space="preserve">7e50ed0</w:t>
+      </w:r>
+      <w:r>
+        <w:t xml:space="preserve"> </w:t>
+      </w:r>
+      <w:r>
+        <w:t xml:space="preserve">+</w:t>
+      </w:r>
+      <w:r>
+        <w:t xml:space="preserve"> </w:t>
+      </w:r>
+      <w:r>
+        <w:rPr>
+          <w:rStyle w:val="VerbatimChar"/>
+        </w:rPr>
+        <w:t xml:space="preserve">d7d6524</w:t>
+      </w:r>
+      <w:r>
+        <w:t xml:space="preserve"> </w:t>
+      </w:r>
+      <w:r>
+        <w:t xml:space="preserve">+</w:t>
+      </w:r>
+      <w:r>
+        <w:t xml:space="preserve"> </w:t>
+      </w:r>
+      <w:r>
+        <w:rPr>
+          <w:rStyle w:val="VerbatimChar"/>
+        </w:rPr>
+        <w:t xml:space="preserve">0797e85</w:t>
+      </w:r>
+      <w:r>
+        <w:t xml:space="preserve">); HRD-142 Wave 6.5 lifecycle PASSED LIVE in 26.04s, 3/3 subtests (</w:t>
+      </w:r>
+      <w:r>
+        <w:rPr>
+          <w:rStyle w:val="VerbatimChar"/>
+        </w:rPr>
+        <w:t xml:space="preserve">1f2e75d</w:t>
+      </w:r>
+      <w:r>
+        <w:t xml:space="preserve">); E135-E137 wired into bluff hunt (</w:t>
+      </w:r>
+      <w:r>
+        <w:rPr>
+          <w:rStyle w:val="VerbatimChar"/>
+        </w:rPr>
+        <w:t xml:space="preserve">a80d206</w:t>
+      </w:r>
+      <w:r>
+        <w:t xml:space="preserve">); HelixConstitution §11.4.99 anchored upstream + Herald root + 9 Helix-stack submodules (</w:t>
+      </w:r>
+      <w:r>
+        <w:rPr>
+          <w:rStyle w:val="VerbatimChar"/>
+        </w:rPr>
+        <w:t xml:space="preserve">fb9d81e</w:t>
+      </w:r>
+      <w:r>
+        <w:t xml:space="preserve"> </w:t>
+      </w:r>
+      <w:r>
+        <w:t xml:space="preserve">+</w:t>
+      </w:r>
+      <w:r>
+        <w:t xml:space="preserve"> </w:t>
+      </w:r>
+      <w:r>
+        <w:rPr>
+          <w:rStyle w:val="VerbatimChar"/>
+        </w:rPr>
+        <w:t xml:space="preserve">d1100b2</w:t>
+      </w:r>
+      <w:r>
+        <w:t xml:space="preserve"> </w:t>
+      </w:r>
+      <w:r>
+        <w:t xml:space="preserve">+</w:t>
+      </w:r>
+      <w:r>
+        <w:t xml:space="preserve"> </w:t>
+      </w:r>
+      <w:r>
+        <w:rPr>
+          <w:rStyle w:val="VerbatimChar"/>
+        </w:rPr>
+        <w:t xml:space="preserve">dc007ab</w:t>
+      </w:r>
+      <w:r>
+        <w:t xml:space="preserve"> </w:t>
+      </w:r>
+      <w:r>
+        <w:t xml:space="preserve">+</w:t>
+      </w:r>
+      <w:r>
+        <w:t xml:space="preserve"> </w:t>
+      </w:r>
+      <w:r>
+        <w:rPr>
+          <w:rStyle w:val="VerbatimChar"/>
+        </w:rPr>
+        <w:t xml:space="preserve">d1b6f25</w:t>
+      </w:r>
+      <w:r>
+        <w:t xml:space="preserve">); evidence committed under</w:t>
+      </w:r>
+      <w:r>
+        <w:t xml:space="preserve"> </w:t>
+      </w:r>
+      <w:r>
+        <w:rPr>
+          <w:rStyle w:val="VerbatimChar"/>
+        </w:rPr>
+        <w:t xml:space="preserve">docs/qa/HRD-LIVE-MTPROTO-20260528T125321Z/</w:t>
+      </w:r>
+      <w:r>
+        <w:t xml:space="preserve"> </w:t>
+      </w:r>
+      <w:r>
+        <w:t xml:space="preserve">(</w:t>
+      </w:r>
+      <w:r>
+        <w:rPr>
+          <w:rStyle w:val="VerbatimChar"/>
+        </w:rPr>
+        <w:t xml:space="preserve">b313a5e</w:t>
+      </w:r>
+      <w:r>
+        <w:t xml:space="preserve">). v0.6.0 ANNOTATED TAG cut.</w:t>
+      </w:r>
+      <w:r>
+        <w:t xml:space="preserve"> </w:t>
+      </w:r>
+      <w:r>
+        <w:rPr>
+          <w:b/>
+          <w:bCs/>
+        </w:rPr>
+        <w:t xml:space="preserve">Prior</w:t>
+      </w:r>
+      <w:r>
+        <w:t xml:space="preserve"> </w:t>
+      </w:r>
+      <w:r>
+        <w:rPr>
+          <w:rStyle w:val="VerbatimChar"/>
+        </w:rPr>
+        <w:t xml:space="preserve">77da6eb</w:t>
+      </w:r>
+      <w:r>
+        <w:t xml:space="preserve"> </w:t>
+      </w:r>
+      <w:r>
+        <w:t xml:space="preserve">—</w:t>
+      </w:r>
+      <w:r>
+        <w:t xml:space="preserve"> </w:t>
+      </w:r>
+      <w:r>
+        <w:rPr>
+          <w:rStyle w:val="VerbatimChar"/>
+        </w:rPr>
+        <w:t xml:space="preserve">feat(tgram HRD-137 + Wave C): §11.4.85 stress+chaos SKIP→PASS + 6 HRDs Issues→Fixed</w:t>
+      </w:r>
+      <w:r>
+        <w:t xml:space="preserve">.</w:t>
+      </w:r>
+      <w:r>
+        <w:t xml:space="preserve"> </w:t>
+      </w:r>
+      <w:r>
+        <w:rPr>
+          <w:b/>
+          <w:bCs/>
+        </w:rPr>
+        <w:t xml:space="preserve">Tgram-completeness wave COMPLETE — HRD-133..138 atomic Issues→Fixed per §11.4.19.</w:t>
+      </w:r>
+      <w:r>
+        <w:t xml:space="preserve"> </w:t>
+      </w:r>
+      <w:r>
+        <w:t xml:space="preserve">9 files changed (3 modified + 6 created): a one-line</w:t>
+      </w:r>
+      <w:r>
+        <w:t xml:space="preserve"> </w:t>
+      </w:r>
+      <w:r>
+        <w:rPr>
+          <w:rStyle w:val="VerbatimChar"/>
+        </w:rPr>
+        <w:t xml:space="preserve">commons_messaging/channels/tgram/subscribe.go</w:t>
+      </w:r>
+      <w:r>
+        <w:t xml:space="preserve"> </w:t>
+      </w:r>
+      <w:r>
+        <w:t xml:space="preserve">seam fix (threads</w:t>
+      </w:r>
+      <w:r>
+        <w:t xml:space="preserve"> </w:t>
+      </w:r>
+      <w:r>
+        <w:rPr>
+          <w:rStyle w:val="VerbatimChar"/>
+        </w:rPr>
+        <w:t xml:space="preserve">a.baseURL</w:t>
+      </w:r>
+      <w:r>
+        <w:t xml:space="preserve"> </w:t>
+      </w:r>
+      <w:r>
+        <w:t xml:space="preserve">into</w:t>
+      </w:r>
+      <w:r>
+        <w:t xml:space="preserve"> </w:t>
+      </w:r>
+      <w:r>
+        <w:rPr>
+          <w:rStyle w:val="VerbatimChar"/>
+        </w:rPr>
+        <w:t xml:space="preserve">telebot.Settings.URL</w:t>
+      </w:r>
+      <w:r>
+        <w:t xml:space="preserve"> </w:t>
+      </w:r>
+      <w:r>
+        <w:t xml:space="preserve">before</w:t>
+      </w:r>
+      <w:r>
+        <w:t xml:space="preserve"> </w:t>
+      </w:r>
+      <w:r>
+        <w:rPr>
+          <w:rStyle w:val="VerbatimChar"/>
+        </w:rPr>
+        <w:t xml:space="preserve">NewBot</w:t>
+      </w:r>
+      <w:r>
+        <w:t xml:space="preserve">, parallel to</w:t>
+      </w:r>
+      <w:r>
+        <w:t xml:space="preserve"> </w:t>
+      </w:r>
+      <w:r>
+        <w:rPr>
+          <w:rStyle w:val="VerbatimChar"/>
+        </w:rPr>
+        <w:t xml:space="preserve">ensureBot</w:t>
+      </w:r>
+      <w:r>
+        <w:t xml:space="preserve"> </w:t>
+      </w:r>
+      <w:r>
+        <w:t xml:space="preserve">at</w:t>
+      </w:r>
+      <w:r>
+        <w:t xml:space="preserve"> </w:t>
+      </w:r>
+      <w:r>
+        <w:rPr>
+          <w:rStyle w:val="VerbatimChar"/>
+        </w:rPr>
+        <w:t xml:space="preserve">tgram.go:60-67</w:t>
+      </w:r>
+      <w:r>
+        <w:t xml:space="preserve">; production path unchanged when</w:t>
+      </w:r>
+      <w:r>
+        <w:t xml:space="preserve"> </w:t>
+      </w:r>
+      <w:r>
+        <w:rPr>
+          <w:rStyle w:val="VerbatimChar"/>
+        </w:rPr>
+        <w:t xml:space="preserve">a.baseURL == ""</w:t>
+      </w:r>
+      <w:r>
+        <w:t xml:space="preserve">); new</w:t>
+      </w:r>
+      <w:r>
+        <w:t xml:space="preserve"> </w:t>
+      </w:r>
+      <w:r>
+        <w:rPr>
+          <w:rStyle w:val="VerbatimChar"/>
+        </w:rPr>
+        <w:t xml:space="preserve">commons_messaging/channels/tgram/stress_chaos_test.go</w:t>
+      </w:r>
+      <w:r>
+        <w:t xml:space="preserve"> </w:t>
+      </w:r>
+      <w:r>
+        <w:t xml:space="preserve">carrying</w:t>
+      </w:r>
+      <w:r>
+        <w:t xml:space="preserve"> </w:t>
+      </w:r>
+      <w:r>
+        <w:rPr>
+          <w:rStyle w:val="VerbatimChar"/>
+        </w:rPr>
+        <w:t xml:space="preserve">TestTgram_Stress_MultiRecipientFanOut</w:t>
+      </w:r>
+      <w:r>
+        <w:t xml:space="preserve"> </w:t>
+      </w:r>
+      <w:r>
+        <w:t xml:space="preserve">(already PASS pre-fix, Wave-B-era) +</w:t>
+      </w:r>
+      <w:r>
+        <w:t xml:space="preserve"> </w:t>
+      </w:r>
+      <w:r>
+        <w:rPr>
+          <w:rStyle w:val="VerbatimChar"/>
+        </w:rPr>
+        <w:t xml:space="preserve">TestTgram_Chaos_GetUpdatesPollerResilience</w:t>
+      </w:r>
+      <w:r>
+        <w:t xml:space="preserve"> </w:t>
+      </w:r>
+      <w:r>
+        <w:t xml:space="preserve">(httptest fault-injector — 3× 500 + 2× 1.5s hangs honoring ctx-cancel + 1× mid-body Hijacker connection-close + 2× success);</w:t>
+      </w:r>
+      <w:r>
+        <w:t xml:space="preserve"> </w:t>
+      </w:r>
+      <w:r>
+        <w:rPr>
+          <w:rStyle w:val="VerbatimChar"/>
+        </w:rPr>
+        <w:t xml:space="preserve">docs/qa/HRD-137-20260528T150000Z/stress_chaos/</w:t>
+      </w:r>
+      <w:r>
+        <w:t xml:space="preserve"> </w:t>
+      </w:r>
+      <w:r>
+        <w:t xml:space="preserve">artefacts (anchor preserved verbatim, transcript §2 documents SKIP→PASS, chaos_assertion.txt rewritten with measured PASS-state values); atomic Issues.md r34→r35 + Fixed.md r15→r16 migrating all 6 tgram-completeness HRDs (HRD-133/134/135/136/137/138) Issues→Fixed. Deterministic across</w:t>
+      </w:r>
+      <w:r>
+        <w:t xml:space="preserve"> </w:t>
+      </w:r>
+      <w:r>
+        <w:rPr>
+          <w:rStyle w:val="VerbatimChar"/>
+        </w:rPr>
+        <w:t xml:space="preserve">-race -count=3</w:t>
+      </w:r>
+      <w:r>
+        <w:t xml:space="preserve"> </w:t>
+      </w:r>
+      <w:r>
+        <w:t xml:space="preserve">— every iteration identical:</w:t>
+      </w:r>
+      <w:r>
+        <w:t xml:space="preserve"> </w:t>
+      </w:r>
+      <w:r>
+        <w:rPr>
+          <w:rStyle w:val="VerbatimChar"/>
+        </w:rPr>
+        <w:t xml:space="preserve">recovery=6 fault(500=12 hang=8 close=3 ok=6) goroutines 3→4 (leaked=1) duration=12.07s</w:t>
+      </w:r>
+      <w:r>
+        <w:t xml:space="preserve">. Full tgram suite</w:t>
+      </w:r>
+      <w:r>
+        <w:t xml:space="preserve"> </w:t>
+      </w:r>
+      <w:r>
+        <w:rPr>
+          <w:b/>
+          <w:bCs/>
+        </w:rPr>
         <w:t xml:space="preserve">26/26 PASS, 0 SKIP</w:t>
       </w:r>
       <w:r>
@@ -2814,49 +3323,169 @@
           <w:b/>
           <w:bCs/>
         </w:rPr>
-        <w:t xml:space="preserve">No active work in flight.</w:t>
-      </w:r>
-      <w:r>
-        <w:t xml:space="preserve"> </w:t>
-      </w:r>
-      <w:r>
-        <w:t xml:space="preserve">Wave 8 Track B closed; v0.6.0 tag cut and pushed to all 4 mirrors. Host machine going to power-off per operator end-of-day request. Pickup tomorrow: (a) §11.4.19 atomic Issues→Fixed migration for HRD-139/140/141/142 (currently tracked only in TaskList — need Issues.md+Fixed.md rows + summary updates), (b) §11.4.90 Obsolete graduation of the 3 legacy NON-COMPLIANT tests (</w:t>
-      </w:r>
-      <w:r>
-        <w:rPr>
-          <w:rStyle w:val="VerbatimChar"/>
-        </w:rPr>
-        <w:t xml:space="preserve">TestSubscribe_LiveBotAPI</w:t>
-      </w:r>
-      <w:r>
-        <w:t xml:space="preserve">,</w:t>
-      </w:r>
-      <w:r>
-        <w:t xml:space="preserve"> </w:t>
-      </w:r>
-      <w:r>
-        <w:rPr>
-          <w:rStyle w:val="VerbatimChar"/>
-        </w:rPr>
-        <w:t xml:space="preserve">tests/test_wave6_live_loop.sh</w:t>
-      </w:r>
-      <w:r>
-        <w:t xml:space="preserve">, lifecycle</w:t>
-      </w:r>
-      <w:r>
-        <w:t xml:space="preserve"> </w:t>
-      </w:r>
-      <w:r>
-        <w:rPr>
-          <w:rStyle w:val="VerbatimChar"/>
-        </w:rPr>
-        <w:t xml:space="preserve">--manual</w:t>
-      </w:r>
-      <w:r>
-        <w:t xml:space="preserve"> </w:t>
-      </w:r>
-      <w:r>
-        <w:t xml:space="preserve">mode) with Obsolete-Details citing superseded-by-later-mandate §11.4.98 / §108.m, (c) v1.0.0 Batch C carry-over (none — all closed this session per Tasks #195-#204) so next unit is Batch E HRD-115..121 status review (already Completed per Tasks #206-#212) → confirm Issues.md / Fixed.md migration, (d) then continue with §43 §43 catalogue stragglers + GAP-4 docs/qa back-fill + comprehensive docs audit task #147. MTProto creds remain in</w:t>
+        <w:t xml:space="preserve">Background e2e_bluff_hunt running</w:t>
+      </w:r>
+      <w:r>
+        <w:t xml:space="preserve"> </w:t>
+      </w:r>
+      <w:r>
+        <w:t xml:space="preserve">(</w:t>
+      </w:r>
+      <w:r>
+        <w:rPr>
+          <w:rStyle w:val="VerbatimChar"/>
+        </w:rPr>
+        <w:t xml:space="preserve">qa-results/e2e_bluff_hunt_20260529T0001Z.log</w:t>
+      </w:r>
+      <w:r>
+        <w:t xml:space="preserve">) to validate state post-§11.4.100 propagation + HRD-139..142 migration + 3-test Obsolete graduation.</w:t>
+      </w:r>
+      <w:r>
+        <w:t xml:space="preserve"> </w:t>
+      </w:r>
+      <w:r>
+        <w:rPr>
+          <w:b/>
+          <w:bCs/>
+        </w:rPr>
+        <w:t xml:space="preserve">Push of 873aab4 to all 4 mirrors COMPLETE</w:t>
+      </w:r>
+      <w:r>
+        <w:t xml:space="preserve"> </w:t>
+      </w:r>
+      <w:r>
+        <w:t xml:space="preserve">per §11.4.88 background-push (per-mirror flock, push detached after commit-lock release; all 4 mirrors confirmed at HEAD</w:t>
+      </w:r>
+      <w:r>
+        <w:t xml:space="preserve"> </w:t>
+      </w:r>
+      <w:r>
+        <w:rPr>
+          <w:rStyle w:val="VerbatimChar"/>
+        </w:rPr>
+        <w:t xml:space="preserve">873aab4</w:t>
+      </w:r>
+      <w:r>
+        <w:t xml:space="preserve">).</w:t>
+      </w:r>
+      <w:r>
+        <w:t xml:space="preserve"> </w:t>
+      </w:r>
+      <w:r>
+        <w:rPr>
+          <w:b/>
+          <w:bCs/>
+        </w:rPr>
+        <w:t xml:space="preserve">No other active work in flight.</w:t>
+      </w:r>
+      <w:r>
+        <w:t xml:space="preserve"> </w:t>
+      </w:r>
+      <w:r>
+        <w:t xml:space="preserve">Operator's next-priority pickup options: (a) v1.0.0 Batch C/D/E status confirm — Tasks #195-#212 mark all Batch C+D+Wave-7-T6-T12 complete; the Issues.md</w:t>
+      </w:r>
+      <w:r>
+        <w:t xml:space="preserve"> </w:t>
+      </w:r>
+      <w:r>
+        <w:rPr>
+          <w:rStyle w:val="VerbatimChar"/>
+        </w:rPr>
+        <w:t xml:space="preserve">in_progress</w:t>
+      </w:r>
+      <w:r>
+        <w:t xml:space="preserve"> </w:t>
+      </w:r>
+      <w:r>
+        <w:t xml:space="preserve">HRD-019..025 + HRD-029..056 + HRD-085..090 + HRD-115..121 rows need their Fixed→Obsolete graduation audit per §11.4.90; (b)</w:t>
+      </w:r>
+      <w:r>
+        <w:t xml:space="preserve"> </w:t>
+      </w:r>
+      <w:r>
+        <w:rPr>
+          <w:b/>
+          <w:bCs/>
+        </w:rPr>
+        <w:t xml:space="preserve">DOCS task #147</w:t>
+      </w:r>
+      <w:r>
+        <w:t xml:space="preserve"> </w:t>
+      </w:r>
+      <w:r>
+        <w:t xml:space="preserve">comprehensive documentation audit + per-flavor operator guides (nano-detail per</w:t>
+      </w:r>
+      <w:r>
+        <w:t xml:space="preserve"> </w:t>
+      </w:r>
+      <w:r>
+        <w:rPr>
+          <w:rStyle w:val="VerbatimChar"/>
+        </w:rPr>
+        <w:t xml:space="preserve">feedback_nano_detail_docs</w:t>
+      </w:r>
+      <w:r>
+        <w:t xml:space="preserve"> </w:t>
+      </w:r>
+      <w:r>
+        <w:t xml:space="preserve">memory — blocks v1.0.0 production-ready readiness per</w:t>
+      </w:r>
+      <w:r>
+        <w:t xml:space="preserve"> </w:t>
+      </w:r>
+      <w:r>
+        <w:rPr>
+          <w:rStyle w:val="VerbatimChar"/>
+        </w:rPr>
+        <w:t xml:space="preserve">feedback_production_ready_mandate</w:t>
+      </w:r>
+      <w:r>
+        <w:t xml:space="preserve">); (c)</w:t>
+      </w:r>
+      <w:r>
+        <w:t xml:space="preserve"> </w:t>
+      </w:r>
+      <w:r>
+        <w:rPr>
+          <w:rStyle w:val="VerbatimChar"/>
+        </w:rPr>
+        <w:t xml:space="preserve">feedback_no_concurrent_mutation_gates</w:t>
+      </w:r>
+      <w:r>
+        <w:t xml:space="preserve"> </w:t>
+      </w:r>
+      <w:r>
+        <w:t xml:space="preserve">is ENFORCED via</w:t>
+      </w:r>
+      <w:r>
+        <w:t xml:space="preserve"> </w:t>
+      </w:r>
+      <w:r>
+        <w:rPr>
+          <w:rStyle w:val="VerbatimChar"/>
+        </w:rPr>
+        <w:t xml:space="preserve">scripts/mutation_residue_audit.sh</w:t>
+      </w:r>
+      <w:r>
+        <w:t xml:space="preserve"> </w:t>
+      </w:r>
+      <w:r>
+        <w:t xml:space="preserve">+</w:t>
+      </w:r>
+      <w:r>
+        <w:t xml:space="preserve"> </w:t>
+      </w:r>
+      <w:r>
+        <w:rPr>
+          <w:rStyle w:val="VerbatimChar"/>
+        </w:rPr>
+        <w:t xml:space="preserve">.git/MUTATION_IN_PROGRESS</w:t>
+      </w:r>
+      <w:r>
+        <w:t xml:space="preserve"> </w:t>
+      </w:r>
+      <w:r>
+        <w:t xml:space="preserve">lockfile + check_quiescence() — no carryover; (d) MTProto creds remain in</w:t>
       </w:r>
       <w:r>
         <w:t xml:space="preserve"> </w:t>
@@ -2871,34 +3500,7 @@
         <w:t xml:space="preserve"> </w:t>
       </w:r>
       <w:r>
-        <w:t xml:space="preserve">(operator-supplied + session cached at</w:t>
-      </w:r>
-      <w:r>
-        <w:t xml:space="preserve"> </w:t>
-      </w:r>
-      <w:r>
-        <w:rPr>
-          <w:rStyle w:val="VerbatimChar"/>
-        </w:rPr>
-        <w:t xml:space="preserve">~/.config/herald/mtproto.session</w:t>
-      </w:r>
-      <w:r>
-        <w:t xml:space="preserve"> </w:t>
-      </w:r>
-      <w:r>
-        <w:t xml:space="preserve">for next-session reuse). All hermetic gates green: tgram suite 26/26 PASS / 0 SKIP, chaos test deterministic</w:t>
-      </w:r>
-      <w:r>
-        <w:t xml:space="preserve"> </w:t>
-      </w:r>
-      <w:r>
-        <w:rPr>
-          <w:rStyle w:val="VerbatimChar"/>
-        </w:rPr>
-        <w:t xml:space="preserve">-race -count=3</w:t>
-      </w:r>
-      <w:r>
-        <w:t xml:space="preserve">. Wave 8 Track B live tests PASSING on every rerun — fully autonomous past the single one-time OOB-code paste at MTProto login (which Telegram fundamentally requires).</w:t>
+        <w:t xml:space="preserve">+ session cached for next-session reuse; (e) HRD-131 §11.4.93 SQLite SSoT remains OPEN-deferred (constitution-repo migration binary still unimplemented per the §11.4.74 catalogue-first constraint).</w:t>
       </w:r>
     </w:p>
     <w:bookmarkEnd w:id="13"/>

</xml_diff>

<commit_message>
docs(CONTINUATION): r21→r22 — ATMOSphere integration delivered end-to-end; resume-tomorrow handoff
Records the day-4 ATMOSphere↔Herald workable-items integration delivery across 3 repos (Herald 2412512 / HelixConstitution 8ec2b38 / ATMOSphere 5462a38) + the precise next-day pickup: HRD-156 live evidence (qaherald mtproto login → real Telegram round-trip), launch pherald watch/listen on the host, gitlab split-archive mirror reconciliation, and follow-ups. Siblings regenerated.

Co-Authored-By: Claude Opus 4.8 <noreply@anthropic.com>
</commit_message>
<xml_diff>
--- a/docs/CONTINUATION.docx
+++ b/docs/CONTINUATION.docx
@@ -75,7 +75,7 @@
               <w:pStyle w:val="Compact"/>
             </w:pPr>
             <w:r>
-              <w:t xml:space="preserve">21</w:t>
+              <w:t xml:space="preserve">22</w:t>
             </w:r>
           </w:p>
         </w:tc>
@@ -175,6 +175,409 @@
                 <w:b/>
                 <w:bCs/>
               </w:rPr>
+              <w:t xml:space="preserve">r22 (2026-05-29 day-4) — ATMOSphere↔Herald workable-items integration DELIVERED end-to-end across 3 repos (Herald</w:t>
+            </w:r>
+            <w:r>
+              <w:rPr>
+                <w:b/>
+                <w:bCs/>
+              </w:rPr>
+              <w:t xml:space="preserve"> </w:t>
+            </w:r>
+            <w:r>
+              <w:rPr>
+                <w:rStyle w:val="VerbatimChar"/>
+                <w:b/>
+                <w:bCs/>
+              </w:rPr>
+              <w:t xml:space="preserve">2412512</w:t>
+            </w:r>
+            <w:r>
+              <w:rPr>
+                <w:b/>
+                <w:bCs/>
+              </w:rPr>
+              <w:t xml:space="preserve"> </w:t>
+            </w:r>
+            <w:r>
+              <w:rPr>
+                <w:b/>
+                <w:bCs/>
+              </w:rPr>
+              <w:t xml:space="preserve">/ HelixConstitution</w:t>
+            </w:r>
+            <w:r>
+              <w:rPr>
+                <w:b/>
+                <w:bCs/>
+              </w:rPr>
+              <w:t xml:space="preserve"> </w:t>
+            </w:r>
+            <w:r>
+              <w:rPr>
+                <w:rStyle w:val="VerbatimChar"/>
+                <w:b/>
+                <w:bCs/>
+              </w:rPr>
+              <w:t xml:space="preserve">8ec2b38</w:t>
+            </w:r>
+            <w:r>
+              <w:rPr>
+                <w:b/>
+                <w:bCs/>
+              </w:rPr>
+              <w:t xml:space="preserve"> </w:t>
+            </w:r>
+            <w:r>
+              <w:rPr>
+                <w:b/>
+                <w:bCs/>
+              </w:rPr>
+              <w:t xml:space="preserve">/ ATMOSphere</w:t>
+            </w:r>
+            <w:r>
+              <w:rPr>
+                <w:b/>
+                <w:bCs/>
+              </w:rPr>
+              <w:t xml:space="preserve"> </w:t>
+            </w:r>
+            <w:r>
+              <w:rPr>
+                <w:rStyle w:val="VerbatimChar"/>
+                <w:b/>
+                <w:bCs/>
+              </w:rPr>
+              <w:t xml:space="preserve">5462a38</w:t>
+            </w:r>
+            <w:r>
+              <w:rPr>
+                <w:b/>
+                <w:bCs/>
+              </w:rPr>
+              <w:t xml:space="preserve">; all synced).</w:t>
+            </w:r>
+            <w:r>
+              <w:t xml:space="preserve"> </w:t>
+            </w:r>
+            <w:r>
+              <w:t xml:space="preserve">Phase 1 plan</w:t>
+            </w:r>
+            <w:r>
+              <w:t xml:space="preserve"> </w:t>
+            </w:r>
+            <w:r>
+              <w:rPr>
+                <w:rStyle w:val="VerbatimChar"/>
+              </w:rPr>
+              <w:t xml:space="preserve">~/Documents/ATMOSphere_Herald_Integration_Plan.md</w:t>
+            </w:r>
+            <w:r>
+              <w:t xml:space="preserve"> </w:t>
+            </w:r>
+            <w:r>
+              <w:t xml:space="preserve">(+PDF/HTML/DOCX) from 5 parallel verified-source analysis agents. Phase 2 Herald build (all</w:t>
+            </w:r>
+            <w:r>
+              <w:t xml:space="preserve"> </w:t>
+            </w:r>
+            <w:r>
+              <w:rPr>
+                <w:rStyle w:val="VerbatimChar"/>
+              </w:rPr>
+              <w:t xml:space="preserve">-race</w:t>
+            </w:r>
+            <w:r>
+              <w:t xml:space="preserve"> </w:t>
+            </w:r>
+            <w:r>
+              <w:t xml:space="preserve">anti-bluff-tested, pushed to 4 mirrors, commits</w:t>
+            </w:r>
+            <w:r>
+              <w:t xml:space="preserve"> </w:t>
+            </w:r>
+            <w:r>
+              <w:rPr>
+                <w:rStyle w:val="VerbatimChar"/>
+              </w:rPr>
+              <w:t xml:space="preserve">92f0136</w:t>
+            </w:r>
+            <w:r>
+              <w:t xml:space="preserve">→</w:t>
+            </w:r>
+            <w:r>
+              <w:rPr>
+                <w:rStyle w:val="VerbatimChar"/>
+              </w:rPr>
+              <w:t xml:space="preserve">a541acc</w:t>
+            </w:r>
+            <w:r>
+              <w:t xml:space="preserve">): HRD-148</w:t>
+            </w:r>
+            <w:r>
+              <w:t xml:space="preserve"> </w:t>
+            </w:r>
+            <w:r>
+              <w:rPr>
+                <w:rStyle w:val="VerbatimChar"/>
+              </w:rPr>
+              <w:t xml:space="preserve">commons_workable</w:t>
+            </w:r>
+            <w:r>
+              <w:t xml:space="preserve"> </w:t>
+            </w:r>
+            <w:r>
+              <w:t xml:space="preserve">(pure-Go SQLite SSoT store+CRUD+ATMOSphere-</w:t>
+            </w:r>
+            <w:r>
+              <w:rPr>
+                <w:rStyle w:val="VerbatimChar"/>
+              </w:rPr>
+              <w:t xml:space="preserve">## §… [ATM-NNN]</w:t>
+            </w:r>
+            <w:r>
+              <w:t xml:space="preserve">-parser+per-property diff change-feed), HRD-149</w:t>
+            </w:r>
+            <w:r>
+              <w:t xml:space="preserve"> </w:t>
+            </w:r>
+            <w:r>
+              <w:rPr>
+                <w:rStyle w:val="VerbatimChar"/>
+              </w:rPr>
+              <w:t xml:space="preserve">commons_watch</w:t>
+            </w:r>
+            <w:r>
+              <w:t xml:space="preserve"> </w:t>
+            </w:r>
+            <w:r>
+              <w:t xml:space="preserve">(fsnotify+WAL-poll+debounce), HRD-151</w:t>
+            </w:r>
+            <w:r>
+              <w:t xml:space="preserve"> </w:t>
+            </w:r>
+            <w:r>
+              <w:rPr>
+                <w:rStyle w:val="VerbatimChar"/>
+              </w:rPr>
+              <w:t xml:space="preserve">pherald/internal/workflow</w:t>
+            </w:r>
+            <w:r>
+              <w:t xml:space="preserve"> </w:t>
+            </w:r>
+            <w:r>
+              <w:t xml:space="preserve">change→CloudEvent→Runner bridge + Jira/ClickUp diff formatter, HRD-152 inbound</w:t>
+            </w:r>
+            <w:r>
+              <w:t xml:space="preserve"> </w:t>
+            </w:r>
+            <w:r>
+              <w:rPr>
+                <w:rStyle w:val="VerbatimChar"/>
+              </w:rPr>
+              <w:t xml:space="preserve">item.update</w:t>
+            </w:r>
+            <w:r>
+              <w:t xml:space="preserve">/</w:t>
+            </w:r>
+            <w:r>
+              <w:rPr>
+                <w:rStyle w:val="VerbatimChar"/>
+              </w:rPr>
+              <w:t xml:space="preserve">item.delete</w:t>
+            </w:r>
+            <w:r>
+              <w:t xml:space="preserve">/</w:t>
+            </w:r>
+            <w:r>
+              <w:rPr>
+                <w:rStyle w:val="VerbatimChar"/>
+              </w:rPr>
+              <w:t xml:space="preserve">investigation.start</w:t>
+            </w:r>
+            <w:r>
+              <w:t xml:space="preserve"> </w:t>
+            </w:r>
+            <w:r>
+              <w:t xml:space="preserve">+</w:t>
+            </w:r>
+            <w:r>
+              <w:t xml:space="preserve"> </w:t>
+            </w:r>
+            <w:r>
+              <w:rPr>
+                <w:rStyle w:val="VerbatimChar"/>
+              </w:rPr>
+              <w:t xml:space="preserve">ItemMutator</w:t>
+            </w:r>
+            <w:r>
+              <w:t xml:space="preserve"> </w:t>
+            </w:r>
+            <w:r>
+              <w:t xml:space="preserve">+ act-with-confirmation CONFIRM flow (wired into</w:t>
+            </w:r>
+            <w:r>
+              <w:t xml:space="preserve"> </w:t>
+            </w:r>
+            <w:r>
+              <w:rPr>
+                <w:rStyle w:val="VerbatimChar"/>
+              </w:rPr>
+              <w:t xml:space="preserve">pherald listen --db</w:t>
+            </w:r>
+            <w:r>
+              <w:t xml:space="preserve">), HRD-153</w:t>
+            </w:r>
+            <w:r>
+              <w:t xml:space="preserve"> </w:t>
+            </w:r>
+            <w:r>
+              <w:rPr>
+                <w:rStyle w:val="VerbatimChar"/>
+              </w:rPr>
+              <w:t xml:space="preserve">pherald watch</w:t>
+            </w:r>
+            <w:r>
+              <w:t xml:space="preserve"> </w:t>
+            </w:r>
+            <w:r>
+              <w:t xml:space="preserve">end-to-end daemon (real-SQLite+fsnotify+diff+dispatch e2e), HRD-154 preference/quiet-hours routing (TZ-aware), e2e invariant</w:t>
+            </w:r>
+            <w:r>
+              <w:t xml:space="preserve"> </w:t>
+            </w:r>
+            <w:r>
+              <w:rPr>
+                <w:b/>
+                <w:bCs/>
+              </w:rPr>
+              <w:t xml:space="preserve">E139</w:t>
+            </w:r>
+            <w:r>
+              <w:t xml:space="preserve">, operator guide</w:t>
+            </w:r>
+            <w:r>
+              <w:t xml:space="preserve"> </w:t>
+            </w:r>
+            <w:r>
+              <w:rPr>
+                <w:rStyle w:val="VerbatimChar"/>
+              </w:rPr>
+              <w:t xml:space="preserve">docs/guides/WORKABLE_ITEMS_INTEGRATION.md</w:t>
+            </w:r>
+            <w:r>
+              <w:t xml:space="preserve">. Phase 3 deployment: HelixConstitution workable-items parser extended for ATMOSphere format backward-compatibly (</w:t>
+            </w:r>
+            <w:r>
+              <w:rPr>
+                <w:rStyle w:val="VerbatimChar"/>
+              </w:rPr>
+              <w:t xml:space="preserve">995bd2f</w:t>
+            </w:r>
+            <w:r>
+              <w:t xml:space="preserve">, 4 upstreams) + anti-bluff covenant QWEN.md leading-clause for cross-file consistency (</w:t>
+            </w:r>
+            <w:r>
+              <w:rPr>
+                <w:rStyle w:val="VerbatimChar"/>
+              </w:rPr>
+              <w:t xml:space="preserve">8ec2b38</w:t>
+            </w:r>
+            <w:r>
+              <w:t xml:space="preserve">, 4 upstreams); on the ATMOSphere host</w:t>
+            </w:r>
+            <w:r>
+              <w:t xml:space="preserve"> </w:t>
+            </w:r>
+            <w:r>
+              <w:rPr>
+                <w:rStyle w:val="VerbatimChar"/>
+              </w:rPr>
+              <w:t xml:space="preserve">docs/workable_items.db</w:t>
+            </w:r>
+            <w:r>
+              <w:t xml:space="preserve"> </w:t>
+            </w:r>
+            <w:r>
+              <w:t xml:space="preserve">SSoT MATERIALIZED (58 items, validate OK, byte-identical round-trip, §11.4.95 version-controlled,</w:t>
+            </w:r>
+            <w:r>
+              <w:t xml:space="preserve"> </w:t>
+            </w:r>
+            <w:r>
+              <w:rPr>
+                <w:rStyle w:val="VerbatimChar"/>
+              </w:rPr>
+              <w:t xml:space="preserve">d41dda5</w:t>
+            </w:r>
+            <w:r>
+              <w:t xml:space="preserve">) +</w:t>
+            </w:r>
+            <w:r>
+              <w:t xml:space="preserve"> </w:t>
+            </w:r>
+            <w:r>
+              <w:rPr>
+                <w:rStyle w:val="VerbatimChar"/>
+              </w:rPr>
+              <w:t xml:space="preserve">tools/herald</w:t>
+            </w:r>
+            <w:r>
+              <w:t xml:space="preserve"> </w:t>
+            </w:r>
+            <w:r>
+              <w:t xml:space="preserve">registered as a PROPER submodule @ Herald main</w:t>
+            </w:r>
+            <w:r>
+              <w:t xml:space="preserve"> </w:t>
+            </w:r>
+            <w:r>
+              <w:rPr>
+                <w:rStyle w:val="VerbatimChar"/>
+              </w:rPr>
+              <w:t xml:space="preserve">80cb734</w:t>
+            </w:r>
+            <w:r>
+              <w:t xml:space="preserve"> </w:t>
+            </w:r>
+            <w:r>
+              <w:t xml:space="preserve">replacing the broken orphan gitlink (</w:t>
+            </w:r>
+            <w:r>
+              <w:rPr>
+                <w:rStyle w:val="VerbatimChar"/>
+              </w:rPr>
+              <w:t xml:space="preserve">3368645</w:t>
+            </w:r>
+            <w:r>
+              <w:t xml:space="preserve">) + constitution pointer bumps (</w:t>
+            </w:r>
+            <w:r>
+              <w:rPr>
+                <w:rStyle w:val="VerbatimChar"/>
+              </w:rPr>
+              <w:t xml:space="preserve">ecdec56</w:t>
+            </w:r>
+            <w:r>
+              <w:t xml:space="preserve">/</w:t>
+            </w:r>
+            <w:r>
+              <w:rPr>
+                <w:rStyle w:val="VerbatimChar"/>
+              </w:rPr>
+              <w:t xml:space="preserve">5462a38</w:t>
+            </w:r>
+            <w:r>
+              <w:t xml:space="preserve">) — pushed to github(ATMOSphere1234321)+vasic-digital-mirror (gitlab is a structural split-archive mirror, left to operator split-tooling per §11.4.41). Issues.md r39→r42; HRD-148..158 filed/advanced. Prior r21 (still valid history):**</w:t>
+            </w:r>
+            <w:r>
+              <w:t xml:space="preserve"> </w:t>
+            </w:r>
+            <w:r>
+              <w:rPr>
+                <w:b/>
+                <w:bCs/>
+              </w:rPr>
               <w:t xml:space="preserve">2026-05-29 — Session-resume sweep: constitution sync c640947→3244bf4 + §11.4.100 propagation + 3 cleanup commits (HEAD</w:t>
             </w:r>
             <w:r>
@@ -1210,6 +1613,336 @@
             <w:pPr>
               <w:pStyle w:val="Compact"/>
             </w:pPr>
+            <w:r>
+              <w:rPr>
+                <w:b/>
+                <w:bCs/>
+              </w:rPr>
+              <w:t xml:space="preserve">▶▶ RESUME TOMORROW (2026-05-30) — ATMOSphere integration: LIVE EVIDENCE + DAEMON LAUNCH.</w:t>
+            </w:r>
+            <w:r>
+              <w:t xml:space="preserve"> </w:t>
+            </w:r>
+            <w:r>
+              <w:t xml:space="preserve">STATE: code is DEPLOYED end-to-end (Herald</w:t>
+            </w:r>
+            <w:r>
+              <w:t xml:space="preserve"> </w:t>
+            </w:r>
+            <w:r>
+              <w:rPr>
+                <w:rStyle w:val="VerbatimChar"/>
+              </w:rPr>
+              <w:t xml:space="preserve">2412512</w:t>
+            </w:r>
+            <w:r>
+              <w:t xml:space="preserve"> </w:t>
+            </w:r>
+            <w:r>
+              <w:t xml:space="preserve">/ HelixConstitution</w:t>
+            </w:r>
+            <w:r>
+              <w:t xml:space="preserve"> </w:t>
+            </w:r>
+            <w:r>
+              <w:rPr>
+                <w:rStyle w:val="VerbatimChar"/>
+              </w:rPr>
+              <w:t xml:space="preserve">8ec2b38</w:t>
+            </w:r>
+            <w:r>
+              <w:t xml:space="preserve"> </w:t>
+            </w:r>
+            <w:r>
+              <w:t xml:space="preserve">/ ATMOSphere</w:t>
+            </w:r>
+            <w:r>
+              <w:t xml:space="preserve"> </w:t>
+            </w:r>
+            <w:r>
+              <w:rPr>
+                <w:rStyle w:val="VerbatimChar"/>
+              </w:rPr>
+              <w:t xml:space="preserve">5462a38</w:t>
+            </w:r>
+            <w:r>
+              <w:t xml:space="preserve">); the SQLite SSoT is materialized (58 items at</w:t>
+            </w:r>
+            <w:r>
+              <w:t xml:space="preserve"> </w:t>
+            </w:r>
+            <w:r>
+              <w:rPr>
+                <w:rStyle w:val="VerbatimChar"/>
+              </w:rPr>
+              <w:t xml:space="preserve">docs/workable_items.db</w:t>
+            </w:r>
+            <w:r>
+              <w:t xml:space="preserve"> </w:t>
+            </w:r>
+            <w:r>
+              <w:t xml:space="preserve">on the nezha host</w:t>
+            </w:r>
+            <w:r>
+              <w:t xml:space="preserve"> </w:t>
+            </w:r>
+            <w:r>
+              <w:rPr>
+                <w:rStyle w:val="VerbatimChar"/>
+              </w:rPr>
+              <w:t xml:space="preserve">milosvasic@10.6.100.146:/run/media/milosvasic/DATA4TB/Projects/Android_15</w:t>
+            </w:r>
+            <w:r>
+              <w:t xml:space="preserve">);</w:t>
+            </w:r>
+            <w:r>
+              <w:t xml:space="preserve"> </w:t>
+            </w:r>
+            <w:r>
+              <w:rPr>
+                <w:rStyle w:val="VerbatimChar"/>
+              </w:rPr>
+              <w:t xml:space="preserve">tools/herald</w:t>
+            </w:r>
+            <w:r>
+              <w:t xml:space="preserve"> </w:t>
+            </w:r>
+            <w:r>
+              <w:t xml:space="preserve">submodule is live. Every Herald module + both flows (watch→diff→notify, inbound→CRUD) are hermetically anti-bluff-tested; what's NOT yet proven is the LIVE Telegram round-trip + a running daemon.</w:t>
+            </w:r>
+            <w:r>
+              <w:t xml:space="preserve"> </w:t>
+            </w:r>
+            <w:r>
+              <w:rPr>
+                <w:b/>
+                <w:bCs/>
+              </w:rPr>
+              <w:t xml:space="preserve">NEXT STEPS (dependency-ordered):</w:t>
+            </w:r>
+            <w:r>
+              <w:t xml:space="preserve"> </w:t>
+            </w:r>
+            <w:r>
+              <w:rPr>
+                <w:b/>
+                <w:bCs/>
+              </w:rPr>
+              <w:t xml:space="preserve">(1) HRD-156 LIVE evidence</w:t>
+            </w:r>
+            <w:r>
+              <w:t xml:space="preserve"> </w:t>
+            </w:r>
+            <w:r>
+              <w:t xml:space="preserve">— operator runs</w:t>
+            </w:r>
+            <w:r>
+              <w:t xml:space="preserve"> </w:t>
+            </w:r>
+            <w:r>
+              <w:rPr>
+                <w:rStyle w:val="VerbatimChar"/>
+              </w:rPr>
+              <w:t xml:space="preserve">qaherald mtproto login</w:t>
+            </w:r>
+            <w:r>
+              <w:t xml:space="preserve"> </w:t>
+            </w:r>
+            <w:r>
+              <w:t xml:space="preserve">ONCE (enter the 5-digit Telegram OOB code; the one step Telegram can't automate). Then conductor drives the live tests: mutate the ATMOSphere SSoT → assert a REAL Telegram message reaches a subscriber (T-A); operator message → real SSoT row mutation (T-B); exact per-property-diff payload byte-assert (T-C); §11.4.85 stress/chaos (T-D/T-E); paired §1.1 mutation gate (T-F). Capture under</w:t>
+            </w:r>
+            <w:r>
+              <w:t xml:space="preserve"> </w:t>
+            </w:r>
+            <w:r>
+              <w:rPr>
+                <w:rStyle w:val="VerbatimChar"/>
+              </w:rPr>
+              <w:t xml:space="preserve">docs/qa/HRD-156-LIVE-&lt;TS&gt;/</w:t>
+            </w:r>
+            <w:r>
+              <w:t xml:space="preserve"> </w:t>
+            </w:r>
+            <w:r>
+              <w:t xml:space="preserve">(HRD-133 sanitizer guarantees no token leak), flip the SKIP-with-reason invariants to PASS.</w:t>
+            </w:r>
+            <w:r>
+              <w:t xml:space="preserve"> </w:t>
+            </w:r>
+            <w:r>
+              <w:rPr>
+                <w:b/>
+                <w:bCs/>
+              </w:rPr>
+              <w:t xml:space="preserve">(2) Launch the daemon on the ATMOSphere host</w:t>
+            </w:r>
+            <w:r>
+              <w:t xml:space="preserve"> </w:t>
+            </w:r>
+            <w:r>
+              <w:t xml:space="preserve">—</w:t>
+            </w:r>
+            <w:r>
+              <w:t xml:space="preserve"> </w:t>
+            </w:r>
+            <w:r>
+              <w:rPr>
+                <w:rStyle w:val="VerbatimChar"/>
+              </w:rPr>
+              <w:t xml:space="preserve">pherald watch --db docs/workable_items.db</w:t>
+            </w:r>
+            <w:r>
+              <w:t xml:space="preserve"> </w:t>
+            </w:r>
+            <w:r>
+              <w:t xml:space="preserve">(outbound SSoT→notify) +</w:t>
+            </w:r>
+            <w:r>
+              <w:t xml:space="preserve"> </w:t>
+            </w:r>
+            <w:r>
+              <w:rPr>
+                <w:rStyle w:val="VerbatimChar"/>
+              </w:rPr>
+              <w:t xml:space="preserve">pherald listen --db docs/workable_items.db</w:t>
+            </w:r>
+            <w:r>
+              <w:t xml:space="preserve"> </w:t>
+            </w:r>
+            <w:r>
+              <w:t xml:space="preserve">(inbound→CRUD), wired as a host-side runner mirroring</w:t>
+            </w:r>
+            <w:r>
+              <w:t xml:space="preserve"> </w:t>
+            </w:r>
+            <w:r>
+              <w:rPr>
+                <w:rStyle w:val="VerbatimChar"/>
+              </w:rPr>
+              <w:t xml:space="preserve">tools/oom-protect</w:t>
+            </w:r>
+            <w:r>
+              <w:t xml:space="preserve">'s install pattern; seed Subscribers + the main-group alias.</w:t>
+            </w:r>
+            <w:r>
+              <w:t xml:space="preserve"> </w:t>
+            </w:r>
+            <w:r>
+              <w:rPr>
+                <w:b/>
+                <w:bCs/>
+              </w:rPr>
+              <w:t xml:space="preserve">(3) gitlab ATMOSphere mirror</w:t>
+            </w:r>
+            <w:r>
+              <w:t xml:space="preserve"> </w:t>
+            </w:r>
+            <w:r>
+              <w:t xml:space="preserve">—</w:t>
+            </w:r>
+            <w:r>
+              <w:t xml:space="preserve"> </w:t>
+            </w:r>
+            <w:r>
+              <w:rPr>
+                <w:rStyle w:val="VerbatimChar"/>
+              </w:rPr>
+              <w:t xml:space="preserve">vasic-digital/ATMOSphere-Android-15</w:t>
+            </w:r>
+            <w:r>
+              <w:t xml:space="preserve"> </w:t>
+            </w:r>
+            <w:r>
+              <w:t xml:space="preserve">gitlab is a STRUCTURAL split-archive mirror (1497-commit divergence + a</w:t>
+            </w:r>
+            <w:r>
+              <w:t xml:space="preserve"> </w:t>
+            </w:r>
+            <w:r>
+              <w:rPr>
+                <w:rStyle w:val="VerbatimChar"/>
+              </w:rPr>
+              <w:t xml:space="preserve">Split-archive batch</w:t>
+            </w:r>
+            <w:r>
+              <w:t xml:space="preserve"> </w:t>
+            </w:r>
+            <w:r>
+              <w:t xml:space="preserve">commit) — needs the operator's split-push tooling, NOT a force-push (§11.4.41).</w:t>
+            </w:r>
+            <w:r>
+              <w:t xml:space="preserve"> </w:t>
+            </w:r>
+            <w:r>
+              <w:rPr>
+                <w:b/>
+                <w:bCs/>
+              </w:rPr>
+              <w:t xml:space="preserve">(4) Follow-ups:</w:t>
+            </w:r>
+            <w:r>
+              <w:t xml:space="preserve"> </w:t>
+            </w:r>
+            <w:r>
+              <w:t xml:space="preserve">Fixed.md item-structuring (currently raw-preserved/lossless but 0 structured items — extend the constitution tool's</w:t>
+            </w:r>
+            <w:r>
+              <w:t xml:space="preserve"> </w:t>
+            </w:r>
+            <w:r>
+              <w:rPr>
+                <w:rStyle w:val="VerbatimChar"/>
+              </w:rPr>
+              <w:t xml:space="preserve">parseFixed</w:t>
+            </w:r>
+            <w:r>
+              <w:t xml:space="preserve">); per-submodule QWEN.md leading-clause cascade across the 25 ATMOSphere submodules (the covenant CORE + operative rule are ALREADY everywhere — only the one leading clause; low priority); HRD-150/regenerator productionization; HRD-154 PG-adapter decode of</w:t>
+            </w:r>
+            <w:r>
+              <w:t xml:space="preserve"> </w:t>
+            </w:r>
+            <w:r>
+              <w:rPr>
+                <w:rStyle w:val="VerbatimChar"/>
+              </w:rPr>
+              <w:t xml:space="preserve">subscribers.metadata.preferences</w:t>
+            </w:r>
+            <w:r>
+              <w:t xml:space="preserve"> </w:t>
+            </w:r>
+            <w:r>
+              <w:t xml:space="preserve">(deferred to HRD-156). All integration HRDs (148-158) tracked in</w:t>
+            </w:r>
+            <w:r>
+              <w:t xml:space="preserve"> </w:t>
+            </w:r>
+            <w:r>
+              <w:rPr>
+                <w:rStyle w:val="VerbatimChar"/>
+              </w:rPr>
+              <w:t xml:space="preserve">Issues.md</w:t>
+            </w:r>
+            <w:r>
+              <w:t xml:space="preserve"> </w:t>
+            </w:r>
+            <w:r>
+              <w:t xml:space="preserve">r42; master plan</w:t>
+            </w:r>
+            <w:r>
+              <w:t xml:space="preserve"> </w:t>
+            </w:r>
+            <w:r>
+              <w:rPr>
+                <w:rStyle w:val="VerbatimChar"/>
+              </w:rPr>
+              <w:t xml:space="preserve">~/Documents/ATMOSphere_Herald_Integration_Plan.md</w:t>
+            </w:r>
+            <w:r>
+              <w:t xml:space="preserve">. ──── (prior continuation history below) ────</w:t>
+            </w:r>
+            <w:r>
+              <w:t xml:space="preserve"> </w:t>
+            </w:r>
             <w:r>
               <w:rPr>
                 <w:b/>

</xml_diff>

<commit_message>
docs(CONTINUATION): r22→r23 — HelixQA incorporated as anti-bluff QA SSoT; surface the ~52-HRD closure migration as the v1.0.0 critical path
Records the 2026-05-30 session: HelixQA fully incorporated (both Herald banks execute for real + mutation-proven; 5 anti-bluff bugs fixed in helixqa; CONST-052 snake_case renames; HRD-146 dispatch hardening; §11.4.98 test gating; 8 per-flavor guides; docs-audit corrections). §3 + §4 updated: the next major work is the §11.4.19 atomic Issues→Fixed migration of ~52 code-complete-and-tested HRDs (E90-E96 e2e invariants verified present) — paperwork, not engineering. HEAD 534e785; helixqa 9e0ec3b.

Co-Authored-By: Claude Opus 4.8 <noreply@anthropic.com>
</commit_message>
<xml_diff>
--- a/docs/CONTINUATION.docx
+++ b/docs/CONTINUATION.docx
@@ -75,7 +75,7 @@
               <w:pStyle w:val="Compact"/>
             </w:pPr>
             <w:r>
-              <w:t xml:space="preserve">22</w:t>
+              <w:t xml:space="preserve">23</w:t>
             </w:r>
           </w:p>
         </w:tc>
@@ -3452,6 +3452,148 @@
           <w:b/>
           <w:bCs/>
         </w:rPr>
+        <w:t xml:space="preserve">534e785</w:t>
+      </w:r>
+      <w:r>
+        <w:t xml:space="preserve"> </w:t>
+      </w:r>
+      <w:r>
+        <w:t xml:space="preserve">(2026-05-30) —</w:t>
+      </w:r>
+      <w:r>
+        <w:t xml:space="preserve"> </w:t>
+      </w:r>
+      <w:r>
+        <w:rPr>
+          <w:rStyle w:val="VerbatimChar"/>
+        </w:rPr>
+        <w:t xml:space="preserve">test(§11.4.98): gate/retire 4 NON-COMPLIANT attended tests behind opt-in skips</w:t>
+      </w:r>
+      <w:r>
+        <w:t xml:space="preserve"> </w:t>
+      </w:r>
+      <w:r>
+        <w:t xml:space="preserve">+ (prior, same session) HRD-146 dispatch hardening</w:t>
+      </w:r>
+      <w:r>
+        <w:t xml:space="preserve"> </w:t>
+      </w:r>
+      <w:r>
+        <w:rPr>
+          <w:rStyle w:val="VerbatimChar"/>
+        </w:rPr>
+        <w:t xml:space="preserve">a975d8b</w:t>
+      </w:r>
+      <w:r>
+        <w:t xml:space="preserve">, per-flavor guides</w:t>
+      </w:r>
+      <w:r>
+        <w:t xml:space="preserve"> </w:t>
+      </w:r>
+      <w:r>
+        <w:rPr>
+          <w:rStyle w:val="VerbatimChar"/>
+        </w:rPr>
+        <w:t xml:space="preserve">87878fb</w:t>
+      </w:r>
+      <w:r>
+        <w:t xml:space="preserve">, api-bank wiring</w:t>
+      </w:r>
+      <w:r>
+        <w:t xml:space="preserve"> </w:t>
+      </w:r>
+      <w:r>
+        <w:rPr>
+          <w:rStyle w:val="VerbatimChar"/>
+        </w:rPr>
+        <w:t xml:space="preserve">c80ad81</w:t>
+      </w:r>
+      <w:r>
+        <w:t xml:space="preserve">, docs-audit</w:t>
+      </w:r>
+      <w:r>
+        <w:t xml:space="preserve"> </w:t>
+      </w:r>
+      <w:r>
+        <w:rPr>
+          <w:rStyle w:val="VerbatimChar"/>
+        </w:rPr>
+        <w:t xml:space="preserve">338a896</w:t>
+      </w:r>
+      <w:r>
+        <w:t xml:space="preserve">, stress/chaos</w:t>
+      </w:r>
+      <w:r>
+        <w:t xml:space="preserve"> </w:t>
+      </w:r>
+      <w:r>
+        <w:rPr>
+          <w:rStyle w:val="VerbatimChar"/>
+        </w:rPr>
+        <w:t xml:space="preserve">ee5566f</w:t>
+      </w:r>
+      <w:r>
+        <w:t xml:space="preserve">, CLI-bank shell:</w:t>
+      </w:r>
+      <w:r>
+        <w:t xml:space="preserve"> </w:t>
+      </w:r>
+      <w:r>
+        <w:rPr>
+          <w:rStyle w:val="VerbatimChar"/>
+        </w:rPr>
+        <w:t xml:space="preserve">bce6de7</w:t>
+      </w:r>
+      <w:r>
+        <w:t xml:space="preserve">. The session incorporated HelixQA as Herald's anti-bluff QA SSoT end-to-end (see §3). helixqa pushed to its 3 mirrors at</w:t>
+      </w:r>
+      <w:r>
+        <w:t xml:space="preserve"> </w:t>
+      </w:r>
+      <w:r>
+        <w:rPr>
+          <w:rStyle w:val="VerbatimChar"/>
+        </w:rPr>
+        <w:t xml:space="preserve">9e0ec3b</w:t>
+      </w:r>
+      <w:r>
+        <w:t xml:space="preserve">; HelixConstitution Fixed.md parser at</w:t>
+      </w:r>
+      <w:r>
+        <w:t xml:space="preserve"> </w:t>
+      </w:r>
+      <w:r>
+        <w:rPr>
+          <w:rStyle w:val="VerbatimChar"/>
+        </w:rPr>
+        <w:t xml:space="preserve">9b74f96</w:t>
+      </w:r>
+      <w:r>
+        <w:t xml:space="preserve">.</w:t>
+      </w:r>
+      <w:r>
+        <w:t xml:space="preserve"> </w:t>
+      </w:r>
+      <w:r>
+        <w:rPr>
+          <w:b/>
+          <w:bCs/>
+        </w:rPr>
+        <w:t xml:space="preserve">Prior</w:t>
+      </w:r>
+      <w:r>
+        <w:rPr>
+          <w:b/>
+          <w:bCs/>
+        </w:rPr>
+        <w:t xml:space="preserve"> </w:t>
+      </w:r>
+      <w:r>
+        <w:rPr>
+          <w:rStyle w:val="VerbatimChar"/>
+          <w:b/>
+          <w:bCs/>
+        </w:rPr>
         <w:t xml:space="preserve">873aab4</w:t>
       </w:r>
       <w:r>
@@ -4056,194 +4198,121 @@
           <w:b/>
           <w:bCs/>
         </w:rPr>
-        <w:t xml:space="preserve">Background e2e_bluff_hunt running</w:t>
-      </w:r>
-      <w:r>
-        <w:t xml:space="preserve"> </w:t>
-      </w:r>
-      <w:r>
-        <w:t xml:space="preserve">(</w:t>
-      </w:r>
-      <w:r>
-        <w:rPr>
-          <w:rStyle w:val="VerbatimChar"/>
-        </w:rPr>
-        <w:t xml:space="preserve">qa-results/e2e_bluff_hunt_20260529T0001Z.log</w:t>
-      </w:r>
-      <w:r>
-        <w:t xml:space="preserve">) to validate state post-§11.4.100 propagation + HRD-139..142 migration + 3-test Obsolete graduation.</w:t>
-      </w:r>
-      <w:r>
-        <w:t xml:space="preserve"> </w:t>
-      </w:r>
-      <w:r>
-        <w:rPr>
-          <w:b/>
-          <w:bCs/>
-        </w:rPr>
-        <w:t xml:space="preserve">Push of 873aab4 to all 4 mirrors COMPLETE</w:t>
-      </w:r>
-      <w:r>
-        <w:t xml:space="preserve"> </w:t>
-      </w:r>
-      <w:r>
-        <w:t xml:space="preserve">per §11.4.88 background-push (per-mirror flock, push detached after commit-lock release; all 4 mirrors confirmed at HEAD</w:t>
-      </w:r>
-      <w:r>
-        <w:t xml:space="preserve"> </w:t>
-      </w:r>
-      <w:r>
-        <w:rPr>
-          <w:rStyle w:val="VerbatimChar"/>
-        </w:rPr>
-        <w:t xml:space="preserve">873aab4</w:t>
-      </w:r>
-      <w:r>
-        <w:t xml:space="preserve">).</w:t>
-      </w:r>
-      <w:r>
-        <w:t xml:space="preserve"> </w:t>
-      </w:r>
-      <w:r>
-        <w:rPr>
-          <w:b/>
-          <w:bCs/>
-        </w:rPr>
-        <w:t xml:space="preserve">No other active work in flight.</w:t>
-      </w:r>
-      <w:r>
-        <w:t xml:space="preserve"> </w:t>
-      </w:r>
-      <w:r>
-        <w:t xml:space="preserve">Operator's next-priority pickup options: (a) v1.0.0 Batch C/D/E status confirm — Tasks #195-#212 mark all Batch C+D+Wave-7-T6-T12 complete; the Issues.md</w:t>
-      </w:r>
-      <w:r>
-        <w:t xml:space="preserve"> </w:t>
-      </w:r>
-      <w:r>
-        <w:rPr>
-          <w:rStyle w:val="VerbatimChar"/>
-        </w:rPr>
-        <w:t xml:space="preserve">in_progress</w:t>
-      </w:r>
-      <w:r>
-        <w:t xml:space="preserve"> </w:t>
-      </w:r>
-      <w:r>
-        <w:t xml:space="preserve">HRD-019..025 + HRD-029..056 + HRD-085..090 + HRD-115..121 rows need their Fixed→Obsolete graduation audit per §11.4.90; (b)</w:t>
-      </w:r>
-      <w:r>
-        <w:t xml:space="preserve"> </w:t>
-      </w:r>
-      <w:r>
-        <w:rPr>
-          <w:b/>
-          <w:bCs/>
-        </w:rPr>
-        <w:t xml:space="preserve">DOCS task #147</w:t>
-      </w:r>
-      <w:r>
-        <w:t xml:space="preserve"> </w:t>
-      </w:r>
-      <w:r>
-        <w:t xml:space="preserve">comprehensive documentation audit + per-flavor operator guides (nano-detail per</w:t>
-      </w:r>
-      <w:r>
-        <w:t xml:space="preserve"> </w:t>
-      </w:r>
-      <w:r>
-        <w:rPr>
-          <w:rStyle w:val="VerbatimChar"/>
-        </w:rPr>
-        <w:t xml:space="preserve">feedback_nano_detail_docs</w:t>
-      </w:r>
-      <w:r>
-        <w:t xml:space="preserve"> </w:t>
-      </w:r>
-      <w:r>
-        <w:t xml:space="preserve">memory — blocks v1.0.0 production-ready readiness per</w:t>
-      </w:r>
-      <w:r>
-        <w:t xml:space="preserve"> </w:t>
-      </w:r>
-      <w:r>
-        <w:rPr>
-          <w:rStyle w:val="VerbatimChar"/>
-        </w:rPr>
-        <w:t xml:space="preserve">feedback_production_ready_mandate</w:t>
-      </w:r>
-      <w:r>
-        <w:t xml:space="preserve">); (c)</w:t>
-      </w:r>
-      <w:r>
-        <w:t xml:space="preserve"> </w:t>
-      </w:r>
-      <w:r>
-        <w:rPr>
-          <w:rStyle w:val="VerbatimChar"/>
-        </w:rPr>
-        <w:t xml:space="preserve">feedback_no_concurrent_mutation_gates</w:t>
-      </w:r>
-      <w:r>
-        <w:t xml:space="preserve"> </w:t>
-      </w:r>
-      <w:r>
-        <w:t xml:space="preserve">is ENFORCED via</w:t>
-      </w:r>
-      <w:r>
-        <w:t xml:space="preserve"> </w:t>
-      </w:r>
-      <w:r>
-        <w:rPr>
-          <w:rStyle w:val="VerbatimChar"/>
-        </w:rPr>
-        <w:t xml:space="preserve">scripts/mutation_residue_audit.sh</w:t>
-      </w:r>
-      <w:r>
-        <w:t xml:space="preserve"> </w:t>
-      </w:r>
-      <w:r>
-        <w:t xml:space="preserve">+</w:t>
-      </w:r>
-      <w:r>
-        <w:t xml:space="preserve"> </w:t>
-      </w:r>
-      <w:r>
-        <w:rPr>
-          <w:rStyle w:val="VerbatimChar"/>
-        </w:rPr>
-        <w:t xml:space="preserve">.git/MUTATION_IN_PROGRESS</w:t>
-      </w:r>
-      <w:r>
-        <w:t xml:space="preserve"> </w:t>
-      </w:r>
-      <w:r>
-        <w:t xml:space="preserve">lockfile + check_quiescence() — no carryover; (d) MTProto creds remain in</w:t>
-      </w:r>
-      <w:r>
-        <w:t xml:space="preserve"> </w:t>
-      </w:r>
-      <w:r>
-        <w:rPr>
-          <w:rStyle w:val="VerbatimChar"/>
-        </w:rPr>
-        <w:t xml:space="preserve">.env</w:t>
-      </w:r>
-      <w:r>
-        <w:t xml:space="preserve"> </w:t>
-      </w:r>
-      <w:r>
-        <w:t xml:space="preserve">+ session cached for next-session reuse; (e) HRD-131 §11.4.93 SQLite SSoT remains OPEN-deferred (constitution-repo migration binary still unimplemented per the §11.4.74 catalogue-first constraint).</w:t>
-      </w:r>
-    </w:p>
-    <w:bookmarkEnd w:id="13"/>
-    <w:bookmarkStart w:id="14" w:name="Xe0231d32a69d17d31f75951dcaa7beff2defc28"/>
-    <w:p>
-      <w:pPr>
-        <w:pStyle w:val="Heading2"/>
-      </w:pPr>
-      <w:r>
-        <w:t xml:space="preserve">§4. Next concrete steps</w:t>
+        <w:t xml:space="preserve">2026-05-30 — HelixQA incorporated as Herald's anti-bluff QA SSoT (COMPLETE, real-evidence-proven). Nothing in flight.</w:t>
+      </w:r>
+      <w:r>
+        <w:t xml:space="preserve"> </w:t>
+      </w:r>
+      <w:r>
+        <w:t xml:space="preserve">HelixQA (</w:t>
+      </w:r>
+      <w:r>
+        <w:rPr>
+          <w:rStyle w:val="VerbatimChar"/>
+        </w:rPr>
+        <w:t xml:space="preserve">git@github.com:HelixDevelopment/helixqa.git</w:t>
+      </w:r>
+      <w:r>
+        <w:t xml:space="preserve">) is a sibling repo at</w:t>
+      </w:r>
+      <w:r>
+        <w:t xml:space="preserve"> </w:t>
+      </w:r>
+      <w:r>
+        <w:rPr>
+          <w:rStyle w:val="VerbatimChar"/>
+        </w:rPr>
+        <w:t xml:space="preserve">~/Projects/helixqa</w:t>
+      </w:r>
+      <w:r>
+        <w:t xml:space="preserve"> </w:t>
+      </w:r>
+      <w:r>
+        <w:t xml:space="preserve">(CONST-051 flat layout) with all 7 own-org deps at</w:t>
+      </w:r>
+      <w:r>
+        <w:t xml:space="preserve"> </w:t>
+      </w:r>
+      <w:r>
+        <w:rPr>
+          <w:rStyle w:val="VerbatimChar"/>
+        </w:rPr>
+        <w:t xml:space="preserve">~/Projects/</w:t>
+      </w:r>
+      <w:r>
+        <w:t xml:space="preserve"> </w:t>
+      </w:r>
+      <w:r>
+        <w:t xml:space="preserve">(snake_case per CONST-052, operator-approved). Herald drives it via</w:t>
+      </w:r>
+      <w:r>
+        <w:t xml:space="preserve"> </w:t>
+      </w:r>
+      <w:r>
+        <w:rPr>
+          <w:rStyle w:val="VerbatimChar"/>
+        </w:rPr>
+        <w:t xml:space="preserve">scripts/helixqa_run.sh</w:t>
+      </w:r>
+      <w:r>
+        <w:t xml:space="preserve"> </w:t>
+      </w:r>
+      <w:r>
+        <w:t xml:space="preserve">+ banks under</w:t>
+      </w:r>
+      <w:r>
+        <w:t xml:space="preserve"> </w:t>
+      </w:r>
+      <w:r>
+        <w:rPr>
+          <w:rStyle w:val="VerbatimChar"/>
+        </w:rPr>
+        <w:t xml:space="preserve">challenges/helixqa-banks/</w:t>
+      </w:r>
+      <w:r>
+        <w:t xml:space="preserve">. Delivered this session (Herald</w:t>
+      </w:r>
+      <w:r>
+        <w:t xml:space="preserve"> </w:t>
+      </w:r>
+      <w:r>
+        <w:rPr>
+          <w:rStyle w:val="VerbatimChar"/>
+        </w:rPr>
+        <w:t xml:space="preserve">e36929a</w:t>
+      </w:r>
+      <w:r>
+        <w:t xml:space="preserve">→</w:t>
+      </w:r>
+      <w:r>
+        <w:rPr>
+          <w:rStyle w:val="VerbatimChar"/>
+        </w:rPr>
+        <w:t xml:space="preserve">534e785</w:t>
+      </w:r>
+      <w:r>
+        <w:t xml:space="preserve">, helixqa</w:t>
+      </w:r>
+      <w:r>
+        <w:t xml:space="preserve"> </w:t>
+      </w:r>
+      <w:r>
+        <w:rPr>
+          <w:rStyle w:val="VerbatimChar"/>
+        </w:rPr>
+        <w:t xml:space="preserve">c0b2757</w:t>
+      </w:r>
+      <w:r>
+        <w:t xml:space="preserve">→</w:t>
+      </w:r>
+      <w:r>
+        <w:rPr>
+          <w:rStyle w:val="VerbatimChar"/>
+        </w:rPr>
+        <w:t xml:space="preserve">9e0ec3b</w:t>
+      </w:r>
+      <w:r>
+        <w:t xml:space="preserve">, all pushed):</w:t>
       </w:r>
     </w:p>
     <w:p>
@@ -4259,52 +4328,91 @@
           <w:b/>
           <w:bCs/>
         </w:rPr>
-        <w:t xml:space="preserve">Live evidence — Telegram + Claude Code closed-loop</w:t>
-      </w:r>
-      <w:r>
-        <w:t xml:space="preserve"> </w:t>
-      </w:r>
-      <w:r>
-        <w:t xml:space="preserve">(gated on operator export). Drive</w:t>
-      </w:r>
-      <w:r>
-        <w:t xml:space="preserve"> </w:t>
-      </w:r>
-      <w:r>
-        <w:rPr>
-          <w:rStyle w:val="VerbatimChar"/>
-        </w:rPr>
-        <w:t xml:space="preserve">tests/test_wave6_live_loop.sh</w:t>
-      </w:r>
-      <w:r>
-        <w:t xml:space="preserve"> </w:t>
-      </w:r>
-      <w:r>
-        <w:t xml:space="preserve">end-to-end with real bot + chat. Capture transcript under</w:t>
-      </w:r>
-      <w:r>
-        <w:t xml:space="preserve"> </w:t>
-      </w:r>
-      <w:r>
-        <w:rPr>
-          <w:rStyle w:val="VerbatimChar"/>
-        </w:rPr>
-        <w:t xml:space="preserve">docs/qa/HRD-100-LIVE-20260528-&lt;TS&gt;/</w:t>
-      </w:r>
-      <w:r>
-        <w:t xml:space="preserve">. Flip E17/E18/E34/E63-E70 SKIP→PASS in</w:t>
-      </w:r>
-      <w:r>
-        <w:t xml:space="preserve"> </w:t>
-      </w:r>
-      <w:r>
-        <w:rPr>
-          <w:rStyle w:val="VerbatimChar"/>
-        </w:rPr>
-        <w:t xml:space="preserve">scripts/e2e_bluff_hunt.sh</w:t>
-      </w:r>
-      <w:r>
-        <w:t xml:space="preserve">. Per §107.x: ALL live evidence lands with the HRD-133 sanitizer guarantee (no token text in any committed transcript/log).</w:t>
+        <w:t xml:space="preserve">Both Herald banks genuinely execute, mutation-proven</w:t>
+      </w:r>
+      <w:r>
+        <w:t xml:space="preserve"> </w:t>
+      </w:r>
+      <w:r>
+        <w:t xml:space="preserve">— CLI bank (10 cases, 8 flavor binaries) + api bank (11</w:t>
+      </w:r>
+      <w:r>
+        <w:t xml:space="preserve"> </w:t>
+      </w:r>
+      <w:r>
+        <w:rPr>
+          <w:rStyle w:val="VerbatimChar"/>
+        </w:rPr>
+        <w:t xml:space="preserve">/v1/*</w:t>
+      </w:r>
+      <w:r>
+        <w:t xml:space="preserve"> </w:t>
+      </w:r>
+      <w:r>
+        <w:t xml:space="preserve">cases) rewritten to self-asserting</w:t>
+      </w:r>
+      <w:r>
+        <w:t xml:space="preserve"> </w:t>
+      </w:r>
+      <w:r>
+        <w:rPr>
+          <w:rStyle w:val="VerbatimChar"/>
+        </w:rPr>
+        <w:t xml:space="preserve">shell:</w:t>
+      </w:r>
+      <w:r>
+        <w:t xml:space="preserve">/</w:t>
+      </w:r>
+      <w:r>
+        <w:rPr>
+          <w:rStyle w:val="VerbatimChar"/>
+        </w:rPr>
+        <w:t xml:space="preserve">curl</w:t>
+      </w:r>
+      <w:r>
+        <w:t xml:space="preserve"> </w:t>
+      </w:r>
+      <w:r>
+        <w:t xml:space="preserve">actions (HelixQA</w:t>
+      </w:r>
+      <w:r>
+        <w:t xml:space="preserve"> </w:t>
+      </w:r>
+      <w:r>
+        <w:rPr>
+          <w:rStyle w:val="VerbatimChar"/>
+        </w:rPr>
+        <w:t xml:space="preserve">run</w:t>
+      </w:r>
+      <w:r>
+        <w:t xml:space="preserve"> </w:t>
+      </w:r>
+      <w:r>
+        <w:t xml:space="preserve">executes shell: on the desktop path; assertions bite — corrupting one flips PASSED→FAILED). Evidence:</w:t>
+      </w:r>
+      <w:r>
+        <w:t xml:space="preserve"> </w:t>
+      </w:r>
+      <w:r>
+        <w:rPr>
+          <w:rStyle w:val="VerbatimChar"/>
+        </w:rPr>
+        <w:t xml:space="preserve">docs/qa/HRD-QA-CLI-FLAVORS-*/</w:t>
+      </w:r>
+      <w:r>
+        <w:t xml:space="preserve">,</w:t>
+      </w:r>
+      <w:r>
+        <w:t xml:space="preserve"> </w:t>
+      </w:r>
+      <w:r>
+        <w:rPr>
+          <w:rStyle w:val="VerbatimChar"/>
+        </w:rPr>
+        <w:t xml:space="preserve">docs/qa/HRD-API-BANK-WIRING-*/</w:t>
+      </w:r>
+      <w:r>
+        <w:t xml:space="preserve">.</w:t>
       </w:r>
     </w:p>
     <w:p>
@@ -4320,25 +4428,58 @@
           <w:b/>
           <w:bCs/>
         </w:rPr>
-        <w:t xml:space="preserve">Live evidence — Wave 6.5 ticket lifecycle</w:t>
-      </w:r>
-      <w:r>
-        <w:t xml:space="preserve"> </w:t>
-      </w:r>
-      <w:r>
-        <w:t xml:space="preserve">(same credentials). Drive the qaherald lifecycle scenarios against the real bot. Capture under</w:t>
-      </w:r>
-      <w:r>
-        <w:t xml:space="preserve"> </w:t>
-      </w:r>
-      <w:r>
-        <w:rPr>
-          <w:rStyle w:val="VerbatimChar"/>
-        </w:rPr>
-        <w:t xml:space="preserve">docs/qa/HRD-NNN-LIVE-W6.5-&lt;TS&gt;/</w:t>
-      </w:r>
-      <w:r>
-        <w:t xml:space="preserve">. Flip E71-E80 SKIP→PASS.</w:t>
+        <w:t xml:space="preserve">5 real anti-bluff bugs found + fixed in helixqa</w:t>
+      </w:r>
+      <w:r>
+        <w:t xml:space="preserve"> </w:t>
+      </w:r>
+      <w:r>
+        <w:t xml:space="preserve">(it's the org-wide SSoT): i18n printf echo; desktop crash-absence promotion bluff (+ generalized to all platforms — a SKIP with any unrun asserting step is never promoted); §107.x captured-evidence reporter (qa-report.md now carries the real command + exit code); autonomous executor</w:t>
+      </w:r>
+      <w:r>
+        <w:t xml:space="preserve"> </w:t>
+      </w:r>
+      <w:r>
+        <w:rPr>
+          <w:rStyle w:val="VerbatimChar"/>
+        </w:rPr>
+        <w:t xml:space="preserve">shell:</w:t>
+      </w:r>
+      <w:r>
+        <w:t xml:space="preserve"> </w:t>
+      </w:r>
+      <w:r>
+        <w:t xml:space="preserve">wiring (was filing false-negative tickets); dead</w:t>
+      </w:r>
+      <w:r>
+        <w:t xml:space="preserve"> </w:t>
+      </w:r>
+      <w:r>
+        <w:rPr>
+          <w:rStyle w:val="VerbatimChar"/>
+        </w:rPr>
+        <w:t xml:space="preserve">swipe:</w:t>
+      </w:r>
+      <w:r>
+        <w:t xml:space="preserve"> </w:t>
+      </w:r>
+      <w:r>
+        <w:t xml:space="preserve">action +</w:t>
+      </w:r>
+      <w:r>
+        <w:t xml:space="preserve"> </w:t>
+      </w:r>
+      <w:r>
+        <w:rPr>
+          <w:rStyle w:val="VerbatimChar"/>
+        </w:rPr>
+        <w:t xml:space="preserve">description:</w:t>
+      </w:r>
+      <w:r>
+        <w:t xml:space="preserve"> </w:t>
+      </w:r>
+      <w:r>
+        <w:t xml:space="preserve">verdict divergence.</w:t>
       </w:r>
     </w:p>
     <w:p>
@@ -4354,13 +4495,58 @@
           <w:b/>
           <w:bCs/>
         </w:rPr>
-        <w:t xml:space="preserve">Tag v0.6.0</w:t>
-      </w:r>
-      <w:r>
-        <w:t xml:space="preserve"> </w:t>
-      </w:r>
-      <w:r>
-        <w:t xml:space="preserve">(after E17-E80 live evidence + Slack live operator-provided OR explicit operator deferral). Wave 7 T6-T12 close at the same boundary; HRD-115..121 Issues→Fixed.</w:t>
+        <w:t xml:space="preserve">LLM/Vision bridge</w:t>
+      </w:r>
+      <w:r>
+        <w:t xml:space="preserve"> </w:t>
+      </w:r>
+      <w:r>
+        <w:t xml:space="preserve">= HelixQA's existing</w:t>
+      </w:r>
+      <w:r>
+        <w:t xml:space="preserve"> </w:t>
+      </w:r>
+      <w:r>
+        <w:rPr>
+          <w:rStyle w:val="VerbatimChar"/>
+        </w:rPr>
+        <w:t xml:space="preserve">BridgedCLIProvider</w:t>
+      </w:r>
+      <w:r>
+        <w:t xml:space="preserve"> </w:t>
+      </w:r>
+      <w:r>
+        <w:t xml:space="preserve">(auto-discovers</w:t>
+      </w:r>
+      <w:r>
+        <w:t xml:space="preserve"> </w:t>
+      </w:r>
+      <w:r>
+        <w:rPr>
+          <w:rStyle w:val="VerbatimChar"/>
+        </w:rPr>
+        <w:t xml:space="preserve">claude</w:t>
+      </w:r>
+      <w:r>
+        <w:t xml:space="preserve"> </w:t>
+      </w:r>
+      <w:r>
+        <w:t xml:space="preserve">on PATH) — zero new bridge code;</w:t>
+      </w:r>
+      <w:r>
+        <w:t xml:space="preserve"> </w:t>
+      </w:r>
+      <w:r>
+        <w:rPr>
+          <w:rStyle w:val="VerbatimChar"/>
+        </w:rPr>
+        <w:t xml:space="preserve">helixqa autonomous</w:t>
+      </w:r>
+      <w:r>
+        <w:t xml:space="preserve"> </w:t>
+      </w:r>
+      <w:r>
+        <w:t xml:space="preserve">runs end-to-end with it ($0 free providers).</w:t>
       </w:r>
     </w:p>
     <w:p>
@@ -4376,90 +4562,187 @@
           <w:b/>
           <w:bCs/>
         </w:rPr>
-        <w:t xml:space="preserve">Tag v0.7.0 / v1.0.0-dev-NN cadence</w:t>
-      </w:r>
-      <w:r>
-        <w:t xml:space="preserve"> </w:t>
-      </w:r>
-      <w:r>
-        <w:t xml:space="preserve">— operator-provided live credentials unblock the v0.6→v1.0 chain (mirrors the v0.4.0 / v0.5.0 deferred-until-live-evidence pattern).</w:t>
+        <w:t xml:space="preserve">Herald-side hardening landed alongside:</w:t>
+      </w:r>
+      <w:r>
+        <w:t xml:space="preserve"> </w:t>
+      </w:r>
+      <w:r>
+        <w:t xml:space="preserve">§11.4.85 stress/chaos for commons_workable + Notifier (</w:t>
+      </w:r>
+      <w:r>
+        <w:rPr>
+          <w:rStyle w:val="VerbatimChar"/>
+        </w:rPr>
+        <w:t xml:space="preserve">ee5566f</w:t>
+      </w:r>
+      <w:r>
+        <w:t xml:space="preserve">); §11.4.98 full-automation — 4 attended tests gated behind opt-in, MTProto replacements confirmed (</w:t>
+      </w:r>
+      <w:r>
+        <w:rPr>
+          <w:rStyle w:val="VerbatimChar"/>
+        </w:rPr>
+        <w:t xml:space="preserve">534e785</w:t>
+      </w:r>
+      <w:r>
+        <w:t xml:space="preserve">);</w:t>
+      </w:r>
+      <w:r>
+        <w:t xml:space="preserve"> </w:t>
+      </w:r>
+      <w:r>
+        <w:rPr>
+          <w:b/>
+          <w:bCs/>
+        </w:rPr>
+        <w:t xml:space="preserve">HRD-146 dispatch hardening</w:t>
+      </w:r>
+      <w:r>
+        <w:t xml:space="preserve"> </w:t>
+      </w:r>
+      <w:r>
+        <w:t xml:space="preserve">— 120s timeout + process-group kill on the claude_code dispatcher (real 30s-shim killed in 702ms); 8 per-flavor operator guides + §11.4.99 footers (</w:t>
+      </w:r>
+      <w:r>
+        <w:rPr>
+          <w:rStyle w:val="VerbatimChar"/>
+        </w:rPr>
+        <w:t xml:space="preserve">87878fb</w:t>
+      </w:r>
+      <w:r>
+        <w:t xml:space="preserve">); docs-audit corrections (module/flavor/migration counts → 18/8/000014, honest DB-materialization status —</w:t>
+      </w:r>
+      <w:r>
+        <w:t xml:space="preserve"> </w:t>
+      </w:r>
+      <w:r>
+        <w:rPr>
+          <w:rStyle w:val="VerbatimChar"/>
+        </w:rPr>
+        <w:t xml:space="preserve">338a896</w:t>
+      </w:r>
+      <w:r>
+        <w:t xml:space="preserve">).</w:t>
       </w:r>
     </w:p>
     <w:p>
       <w:pPr>
-        <w:pStyle w:val="Compact"/>
-        <w:numPr>
-          <w:ilvl w:val="0"/>
-          <w:numId w:val="1003"/>
-        </w:numPr>
+        <w:pStyle w:val="FirstParagraph"/>
       </w:pPr>
       <w:r>
         <w:rPr>
           <w:b/>
           <w:bCs/>
         </w:rPr>
-        <w:t xml:space="preserve">Deferred / gated items:</w:t>
-      </w:r>
-      <w:r>
-        <w:t xml:space="preserve"> </w:t>
-      </w:r>
-      <w:r>
-        <w:t xml:space="preserve">§11.4.93 SQLite SSoT (HRD-131, constitution-repo task), MTProto real-channel automation (operator decision), Wave 8 supervised channel restart (currently fail-loud-tears-down-siblings per</w:t>
-      </w:r>
-      <w:r>
-        <w:t xml:space="preserve"> </w:t>
-      </w:r>
-      <w:r>
-        <w:rPr>
-          <w:rStyle w:val="VerbatimChar"/>
-        </w:rPr>
-        <w:t xml:space="preserve">pherald/cmd/pherald/listen.go:387-398</w:t>
-      </w:r>
-      <w:r>
-        <w:t xml:space="preserve"> </w:t>
-      </w:r>
-      <w:r>
-        <w:t xml:space="preserve">doc-comment), docs audit task #147 (comprehensive per-flavor operator guides).</w:t>
-      </w:r>
-    </w:p>
-    <w:bookmarkEnd w:id="14"/>
-    <w:bookmarkStart w:id="15" w:name="Xaef6f4bf8948401e7913347ad62a96c9e4cace3"/>
-    <w:p>
-      <w:pPr>
-        <w:pStyle w:val="Heading2"/>
-      </w:pPr>
-      <w:r>
-        <w:t xml:space="preserve">§4a. Wave 6 live-test handoff (T10b — gating tag v0.4.0)</w:t>
+        <w:t xml:space="preserve">Cross-repo also landed:</w:t>
+      </w:r>
+      <w:r>
+        <w:t xml:space="preserve"> </w:t>
+      </w:r>
+      <w:r>
+        <w:t xml:space="preserve">HelixConstitution Fixed.md tracker parser (</w:t>
+      </w:r>
+      <w:r>
+        <w:rPr>
+          <w:rStyle w:val="VerbatimChar"/>
+        </w:rPr>
+        <w:t xml:space="preserve">9b74f96</w:t>
+      </w:r>
+      <w:r>
+        <w:t xml:space="preserve">, 4 mirrors); ATMOSphere constitution pointer bump (</w:t>
+      </w:r>
+      <w:r>
+        <w:rPr>
+          <w:rStyle w:val="VerbatimChar"/>
+        </w:rPr>
+        <w:t xml:space="preserve">643b36c</w:t>
+      </w:r>
+      <w:r>
+        <w:t xml:space="preserve">); HRD-158 QWEN anti-bluff-clause cascade reconciled across 18/19 ATMOSphere submodule repos; codegraph re-indexed (5042 files, validator 7/0).</w:t>
       </w:r>
     </w:p>
     <w:p>
       <w:pPr>
-        <w:pStyle w:val="FirstParagraph"/>
+        <w:pStyle w:val="BodyText"/>
       </w:pPr>
       <w:r>
         <w:rPr>
           <w:b/>
           <w:bCs/>
         </w:rPr>
-        <w:t xml:space="preserve">Operator-supplied credentials required</w:t>
-      </w:r>
-      <w:r>
-        <w:t xml:space="preserve"> </w:t>
-      </w:r>
-      <w:r>
-        <w:t xml:space="preserve">— Wave 6's e2e invariants E63-E70 land as honest SKIPs until the live closed-loop runs against real Telegram + real Claude Code with real chat messages exchanged.</w:t>
-      </w:r>
-    </w:p>
-    <w:p>
-      <w:pPr>
-        <w:pStyle w:val="BodyText"/>
-      </w:pPr>
+        <w:t xml:space="preserve">Remaining (next session):</w:t>
+      </w:r>
+      <w:r>
+        <w:t xml:space="preserve"> </w:t>
+      </w:r>
+      <w:r>
+        <w:t xml:space="preserve">(a) the</w:t>
+      </w:r>
+      <w:r>
+        <w:t xml:space="preserve"> </w:t>
+      </w:r>
       <w:r>
         <w:rPr>
           <w:b/>
           <w:bCs/>
         </w:rPr>
-        <w:t xml:space="preserve">Step-by-step.</w:t>
+        <w:t xml:space="preserve">~52-HRD Issues→Fixed closure migration</w:t>
+      </w:r>
+      <w:r>
+        <w:t xml:space="preserve"> </w:t>
+      </w:r>
+      <w:r>
+        <w:t xml:space="preserve">— the production-readiness map (a read-only audit this session) found ~52 HRDs are code-complete + tested + evidence-backed (E90-E96 e2e invariants VERIFIED present) but stuck in</w:t>
+      </w:r>
+      <w:r>
+        <w:t xml:space="preserve"> </w:t>
+      </w:r>
+      <w:r>
+        <w:rPr>
+          <w:rStyle w:val="VerbatimChar"/>
+        </w:rPr>
+        <w:t xml:space="preserve">open</w:t>
+      </w:r>
+      <w:r>
+        <w:t xml:space="preserve">/</w:t>
+      </w:r>
+      <w:r>
+        <w:rPr>
+          <w:rStyle w:val="VerbatimChar"/>
+        </w:rPr>
+        <w:t xml:space="preserve">in_progress</w:t>
+      </w:r>
+      <w:r>
+        <w:t xml:space="preserve"> </w:t>
+      </w:r>
+      <w:r>
+        <w:t xml:space="preserve">because the §11.4.19 atomic migration was never run; this is the v1.0.0 critical path and it is paperwork, not engineering; (b) HRD-147 (governance dead_letter subscriber — genuinely not-started, needs design); (c) the 1 skipped QWEN repo</w:t>
+      </w:r>
+      <w:r>
+        <w:t xml:space="preserve"> </w:t>
+      </w:r>
+      <w:r>
+        <w:rPr>
+          <w:rStyle w:val="VerbatimChar"/>
+        </w:rPr>
+        <w:t xml:space="preserve">tools/helixqa/HelixQA</w:t>
+      </w:r>
+      <w:r>
+        <w:t xml:space="preserve"> </w:t>
+      </w:r>
+      <w:r>
+        <w:t xml:space="preserve">(has an unrelated 2nd commit — operator decision); (d) CONST-052 REMOTE GitHub repo renames (deferred — cross-org, GitHub redirect); (e) HRD-131 §11.4.93 SQLite SSoT (constitution-repo binary still unimplemented).</w:t>
+      </w:r>
+    </w:p>
+    <w:bookmarkEnd w:id="13"/>
+    <w:bookmarkStart w:id="14" w:name="Xe0231d32a69d17d31f75951dcaa7beff2defc28"/>
+    <w:p>
+      <w:pPr>
+        <w:pStyle w:val="Heading2"/>
+      </w:pPr>
+      <w:r>
+        <w:t xml:space="preserve">§4. Next concrete steps</w:t>
       </w:r>
     </w:p>
     <w:p>
@@ -4471,6 +4754,280 @@
         </w:numPr>
       </w:pPr>
       <w:r>
+        <w:rPr>
+          <w:b/>
+          <w:bCs/>
+        </w:rPr>
+        <w:t xml:space="preserve">▶ v1.0.0 critical path — the ~52-HRD Issues→Fixed closure migration (paperwork, not engineering).</w:t>
+      </w:r>
+      <w:r>
+        <w:t xml:space="preserve"> </w:t>
+      </w:r>
+      <w:r>
+        <w:t xml:space="preserve">A read-only production-readiness audit (2026-05-30) found ~52 HRDs are code-complete, tested, and evidence-backed but sitting in</w:t>
+      </w:r>
+      <w:r>
+        <w:t xml:space="preserve"> </w:t>
+      </w:r>
+      <w:r>
+        <w:rPr>
+          <w:rStyle w:val="VerbatimChar"/>
+        </w:rPr>
+        <w:t xml:space="preserve">open</w:t>
+      </w:r>
+      <w:r>
+        <w:t xml:space="preserve">/</w:t>
+      </w:r>
+      <w:r>
+        <w:rPr>
+          <w:rStyle w:val="VerbatimChar"/>
+        </w:rPr>
+        <w:t xml:space="preserve">in_progress</w:t>
+      </w:r>
+      <w:r>
+        <w:t xml:space="preserve"> </w:t>
+      </w:r>
+      <w:r>
+        <w:t xml:space="preserve">because the §11.4.19 atomic migration was never run. The "after Telegram works" gate (HRD-156) is ALREADY live-proven, and the §43 binding e2e invariants E90-E96 are VERIFIED present in</w:t>
+      </w:r>
+      <w:r>
+        <w:t xml:space="preserve"> </w:t>
+      </w:r>
+      <w:r>
+        <w:rPr>
+          <w:rStyle w:val="VerbatimChar"/>
+        </w:rPr>
+        <w:t xml:space="preserve">scripts/e2e_bluff_hunt.sh</w:t>
+      </w:r>
+      <w:r>
+        <w:t xml:space="preserve">. Work: per closeable HRD, atomically move its entry Issues.md→Fixed.md, bump the revision metadata, regen siblings. Closeable-now (no operator): HRD-019..025 (flavor bindings, E90-E96), HRD-029..056 (§43 commands), HRD-085..089 (pgx repo ops), HRD-116/118/119/120/121, HRD-148/149/151/152/153/154 (ATMOSphere WS — table is stale vs the r42 header which already says "landed"), HRD-146 (now hardened+tested this session). Anti-bluff: verify each HRD's real test/qa evidence before migrating (don't trust the self-reported status). Genuinely not-done (skip): HRD-147 (dead_letter subscriber, needs design). Externally-gated (skip): HRD-115-live/157/150/155/131/158/008/081.</w:t>
+      </w:r>
+    </w:p>
+    <w:p>
+      <w:pPr>
+        <w:pStyle w:val="Compact"/>
+        <w:numPr>
+          <w:ilvl w:val="0"/>
+          <w:numId w:val="1004"/>
+        </w:numPr>
+      </w:pPr>
+      <w:r>
+        <w:rPr>
+          <w:b/>
+          <w:bCs/>
+        </w:rPr>
+        <w:t xml:space="preserve">Live evidence — Telegram + Claude Code closed-loop</w:t>
+      </w:r>
+      <w:r>
+        <w:t xml:space="preserve"> </w:t>
+      </w:r>
+      <w:r>
+        <w:t xml:space="preserve">(gated on operator export). Drive</w:t>
+      </w:r>
+      <w:r>
+        <w:t xml:space="preserve"> </w:t>
+      </w:r>
+      <w:r>
+        <w:rPr>
+          <w:rStyle w:val="VerbatimChar"/>
+        </w:rPr>
+        <w:t xml:space="preserve">tests/test_wave6_live_loop.sh</w:t>
+      </w:r>
+      <w:r>
+        <w:t xml:space="preserve"> </w:t>
+      </w:r>
+      <w:r>
+        <w:t xml:space="preserve">end-to-end with real bot + chat. Capture transcript under</w:t>
+      </w:r>
+      <w:r>
+        <w:t xml:space="preserve"> </w:t>
+      </w:r>
+      <w:r>
+        <w:rPr>
+          <w:rStyle w:val="VerbatimChar"/>
+        </w:rPr>
+        <w:t xml:space="preserve">docs/qa/HRD-100-LIVE-20260528-&lt;TS&gt;/</w:t>
+      </w:r>
+      <w:r>
+        <w:t xml:space="preserve">. Flip E17/E18/E34/E63-E70 SKIP→PASS in</w:t>
+      </w:r>
+      <w:r>
+        <w:t xml:space="preserve"> </w:t>
+      </w:r>
+      <w:r>
+        <w:rPr>
+          <w:rStyle w:val="VerbatimChar"/>
+        </w:rPr>
+        <w:t xml:space="preserve">scripts/e2e_bluff_hunt.sh</w:t>
+      </w:r>
+      <w:r>
+        <w:t xml:space="preserve">. Per §107.x: ALL live evidence lands with the HRD-133 sanitizer guarantee (no token text in any committed transcript/log).</w:t>
+      </w:r>
+    </w:p>
+    <w:p>
+      <w:pPr>
+        <w:pStyle w:val="Compact"/>
+        <w:numPr>
+          <w:ilvl w:val="0"/>
+          <w:numId w:val="1004"/>
+        </w:numPr>
+      </w:pPr>
+      <w:r>
+        <w:rPr>
+          <w:b/>
+          <w:bCs/>
+        </w:rPr>
+        <w:t xml:space="preserve">Live evidence — Wave 6.5 ticket lifecycle</w:t>
+      </w:r>
+      <w:r>
+        <w:t xml:space="preserve"> </w:t>
+      </w:r>
+      <w:r>
+        <w:t xml:space="preserve">(same credentials). Drive the qaherald lifecycle scenarios against the real bot. Capture under</w:t>
+      </w:r>
+      <w:r>
+        <w:t xml:space="preserve"> </w:t>
+      </w:r>
+      <w:r>
+        <w:rPr>
+          <w:rStyle w:val="VerbatimChar"/>
+        </w:rPr>
+        <w:t xml:space="preserve">docs/qa/HRD-NNN-LIVE-W6.5-&lt;TS&gt;/</w:t>
+      </w:r>
+      <w:r>
+        <w:t xml:space="preserve">. Flip E71-E80 SKIP→PASS.</w:t>
+      </w:r>
+    </w:p>
+    <w:p>
+      <w:pPr>
+        <w:pStyle w:val="Compact"/>
+        <w:numPr>
+          <w:ilvl w:val="0"/>
+          <w:numId w:val="1004"/>
+        </w:numPr>
+      </w:pPr>
+      <w:r>
+        <w:rPr>
+          <w:b/>
+          <w:bCs/>
+        </w:rPr>
+        <w:t xml:space="preserve">Tag v0.6.0</w:t>
+      </w:r>
+      <w:r>
+        <w:t xml:space="preserve"> </w:t>
+      </w:r>
+      <w:r>
+        <w:t xml:space="preserve">(after E17-E80 live evidence + Slack live operator-provided OR explicit operator deferral). Wave 7 T6-T12 close at the same boundary; HRD-115..121 Issues→Fixed.</w:t>
+      </w:r>
+    </w:p>
+    <w:p>
+      <w:pPr>
+        <w:pStyle w:val="Compact"/>
+        <w:numPr>
+          <w:ilvl w:val="0"/>
+          <w:numId w:val="1004"/>
+        </w:numPr>
+      </w:pPr>
+      <w:r>
+        <w:rPr>
+          <w:b/>
+          <w:bCs/>
+        </w:rPr>
+        <w:t xml:space="preserve">Tag v0.7.0 / v1.0.0-dev-NN cadence</w:t>
+      </w:r>
+      <w:r>
+        <w:t xml:space="preserve"> </w:t>
+      </w:r>
+      <w:r>
+        <w:t xml:space="preserve">— operator-provided live credentials unblock the v0.6→v1.0 chain (mirrors the v0.4.0 / v0.5.0 deferred-until-live-evidence pattern).</w:t>
+      </w:r>
+    </w:p>
+    <w:p>
+      <w:pPr>
+        <w:pStyle w:val="Compact"/>
+        <w:numPr>
+          <w:ilvl w:val="0"/>
+          <w:numId w:val="1004"/>
+        </w:numPr>
+      </w:pPr>
+      <w:r>
+        <w:rPr>
+          <w:b/>
+          <w:bCs/>
+        </w:rPr>
+        <w:t xml:space="preserve">Deferred / gated items:</w:t>
+      </w:r>
+      <w:r>
+        <w:t xml:space="preserve"> </w:t>
+      </w:r>
+      <w:r>
+        <w:t xml:space="preserve">§11.4.93 SQLite SSoT (HRD-131, constitution-repo task), MTProto real-channel automation (operator decision), Wave 8 supervised channel restart (currently fail-loud-tears-down-siblings per</w:t>
+      </w:r>
+      <w:r>
+        <w:t xml:space="preserve"> </w:t>
+      </w:r>
+      <w:r>
+        <w:rPr>
+          <w:rStyle w:val="VerbatimChar"/>
+        </w:rPr>
+        <w:t xml:space="preserve">pherald/cmd/pherald/listen.go:387-398</w:t>
+      </w:r>
+      <w:r>
+        <w:t xml:space="preserve"> </w:t>
+      </w:r>
+      <w:r>
+        <w:t xml:space="preserve">doc-comment), docs audit task #147 (comprehensive per-flavor operator guides).</w:t>
+      </w:r>
+    </w:p>
+    <w:bookmarkEnd w:id="14"/>
+    <w:bookmarkStart w:id="15" w:name="Xaef6f4bf8948401e7913347ad62a96c9e4cace3"/>
+    <w:p>
+      <w:pPr>
+        <w:pStyle w:val="Heading2"/>
+      </w:pPr>
+      <w:r>
+        <w:t xml:space="preserve">§4a. Wave 6 live-test handoff (T10b — gating tag v0.4.0)</w:t>
+      </w:r>
+    </w:p>
+    <w:p>
+      <w:pPr>
+        <w:pStyle w:val="FirstParagraph"/>
+      </w:pPr>
+      <w:r>
+        <w:rPr>
+          <w:b/>
+          <w:bCs/>
+        </w:rPr>
+        <w:t xml:space="preserve">Operator-supplied credentials required</w:t>
+      </w:r>
+      <w:r>
+        <w:t xml:space="preserve"> </w:t>
+      </w:r>
+      <w:r>
+        <w:t xml:space="preserve">— Wave 6's e2e invariants E63-E70 land as honest SKIPs until the live closed-loop runs against real Telegram + real Claude Code with real chat messages exchanged.</w:t>
+      </w:r>
+    </w:p>
+    <w:p>
+      <w:pPr>
+        <w:pStyle w:val="BodyText"/>
+      </w:pPr>
+      <w:r>
+        <w:rPr>
+          <w:b/>
+          <w:bCs/>
+        </w:rPr>
+        <w:t xml:space="preserve">Step-by-step.</w:t>
+      </w:r>
+    </w:p>
+    <w:p>
+      <w:pPr>
+        <w:pStyle w:val="Compact"/>
+        <w:numPr>
+          <w:ilvl w:val="0"/>
+          <w:numId w:val="1005"/>
+        </w:numPr>
+      </w:pPr>
+      <w:r>
         <w:t xml:space="preserve">Export credentials in the shell that will drive the test:</w:t>
       </w:r>
     </w:p>
@@ -4683,7 +5240,7 @@
         <w:pStyle w:val="Compact"/>
         <w:numPr>
           <w:ilvl w:val="0"/>
-          <w:numId w:val="1004"/>
+          <w:numId w:val="1005"/>
         </w:numPr>
       </w:pPr>
       <w:r>
@@ -4917,7 +5474,7 @@
         <w:pStyle w:val="Compact"/>
         <w:numPr>
           <w:ilvl w:val="0"/>
-          <w:numId w:val="1004"/>
+          <w:numId w:val="1005"/>
         </w:numPr>
       </w:pPr>
       <w:r>
@@ -4944,7 +5501,7 @@
         <w:pStyle w:val="Compact"/>
         <w:numPr>
           <w:ilvl w:val="0"/>
-          <w:numId w:val="1004"/>
+          <w:numId w:val="1005"/>
         </w:numPr>
       </w:pPr>
       <w:r>
@@ -5040,7 +5597,7 @@
         <w:pStyle w:val="Compact"/>
         <w:numPr>
           <w:ilvl w:val="0"/>
-          <w:numId w:val="1004"/>
+          <w:numId w:val="1005"/>
         </w:numPr>
       </w:pPr>
       <w:r>
@@ -5109,7 +5666,7 @@
         <w:pStyle w:val="Compact"/>
         <w:numPr>
           <w:ilvl w:val="0"/>
-          <w:numId w:val="1004"/>
+          <w:numId w:val="1005"/>
         </w:numPr>
       </w:pPr>
       <w:r>
@@ -5129,121 +5686,6 @@
       </w:r>
       <w:r>
         <w:t xml:space="preserve">(5 lines minimum) narrating: who ran it, when, what message was sent, what reply came back, any anomalies. This is NOT auto-generated — operator-written narrative is the §107.x evidence anchor.</w:t>
-      </w:r>
-    </w:p>
-    <w:p>
-      <w:pPr>
-        <w:pStyle w:val="Compact"/>
-        <w:numPr>
-          <w:ilvl w:val="0"/>
-          <w:numId w:val="1004"/>
-        </w:numPr>
-      </w:pPr>
-      <w:r>
-        <w:rPr>
-          <w:rStyle w:val="VerbatimChar"/>
-        </w:rPr>
-        <w:t xml:space="preserve">git add ${QA_DIR}/ &amp;&amp; git commit -m "Wave 6 step 10b: docs/qa/HRD-100-${RUN_ID}/ live closed-loop evidence"</w:t>
-      </w:r>
-      <w:r>
-        <w:t xml:space="preserve"> </w:t>
-      </w:r>
-      <w:r>
-        <w:t xml:space="preserve">then proceed to T13b (</w:t>
-      </w:r>
-      <w:r>
-        <w:rPr>
-          <w:rStyle w:val="VerbatimChar"/>
-        </w:rPr>
-        <w:t xml:space="preserve">v0.4.0</w:t>
-      </w:r>
-      <w:r>
-        <w:t xml:space="preserve"> </w:t>
-      </w:r>
-      <w:r>
-        <w:t xml:space="preserve">tag + 4-mirror push).</w:t>
-      </w:r>
-    </w:p>
-    <w:p>
-      <w:pPr>
-        <w:pStyle w:val="FirstParagraph"/>
-      </w:pPr>
-      <w:r>
-        <w:rPr>
-          <w:b/>
-          <w:bCs/>
-        </w:rPr>
-        <w:t xml:space="preserve">If the script SKIPs</w:t>
-      </w:r>
-      <w:r>
-        <w:t xml:space="preserve"> </w:t>
-      </w:r>
-      <w:r>
-        <w:t xml:space="preserve">(any env var unset): the test prints</w:t>
-      </w:r>
-      <w:r>
-        <w:t xml:space="preserve"> </w:t>
-      </w:r>
-      <w:r>
-        <w:rPr>
-          <w:rStyle w:val="VerbatimChar"/>
-        </w:rPr>
-        <w:t xml:space="preserve">SKIP: &lt;reason&gt;</w:t>
-      </w:r>
-      <w:r>
-        <w:t xml:space="preserve"> </w:t>
-      </w:r>
-      <w:r>
-        <w:t xml:space="preserve">and exits 0. That is honest §11.4.3 hardware-absent SKIP-with-reason, not a PASS. Tag</w:t>
-      </w:r>
-      <w:r>
-        <w:t xml:space="preserve"> </w:t>
-      </w:r>
-      <w:r>
-        <w:rPr>
-          <w:rStyle w:val="VerbatimChar"/>
-        </w:rPr>
-        <w:t xml:space="preserve">v0.4.0</w:t>
-      </w:r>
-      <w:r>
-        <w:t xml:space="preserve"> </w:t>
-      </w:r>
-      <w:r>
-        <w:t xml:space="preserve">MUST NOT be created until at least one PASS run is committed to</w:t>
-      </w:r>
-      <w:r>
-        <w:t xml:space="preserve"> </w:t>
-      </w:r>
-      <w:r>
-        <w:rPr>
-          <w:rStyle w:val="VerbatimChar"/>
-        </w:rPr>
-        <w:t xml:space="preserve">docs/qa/HRD-100-&lt;run-id&gt;/</w:t>
-      </w:r>
-      <w:r>
-        <w:t xml:space="preserve">.</w:t>
-      </w:r>
-    </w:p>
-    <w:bookmarkEnd w:id="15"/>
-    <w:bookmarkStart w:id="20" w:name="Xbc160a9833928e45f1f952d03b94bf613f1bd17"/>
-    <w:p>
-      <w:pPr>
-        <w:pStyle w:val="Heading2"/>
-      </w:pPr>
-      <w:r>
-        <w:t xml:space="preserve">§4b. qaherald-auto resume runbook (next session — gating tag v0.5.1)</w:t>
-      </w:r>
-    </w:p>
-    <w:p>
-      <w:pPr>
-        <w:pStyle w:val="FirstParagraph"/>
-      </w:pPr>
-      <w:r>
-        <w:rPr>
-          <w:b/>
-          <w:bCs/>
-        </w:rPr>
-        <w:t xml:space="preserve">Status as of 2026-05-23 session end:</w:t>
       </w:r>
     </w:p>
     <w:p>
@@ -5255,79 +5697,110 @@
         </w:numPr>
       </w:pPr>
       <w:r>
-        <w:t xml:space="preserve">HEAD</w:t>
-      </w:r>
-      <w:r>
-        <w:t xml:space="preserve"> </w:t>
-      </w:r>
-      <w:r>
-        <w:rPr>
-          <w:rStyle w:val="VerbatimChar"/>
-        </w:rPr>
-        <w:t xml:space="preserve">8ad4cb9</w:t>
-      </w:r>
-      <w:r>
-        <w:t xml:space="preserve"> </w:t>
-      </w:r>
-      <w:r>
-        <w:t xml:space="preserve">on</w:t>
-      </w:r>
-      <w:r>
-        <w:t xml:space="preserve"> </w:t>
-      </w:r>
-      <w:r>
-        <w:rPr>
-          <w:rStyle w:val="VerbatimChar"/>
-        </w:rPr>
-        <w:t xml:space="preserve">main</w:t>
-      </w:r>
-      <w:r>
-        <w:t xml:space="preserve">; all 4 mirrors in sync (</w:t>
-      </w:r>
-      <w:r>
-        <w:rPr>
-          <w:rStyle w:val="VerbatimChar"/>
-        </w:rPr>
-        <w:t xml:space="preserve">github.com:vasic-digital/Herald.git</w:t>
-      </w:r>
-      <w:r>
-        <w:t xml:space="preserve">,</w:t>
-      </w:r>
-      <w:r>
-        <w:t xml:space="preserve"> </w:t>
-      </w:r>
-      <w:r>
-        <w:rPr>
-          <w:rStyle w:val="VerbatimChar"/>
-        </w:rPr>
-        <w:t xml:space="preserve">gitlab.com:vasic-digital/herald.git</w:t>
-      </w:r>
-      <w:r>
-        <w:t xml:space="preserve">,</w:t>
-      </w:r>
-      <w:r>
-        <w:t xml:space="preserve"> </w:t>
-      </w:r>
-      <w:r>
-        <w:rPr>
-          <w:rStyle w:val="VerbatimChar"/>
-        </w:rPr>
-        <w:t xml:space="preserve">gitflic.ru:vasic-digital/herald.git</w:t>
-      </w:r>
-      <w:r>
-        <w:t xml:space="preserve">,</w:t>
-      </w:r>
-      <w:r>
-        <w:t xml:space="preserve"> </w:t>
-      </w:r>
-      <w:r>
-        <w:rPr>
-          <w:rStyle w:val="VerbatimChar"/>
-        </w:rPr>
-        <w:t xml:space="preserve">gitverse.ru:vasic-digital/Herald.git</w:t>
-      </w:r>
-      <w:r>
-        <w:t xml:space="preserve">).</w:t>
+        <w:rPr>
+          <w:rStyle w:val="VerbatimChar"/>
+        </w:rPr>
+        <w:t xml:space="preserve">git add ${QA_DIR}/ &amp;&amp; git commit -m "Wave 6 step 10b: docs/qa/HRD-100-${RUN_ID}/ live closed-loop evidence"</w:t>
+      </w:r>
+      <w:r>
+        <w:t xml:space="preserve"> </w:t>
+      </w:r>
+      <w:r>
+        <w:t xml:space="preserve">then proceed to T13b (</w:t>
+      </w:r>
+      <w:r>
+        <w:rPr>
+          <w:rStyle w:val="VerbatimChar"/>
+        </w:rPr>
+        <w:t xml:space="preserve">v0.4.0</w:t>
+      </w:r>
+      <w:r>
+        <w:t xml:space="preserve"> </w:t>
+      </w:r>
+      <w:r>
+        <w:t xml:space="preserve">tag + 4-mirror push).</w:t>
+      </w:r>
+    </w:p>
+    <w:p>
+      <w:pPr>
+        <w:pStyle w:val="FirstParagraph"/>
+      </w:pPr>
+      <w:r>
+        <w:rPr>
+          <w:b/>
+          <w:bCs/>
+        </w:rPr>
+        <w:t xml:space="preserve">If the script SKIPs</w:t>
+      </w:r>
+      <w:r>
+        <w:t xml:space="preserve"> </w:t>
+      </w:r>
+      <w:r>
+        <w:t xml:space="preserve">(any env var unset): the test prints</w:t>
+      </w:r>
+      <w:r>
+        <w:t xml:space="preserve"> </w:t>
+      </w:r>
+      <w:r>
+        <w:rPr>
+          <w:rStyle w:val="VerbatimChar"/>
+        </w:rPr>
+        <w:t xml:space="preserve">SKIP: &lt;reason&gt;</w:t>
+      </w:r>
+      <w:r>
+        <w:t xml:space="preserve"> </w:t>
+      </w:r>
+      <w:r>
+        <w:t xml:space="preserve">and exits 0. That is honest §11.4.3 hardware-absent SKIP-with-reason, not a PASS. Tag</w:t>
+      </w:r>
+      <w:r>
+        <w:t xml:space="preserve"> </w:t>
+      </w:r>
+      <w:r>
+        <w:rPr>
+          <w:rStyle w:val="VerbatimChar"/>
+        </w:rPr>
+        <w:t xml:space="preserve">v0.4.0</w:t>
+      </w:r>
+      <w:r>
+        <w:t xml:space="preserve"> </w:t>
+      </w:r>
+      <w:r>
+        <w:t xml:space="preserve">MUST NOT be created until at least one PASS run is committed to</w:t>
+      </w:r>
+      <w:r>
+        <w:t xml:space="preserve"> </w:t>
+      </w:r>
+      <w:r>
+        <w:rPr>
+          <w:rStyle w:val="VerbatimChar"/>
+        </w:rPr>
+        <w:t xml:space="preserve">docs/qa/HRD-100-&lt;run-id&gt;/</w:t>
+      </w:r>
+      <w:r>
+        <w:t xml:space="preserve">.</w:t>
+      </w:r>
+    </w:p>
+    <w:bookmarkEnd w:id="15"/>
+    <w:bookmarkStart w:id="20" w:name="Xbc160a9833928e45f1f952d03b94bf613f1bd17"/>
+    <w:p>
+      <w:pPr>
+        <w:pStyle w:val="Heading2"/>
+      </w:pPr>
+      <w:r>
+        <w:t xml:space="preserve">§4b. qaherald-auto resume runbook (next session — gating tag v0.5.1)</w:t>
+      </w:r>
+    </w:p>
+    <w:p>
+      <w:pPr>
+        <w:pStyle w:val="FirstParagraph"/>
+      </w:pPr>
+      <w:r>
+        <w:rPr>
+          <w:b/>
+          <w:bCs/>
+        </w:rPr>
+        <w:t xml:space="preserve">Status as of 2026-05-23 session end:</w:t>
       </w:r>
     </w:p>
     <w:p>
@@ -5335,68 +5808,83 @@
         <w:pStyle w:val="Compact"/>
         <w:numPr>
           <w:ilvl w:val="0"/>
-          <w:numId w:val="1005"/>
+          <w:numId w:val="1006"/>
         </w:numPr>
       </w:pPr>
       <w:r>
-        <w:t xml:space="preserve">Tag</w:t>
-      </w:r>
-      <w:r>
-        <w:t xml:space="preserve"> </w:t>
-      </w:r>
-      <w:r>
-        <w:rPr>
-          <w:rStyle w:val="VerbatimChar"/>
-        </w:rPr>
-        <w:t xml:space="preserve">v0.4.0</w:t>
-      </w:r>
-      <w:r>
-        <w:t xml:space="preserve"> </w:t>
-      </w:r>
-      <w:r>
-        <w:t xml:space="preserve">shipped (Wave 6 closed-loop). Tag</w:t>
-      </w:r>
-      <w:r>
-        <w:t xml:space="preserve"> </w:t>
-      </w:r>
-      <w:r>
-        <w:rPr>
-          <w:rStyle w:val="VerbatimChar"/>
-        </w:rPr>
-        <w:t xml:space="preserve">v0.5.0</w:t>
-      </w:r>
-      <w:r>
-        <w:t xml:space="preserve"> </w:t>
-      </w:r>
-      <w:r>
-        <w:t xml:space="preserve">shipped (Wave 6.5 lifecycle implementations — premature: only S1+S2 live evidence + carries the pre-</w:t>
-      </w:r>
-      <w:r>
-        <w:rPr>
-          <w:rStyle w:val="VerbatimChar"/>
-        </w:rPr>
-        <w:t xml:space="preserve">53a7ad3</w:t>
-      </w:r>
-      <w:r>
-        <w:t xml:space="preserve"> </w:t>
-      </w:r>
-      <w:r>
-        <w:t xml:space="preserve">envelope-action-guidance bug). Tag</w:t>
-      </w:r>
-      <w:r>
-        <w:t xml:space="preserve"> </w:t>
-      </w:r>
-      <w:r>
-        <w:rPr>
-          <w:rStyle w:val="VerbatimChar"/>
-        </w:rPr>
-        <w:t xml:space="preserve">v0.5.1</w:t>
-      </w:r>
-      <w:r>
-        <w:t xml:space="preserve"> </w:t>
-      </w:r>
-      <w:r>
-        <w:t xml:space="preserve">is the target after qaherald-auto T6-T8 land + full 15-scenario evidence committed.</w:t>
+        <w:t xml:space="preserve">HEAD</w:t>
+      </w:r>
+      <w:r>
+        <w:t xml:space="preserve"> </w:t>
+      </w:r>
+      <w:r>
+        <w:rPr>
+          <w:rStyle w:val="VerbatimChar"/>
+        </w:rPr>
+        <w:t xml:space="preserve">8ad4cb9</w:t>
+      </w:r>
+      <w:r>
+        <w:t xml:space="preserve"> </w:t>
+      </w:r>
+      <w:r>
+        <w:t xml:space="preserve">on</w:t>
+      </w:r>
+      <w:r>
+        <w:t xml:space="preserve"> </w:t>
+      </w:r>
+      <w:r>
+        <w:rPr>
+          <w:rStyle w:val="VerbatimChar"/>
+        </w:rPr>
+        <w:t xml:space="preserve">main</w:t>
+      </w:r>
+      <w:r>
+        <w:t xml:space="preserve">; all 4 mirrors in sync (</w:t>
+      </w:r>
+      <w:r>
+        <w:rPr>
+          <w:rStyle w:val="VerbatimChar"/>
+        </w:rPr>
+        <w:t xml:space="preserve">github.com:vasic-digital/Herald.git</w:t>
+      </w:r>
+      <w:r>
+        <w:t xml:space="preserve">,</w:t>
+      </w:r>
+      <w:r>
+        <w:t xml:space="preserve"> </w:t>
+      </w:r>
+      <w:r>
+        <w:rPr>
+          <w:rStyle w:val="VerbatimChar"/>
+        </w:rPr>
+        <w:t xml:space="preserve">gitlab.com:vasic-digital/herald.git</w:t>
+      </w:r>
+      <w:r>
+        <w:t xml:space="preserve">,</w:t>
+      </w:r>
+      <w:r>
+        <w:t xml:space="preserve"> </w:t>
+      </w:r>
+      <w:r>
+        <w:rPr>
+          <w:rStyle w:val="VerbatimChar"/>
+        </w:rPr>
+        <w:t xml:space="preserve">gitflic.ru:vasic-digital/herald.git</w:t>
+      </w:r>
+      <w:r>
+        <w:t xml:space="preserve">,</w:t>
+      </w:r>
+      <w:r>
+        <w:t xml:space="preserve"> </w:t>
+      </w:r>
+      <w:r>
+        <w:rPr>
+          <w:rStyle w:val="VerbatimChar"/>
+        </w:rPr>
+        <w:t xml:space="preserve">gitverse.ru:vasic-digital/Herald.git</w:t>
+      </w:r>
+      <w:r>
+        <w:t xml:space="preserve">).</w:t>
       </w:r>
     </w:p>
     <w:p>
@@ -5404,38 +5892,68 @@
         <w:pStyle w:val="Compact"/>
         <w:numPr>
           <w:ilvl w:val="0"/>
-          <w:numId w:val="1005"/>
+          <w:numId w:val="1006"/>
         </w:numPr>
       </w:pPr>
       <w:r>
-        <w:t xml:space="preserve">Plan:</w:t>
-      </w:r>
-      <w:r>
-        <w:t xml:space="preserve"> </w:t>
-      </w:r>
-      <w:r>
-        <w:rPr>
-          <w:rStyle w:val="VerbatimChar"/>
-        </w:rPr>
-        <w:t xml:space="preserve">docs/superpowers/plans/2026-05-23-qaherald-auto.md</w:t>
-      </w:r>
-      <w:r>
-        <w:t xml:space="preserve"> </w:t>
-      </w:r>
-      <w:r>
-        <w:t xml:space="preserve">(commit</w:t>
-      </w:r>
-      <w:r>
-        <w:t xml:space="preserve"> </w:t>
-      </w:r>
-      <w:r>
-        <w:rPr>
-          <w:rStyle w:val="VerbatimChar"/>
-        </w:rPr>
-        <w:t xml:space="preserve">52ce679</w:t>
-      </w:r>
-      <w:r>
-        <w:t xml:space="preserve">).</w:t>
+        <w:t xml:space="preserve">Tag</w:t>
+      </w:r>
+      <w:r>
+        <w:t xml:space="preserve"> </w:t>
+      </w:r>
+      <w:r>
+        <w:rPr>
+          <w:rStyle w:val="VerbatimChar"/>
+        </w:rPr>
+        <w:t xml:space="preserve">v0.4.0</w:t>
+      </w:r>
+      <w:r>
+        <w:t xml:space="preserve"> </w:t>
+      </w:r>
+      <w:r>
+        <w:t xml:space="preserve">shipped (Wave 6 closed-loop). Tag</w:t>
+      </w:r>
+      <w:r>
+        <w:t xml:space="preserve"> </w:t>
+      </w:r>
+      <w:r>
+        <w:rPr>
+          <w:rStyle w:val="VerbatimChar"/>
+        </w:rPr>
+        <w:t xml:space="preserve">v0.5.0</w:t>
+      </w:r>
+      <w:r>
+        <w:t xml:space="preserve"> </w:t>
+      </w:r>
+      <w:r>
+        <w:t xml:space="preserve">shipped (Wave 6.5 lifecycle implementations — premature: only S1+S2 live evidence + carries the pre-</w:t>
+      </w:r>
+      <w:r>
+        <w:rPr>
+          <w:rStyle w:val="VerbatimChar"/>
+        </w:rPr>
+        <w:t xml:space="preserve">53a7ad3</w:t>
+      </w:r>
+      <w:r>
+        <w:t xml:space="preserve"> </w:t>
+      </w:r>
+      <w:r>
+        <w:t xml:space="preserve">envelope-action-guidance bug). Tag</w:t>
+      </w:r>
+      <w:r>
+        <w:t xml:space="preserve"> </w:t>
+      </w:r>
+      <w:r>
+        <w:rPr>
+          <w:rStyle w:val="VerbatimChar"/>
+        </w:rPr>
+        <w:t xml:space="preserve">v0.5.1</w:t>
+      </w:r>
+      <w:r>
+        <w:t xml:space="preserve"> </w:t>
+      </w:r>
+      <w:r>
+        <w:t xml:space="preserve">is the target after qaherald-auto T6-T8 land + full 15-scenario evidence committed.</w:t>
       </w:r>
     </w:p>
     <w:p>
@@ -5443,26 +5961,38 @@
         <w:pStyle w:val="Compact"/>
         <w:numPr>
           <w:ilvl w:val="0"/>
-          <w:numId w:val="1005"/>
+          <w:numId w:val="1006"/>
         </w:numPr>
       </w:pPr>
       <w:r>
-        <w:t xml:space="preserve">Done: T1 skeleton + T2 messenger + T3 scenarios + T4 orchestrator + T5 report (combined commit</w:t>
-      </w:r>
-      <w:r>
-        <w:t xml:space="preserve"> </w:t>
-      </w:r>
-      <w:r>
-        <w:rPr>
-          <w:rStyle w:val="VerbatimChar"/>
-        </w:rPr>
-        <w:t xml:space="preserve">8ad4cb9</w:t>
-      </w:r>
-      <w:r>
-        <w:t xml:space="preserve"> </w:t>
-      </w:r>
-      <w:r>
-        <w:t xml:space="preserve">for T3-T5).</w:t>
+        <w:t xml:space="preserve">Plan:</w:t>
+      </w:r>
+      <w:r>
+        <w:t xml:space="preserve"> </w:t>
+      </w:r>
+      <w:r>
+        <w:rPr>
+          <w:rStyle w:val="VerbatimChar"/>
+        </w:rPr>
+        <w:t xml:space="preserve">docs/superpowers/plans/2026-05-23-qaherald-auto.md</w:t>
+      </w:r>
+      <w:r>
+        <w:t xml:space="preserve"> </w:t>
+      </w:r>
+      <w:r>
+        <w:t xml:space="preserve">(commit</w:t>
+      </w:r>
+      <w:r>
+        <w:t xml:space="preserve"> </w:t>
+      </w:r>
+      <w:r>
+        <w:rPr>
+          <w:rStyle w:val="VerbatimChar"/>
+        </w:rPr>
+        <w:t xml:space="preserve">52ce679</w:t>
+      </w:r>
+      <w:r>
+        <w:t xml:space="preserve">).</w:t>
       </w:r>
     </w:p>
     <w:p>
@@ -5470,7 +6000,34 @@
         <w:pStyle w:val="Compact"/>
         <w:numPr>
           <w:ilvl w:val="0"/>
-          <w:numId w:val="1005"/>
+          <w:numId w:val="1006"/>
+        </w:numPr>
+      </w:pPr>
+      <w:r>
+        <w:t xml:space="preserve">Done: T1 skeleton + T2 messenger + T3 scenarios + T4 orchestrator + T5 report (combined commit</w:t>
+      </w:r>
+      <w:r>
+        <w:t xml:space="preserve"> </w:t>
+      </w:r>
+      <w:r>
+        <w:rPr>
+          <w:rStyle w:val="VerbatimChar"/>
+        </w:rPr>
+        <w:t xml:space="preserve">8ad4cb9</w:t>
+      </w:r>
+      <w:r>
+        <w:t xml:space="preserve"> </w:t>
+      </w:r>
+      <w:r>
+        <w:t xml:space="preserve">for T3-T5).</w:t>
+      </w:r>
+    </w:p>
+    <w:p>
+      <w:pPr>
+        <w:pStyle w:val="Compact"/>
+        <w:numPr>
+          <w:ilvl w:val="0"/>
+          <w:numId w:val="1006"/>
         </w:numPr>
       </w:pPr>
       <w:r>
@@ -5742,7 +6299,7 @@
       <w:pPr>
         <w:numPr>
           <w:ilvl w:val="0"/>
-          <w:numId w:val="1006"/>
+          <w:numId w:val="1007"/>
         </w:numPr>
       </w:pPr>
       <w:r>
@@ -5901,7 +6458,7 @@
       <w:pPr>
         <w:numPr>
           <w:ilvl w:val="0"/>
-          <w:numId w:val="1006"/>
+          <w:numId w:val="1007"/>
         </w:numPr>
       </w:pPr>
       <w:r>
@@ -5964,7 +6521,7 @@
       <w:pPr>
         <w:numPr>
           <w:ilvl w:val="0"/>
-          <w:numId w:val="1006"/>
+          <w:numId w:val="1007"/>
         </w:numPr>
       </w:pPr>
       <w:r>
@@ -5985,7 +6542,7 @@
       <w:pPr>
         <w:numPr>
           <w:ilvl w:val="0"/>
-          <w:numId w:val="1006"/>
+          <w:numId w:val="1007"/>
         </w:numPr>
       </w:pPr>
       <w:r>
@@ -6051,7 +6608,7 @@
       <w:pPr>
         <w:numPr>
           <w:ilvl w:val="0"/>
-          <w:numId w:val="1006"/>
+          <w:numId w:val="1007"/>
         </w:numPr>
       </w:pPr>
       <w:r>
@@ -6792,7 +7349,7 @@
       <w:pPr>
         <w:numPr>
           <w:ilvl w:val="0"/>
-          <w:numId w:val="1006"/>
+          <w:numId w:val="1007"/>
         </w:numPr>
       </w:pPr>
       <w:r>
@@ -6811,7 +7368,7 @@
         <w:pStyle w:val="Compact"/>
         <w:numPr>
           <w:ilvl w:val="1"/>
-          <w:numId w:val="1007"/>
+          <w:numId w:val="1008"/>
         </w:numPr>
       </w:pPr>
       <w:r>
@@ -6832,7 +7389,7 @@
         <w:pStyle w:val="Compact"/>
         <w:numPr>
           <w:ilvl w:val="1"/>
-          <w:numId w:val="1007"/>
+          <w:numId w:val="1008"/>
         </w:numPr>
       </w:pPr>
       <w:r>
@@ -6853,7 +7410,7 @@
         <w:pStyle w:val="Compact"/>
         <w:numPr>
           <w:ilvl w:val="1"/>
-          <w:numId w:val="1007"/>
+          <w:numId w:val="1008"/>
         </w:numPr>
       </w:pPr>
       <w:r>
@@ -6874,7 +7431,7 @@
         <w:pStyle w:val="Compact"/>
         <w:numPr>
           <w:ilvl w:val="1"/>
-          <w:numId w:val="1007"/>
+          <w:numId w:val="1008"/>
         </w:numPr>
       </w:pPr>
       <w:r>
@@ -6895,7 +7452,7 @@
         <w:pStyle w:val="Compact"/>
         <w:numPr>
           <w:ilvl w:val="1"/>
-          <w:numId w:val="1007"/>
+          <w:numId w:val="1008"/>
         </w:numPr>
       </w:pPr>
       <w:r>
@@ -6930,7 +7487,7 @@
       <w:pPr>
         <w:numPr>
           <w:ilvl w:val="0"/>
-          <w:numId w:val="1006"/>
+          <w:numId w:val="1007"/>
         </w:numPr>
       </w:pPr>
       <w:r>
@@ -7110,7 +7667,7 @@
       <w:pPr>
         <w:numPr>
           <w:ilvl w:val="0"/>
-          <w:numId w:val="1006"/>
+          <w:numId w:val="1007"/>
         </w:numPr>
       </w:pPr>
       <w:r>
@@ -7328,7 +7885,7 @@
         <w:pStyle w:val="Compact"/>
         <w:numPr>
           <w:ilvl w:val="0"/>
-          <w:numId w:val="1008"/>
+          <w:numId w:val="1009"/>
         </w:numPr>
       </w:pPr>
       <w:r>
@@ -7362,7 +7919,7 @@
         <w:pStyle w:val="Compact"/>
         <w:numPr>
           <w:ilvl w:val="0"/>
-          <w:numId w:val="1008"/>
+          <w:numId w:val="1009"/>
         </w:numPr>
       </w:pPr>
       <w:r>
@@ -7381,7 +7938,7 @@
         <w:pStyle w:val="Compact"/>
         <w:numPr>
           <w:ilvl w:val="0"/>
-          <w:numId w:val="1008"/>
+          <w:numId w:val="1009"/>
         </w:numPr>
       </w:pPr>
       <w:r>
@@ -7415,7 +7972,7 @@
         <w:pStyle w:val="Compact"/>
         <w:numPr>
           <w:ilvl w:val="0"/>
-          <w:numId w:val="1008"/>
+          <w:numId w:val="1009"/>
         </w:numPr>
       </w:pPr>
       <w:r>
@@ -7938,7 +8495,7 @@
         <w:pStyle w:val="Compact"/>
         <w:numPr>
           <w:ilvl w:val="0"/>
-          <w:numId w:val="1009"/>
+          <w:numId w:val="1010"/>
         </w:numPr>
       </w:pPr>
       <w:r>
@@ -7959,7 +8516,7 @@
         <w:pStyle w:val="Compact"/>
         <w:numPr>
           <w:ilvl w:val="0"/>
-          <w:numId w:val="1009"/>
+          <w:numId w:val="1010"/>
         </w:numPr>
       </w:pPr>
       <w:r>
@@ -7980,7 +8537,7 @@
         <w:pStyle w:val="Compact"/>
         <w:numPr>
           <w:ilvl w:val="0"/>
-          <w:numId w:val="1009"/>
+          <w:numId w:val="1010"/>
         </w:numPr>
       </w:pPr>
       <w:r>
@@ -8001,7 +8558,7 @@
         <w:pStyle w:val="Compact"/>
         <w:numPr>
           <w:ilvl w:val="0"/>
-          <w:numId w:val="1009"/>
+          <w:numId w:val="1010"/>
         </w:numPr>
       </w:pPr>
       <w:r>
@@ -8022,7 +8579,7 @@
         <w:pStyle w:val="Compact"/>
         <w:numPr>
           <w:ilvl w:val="0"/>
-          <w:numId w:val="1009"/>
+          <w:numId w:val="1010"/>
         </w:numPr>
       </w:pPr>
       <w:r>
@@ -8043,7 +8600,7 @@
         <w:pStyle w:val="Compact"/>
         <w:numPr>
           <w:ilvl w:val="0"/>
-          <w:numId w:val="1009"/>
+          <w:numId w:val="1010"/>
         </w:numPr>
       </w:pPr>
       <w:r>
@@ -8064,7 +8621,7 @@
         <w:pStyle w:val="Compact"/>
         <w:numPr>
           <w:ilvl w:val="0"/>
-          <w:numId w:val="1009"/>
+          <w:numId w:val="1010"/>
         </w:numPr>
       </w:pPr>
       <w:r>
@@ -8295,6 +8852,91 @@
       </w:rPr>
     </w:lvl>
   </w:abstractNum>
+  <w:abstractNum w:abstractNumId="99410">
+    <w:nsid w:val="00A99410"/>
+    <w:multiLevelType w:val="multilevel"/>
+    <w:lvl w:ilvl="0">
+      <w:start w:val="0"/>
+      <w:numFmt w:val="decimal"/>
+      <w:lvlText w:val="%1."/>
+      <w:lvlJc w:val="left"/>
+      <w:pPr>
+        <w:ind w:left="720" w:hanging="360"/>
+      </w:pPr>
+    </w:lvl>
+    <w:lvl w:ilvl="1">
+      <w:start w:val="0"/>
+      <w:numFmt w:val="decimal"/>
+      <w:lvlText w:val="%2."/>
+      <w:lvlJc w:val="left"/>
+      <w:pPr>
+        <w:ind w:left="1440" w:hanging="360"/>
+      </w:pPr>
+    </w:lvl>
+    <w:lvl w:ilvl="2">
+      <w:start w:val="0"/>
+      <w:numFmt w:val="decimal"/>
+      <w:lvlText w:val="%3."/>
+      <w:lvlJc w:val="left"/>
+      <w:pPr>
+        <w:ind w:left="2160" w:hanging="360"/>
+      </w:pPr>
+    </w:lvl>
+    <w:lvl w:ilvl="3">
+      <w:start w:val="0"/>
+      <w:numFmt w:val="decimal"/>
+      <w:lvlText w:val="%4."/>
+      <w:lvlJc w:val="left"/>
+      <w:pPr>
+        <w:ind w:left="2880" w:hanging="360"/>
+      </w:pPr>
+    </w:lvl>
+    <w:lvl w:ilvl="4">
+      <w:start w:val="0"/>
+      <w:numFmt w:val="decimal"/>
+      <w:lvlText w:val="%5."/>
+      <w:lvlJc w:val="left"/>
+      <w:pPr>
+        <w:ind w:left="3600" w:hanging="360"/>
+      </w:pPr>
+    </w:lvl>
+    <w:lvl w:ilvl="5">
+      <w:start w:val="0"/>
+      <w:numFmt w:val="decimal"/>
+      <w:lvlText w:val="%6."/>
+      <w:lvlJc w:val="left"/>
+      <w:pPr>
+        <w:ind w:left="4320" w:hanging="360"/>
+      </w:pPr>
+    </w:lvl>
+    <w:lvl w:ilvl="6">
+      <w:start w:val="0"/>
+      <w:numFmt w:val="decimal"/>
+      <w:lvlText w:val="%7."/>
+      <w:lvlJc w:val="left"/>
+      <w:pPr>
+        <w:ind w:left="5040" w:hanging="360"/>
+      </w:pPr>
+    </w:lvl>
+    <w:lvl w:ilvl="7">
+      <w:start w:val="0"/>
+      <w:numFmt w:val="decimal"/>
+      <w:lvlText w:val="%8."/>
+      <w:lvlJc w:val="left"/>
+      <w:pPr>
+        <w:ind w:left="5760" w:hanging="360"/>
+      </w:pPr>
+    </w:lvl>
+    <w:lvl w:ilvl="8">
+      <w:start w:val="0"/>
+      <w:numFmt w:val="decimal"/>
+      <w:lvlText w:val="%9."/>
+      <w:lvlJc w:val="left"/>
+      <w:pPr>
+        <w:ind w:left="6480" w:hanging="360"/>
+      </w:pPr>
+    </w:lvl>
+  </w:abstractNum>
   <w:abstractNum w:abstractNumId="99411">
     <w:nsid w:val="00A99411"/>
     <w:multiLevelType w:val="multilevel"/>
@@ -8390,6 +9032,39 @@
     <w:abstractNumId w:val="991"/>
   </w:num>
   <w:num w:numId="1003">
+    <w:abstractNumId w:val="991"/>
+  </w:num>
+  <w:num w:numId="1004">
+    <w:abstractNumId w:val="99410"/>
+    <w:lvlOverride w:ilvl="0">
+      <w:startOverride w:val="0"/>
+    </w:lvlOverride>
+    <w:lvlOverride w:ilvl="1">
+      <w:startOverride w:val="0"/>
+    </w:lvlOverride>
+    <w:lvlOverride w:ilvl="2">
+      <w:startOverride w:val="0"/>
+    </w:lvlOverride>
+    <w:lvlOverride w:ilvl="3">
+      <w:startOverride w:val="0"/>
+    </w:lvlOverride>
+    <w:lvlOverride w:ilvl="4">
+      <w:startOverride w:val="0"/>
+    </w:lvlOverride>
+    <w:lvlOverride w:ilvl="5">
+      <w:startOverride w:val="0"/>
+    </w:lvlOverride>
+    <w:lvlOverride w:ilvl="6">
+      <w:startOverride w:val="0"/>
+    </w:lvlOverride>
+    <w:lvlOverride w:ilvl="7">
+      <w:startOverride w:val="0"/>
+    </w:lvlOverride>
+    <w:lvlOverride w:ilvl="8">
+      <w:startOverride w:val="0"/>
+    </w:lvlOverride>
+  </w:num>
+  <w:num w:numId="1005">
     <w:abstractNumId w:val="99411"/>
     <w:lvlOverride w:ilvl="0">
       <w:startOverride w:val="1"/>
@@ -8419,7 +9094,10 @@
       <w:startOverride w:val="1"/>
     </w:lvlOverride>
   </w:num>
-  <w:num w:numId="1004">
+  <w:num w:numId="1006">
+    <w:abstractNumId w:val="991"/>
+  </w:num>
+  <w:num w:numId="1007">
     <w:abstractNumId w:val="99411"/>
     <w:lvlOverride w:ilvl="0">
       <w:startOverride w:val="1"/>
@@ -8449,46 +9127,13 @@
       <w:startOverride w:val="1"/>
     </w:lvlOverride>
   </w:num>
-  <w:num w:numId="1005">
-    <w:abstractNumId w:val="991"/>
-  </w:num>
-  <w:num w:numId="1006">
-    <w:abstractNumId w:val="99411"/>
-    <w:lvlOverride w:ilvl="0">
-      <w:startOverride w:val="1"/>
-    </w:lvlOverride>
-    <w:lvlOverride w:ilvl="1">
-      <w:startOverride w:val="1"/>
-    </w:lvlOverride>
-    <w:lvlOverride w:ilvl="2">
-      <w:startOverride w:val="1"/>
-    </w:lvlOverride>
-    <w:lvlOverride w:ilvl="3">
-      <w:startOverride w:val="1"/>
-    </w:lvlOverride>
-    <w:lvlOverride w:ilvl="4">
-      <w:startOverride w:val="1"/>
-    </w:lvlOverride>
-    <w:lvlOverride w:ilvl="5">
-      <w:startOverride w:val="1"/>
-    </w:lvlOverride>
-    <w:lvlOverride w:ilvl="6">
-      <w:startOverride w:val="1"/>
-    </w:lvlOverride>
-    <w:lvlOverride w:ilvl="7">
-      <w:startOverride w:val="1"/>
-    </w:lvlOverride>
-    <w:lvlOverride w:ilvl="8">
-      <w:startOverride w:val="1"/>
-    </w:lvlOverride>
-  </w:num>
-  <w:num w:numId="1007">
-    <w:abstractNumId w:val="991"/>
-  </w:num>
   <w:num w:numId="1008">
     <w:abstractNumId w:val="991"/>
   </w:num>
   <w:num w:numId="1009">
+    <w:abstractNumId w:val="991"/>
+  </w:num>
+  <w:num w:numId="1010">
     <w:abstractNumId w:val="991"/>
   </w:num>
 </w:numbering>

</xml_diff>

<commit_message>
docs(continuation): r25 EOD handoff 2026-06-02 — messaging features live-proven; clean checkpoint
Updates CONTINUATION.md for tomorrow's pickup: HEAD 14fed75 (all 4 mirrors, ls-remote
verified), docs_chain 02eb81b, all submodules clean. Records the day's delivery
(docs_chain integration; Slack live parity; threading both channels; inbound-threaded
processing; thread-context-awareness with participants+subject, live-proven both
channels via the envelope-capture wrapper; fork/exec deadlock fix; mtproto SendReply)
with commit ids + evidence paths, and the open follow-ups (HRD-159; Slack participant
resolution; LEG-2 flakiness; HRD-115 ready for Issues→Fixed; ATMOSphere cluster).
§1 HEAD + §3 Active-work refreshed. Siblings regenerated via docs_chain (in-sync).

Co-Authored-By: Claude Opus 4.8 <noreply@anthropic.com>
</commit_message>
<xml_diff>
--- a/docs/CONTINUATION.docx
+++ b/docs/CONTINUATION.docx
@@ -123,7 +123,7 @@
               <w:pStyle w:val="Compact"/>
             </w:pPr>
             <w:r>
-              <w:t xml:space="preserve">2026-05-31</w:t>
+              <w:t xml:space="preserve">2026-06-02</w:t>
             </w:r>
           </w:p>
         </w:tc>
@@ -175,7 +175,7 @@
                 <w:b/>
                 <w:bCs/>
               </w:rPr>
-              <w:t xml:space="preserve">r22 (2026-05-29 day-4) — ATMOSphere↔Herald workable-items integration DELIVERED end-to-end across 3 repos (Herald</w:t>
+              <w:t xml:space="preserve">r25 (2026-06-02) — Messaging-features day: Slack live parity + threading + thread-context, all LIVE-PROVEN, all pushed (Herald HEAD</w:t>
             </w:r>
             <w:r>
               <w:rPr>
@@ -190,42 +190,96 @@
                 <w:b/>
                 <w:bCs/>
               </w:rPr>
-              <w:t xml:space="preserve">2412512</w:t>
+              <w:t xml:space="preserve">14fed75</w:t>
             </w:r>
             <w:r>
               <w:rPr>
                 <w:b/>
                 <w:bCs/>
               </w:rPr>
-              <w:t xml:space="preserve"> </w:t>
+              <w:t xml:space="preserve">, 4 mirrors verified via ls-remote; docs_chain</w:t>
             </w:r>
             <w:r>
               <w:rPr>
                 <w:b/>
                 <w:bCs/>
               </w:rPr>
-              <w:t xml:space="preserve">/ HelixConstitution</w:t>
-            </w:r>
-            <w:r>
-              <w:rPr>
+              <w:t xml:space="preserve"> </w:t>
+            </w:r>
+            <w:r>
+              <w:rPr>
+                <w:rStyle w:val="VerbatimChar"/>
                 <w:b/>
                 <w:bCs/>
               </w:rPr>
-              <w:t xml:space="preserve"> </w:t>
-            </w:r>
-            <w:r>
-              <w:rPr>
-                <w:rStyle w:val="VerbatimChar"/>
+              <w:t xml:space="preserve">02eb81b</w:t>
+            </w:r>
+            <w:r>
+              <w:rPr>
                 <w:b/>
                 <w:bCs/>
               </w:rPr>
-              <w:t xml:space="preserve">8ec2b38</w:t>
+              <w:t xml:space="preserve"> </w:t>
             </w:r>
             <w:r>
               <w:rPr>
                 <w:b/>
                 <w:bCs/>
               </w:rPr>
+              <w:t xml:space="preserve">origin; all submodules clean).</w:t>
+            </w:r>
+            <w:r>
+              <w:t xml:space="preserve"> </w:t>
+            </w:r>
+            <w:r>
+              <w:t xml:space="preserve">Delivered this session (9 Herald commits</w:t>
+            </w:r>
+            <w:r>
+              <w:t xml:space="preserve"> </w:t>
+            </w:r>
+            <w:r>
+              <w:rPr>
+                <w:rStyle w:val="VerbatimChar"/>
+              </w:rPr>
+              <w:t xml:space="preserve">005ff22</w:t>
+            </w:r>
+            <w:r>
+              <w:t xml:space="preserve">→</w:t>
+            </w:r>
+            <w:r>
+              <w:rPr>
+                <w:rStyle w:val="VerbatimChar"/>
+              </w:rPr>
+              <w:t xml:space="preserve">14fed75</w:t>
+            </w:r>
+            <w:r>
+              <w:t xml:space="preserve"> </w:t>
+            </w:r>
+            <w:r>
+              <w:t xml:space="preserve">+ docs_chain</w:t>
+            </w:r>
+            <w:r>
+              <w:t xml:space="preserve"> </w:t>
+            </w:r>
+            <w:r>
+              <w:rPr>
+                <w:rStyle w:val="VerbatimChar"/>
+              </w:rPr>
+              <w:t xml:space="preserve">80d3d8d</w:t>
+            </w:r>
+            <w:r>
+              <w:t xml:space="preserve">/</w:t>
+            </w:r>
+            <w:r>
+              <w:rPr>
+                <w:rStyle w:val="VerbatimChar"/>
+              </w:rPr>
+              <w:t xml:space="preserve">02eb81b</w:t>
+            </w:r>
+            <w:r>
+              <w:t xml:space="preserve">): (1)</w:t>
+            </w:r>
+            <w:r>
               <w:t xml:space="preserve"> </w:t>
             </w:r>
             <w:r>
@@ -233,35 +287,413 @@
                 <w:b/>
                 <w:bCs/>
               </w:rPr>
-              <w:t xml:space="preserve">/ ATMOSphere</w:t>
+              <w:t xml:space="preserve">docs_chain fully integrated</w:t>
+            </w:r>
+            <w:r>
+              <w:t xml:space="preserve"> </w:t>
+            </w:r>
+            <w:r>
+              <w:t xml:space="preserve">— engine Phase-4/5 gaps filled (watch daemon, md↔sqlite, colorize-html), latent row-hash bug fixed, real-binary e2e GREEN; Herald 66-doc corpus drift caught + reconciled,</w:t>
+            </w:r>
+            <w:r>
+              <w:t xml:space="preserve"> </w:t>
+            </w:r>
+            <w:r>
+              <w:rPr>
+                <w:rStyle w:val="VerbatimChar"/>
+              </w:rPr>
+              <w:t xml:space="preserve">verify herald-docs</w:t>
+            </w:r>
+            <w:r>
+              <w:t xml:space="preserve"> </w:t>
+            </w:r>
+            <w:r>
+              <w:t xml:space="preserve">exit 0; routine doc flow now</w:t>
+            </w:r>
+            <w:r>
+              <w:t xml:space="preserve"> </w:t>
+            </w:r>
+            <w:r>
+              <w:rPr>
+                <w:rStyle w:val="VerbatimChar"/>
+              </w:rPr>
+              <w:t xml:space="preserve">docs_chain sync herald-docs</w:t>
+            </w:r>
+            <w:r>
+              <w:t xml:space="preserve"> </w:t>
+            </w:r>
+            <w:r>
+              <w:t xml:space="preserve">(not export_docs.sh). (2)</w:t>
+            </w:r>
+            <w:r>
+              <w:t xml:space="preserve"> </w:t>
             </w:r>
             <w:r>
               <w:rPr>
                 <w:b/>
                 <w:bCs/>
               </w:rPr>
-              <w:t xml:space="preserve"> </w:t>
-            </w:r>
-            <w:r>
-              <w:rPr>
-                <w:rStyle w:val="VerbatimChar"/>
+              <w:t xml:space="preserve">Slack live parity</w:t>
+            </w:r>
+            <w:r>
+              <w:t xml:space="preserve"> </w:t>
+            </w:r>
+            <w:r>
+              <w:t xml:space="preserve">— send + inbound Socket-Mode + reply-delivery + §11.4.104 resolver +</w:t>
+            </w:r>
+            <w:r>
+              <w:t xml:space="preserve"> </w:t>
+            </w:r>
+            <w:r>
+              <w:rPr>
+                <w:rStyle w:val="VerbatimChar"/>
+              </w:rPr>
+              <w:t xml:space="preserve">--channels</w:t>
+            </w:r>
+            <w:r>
+              <w:t xml:space="preserve"> </w:t>
+            </w:r>
+            <w:r>
+              <w:t xml:space="preserve">flag (</w:t>
+            </w:r>
+            <w:r>
+              <w:rPr>
+                <w:rStyle w:val="VerbatimChar"/>
+              </w:rPr>
+              <w:t xml:space="preserve">1f2b60c</w:t>
+            </w:r>
+            <w:r>
+              <w:t xml:space="preserve">/</w:t>
+            </w:r>
+            <w:r>
+              <w:rPr>
+                <w:rStyle w:val="VerbatimChar"/>
+              </w:rPr>
+              <w:t xml:space="preserve">43abe9b</w:t>
+            </w:r>
+            <w:r>
+              <w:t xml:space="preserve">/</w:t>
+            </w:r>
+            <w:r>
+              <w:rPr>
+                <w:rStyle w:val="VerbatimChar"/>
+              </w:rPr>
+              <w:t xml:space="preserve">f5c9aa5</w:t>
+            </w:r>
+            <w:r>
+              <w:t xml:space="preserve">); evidence</w:t>
+            </w:r>
+            <w:r>
+              <w:t xml:space="preserve"> </w:t>
+            </w:r>
+            <w:r>
+              <w:rPr>
+                <w:rStyle w:val="VerbatimChar"/>
+              </w:rPr>
+              <w:t xml:space="preserve">docs/qa/HRD-115-LIVE-*</w:t>
+            </w:r>
+            <w:r>
+              <w:t xml:space="preserve">. (3)</w:t>
+            </w:r>
+            <w:r>
+              <w:t xml:space="preserve"> </w:t>
+            </w:r>
+            <w:r>
+              <w:rPr>
                 <w:b/>
                 <w:bCs/>
               </w:rPr>
-              <w:t xml:space="preserve">5462a38</w:t>
+              <w:t xml:space="preserve">Threading both channels</w:t>
+            </w:r>
+            <w:r>
+              <w:t xml:space="preserve"> </w:t>
+            </w:r>
+            <w:r>
+              <w:t xml:space="preserve">— Slack</w:t>
+            </w:r>
+            <w:r>
+              <w:t xml:space="preserve"> </w:t>
+            </w:r>
+            <w:r>
+              <w:rPr>
+                <w:rStyle w:val="VerbatimChar"/>
+              </w:rPr>
+              <w:t xml:space="preserve">thread_ts</w:t>
+            </w:r>
+            <w:r>
+              <w:t xml:space="preserve">, Telegram</w:t>
+            </w:r>
+            <w:r>
+              <w:t xml:space="preserve"> </w:t>
+            </w:r>
+            <w:r>
+              <w:rPr>
+                <w:rStyle w:val="VerbatimChar"/>
+              </w:rPr>
+              <w:t xml:space="preserve">reply_to_message_id</w:t>
+            </w:r>
+            <w:r>
+              <w:t xml:space="preserve">, via channel-agnostic</w:t>
+            </w:r>
+            <w:r>
+              <w:t xml:space="preserve"> </w:t>
+            </w:r>
+            <w:r>
+              <w:rPr>
+                <w:rStyle w:val="VerbatimChar"/>
+              </w:rPr>
+              <w:t xml:space="preserve">extractReplyToID</w:t>
+            </w:r>
+            <w:r>
+              <w:t xml:space="preserve"> </w:t>
+            </w:r>
+            <w:r>
+              <w:t xml:space="preserve">(</w:t>
+            </w:r>
+            <w:r>
+              <w:rPr>
+                <w:rStyle w:val="VerbatimChar"/>
+              </w:rPr>
+              <w:t xml:space="preserve">28af644</w:t>
+            </w:r>
+            <w:r>
+              <w:t xml:space="preserve">/</w:t>
+            </w:r>
+            <w:r>
+              <w:rPr>
+                <w:rStyle w:val="VerbatimChar"/>
+              </w:rPr>
+              <w:t xml:space="preserve">e412383</w:t>
+            </w:r>
+            <w:r>
+              <w:t xml:space="preserve">); live-proven. (4)</w:t>
+            </w:r>
+            <w:r>
+              <w:t xml:space="preserve"> </w:t>
             </w:r>
             <w:r>
               <w:rPr>
                 <w:b/>
                 <w:bCs/>
               </w:rPr>
-              <w:t xml:space="preserve">; all synced).</w:t>
-            </w:r>
-            <w:r>
-              <w:t xml:space="preserve"> </w:t>
-            </w:r>
-            <w:r>
-              <w:t xml:space="preserve">Phase 1 plan</w:t>
+              <w:t xml:space="preserve">Inbound threaded messages</w:t>
+            </w:r>
+            <w:r>
+              <w:t xml:space="preserve"> </w:t>
+            </w:r>
+            <w:r>
+              <w:t xml:space="preserve">— a Subscriber replying WITHIN a thread is answered IN the same thread; live-proven. (5)</w:t>
+            </w:r>
+            <w:r>
+              <w:t xml:space="preserve"> </w:t>
+            </w:r>
+            <w:r>
+              <w:rPr>
+                <w:b/>
+                <w:bCs/>
+              </w:rPr>
+              <w:t xml:space="preserve">Thread-context-awareness</w:t>
+            </w:r>
+            <w:r>
+              <w:t xml:space="preserve"> </w:t>
+            </w:r>
+            <w:r>
+              <w:t xml:space="preserve">(</w:t>
+            </w:r>
+            <w:r>
+              <w:rPr>
+                <w:rStyle w:val="VerbatimChar"/>
+              </w:rPr>
+              <w:t xml:space="preserve">daebefc</w:t>
+            </w:r>
+            <w:r>
+              <w:t xml:space="preserve">/</w:t>
+            </w:r>
+            <w:r>
+              <w:rPr>
+                <w:rStyle w:val="VerbatimChar"/>
+              </w:rPr>
+              <w:t xml:space="preserve">bc246a2</w:t>
+            </w:r>
+            <w:r>
+              <w:t xml:space="preserve">) —</w:t>
+            </w:r>
+            <w:r>
+              <w:t xml:space="preserve"> </w:t>
+            </w:r>
+            <w:r>
+              <w:rPr>
+                <w:rStyle w:val="VerbatimChar"/>
+              </w:rPr>
+              <w:t xml:space="preserve">InboundEvent.ThreadContext</w:t>
+            </w:r>
+            <w:r>
+              <w:t xml:space="preserve">; adapters gather the thread (Slack conversations.replies; Telegram quoted-parent, Bot-API single-parent limit documented); envelope conveys WHO (participants human/bot) + prior messages + WHAT (</w:t>
+            </w:r>
+            <w:r>
+              <w:rPr>
+                <w:rStyle w:val="VerbatimChar"/>
+              </w:rPr>
+              <w:t xml:space="preserve">detectWorkableRefs</w:t>
+            </w:r>
+            <w:r>
+              <w:t xml:space="preserve"> </w:t>
+            </w:r>
+            <w:r>
+              <w:t xml:space="preserve">HRD-N/ATM-N → names existing item, else classify newly-reported-issue/existing-item/system-event); LIVE-PROVEN BOTH channels via an</w:t>
+            </w:r>
+            <w:r>
+              <w:t xml:space="preserve"> </w:t>
+            </w:r>
+            <w:r>
+              <w:rPr>
+                <w:rStyle w:val="VerbatimChar"/>
+              </w:rPr>
+              <w:t xml:space="preserve">HERALD_CLAUDE_BIN</w:t>
+            </w:r>
+            <w:r>
+              <w:t xml:space="preserve"> </w:t>
+            </w:r>
+            <w:r>
+              <w:t xml:space="preserve">envelope-capture wrapper (the cc.dispatch JOURNAL does NOT contain the rendered envelope — only raw user message — so the wrapper captures</w:t>
+            </w:r>
+            <w:r>
+              <w:t xml:space="preserve"> </w:t>
+            </w:r>
+            <w:r>
+              <w:rPr>
+                <w:rStyle w:val="VerbatimChar"/>
+              </w:rPr>
+              <w:t xml:space="preserve">claude --print</w:t>
+            </w:r>
+            <w:r>
+              <w:t xml:space="preserve"> </w:t>
+            </w:r>
+            <w:r>
+              <w:t xml:space="preserve">argv). (6)</w:t>
+            </w:r>
+            <w:r>
+              <w:t xml:space="preserve"> </w:t>
+            </w:r>
+            <w:r>
+              <w:rPr>
+                <w:b/>
+                <w:bCs/>
+              </w:rPr>
+              <w:t xml:space="preserve">Real bug fixed</w:t>
+            </w:r>
+            <w:r>
+              <w:t xml:space="preserve"> </w:t>
+            </w:r>
+            <w:r>
+              <w:t xml:space="preserve">(</w:t>
+            </w:r>
+            <w:r>
+              <w:rPr>
+                <w:rStyle w:val="VerbatimChar"/>
+              </w:rPr>
+              <w:t xml:space="preserve">14fed75</w:t>
+            </w:r>
+            <w:r>
+              <w:t xml:space="preserve">) — fork/exec deadlock under concurrent dispatch (Setpgid child wedges fork→execve → parent blocks in forkExec pipe-read; stress test hung 10min under -race); fix = forkExecLock across cmd.Start() only; -race -count=3 stress PASS. (7)</w:t>
+            </w:r>
+            <w:r>
+              <w:t xml:space="preserve"> </w:t>
+            </w:r>
+            <w:r>
+              <w:rPr>
+                <w:rStyle w:val="VerbatimChar"/>
+              </w:rPr>
+              <w:t xml:space="preserve">mtproto.Client.SendReply</w:t>
+            </w:r>
+            <w:r>
+              <w:t xml:space="preserve"> </w:t>
+            </w:r>
+            <w:r>
+              <w:t xml:space="preserve">added (quoted reply).</w:t>
+            </w:r>
+            <w:r>
+              <w:t xml:space="preserve"> </w:t>
+            </w:r>
+            <w:r>
+              <w:rPr>
+                <w:b/>
+                <w:bCs/>
+              </w:rPr>
+              <w:t xml:space="preserve">Worked subagent-driven, max parallelism, file-DISJOINT (2 batches/7 agents); conductor = integration+commit+push seam; live tests serialized (shared channel/chat); anti-bluff real evidence, zero secrets in git (verified).</w:t>
+            </w:r>
+            <w:r>
+              <w:t xml:space="preserve"> </w:t>
+            </w:r>
+            <w:r>
+              <w:rPr>
+                <w:b/>
+                <w:bCs/>
+              </w:rPr>
+              <w:t xml:space="preserve">OPEN follow-ups (honest, candidate parallel streams for tomorrow):</w:t>
+            </w:r>
+            <w:r>
+              <w:t xml:space="preserve"> </w:t>
+            </w:r>
+            <w:r>
+              <w:t xml:space="preserve">HRD-159 (CC fresh-session empty-reply, cross-channel — Tier-2 reply not delivered; only Tier-1 deterministic + autonomy chain proven); Slack participant-handle resolution (raw user-ids not @usernames, app-token QA user shows as bot, inbound sender maps to channel-id not poster); Slack live LEG-2 occasional flakiness under heavy channel load (re-run passes); HRD-115 ready for Issues→Fixed; broader open HRDs (081, 131, 150/155/156/157/158 ATMOSphere cluster — do cohesively, 008). Live-test cheat-sheet + gotchas in</w:t>
+            </w:r>
+            <w:r>
+              <w:t xml:space="preserve"> </w:t>
+            </w:r>
+            <w:r>
+              <w:rPr>
+                <w:rStyle w:val="VerbatimChar"/>
+              </w:rPr>
+              <w:t xml:space="preserve">.remember/remember.md</w:t>
+            </w:r>
+            <w:r>
+              <w:t xml:space="preserve"> </w:t>
+            </w:r>
+            <w:r>
+              <w:t xml:space="preserve">(local). Prior r22 (2026-05-29 day-4) — ATMOSphere↔Herald workable-items integration DELIVERED end-to-end across 3 repos (Herald</w:t>
+            </w:r>
+            <w:r>
+              <w:t xml:space="preserve"> </w:t>
+            </w:r>
+            <w:r>
+              <w:rPr>
+                <w:rStyle w:val="VerbatimChar"/>
+              </w:rPr>
+              <w:t xml:space="preserve">2412512</w:t>
+            </w:r>
+            <w:r>
+              <w:t xml:space="preserve"> </w:t>
+            </w:r>
+            <w:r>
+              <w:t xml:space="preserve">/ HelixConstitution</w:t>
+            </w:r>
+            <w:r>
+              <w:t xml:space="preserve"> </w:t>
+            </w:r>
+            <w:r>
+              <w:rPr>
+                <w:rStyle w:val="VerbatimChar"/>
+              </w:rPr>
+              <w:t xml:space="preserve">8ec2b38</w:t>
+            </w:r>
+            <w:r>
+              <w:t xml:space="preserve"> </w:t>
+            </w:r>
+            <w:r>
+              <w:t xml:space="preserve">/ ATMOSphere</w:t>
+            </w:r>
+            <w:r>
+              <w:t xml:space="preserve"> </w:t>
+            </w:r>
+            <w:r>
+              <w:rPr>
+                <w:rStyle w:val="VerbatimChar"/>
+              </w:rPr>
+              <w:t xml:space="preserve">5462a38</w:t>
+            </w:r>
+            <w:r>
+              <w:t xml:space="preserve">; all synced).** Phase 1 plan</w:t>
             </w:r>
             <w:r>
               <w:t xml:space="preserve"> </w:t>
@@ -3331,13 +3763,13 @@
         <w:rPr>
           <w:rStyle w:val="VerbatimChar"/>
         </w:rPr>
-        <w:t xml:space="preserve">bff48a5</w:t>
-      </w:r>
-      <w:r>
-        <w:t xml:space="preserve"> </w:t>
-      </w:r>
-      <w:r>
-        <w:t xml:space="preserve">(2026-05-31).</w:t>
+        <w:t xml:space="preserve">14fed75</w:t>
+      </w:r>
+      <w:r>
+        <w:t xml:space="preserve"> </w:t>
+      </w:r>
+      <w:r>
+        <w:t xml:space="preserve">(2026-06-02).</w:t>
       </w:r>
       <w:r>
         <w:t xml:space="preserve"> </w:t>
@@ -3350,7 +3782,22 @@
         <w:t xml:space="preserve">All 4 mirrors (GitHub / GitLab / GitFlic / GitVerse) in sync</w:t>
       </w:r>
       <w:r>
-        <w:t xml:space="preserve">; all 9 Helix-stack submodules +</w:t>
+        <w:t xml:space="preserve"> </w:t>
+      </w:r>
+      <w:r>
+        <w:t xml:space="preserve">(verified via</w:t>
+      </w:r>
+      <w:r>
+        <w:t xml:space="preserve"> </w:t>
+      </w:r>
+      <w:r>
+        <w:rPr>
+          <w:rStyle w:val="VerbatimChar"/>
+        </w:rPr>
+        <w:t xml:space="preserve">ls-remote</w:t>
+      </w:r>
+      <w:r>
+        <w:t xml:space="preserve">); all 9 Helix-stack submodules +</w:t>
       </w:r>
       <w:r>
         <w:t xml:space="preserve"> </w:t>
@@ -3389,7 +3836,19 @@
         <w:t xml:space="preserve">~/Projects/docs_chain</w:t>
       </w:r>
       <w:r>
-        <w:t xml:space="preserve">) clean + pushed.</w:t>
+        <w:t xml:space="preserve">) clean + pushed at</w:t>
+      </w:r>
+      <w:r>
+        <w:t xml:space="preserve"> </w:t>
+      </w:r>
+      <w:r>
+        <w:rPr>
+          <w:rStyle w:val="VerbatimChar"/>
+        </w:rPr>
+        <w:t xml:space="preserve">02eb81b</w:t>
+      </w:r>
+      <w:r>
+        <w:t xml:space="preserve">.</w:t>
       </w:r>
     </w:p>
     <w:p>
@@ -5293,6 +5752,203 @@
     <w:p>
       <w:pPr>
         <w:pStyle w:val="FirstParagraph"/>
+      </w:pPr>
+      <w:r>
+        <w:rPr>
+          <w:b/>
+          <w:bCs/>
+        </w:rPr>
+        <w:t xml:space="preserve">2026-06-02 — Messaging features (Slack live parity + threading + thread-context) COMPLETE + live-proven + pushed. NOTHING IN FLIGHT.</w:t>
+      </w:r>
+      <w:r>
+        <w:t xml:space="preserve"> </w:t>
+      </w:r>
+      <w:r>
+        <w:t xml:space="preserve">Clean checkpoint: Herald</w:t>
+      </w:r>
+      <w:r>
+        <w:t xml:space="preserve"> </w:t>
+      </w:r>
+      <w:r>
+        <w:rPr>
+          <w:rStyle w:val="VerbatimChar"/>
+        </w:rPr>
+        <w:t xml:space="preserve">14fed75</w:t>
+      </w:r>
+      <w:r>
+        <w:t xml:space="preserve"> </w:t>
+      </w:r>
+      <w:r>
+        <w:t xml:space="preserve">on all 4 mirrors (ls-remote verified), docs_chain</w:t>
+      </w:r>
+      <w:r>
+        <w:t xml:space="preserve"> </w:t>
+      </w:r>
+      <w:r>
+        <w:rPr>
+          <w:rStyle w:val="VerbatimChar"/>
+        </w:rPr>
+        <w:t xml:space="preserve">02eb81b</w:t>
+      </w:r>
+      <w:r>
+        <w:t xml:space="preserve"> </w:t>
+      </w:r>
+      <w:r>
+        <w:t xml:space="preserve">origin, all submodules clean. The day's work (docs_chain integration, Slack live parity, threading both channels, inbound-threaded processing, thread-context-awareness with participants+subject, fork/exec deadlock fix, mtproto SendReply) is summarized in the r25 Status-summary above with commit ids; live evidence under</w:t>
+      </w:r>
+      <w:r>
+        <w:t xml:space="preserve"> </w:t>
+      </w:r>
+      <w:r>
+        <w:rPr>
+          <w:rStyle w:val="VerbatimChar"/>
+        </w:rPr>
+        <w:t xml:space="preserve">docs/qa/HRD-115-LIVE-*</w:t>
+      </w:r>
+      <w:r>
+        <w:t xml:space="preserve"> </w:t>
+      </w:r>
+      <w:r>
+        <w:t xml:space="preserve">+</w:t>
+      </w:r>
+      <w:r>
+        <w:t xml:space="preserve"> </w:t>
+      </w:r>
+      <w:r>
+        <w:rPr>
+          <w:rStyle w:val="VerbatimChar"/>
+        </w:rPr>
+        <w:t xml:space="preserve">docs/qa/HRD-thread-context-tgram-*</w:t>
+      </w:r>
+      <w:r>
+        <w:t xml:space="preserve">. Worked subagent-driven (2 batches/7 agents, file-disjoint, conductor-integrated).</w:t>
+      </w:r>
+      <w:r>
+        <w:t xml:space="preserve"> </w:t>
+      </w:r>
+      <w:r>
+        <w:rPr>
+          <w:b/>
+          <w:bCs/>
+        </w:rPr>
+        <w:t xml:space="preserve">OPEN follow-ups (next session — candidate parallel streams):</w:t>
+      </w:r>
+      <w:r>
+        <w:t xml:space="preserve"> </w:t>
+      </w:r>
+      <w:r>
+        <w:t xml:space="preserve">(1)</w:t>
+      </w:r>
+      <w:r>
+        <w:t xml:space="preserve"> </w:t>
+      </w:r>
+      <w:r>
+        <w:rPr>
+          <w:b/>
+          <w:bCs/>
+        </w:rPr>
+        <w:t xml:space="preserve">HRD-159</w:t>
+      </w:r>
+      <w:r>
+        <w:t xml:space="preserve"> </w:t>
+      </w:r>
+      <w:r>
+        <w:t xml:space="preserve">CC fresh-session empty-reply (cross-channel — Tier-2 CC reply not delivered; touches</w:t>
+      </w:r>
+      <w:r>
+        <w:t xml:space="preserve"> </w:t>
+      </w:r>
+      <w:r>
+        <w:rPr>
+          <w:rStyle w:val="VerbatimChar"/>
+        </w:rPr>
+        <w:t xml:space="preserve">commons_messaging/dispatch/claude_code</w:t>
+      </w:r>
+      <w:r>
+        <w:t xml:space="preserve">). (2)</w:t>
+      </w:r>
+      <w:r>
+        <w:t xml:space="preserve"> </w:t>
+      </w:r>
+      <w:r>
+        <w:rPr>
+          <w:b/>
+          <w:bCs/>
+        </w:rPr>
+        <w:t xml:space="preserve">Slack participant-handle resolution</w:t>
+      </w:r>
+      <w:r>
+        <w:t xml:space="preserve"> </w:t>
+      </w:r>
+      <w:r>
+        <w:t xml:space="preserve">— thread-context Participants show raw Slack user-ids not @usernames, the app-associated QA user shows as "bot", and the Slack inbound sender maps to the channel-id not the poster (touches</w:t>
+      </w:r>
+      <w:r>
+        <w:t xml:space="preserve"> </w:t>
+      </w:r>
+      <w:r>
+        <w:rPr>
+          <w:rStyle w:val="VerbatimChar"/>
+        </w:rPr>
+        <w:t xml:space="preserve">commons_messaging/channels/slack/</w:t>
+      </w:r>
+      <w:r>
+        <w:t xml:space="preserve"> </w:t>
+      </w:r>
+      <w:r>
+        <w:t xml:space="preserve">+ the §11.4.104 resolver). (3)</w:t>
+      </w:r>
+      <w:r>
+        <w:t xml:space="preserve"> </w:t>
+      </w:r>
+      <w:r>
+        <w:rPr>
+          <w:b/>
+          <w:bCs/>
+        </w:rPr>
+        <w:t xml:space="preserve">Slack live LEG-2 flakiness</w:t>
+      </w:r>
+      <w:r>
+        <w:t xml:space="preserve"> </w:t>
+      </w:r>
+      <w:r>
+        <w:t xml:space="preserve">under heavy same-channel load (re-run passes — consider adaptive timeout / channel cleanup). (4)</w:t>
+      </w:r>
+      <w:r>
+        <w:t xml:space="preserve"> </w:t>
+      </w:r>
+      <w:r>
+        <w:rPr>
+          <w:b/>
+          <w:bCs/>
+        </w:rPr>
+        <w:t xml:space="preserve">HRD-115</w:t>
+      </w:r>
+      <w:r>
+        <w:t xml:space="preserve"> </w:t>
+      </w:r>
+      <w:r>
+        <w:t xml:space="preserve">is round-trip+threading+context live-proven → ready for Issues→Fixed (§11.4.19). (5) Broader open HRDs (081, 131, 150/155/156/157/158 ATMOSphere cluster — cohesive not split, 008). Live-test cheat-sheet + gotchas in</w:t>
+      </w:r>
+      <w:r>
+        <w:t xml:space="preserve"> </w:t>
+      </w:r>
+      <w:r>
+        <w:rPr>
+          <w:rStyle w:val="VerbatimChar"/>
+        </w:rPr>
+        <w:t xml:space="preserve">.remember/remember.md</w:t>
+      </w:r>
+      <w:r>
+        <w:t xml:space="preserve"> </w:t>
+      </w:r>
+      <w:r>
+        <w:t xml:space="preserve">(local-only handoff buffer).</w:t>
+      </w:r>
+    </w:p>
+    <w:p>
+      <w:pPr>
+        <w:pStyle w:val="BodyText"/>
       </w:pPr>
       <w:r>
         <w:rPr>

</xml_diff>

<commit_message>
docs(continuation): r26 — autonomous parallel batch; HRD-115/081 Fixed, 8 open all external-dep-blocked
Records the 4-stream subagent batch (HRD-159 partial, Slack resolution,
HRD-081 fixed upstream) + the v1.0.0 audit + the HRD-115/081 Issues->Fixed
migration. Documents that the remaining 8 open HRDs are all blocked on
external deps in this environment (ATMOSphere repo not checked out; live/
operator confirmations) and lists the exact operator unblock-inputs.

Co-Authored-By: Claude Opus 4.8 <noreply@anthropic.com>
</commit_message>
<xml_diff>
--- a/docs/CONTINUATION.docx
+++ b/docs/CONTINUATION.docx
@@ -75,7 +75,7 @@
               <w:pStyle w:val="Compact"/>
             </w:pPr>
             <w:r>
-              <w:t xml:space="preserve">24</w:t>
+              <w:t xml:space="preserve">25</w:t>
             </w:r>
           </w:p>
         </w:tc>
@@ -170,6 +170,537 @@
             <w:pPr>
               <w:pStyle w:val="Compact"/>
             </w:pPr>
+            <w:r>
+              <w:rPr>
+                <w:b/>
+                <w:bCs/>
+              </w:rPr>
+              <w:t xml:space="preserve">r26 (2026-06-02) — Autonomous parallel batch (operator mandate: 3-5 subagent-driven streams, max parallelism). Ran 4 file-disjoint streams + 1 migration agent; conductor = integration+commit+push seam (subagents did NOT touch git or mutation gates — §107.y quiescence held by construction). DELIVERED (Herald</w:t>
+            </w:r>
+            <w:r>
+              <w:rPr>
+                <w:b/>
+                <w:bCs/>
+              </w:rPr>
+              <w:t xml:space="preserve"> </w:t>
+            </w:r>
+            <w:r>
+              <w:rPr>
+                <w:rStyle w:val="VerbatimChar"/>
+                <w:b/>
+                <w:bCs/>
+              </w:rPr>
+              <w:t xml:space="preserve">f0c7858</w:t>
+            </w:r>
+            <w:r>
+              <w:rPr>
+                <w:b/>
+                <w:bCs/>
+              </w:rPr>
+              <w:t xml:space="preserve">→</w:t>
+            </w:r>
+            <w:r>
+              <w:rPr>
+                <w:rStyle w:val="VerbatimChar"/>
+                <w:b/>
+                <w:bCs/>
+              </w:rPr>
+              <w:t xml:space="preserve">4534fb4</w:t>
+            </w:r>
+            <w:r>
+              <w:rPr>
+                <w:b/>
+                <w:bCs/>
+              </w:rPr>
+              <w:t xml:space="preserve">, 5 commits + containers</w:t>
+            </w:r>
+            <w:r>
+              <w:rPr>
+                <w:b/>
+                <w:bCs/>
+              </w:rPr>
+              <w:t xml:space="preserve"> </w:t>
+            </w:r>
+            <w:r>
+              <w:rPr>
+                <w:rStyle w:val="VerbatimChar"/>
+                <w:b/>
+                <w:bCs/>
+              </w:rPr>
+              <w:t xml:space="preserve">222fb90</w:t>
+            </w:r>
+            <w:r>
+              <w:rPr>
+                <w:b/>
+                <w:bCs/>
+              </w:rPr>
+              <w:t xml:space="preserve">; all 4 mirrors verified at</w:t>
+            </w:r>
+            <w:r>
+              <w:rPr>
+                <w:b/>
+                <w:bCs/>
+              </w:rPr>
+              <w:t xml:space="preserve"> </w:t>
+            </w:r>
+            <w:r>
+              <w:rPr>
+                <w:rStyle w:val="VerbatimChar"/>
+                <w:b/>
+                <w:bCs/>
+              </w:rPr>
+              <w:t xml:space="preserve">4534fb4</w:t>
+            </w:r>
+            <w:r>
+              <w:rPr>
+                <w:b/>
+                <w:bCs/>
+              </w:rPr>
+              <w:t xml:space="preserve"> </w:t>
+            </w:r>
+            <w:r>
+              <w:rPr>
+                <w:b/>
+                <w:bCs/>
+              </w:rPr>
+              <w:t xml:space="preserve">via ls-remote; submodule pushed): (1) HRD-159 PARTIAL — seeded</w:t>
+            </w:r>
+            <w:r>
+              <w:rPr>
+                <w:b/>
+                <w:bCs/>
+              </w:rPr>
+              <w:t xml:space="preserve"> </w:t>
+            </w:r>
+            <w:r>
+              <w:rPr>
+                <w:rStyle w:val="VerbatimChar"/>
+                <w:b/>
+                <w:bCs/>
+              </w:rPr>
+              <w:t xml:space="preserve">bootstrapPrompt</w:t>
+            </w:r>
+            <w:r>
+              <w:rPr>
+                <w:b/>
+                <w:bCs/>
+              </w:rPr>
+              <w:t xml:space="preserve"> </w:t>
+            </w:r>
+            <w:r>
+              <w:rPr>
+                <w:b/>
+                <w:bCs/>
+              </w:rPr>
+              <w:t xml:space="preserve">with a permanent STANDING CONTRACT so a fresh CC session never returns empty (</w:t>
+            </w:r>
+            <w:r>
+              <w:rPr>
+                <w:rStyle w:val="VerbatimChar"/>
+                <w:b/>
+                <w:bCs/>
+              </w:rPr>
+              <w:t xml:space="preserve">f0c7858</w:t>
+            </w:r>
+            <w:r>
+              <w:rPr>
+                <w:b/>
+                <w:bCs/>
+              </w:rPr>
+              <w:t xml:space="preserve">); deterministic full-automation test (</w:t>
+            </w:r>
+            <w:r>
+              <w:rPr>
+                <w:rStyle w:val="VerbatimChar"/>
+                <w:b/>
+                <w:bCs/>
+              </w:rPr>
+              <w:t xml:space="preserve">HERALD_CLAUDE_BIN</w:t>
+            </w:r>
+            <w:r>
+              <w:rPr>
+                <w:b/>
+                <w:bCs/>
+              </w:rPr>
+              <w:t xml:space="preserve"> </w:t>
+            </w:r>
+            <w:r>
+              <w:rPr>
+                <w:b/>
+                <w:bCs/>
+              </w:rPr>
+              <w:t xml:space="preserve">stateful fake, paired negative + revert-guard); stays OPEN pending real-Claude live confirmation. (2) Slack participant-handle resolution (</w:t>
+            </w:r>
+            <w:r>
+              <w:rPr>
+                <w:rStyle w:val="VerbatimChar"/>
+                <w:b/>
+                <w:bCs/>
+              </w:rPr>
+              <w:t xml:space="preserve">7e7a04e</w:t>
+            </w:r>
+            <w:r>
+              <w:rPr>
+                <w:b/>
+                <w:bCs/>
+              </w:rPr>
+              <w:t xml:space="preserve">) —</w:t>
+            </w:r>
+            <w:r>
+              <w:rPr>
+                <w:b/>
+                <w:bCs/>
+              </w:rPr>
+              <w:t xml:space="preserve"> </w:t>
+            </w:r>
+            <w:r>
+              <w:rPr>
+                <w:rStyle w:val="VerbatimChar"/>
+                <w:b/>
+                <w:bCs/>
+              </w:rPr>
+              <w:t xml:space="preserve">resolveUserHandle</w:t>
+            </w:r>
+            <w:r>
+              <w:rPr>
+                <w:b/>
+                <w:bCs/>
+              </w:rPr>
+              <w:t xml:space="preserve"> </w:t>
+            </w:r>
+            <w:r>
+              <w:rPr>
+                <w:b/>
+                <w:bCs/>
+              </w:rPr>
+              <w:t xml:space="preserve">(users.info, cached) maps ids→@handles; inbound Sender = poster (</w:t>
+            </w:r>
+            <w:r>
+              <w:rPr>
+                <w:rStyle w:val="VerbatimChar"/>
+                <w:b/>
+                <w:bCs/>
+              </w:rPr>
+              <w:t xml:space="preserve">inner.User</w:t>
+            </w:r>
+            <w:r>
+              <w:rPr>
+                <w:b/>
+                <w:bCs/>
+              </w:rPr>
+              <w:t xml:space="preserve">) not channel; bot/app user resolves to real handle; httptest-proven, hit-counted, paired-mutation-verified. (3) HRD-081 FIXED — podman-compose detection landed UPSTREAM (containers</w:t>
+            </w:r>
+            <w:r>
+              <w:rPr>
+                <w:b/>
+                <w:bCs/>
+              </w:rPr>
+              <w:t xml:space="preserve"> </w:t>
+            </w:r>
+            <w:r>
+              <w:rPr>
+                <w:rStyle w:val="VerbatimChar"/>
+                <w:b/>
+                <w:bCs/>
+              </w:rPr>
+              <w:t xml:space="preserve">222fb90</w:t>
+            </w:r>
+            <w:r>
+              <w:rPr>
+                <w:b/>
+                <w:bCs/>
+              </w:rPr>
+              <w:t xml:space="preserve">: omit</w:t>
+            </w:r>
+            <w:r>
+              <w:rPr>
+                <w:b/>
+                <w:bCs/>
+              </w:rPr>
+              <w:t xml:space="preserve"> </w:t>
+            </w:r>
+            <w:r>
+              <w:rPr>
+                <w:rStyle w:val="VerbatimChar"/>
+                <w:b/>
+                <w:bCs/>
+              </w:rPr>
+              <w:t xml:space="preserve">--wait</w:t>
+            </w:r>
+            <w:r>
+              <w:rPr>
+                <w:b/>
+                <w:bCs/>
+              </w:rPr>
+              <w:t xml:space="preserve"> </w:t>
+            </w:r>
+            <w:r>
+              <w:rPr>
+                <w:b/>
+                <w:bCs/>
+              </w:rPr>
+              <w:t xml:space="preserve">+ host-poll fallback; fix</w:t>
+            </w:r>
+            <w:r>
+              <w:rPr>
+                <w:b/>
+                <w:bCs/>
+              </w:rPr>
+              <w:t xml:space="preserve"> </w:t>
+            </w:r>
+            <w:r>
+              <w:rPr>
+                <w:rStyle w:val="VerbatimChar"/>
+                <w:b/>
+                <w:bCs/>
+              </w:rPr>
+              <w:t xml:space="preserve">Status()</w:t>
+            </w:r>
+            <w:r>
+              <w:rPr>
+                <w:b/>
+                <w:bCs/>
+              </w:rPr>
+              <w:t xml:space="preserve"> </w:t>
+            </w:r>
+            <w:r>
+              <w:rPr>
+                <w:b/>
+                <w:bCs/>
+              </w:rPr>
+              <w:t xml:space="preserve">ps JSON — old docker template saw 0 services because podman ps uses</w:t>
+            </w:r>
+            <w:r>
+              <w:rPr>
+                <w:b/>
+                <w:bCs/>
+              </w:rPr>
+              <w:t xml:space="preserve"> </w:t>
+            </w:r>
+            <w:r>
+              <w:rPr>
+                <w:rStyle w:val="VerbatimChar"/>
+                <w:b/>
+                <w:bCs/>
+              </w:rPr>
+              <w:t xml:space="preserve">Names</w:t>
+            </w:r>
+            <w:r>
+              <w:rPr>
+                <w:b/>
+                <w:bCs/>
+              </w:rPr>
+              <w:t xml:space="preserve">≠</w:t>
+            </w:r>
+            <w:r>
+              <w:rPr>
+                <w:rStyle w:val="VerbatimChar"/>
+                <w:b/>
+                <w:bCs/>
+              </w:rPr>
+              <w:t xml:space="preserve">Name</w:t>
+            </w:r>
+            <w:r>
+              <w:rPr>
+                <w:b/>
+                <w:bCs/>
+              </w:rPr>
+              <w:t xml:space="preserve">); live-proven podman-compose 1.5.0/podman 5.8.2; Herald pointer</w:t>
+            </w:r>
+            <w:r>
+              <w:rPr>
+                <w:b/>
+                <w:bCs/>
+              </w:rPr>
+              <w:t xml:space="preserve"> </w:t>
+            </w:r>
+            <w:r>
+              <w:rPr>
+                <w:rStyle w:val="VerbatimChar"/>
+                <w:b/>
+                <w:bCs/>
+              </w:rPr>
+              <w:t xml:space="preserve">af48c97</w:t>
+            </w:r>
+            <w:r>
+              <w:rPr>
+                <w:b/>
+                <w:bCs/>
+              </w:rPr>
+              <w:t xml:space="preserve">; §107.x evidence</w:t>
+            </w:r>
+            <w:r>
+              <w:rPr>
+                <w:b/>
+                <w:bCs/>
+              </w:rPr>
+              <w:t xml:space="preserve"> </w:t>
+            </w:r>
+            <w:r>
+              <w:rPr>
+                <w:rStyle w:val="VerbatimChar"/>
+                <w:b/>
+                <w:bCs/>
+              </w:rPr>
+              <w:t xml:space="preserve">docs/qa/HRD-081-20260602/</w:t>
+            </w:r>
+            <w:r>
+              <w:rPr>
+                <w:b/>
+                <w:bCs/>
+              </w:rPr>
+              <w:t xml:space="preserve">. (4) v1.0.0 readiness audit (</w:t>
+            </w:r>
+            <w:r>
+              <w:rPr>
+                <w:rStyle w:val="VerbatimChar"/>
+                <w:b/>
+                <w:bCs/>
+              </w:rPr>
+              <w:t xml:space="preserve">docs/qa/v1_0_0_migration_audit/manifest.md</w:t>
+            </w:r>
+            <w:r>
+              <w:rPr>
+                <w:b/>
+                <w:bCs/>
+              </w:rPr>
+              <w:t xml:space="preserve">) — corrected a STALE premise ("~52 stuck HRDs"; that bulk migration already happened r43-r47). (5) §11.4.19 atomic migration HRD-115 + HRD-081 Issues→Fixed (</w:t>
+            </w:r>
+            <w:r>
+              <w:rPr>
+                <w:rStyle w:val="VerbatimChar"/>
+                <w:b/>
+                <w:bCs/>
+              </w:rPr>
+              <w:t xml:space="preserve">4534fb4</w:t>
+            </w:r>
+            <w:r>
+              <w:rPr>
+                <w:b/>
+                <w:bCs/>
+              </w:rPr>
+              <w:t xml:space="preserve">; Issues r48→r49, Fixed r23→r24, open 10→8, siblings regenerated, stale</w:t>
+            </w:r>
+            <w:r>
+              <w:rPr>
+                <w:b/>
+                <w:bCs/>
+              </w:rPr>
+              <w:t xml:space="preserve"> </w:t>
+            </w:r>
+            <w:r>
+              <w:rPr>
+                <w:rStyle w:val="VerbatimChar"/>
+                <w:b/>
+                <w:bCs/>
+              </w:rPr>
+              <w:t xml:space="preserve">| Issues |</w:t>
+            </w:r>
+            <w:r>
+              <w:rPr>
+                <w:b/>
+                <w:bCs/>
+              </w:rPr>
+              <w:t xml:space="preserve"> </w:t>
+            </w:r>
+            <w:r>
+              <w:rPr>
+                <w:b/>
+                <w:bCs/>
+              </w:rPr>
+              <w:t xml:space="preserve">line reconciled).</w:t>
+            </w:r>
+            <w:r>
+              <w:rPr>
+                <w:b/>
+                <w:bCs/>
+              </w:rPr>
+              <w:t xml:space="preserve"> </w:t>
+            </w:r>
+            <w:r>
+              <w:rPr>
+                <w:b/>
+                <w:b/>
+                <w:bCs/>
+                <w:bCs/>
+              </w:rPr>
+              <w:t xml:space="preserve">REMAINING 8 OPEN — ALL external-dependency-blocked in this environment (§11.4.87(E)/§11.4.94 idle-permitted):</w:t>
+            </w:r>
+            <w:r>
+              <w:rPr>
+                <w:b/>
+                <w:bCs/>
+              </w:rPr>
+              <w:t xml:space="preserve"> </w:t>
+            </w:r>
+            <w:r>
+              <w:rPr>
+                <w:b/>
+                <w:bCs/>
+              </w:rPr>
+              <w:t xml:space="preserve">HRD-159 + HRD-008 need LIVE/operator confirmation; HRD-150/155 upstream tool is DONE+tested (</w:t>
+            </w:r>
+            <w:r>
+              <w:rPr>
+                <w:rStyle w:val="VerbatimChar"/>
+                <w:b/>
+                <w:bCs/>
+              </w:rPr>
+              <w:t xml:space="preserve">constitution/scripts/workable-items/</w:t>
+            </w:r>
+            <w:r>
+              <w:rPr>
+                <w:b/>
+                <w:bCs/>
+              </w:rPr>
+              <w:t xml:space="preserve"> </w:t>
+            </w:r>
+            <w:r>
+              <w:rPr>
+                <w:b/>
+                <w:bCs/>
+              </w:rPr>
+              <w:t xml:space="preserve">has sync/diff/validate/add/update/reopen/close/report + atmosphere parser, suite green) but kept OPEN — operator wants the ATMOSphere cluster (150/155/156/157/158/131) COHESIVE, and end-to-end §107 verification needs the ATMOSphere repo which is NOT checked out at ~/Projects; HRD-156/157/158/131-materialization are ATMOSphere cross-repo.</w:t>
+            </w:r>
+            <w:r>
+              <w:rPr>
+                <w:b/>
+                <w:bCs/>
+              </w:rPr>
+              <w:t xml:space="preserve"> </w:t>
+            </w:r>
+            <w:r>
+              <w:rPr>
+                <w:b/>
+                <w:b/>
+                <w:bCs/>
+                <w:bCs/>
+              </w:rPr>
+              <w:t xml:space="preserve">UNBLOCK INPUTS NEEDED FROM OPERATOR:</w:t>
+            </w:r>
+            <w:r>
+              <w:rPr>
+                <w:b/>
+                <w:bCs/>
+              </w:rPr>
+              <w:t xml:space="preserve"> </w:t>
+            </w:r>
+            <w:r>
+              <w:rPr>
+                <w:b/>
+                <w:bCs/>
+              </w:rPr>
+              <w:t xml:space="preserve">(a) provide/point to the ATMOSphere working copy to progress the cluster; (b) run the HRD-159/008/115 live confirmations; (c) authorize splitting the cluster to close 150/155 on upstream-tests-alone (NOT recommended without ATMOSphere e2e).</w:t>
+            </w:r>
+            <w:r>
+              <w:t xml:space="preserve"> </w:t>
+            </w:r>
+            <w:r>
+              <w:t xml:space="preserve">Prior</w:t>
+            </w:r>
+            <w:r>
+              <w:t xml:space="preserve"> </w:t>
+            </w:r>
             <w:r>
               <w:rPr>
                 <w:b/>
@@ -5752,6 +6283,160 @@
     <w:p>
       <w:pPr>
         <w:pStyle w:val="FirstParagraph"/>
+      </w:pPr>
+      <w:r>
+        <w:rPr>
+          <w:b/>
+          <w:bCs/>
+        </w:rPr>
+        <w:t xml:space="preserve">2026-06-02 (r26) — Autonomous parallel batch COMPLETE + pushed. NOTHING IN FLIGHT.</w:t>
+      </w:r>
+      <w:r>
+        <w:t xml:space="preserve"> </w:t>
+      </w:r>
+      <w:r>
+        <w:t xml:space="preserve">Clean checkpoint: Herald</w:t>
+      </w:r>
+      <w:r>
+        <w:t xml:space="preserve"> </w:t>
+      </w:r>
+      <w:r>
+        <w:rPr>
+          <w:rStyle w:val="VerbatimChar"/>
+        </w:rPr>
+        <w:t xml:space="preserve">4534fb4</w:t>
+      </w:r>
+      <w:r>
+        <w:t xml:space="preserve"> </w:t>
+      </w:r>
+      <w:r>
+        <w:t xml:space="preserve">on all 4 mirrors (ls-remote verified), containers submodule</w:t>
+      </w:r>
+      <w:r>
+        <w:t xml:space="preserve"> </w:t>
+      </w:r>
+      <w:r>
+        <w:rPr>
+          <w:rStyle w:val="VerbatimChar"/>
+        </w:rPr>
+        <w:t xml:space="preserve">222fb90</w:t>
+      </w:r>
+      <w:r>
+        <w:t xml:space="preserve"> </w:t>
+      </w:r>
+      <w:r>
+        <w:t xml:space="preserve">pushed. Delivered via 4 file-disjoint subagent streams + 1 migration agent (conductor integrated/committed/pushed serially; subagents never ran git or mutation gates): HRD-159 seeding fix (partial,</w:t>
+      </w:r>
+      <w:r>
+        <w:t xml:space="preserve"> </w:t>
+      </w:r>
+      <w:r>
+        <w:rPr>
+          <w:rStyle w:val="VerbatimChar"/>
+        </w:rPr>
+        <w:t xml:space="preserve">f0c7858</w:t>
+      </w:r>
+      <w:r>
+        <w:t xml:space="preserve">), Slack participant-handle resolution (</w:t>
+      </w:r>
+      <w:r>
+        <w:rPr>
+          <w:rStyle w:val="VerbatimChar"/>
+        </w:rPr>
+        <w:t xml:space="preserve">7e7a04e</w:t>
+      </w:r>
+      <w:r>
+        <w:t xml:space="preserve">), HRD-081 podman-compose fix upstream (</w:t>
+      </w:r>
+      <w:r>
+        <w:rPr>
+          <w:rStyle w:val="VerbatimChar"/>
+        </w:rPr>
+        <w:t xml:space="preserve">222fb90</w:t>
+      </w:r>
+      <w:r>
+        <w:t xml:space="preserve">/</w:t>
+      </w:r>
+      <w:r>
+        <w:rPr>
+          <w:rStyle w:val="VerbatimChar"/>
+        </w:rPr>
+        <w:t xml:space="preserve">af48c97</w:t>
+      </w:r>
+      <w:r>
+        <w:t xml:space="preserve">,</w:t>
+      </w:r>
+      <w:r>
+        <w:t xml:space="preserve"> </w:t>
+      </w:r>
+      <w:r>
+        <w:rPr>
+          <w:b/>
+          <w:bCs/>
+        </w:rPr>
+        <w:t xml:space="preserve">Fixed</w:t>
+      </w:r>
+      <w:r>
+        <w:t xml:space="preserve">), v1.0.0 readiness audit + §11.4.19 migration of HRD-115 + HRD-081 (</w:t>
+      </w:r>
+      <w:r>
+        <w:rPr>
+          <w:b/>
+          <w:bCs/>
+        </w:rPr>
+        <w:t xml:space="preserve">Fixed</w:t>
+      </w:r>
+      <w:r>
+        <w:t xml:space="preserve">; open 10→8).</w:t>
+      </w:r>
+      <w:r>
+        <w:t xml:space="preserve"> </w:t>
+      </w:r>
+      <w:r>
+        <w:rPr>
+          <w:b/>
+          <w:bCs/>
+        </w:rPr>
+        <w:t xml:space="preserve">All 8 remaining open HRDs are external-dependency-blocked in this environment — the autonomous loop is at a legitimate idle point (§11.4.87(E)).</w:t>
+      </w:r>
+      <w:r>
+        <w:t xml:space="preserve"> </w:t>
+      </w:r>
+      <w:r>
+        <w:t xml:space="preserve">Blockers + the exact operator unblock-inputs are in the r26 Status-summary above. KEY: the constitution workable-items tool (HRD-150/155 substrate) is already implemented + tested upstream, but the ATMOSphere repo is NOT checked out at</w:t>
+      </w:r>
+      <w:r>
+        <w:t xml:space="preserve"> </w:t>
+      </w:r>
+      <w:r>
+        <w:rPr>
+          <w:rStyle w:val="VerbatimChar"/>
+        </w:rPr>
+        <w:t xml:space="preserve">~/Projects/ATMOSphere</w:t>
+      </w:r>
+      <w:r>
+        <w:t xml:space="preserve">, so the ATMOSphere cluster (150/155/156/157/158 + HRD-131 DB materialization) cannot be e2e-verified/closed here; operator wants the cluster handled cohesively. HRD-159/008/115-live need operator-run live confirmations.</w:t>
+      </w:r>
+      <w:r>
+        <w:t xml:space="preserve"> </w:t>
+      </w:r>
+      <w:r>
+        <w:rPr>
+          <w:b/>
+          <w:bCs/>
+        </w:rPr>
+        <w:t xml:space="preserve">NEXT SESSION:</w:t>
+      </w:r>
+      <w:r>
+        <w:t xml:space="preserve"> </w:t>
+      </w:r>
+      <w:r>
+        <w:t xml:space="preserve">operator provides ATMOSphere checkout → resume the cohesive ATMOSphere cluster; OR run the live confirmations for HRD-159/008.</w:t>
+      </w:r>
+    </w:p>
+    <w:p>
+      <w:pPr>
+        <w:pStyle w:val="BodyText"/>
       </w:pPr>
       <w:r>
         <w:rPr>

</xml_diff>

<commit_message>
docs(continuation): r27 — docs_chain installed + Batch 2 (E148 gate, inbound delivery test, CLAUDE r22)
Siblings via docs_chain sync (verify herald-docs in-sync). Records the routine
doc-flow rule: edit .md -> docs_chain sync -> verify -> commit.

Co-Authored-By: Claude Opus 4.8 <noreply@anthropic.com>
</commit_message>
<xml_diff>
--- a/docs/CONTINUATION.docx
+++ b/docs/CONTINUATION.docx
@@ -75,7 +75,7 @@
               <w:pStyle w:val="Compact"/>
             </w:pPr>
             <w:r>
-              <w:t xml:space="preserve">25</w:t>
+              <w:t xml:space="preserve">26</w:t>
             </w:r>
           </w:p>
         </w:tc>
@@ -6283,6 +6283,348 @@
     <w:p>
       <w:pPr>
         <w:pStyle w:val="FirstParagraph"/>
+      </w:pPr>
+      <w:r>
+        <w:rPr>
+          <w:b/>
+          <w:bCs/>
+        </w:rPr>
+        <w:t xml:space="preserve">2026-06-02 (r27) — docs_chain INSTALLED + Batch 2 (3 parallel streams) COMPLETE + pushed. NOTHING IN FLIGHT.</w:t>
+      </w:r>
+      <w:r>
+        <w:t xml:space="preserve"> </w:t>
+      </w:r>
+      <w:r>
+        <w:t xml:space="preserve">Herald</w:t>
+      </w:r>
+      <w:r>
+        <w:t xml:space="preserve"> </w:t>
+      </w:r>
+      <w:r>
+        <w:rPr>
+          <w:rStyle w:val="VerbatimChar"/>
+        </w:rPr>
+        <w:t xml:space="preserve">f776b90</w:t>
+      </w:r>
+      <w:r>
+        <w:t xml:space="preserve"> </w:t>
+      </w:r>
+      <w:r>
+        <w:t xml:space="preserve">on all 4 mirrors (ls-remote verified).</w:t>
+      </w:r>
+      <w:r>
+        <w:t xml:space="preserve"> </w:t>
+      </w:r>
+      <w:r>
+        <w:rPr>
+          <w:rStyle w:val="VerbatimChar"/>
+        </w:rPr>
+        <w:t xml:space="preserve">docs_chain</w:t>
+      </w:r>
+      <w:r>
+        <w:t xml:space="preserve"> </w:t>
+      </w:r>
+      <w:r>
+        <w:t xml:space="preserve">now built + installed at</w:t>
+      </w:r>
+      <w:r>
+        <w:t xml:space="preserve"> </w:t>
+      </w:r>
+      <w:r>
+        <w:rPr>
+          <w:rStyle w:val="VerbatimChar"/>
+        </w:rPr>
+        <w:t xml:space="preserve">~/.local/bin/docs_chain</w:t>
+      </w:r>
+      <w:r>
+        <w:t xml:space="preserve"> </w:t>
+      </w:r>
+      <w:r>
+        <w:t xml:space="preserve">(from</w:t>
+      </w:r>
+      <w:r>
+        <w:t xml:space="preserve"> </w:t>
+      </w:r>
+      <w:r>
+        <w:rPr>
+          <w:rStyle w:val="VerbatimChar"/>
+        </w:rPr>
+        <w:t xml:space="preserve">~/Projects/docs_chain</w:t>
+      </w:r>
+      <w:r>
+        <w:t xml:space="preserve"> </w:t>
+      </w:r>
+      <w:r>
+        <w:t xml:space="preserve">@</w:t>
+      </w:r>
+      <w:r>
+        <w:t xml:space="preserve"> </w:t>
+      </w:r>
+      <w:r>
+        <w:rPr>
+          <w:rStyle w:val="VerbatimChar"/>
+        </w:rPr>
+        <w:t xml:space="preserve">02eb81b</w:t>
+      </w:r>
+      <w:r>
+        <w:t xml:space="preserve">);</w:t>
+      </w:r>
+      <w:r>
+        <w:t xml:space="preserve"> </w:t>
+      </w:r>
+      <w:r>
+        <w:rPr>
+          <w:rStyle w:val="VerbatimChar"/>
+        </w:rPr>
+        <w:t xml:space="preserve">verify herald-docs</w:t>
+      </w:r>
+      <w:r>
+        <w:t xml:space="preserve"> </w:t>
+      </w:r>
+      <w:r>
+        <w:t xml:space="preserve">reports</w:t>
+      </w:r>
+      <w:r>
+        <w:t xml:space="preserve"> </w:t>
+      </w:r>
+      <w:r>
+        <w:rPr>
+          <w:b/>
+          <w:bCs/>
+        </w:rPr>
+        <w:t xml:space="preserve">in-sync</w:t>
+      </w:r>
+      <w:r>
+        <w:t xml:space="preserve"> </w:t>
+      </w:r>
+      <w:r>
+        <w:t xml:space="preserve">and is the live §11.4.106 drift-gate. Batch 2 (file-disjoint subagent streams, conductor-integrated):</w:t>
+      </w:r>
+      <w:r>
+        <w:t xml:space="preserve"> </w:t>
+      </w:r>
+      <w:r>
+        <w:rPr>
+          <w:rStyle w:val="VerbatimChar"/>
+        </w:rPr>
+        <w:t xml:space="preserve">4df729f</w:t>
+      </w:r>
+      <w:r>
+        <w:t xml:space="preserve"> </w:t>
+      </w:r>
+      <w:r>
+        <w:t xml:space="preserve">reconciled siblings to docs_chain canonical (export_docs.sh docx/pdf had drifted);</w:t>
+      </w:r>
+      <w:r>
+        <w:t xml:space="preserve"> </w:t>
+      </w:r>
+      <w:r>
+        <w:rPr>
+          <w:rStyle w:val="VerbatimChar"/>
+        </w:rPr>
+        <w:t xml:space="preserve">02faf56</w:t>
+      </w:r>
+      <w:r>
+        <w:t xml:space="preserve"> </w:t>
+      </w:r>
+      <w:r>
+        <w:t xml:space="preserve">added e2e</w:t>
+      </w:r>
+      <w:r>
+        <w:t xml:space="preserve"> </w:t>
+      </w:r>
+      <w:r>
+        <w:rPr>
+          <w:b/>
+          <w:bCs/>
+        </w:rPr>
+        <w:t xml:space="preserve">E148</w:t>
+      </w:r>
+      <w:r>
+        <w:t xml:space="preserve"> </w:t>
+      </w:r>
+      <w:r>
+        <w:t xml:space="preserve">pure read-only</w:t>
+      </w:r>
+      <w:r>
+        <w:t xml:space="preserve"> </w:t>
+      </w:r>
+      <w:r>
+        <w:rPr>
+          <w:rStyle w:val="VerbatimChar"/>
+        </w:rPr>
+        <w:t xml:space="preserve">docs_chain verify</w:t>
+      </w:r>
+      <w:r>
+        <w:t xml:space="preserve"> </w:t>
+      </w:r>
+      <w:r>
+        <w:t xml:space="preserve">drift-gate (E146/E147 sync-gates already existed);</w:t>
+      </w:r>
+      <w:r>
+        <w:t xml:space="preserve"> </w:t>
+      </w:r>
+      <w:r>
+        <w:rPr>
+          <w:rStyle w:val="VerbatimChar"/>
+        </w:rPr>
+        <w:t xml:space="preserve">bc8a9da</w:t>
+      </w:r>
+      <w:r>
+        <w:t xml:space="preserve"> </w:t>
+      </w:r>
+      <w:r>
+        <w:t xml:space="preserve">added the</w:t>
+      </w:r>
+      <w:r>
+        <w:t xml:space="preserve"> </w:t>
+      </w:r>
+      <w:r>
+        <w:rPr>
+          <w:rStyle w:val="VerbatimChar"/>
+        </w:rPr>
+        <w:t xml:space="preserve">pherald/internal/inbound</w:t>
+      </w:r>
+      <w:r>
+        <w:t xml:space="preserve"> </w:t>
+      </w:r>
+      <w:r>
+        <w:t xml:space="preserve">full-pipeline reply-DELIVERY regression-guard (seeded stub→reply posted back; does NOT close HRD-159);</w:t>
+      </w:r>
+      <w:r>
+        <w:t xml:space="preserve"> </w:t>
+      </w:r>
+      <w:r>
+        <w:rPr>
+          <w:rStyle w:val="VerbatimChar"/>
+        </w:rPr>
+        <w:t xml:space="preserve">f776b90</w:t>
+      </w:r>
+      <w:r>
+        <w:t xml:space="preserve"> </w:t>
+      </w:r>
+      <w:r>
+        <w:t xml:space="preserve">CLAUDE.md r22 documents docs_chain as the routine doc-sync flow.</w:t>
+      </w:r>
+      <w:r>
+        <w:t xml:space="preserve"> </w:t>
+      </w:r>
+      <w:r>
+        <w:rPr>
+          <w:b/>
+          <w:bCs/>
+        </w:rPr>
+        <w:t xml:space="preserve">Routine doc rule going forward: edit</w:t>
+      </w:r>
+      <w:r>
+        <w:rPr>
+          <w:b/>
+          <w:bCs/>
+        </w:rPr>
+        <w:t xml:space="preserve"> </w:t>
+      </w:r>
+      <w:r>
+        <w:rPr>
+          <w:rStyle w:val="VerbatimChar"/>
+          <w:b/>
+          <w:bCs/>
+        </w:rPr>
+        <w:t xml:space="preserve">.md</w:t>
+      </w:r>
+      <w:r>
+        <w:rPr>
+          <w:b/>
+          <w:bCs/>
+        </w:rPr>
+        <w:t xml:space="preserve"> </w:t>
+      </w:r>
+      <w:r>
+        <w:rPr>
+          <w:b/>
+          <w:bCs/>
+        </w:rPr>
+        <w:t xml:space="preserve">→</w:t>
+      </w:r>
+      <w:r>
+        <w:rPr>
+          <w:b/>
+          <w:bCs/>
+        </w:rPr>
+        <w:t xml:space="preserve"> </w:t>
+      </w:r>
+      <w:r>
+        <w:rPr>
+          <w:rStyle w:val="VerbatimChar"/>
+          <w:b/>
+          <w:bCs/>
+        </w:rPr>
+        <w:t xml:space="preserve">docs_chain sync herald-docs</w:t>
+      </w:r>
+      <w:r>
+        <w:rPr>
+          <w:b/>
+          <w:bCs/>
+        </w:rPr>
+        <w:t xml:space="preserve"> </w:t>
+      </w:r>
+      <w:r>
+        <w:rPr>
+          <w:b/>
+          <w:bCs/>
+        </w:rPr>
+        <w:t xml:space="preserve">→</w:t>
+      </w:r>
+      <w:r>
+        <w:rPr>
+          <w:b/>
+          <w:bCs/>
+        </w:rPr>
+        <w:t xml:space="preserve"> </w:t>
+      </w:r>
+      <w:r>
+        <w:rPr>
+          <w:rStyle w:val="VerbatimChar"/>
+          <w:b/>
+          <w:bCs/>
+        </w:rPr>
+        <w:t xml:space="preserve">verify</w:t>
+      </w:r>
+      <w:r>
+        <w:rPr>
+          <w:b/>
+          <w:bCs/>
+        </w:rPr>
+        <w:t xml:space="preserve"> </w:t>
+      </w:r>
+      <w:r>
+        <w:rPr>
+          <w:b/>
+          <w:bCs/>
+        </w:rPr>
+        <w:t xml:space="preserve">in-sync → commit (NOT export_docs.sh for docx/pdf).</w:t>
+      </w:r>
+      <w:r>
+        <w:t xml:space="preserve"> </w:t>
+      </w:r>
+      <w:r>
+        <w:t xml:space="preserve">Open HRDs unchanged (8, all external-dep-blocked). Live-test cheat-sheet in</w:t>
+      </w:r>
+      <w:r>
+        <w:t xml:space="preserve"> </w:t>
+      </w:r>
+      <w:r>
+        <w:rPr>
+          <w:rStyle w:val="VerbatimChar"/>
+        </w:rPr>
+        <w:t xml:space="preserve">.remember/remember.md</w:t>
+      </w:r>
+      <w:r>
+        <w:t xml:space="preserve">.</w:t>
+      </w:r>
+    </w:p>
+    <w:p>
+      <w:pPr>
+        <w:pStyle w:val="BodyText"/>
       </w:pPr>
       <w:r>
         <w:rPr>

</xml_diff>